<commit_message>
Add chapters 10-15 content, examples, and updated book
</commit_message>
<xml_diff>
--- a/Book_Version/MustLearnCodeQL.docx
+++ b/Book_Version/MustLearnCodeQL.docx
@@ -53,7 +53,7 @@
         <w:spacing w:before="600"/>
         <w:jc w:val="center"/>
       </w:pPr>
-      <w:hyperlink w:history="1" r:id="rIdfl4oiympy6pmipro_2myg">
+      <w:hyperlink w:history="1" r:id="rIdverwpscisjky83q3ph6oq">
         <w:r>
           <w:rPr>
             <w:rStyle w:val="Hyperlink"/>
@@ -560,12 +560,81 @@
         </w:p>
         <w:p>
           <w:pPr>
+            <w:pStyle w:val="TOC2"/>
+            <w:tabs>
+              <w:tab w:val="right" w:pos="9360" w:leader="dot"/>
+            </w:tabs>
+            <w:ind w:left="220"/>
+          </w:pPr>
+          <w:hyperlink w:history="1" w:anchor="_Toc22">
+            <w:r>
+              <w:t xml:space="preserve">Why Extend Libraries</w:t>
+            </w:r>
+            <w:r>
+              <w:tab/>
+            </w:r>
+            <w:r>
+              <w:fldChar w:fldCharType="begin" w:dirty="true"/>
+              <w:instrText xml:space="preserve">PAGEREF _Toc22 \h</w:instrText>
+              <w:fldChar w:fldCharType="separate"/>
+              <w:fldChar w:fldCharType="end"/>
+            </w:r>
+          </w:hyperlink>
+        </w:p>
+        <w:p>
+          <w:pPr>
+            <w:pStyle w:val="TOC2"/>
+            <w:tabs>
+              <w:tab w:val="right" w:pos="9360" w:leader="dot"/>
+            </w:tabs>
+            <w:ind w:left="220"/>
+          </w:pPr>
+          <w:hyperlink w:history="1" w:anchor="_Toc23">
+            <w:r>
+              <w:t xml:space="preserve">Custom Sources</w:t>
+            </w:r>
+            <w:r>
+              <w:tab/>
+            </w:r>
+            <w:r>
+              <w:fldChar w:fldCharType="begin" w:dirty="true"/>
+              <w:instrText xml:space="preserve">PAGEREF _Toc23 \h</w:instrText>
+              <w:fldChar w:fldCharType="separate"/>
+              <w:fldChar w:fldCharType="end"/>
+            </w:r>
+          </w:hyperlink>
+        </w:p>
+        <w:p>
+          <w:pPr>
+            <w:pStyle w:val="TOC2"/>
+            <w:tabs>
+              <w:tab w:val="right" w:pos="9360" w:leader="dot"/>
+            </w:tabs>
+            <w:ind w:left="220"/>
+          </w:pPr>
+          <w:hyperlink w:history="1" w:anchor="_Toc24">
+            <w:r>
+              <w:t xml:space="preserve">Additional Flow Steps and Summaries</w:t>
+            </w:r>
+            <w:r>
+              <w:tab/>
+            </w:r>
+            <w:r>
+              <w:fldChar w:fldCharType="begin" w:dirty="true"/>
+              <w:instrText xml:space="preserve">PAGEREF _Toc24 \h</w:instrText>
+              <w:fldChar w:fldCharType="separate"/>
+              <w:fldChar w:fldCharType="end"/>
+            </w:r>
+          </w:hyperlink>
+        </w:p>
+        <w:p>
+          <w:pPr>
             <w:pStyle w:val="TOC1"/>
             <w:tabs>
               <w:tab w:val="right" w:pos="9360" w:leader="dot"/>
             </w:tabs>
           </w:pPr>
-          <w:hyperlink w:history="1" w:anchor="_Toc22">
+          <w:hyperlink w:history="1" w:anchor="_Toc25">
             <w:r>
               <w:t xml:space="preserve">Chapter 11: Query Packs, Suites, Metadata, and Production Use</w:t>
             </w:r>
@@ -574,7 +643,76 @@
             </w:r>
             <w:r>
               <w:fldChar w:fldCharType="begin" w:dirty="true"/>
-              <w:instrText xml:space="preserve">PAGEREF _Toc22 \h</w:instrText>
+              <w:instrText xml:space="preserve">PAGEREF _Toc25 \h</w:instrText>
+              <w:fldChar w:fldCharType="separate"/>
+              <w:fldChar w:fldCharType="end"/>
+            </w:r>
+          </w:hyperlink>
+        </w:p>
+        <w:p>
+          <w:pPr>
+            <w:pStyle w:val="TOC2"/>
+            <w:tabs>
+              <w:tab w:val="right" w:pos="9360" w:leader="dot"/>
+            </w:tabs>
+            <w:ind w:left="220"/>
+          </w:pPr>
+          <w:hyperlink w:history="1" w:anchor="_Toc26">
+            <w:r>
+              <w:t xml:space="preserve">Pack Structure</w:t>
+            </w:r>
+            <w:r>
+              <w:tab/>
+            </w:r>
+            <w:r>
+              <w:fldChar w:fldCharType="begin" w:dirty="true"/>
+              <w:instrText xml:space="preserve">PAGEREF _Toc26 \h</w:instrText>
+              <w:fldChar w:fldCharType="separate"/>
+              <w:fldChar w:fldCharType="end"/>
+            </w:r>
+          </w:hyperlink>
+        </w:p>
+        <w:p>
+          <w:pPr>
+            <w:pStyle w:val="TOC2"/>
+            <w:tabs>
+              <w:tab w:val="right" w:pos="9360" w:leader="dot"/>
+            </w:tabs>
+            <w:ind w:left="220"/>
+          </w:pPr>
+          <w:hyperlink w:history="1" w:anchor="_Toc27">
+            <w:r>
+              <w:t xml:space="preserve">Query Suites</w:t>
+            </w:r>
+            <w:r>
+              <w:tab/>
+            </w:r>
+            <w:r>
+              <w:fldChar w:fldCharType="begin" w:dirty="true"/>
+              <w:instrText xml:space="preserve">PAGEREF _Toc27 \h</w:instrText>
+              <w:fldChar w:fldCharType="separate"/>
+              <w:fldChar w:fldCharType="end"/>
+            </w:r>
+          </w:hyperlink>
+        </w:p>
+        <w:p>
+          <w:pPr>
+            <w:pStyle w:val="TOC2"/>
+            <w:tabs>
+              <w:tab w:val="right" w:pos="9360" w:leader="dot"/>
+            </w:tabs>
+            <w:ind w:left="220"/>
+          </w:pPr>
+          <w:hyperlink w:history="1" w:anchor="_Toc28">
+            <w:r>
+              <w:t xml:space="preserve">Metadata Best Practices</w:t>
+            </w:r>
+            <w:r>
+              <w:tab/>
+            </w:r>
+            <w:r>
+              <w:fldChar w:fldCharType="begin" w:dirty="true"/>
+              <w:instrText xml:space="preserve">PAGEREF _Toc28 \h</w:instrText>
               <w:fldChar w:fldCharType="separate"/>
               <w:fldChar w:fldCharType="end"/>
             </w:r>
@@ -587,7 +725,7 @@
               <w:tab w:val="right" w:pos="9360" w:leader="dot"/>
             </w:tabs>
           </w:pPr>
-          <w:hyperlink w:history="1" w:anchor="_Toc23">
+          <w:hyperlink w:history="1" w:anchor="_Toc29">
             <w:r>
               <w:t xml:space="preserve">Chapter 12: Integrating CodeQL into Development Workflows</w:t>
             </w:r>
@@ -596,7 +734,53 @@
             </w:r>
             <w:r>
               <w:fldChar w:fldCharType="begin" w:dirty="true"/>
-              <w:instrText xml:space="preserve">PAGEREF _Toc23 \h</w:instrText>
+              <w:instrText xml:space="preserve">PAGEREF _Toc29 \h</w:instrText>
+              <w:fldChar w:fldCharType="separate"/>
+              <w:fldChar w:fldCharType="end"/>
+            </w:r>
+          </w:hyperlink>
+        </w:p>
+        <w:p>
+          <w:pPr>
+            <w:pStyle w:val="TOC2"/>
+            <w:tabs>
+              <w:tab w:val="right" w:pos="9360" w:leader="dot"/>
+            </w:tabs>
+            <w:ind w:left="220"/>
+          </w:pPr>
+          <w:hyperlink w:history="1" w:anchor="_Toc30">
+            <w:r>
+              <w:t xml:space="preserve">Sample Workflow</w:t>
+            </w:r>
+            <w:r>
+              <w:tab/>
+            </w:r>
+            <w:r>
+              <w:fldChar w:fldCharType="begin" w:dirty="true"/>
+              <w:instrText xml:space="preserve">PAGEREF _Toc30 \h</w:instrText>
+              <w:fldChar w:fldCharType="separate"/>
+              <w:fldChar w:fldCharType="end"/>
+            </w:r>
+          </w:hyperlink>
+        </w:p>
+        <w:p>
+          <w:pPr>
+            <w:pStyle w:val="TOC2"/>
+            <w:tabs>
+              <w:tab w:val="right" w:pos="9360" w:leader="dot"/>
+            </w:tabs>
+            <w:ind w:left="220"/>
+          </w:pPr>
+          <w:hyperlink w:history="1" w:anchor="_Toc31">
+            <w:r>
+              <w:t xml:space="preserve">Other CI Systems</w:t>
+            </w:r>
+            <w:r>
+              <w:tab/>
+            </w:r>
+            <w:r>
+              <w:fldChar w:fldCharType="begin" w:dirty="true"/>
+              <w:instrText xml:space="preserve">PAGEREF _Toc31 \h</w:instrText>
               <w:fldChar w:fldCharType="separate"/>
               <w:fldChar w:fldCharType="end"/>
             </w:r>
@@ -609,7 +793,7 @@
               <w:tab w:val="right" w:pos="9360" w:leader="dot"/>
             </w:tabs>
           </w:pPr>
-          <w:hyperlink w:history="1" w:anchor="_Toc24">
+          <w:hyperlink w:history="1" w:anchor="_Toc32">
             <w:r>
               <w:t xml:space="preserve">Chapter 13: Advanced Techniques and Performance</w:t>
             </w:r>
@@ -618,7 +802,53 @@
             </w:r>
             <w:r>
               <w:fldChar w:fldCharType="begin" w:dirty="true"/>
-              <w:instrText xml:space="preserve">PAGEREF _Toc24 \h</w:instrText>
+              <w:instrText xml:space="preserve">PAGEREF _Toc32 \h</w:instrText>
+              <w:fldChar w:fldCharType="separate"/>
+              <w:fldChar w:fldCharType="end"/>
+            </w:r>
+          </w:hyperlink>
+        </w:p>
+        <w:p>
+          <w:pPr>
+            <w:pStyle w:val="TOC2"/>
+            <w:tabs>
+              <w:tab w:val="right" w:pos="9360" w:leader="dot"/>
+            </w:tabs>
+            <w:ind w:left="220"/>
+          </w:pPr>
+          <w:hyperlink w:history="1" w:anchor="_Toc33">
+            <w:r>
+              <w:t xml:space="preserve">Performance-Conscious Predicates</w:t>
+            </w:r>
+            <w:r>
+              <w:tab/>
+            </w:r>
+            <w:r>
+              <w:fldChar w:fldCharType="begin" w:dirty="true"/>
+              <w:instrText xml:space="preserve">PAGEREF _Toc33 \h</w:instrText>
+              <w:fldChar w:fldCharType="separate"/>
+              <w:fldChar w:fldCharType="end"/>
+            </w:r>
+          </w:hyperlink>
+        </w:p>
+        <w:p>
+          <w:pPr>
+            <w:pStyle w:val="TOC2"/>
+            <w:tabs>
+              <w:tab w:val="right" w:pos="9360" w:leader="dot"/>
+            </w:tabs>
+            <w:ind w:left="220"/>
+          </w:pPr>
+          <w:hyperlink w:history="1" w:anchor="_Toc34">
+            <w:r>
+              <w:t xml:space="preserve">Debugging and Optimization</w:t>
+            </w:r>
+            <w:r>
+              <w:tab/>
+            </w:r>
+            <w:r>
+              <w:fldChar w:fldCharType="begin" w:dirty="true"/>
+              <w:instrText xml:space="preserve">PAGEREF _Toc34 \h</w:instrText>
               <w:fldChar w:fldCharType="separate"/>
               <w:fldChar w:fldCharType="end"/>
             </w:r>
@@ -631,7 +861,7 @@
               <w:tab w:val="right" w:pos="9360" w:leader="dot"/>
             </w:tabs>
           </w:pPr>
-          <w:hyperlink w:history="1" w:anchor="_Toc25">
+          <w:hyperlink w:history="1" w:anchor="_Toc35">
             <w:r>
               <w:t xml:space="preserve">Chapter 14: Real-World Case Studies and Patterns</w:t>
             </w:r>
@@ -640,7 +870,30 @@
             </w:r>
             <w:r>
               <w:fldChar w:fldCharType="begin" w:dirty="true"/>
-              <w:instrText xml:space="preserve">PAGEREF _Toc25 \h</w:instrText>
+              <w:instrText xml:space="preserve">PAGEREF _Toc35 \h</w:instrText>
+              <w:fldChar w:fldCharType="separate"/>
+              <w:fldChar w:fldCharType="end"/>
+            </w:r>
+          </w:hyperlink>
+        </w:p>
+        <w:p>
+          <w:pPr>
+            <w:pStyle w:val="TOC2"/>
+            <w:tabs>
+              <w:tab w:val="right" w:pos="9360" w:leader="dot"/>
+            </w:tabs>
+            <w:ind w:left="220"/>
+          </w:pPr>
+          <w:hyperlink w:history="1" w:anchor="_Toc36">
+            <w:r>
+              <w:t xml:space="preserve">SQL Injection Example</w:t>
+            </w:r>
+            <w:r>
+              <w:tab/>
+            </w:r>
+            <w:r>
+              <w:fldChar w:fldCharType="begin" w:dirty="true"/>
+              <w:instrText xml:space="preserve">PAGEREF _Toc36 \h</w:instrText>
               <w:fldChar w:fldCharType="separate"/>
               <w:fldChar w:fldCharType="end"/>
             </w:r>
@@ -653,7 +906,7 @@
               <w:tab w:val="right" w:pos="9360" w:leader="dot"/>
             </w:tabs>
           </w:pPr>
-          <w:hyperlink w:history="1" w:anchor="_Toc26">
+          <w:hyperlink w:history="1" w:anchor="_Toc37">
             <w:r>
               <w:t xml:space="preserve">Chapter 15: Best Practices, Common Pitfalls, and Next Steps</w:t>
             </w:r>
@@ -662,7 +915,76 @@
             </w:r>
             <w:r>
               <w:fldChar w:fldCharType="begin" w:dirty="true"/>
-              <w:instrText xml:space="preserve">PAGEREF _Toc26 \h</w:instrText>
+              <w:instrText xml:space="preserve">PAGEREF _Toc37 \h</w:instrText>
+              <w:fldChar w:fldCharType="separate"/>
+              <w:fldChar w:fldCharType="end"/>
+            </w:r>
+          </w:hyperlink>
+        </w:p>
+        <w:p>
+          <w:pPr>
+            <w:pStyle w:val="TOC2"/>
+            <w:tabs>
+              <w:tab w:val="right" w:pos="9360" w:leader="dot"/>
+            </w:tabs>
+            <w:ind w:left="220"/>
+          </w:pPr>
+          <w:hyperlink w:history="1" w:anchor="_Toc38">
+            <w:r>
+              <w:t xml:space="preserve">Writing and Testing</w:t>
+            </w:r>
+            <w:r>
+              <w:tab/>
+            </w:r>
+            <w:r>
+              <w:fldChar w:fldCharType="begin" w:dirty="true"/>
+              <w:instrText xml:space="preserve">PAGEREF _Toc38 \h</w:instrText>
+              <w:fldChar w:fldCharType="separate"/>
+              <w:fldChar w:fldCharType="end"/>
+            </w:r>
+          </w:hyperlink>
+        </w:p>
+        <w:p>
+          <w:pPr>
+            <w:pStyle w:val="TOC2"/>
+            <w:tabs>
+              <w:tab w:val="right" w:pos="9360" w:leader="dot"/>
+            </w:tabs>
+            <w:ind w:left="220"/>
+          </w:pPr>
+          <w:hyperlink w:history="1" w:anchor="_Toc39">
+            <w:r>
+              <w:t xml:space="preserve">Reducing False Positives</w:t>
+            </w:r>
+            <w:r>
+              <w:tab/>
+            </w:r>
+            <w:r>
+              <w:fldChar w:fldCharType="begin" w:dirty="true"/>
+              <w:instrText xml:space="preserve">PAGEREF _Toc39 \h</w:instrText>
+              <w:fldChar w:fldCharType="separate"/>
+              <w:fldChar w:fldCharType="end"/>
+            </w:r>
+          </w:hyperlink>
+        </w:p>
+        <w:p>
+          <w:pPr>
+            <w:pStyle w:val="TOC2"/>
+            <w:tabs>
+              <w:tab w:val="right" w:pos="9360" w:leader="dot"/>
+            </w:tabs>
+            <w:ind w:left="220"/>
+          </w:pPr>
+          <w:hyperlink w:history="1" w:anchor="_Toc40">
+            <w:r>
+              <w:t xml:space="preserve">Contributing and Staying Current</w:t>
+            </w:r>
+            <w:r>
+              <w:tab/>
+            </w:r>
+            <w:r>
+              <w:fldChar w:fldCharType="begin" w:dirty="true"/>
+              <w:instrText xml:space="preserve">PAGEREF _Toc40 \h</w:instrText>
               <w:fldChar w:fldCharType="separate"/>
               <w:fldChar w:fldCharType="end"/>
             </w:r>
@@ -675,7 +997,7 @@
               <w:tab w:val="right" w:pos="9360" w:leader="dot"/>
             </w:tabs>
           </w:pPr>
-          <w:hyperlink w:history="1" w:anchor="_Toc27">
+          <w:hyperlink w:history="1" w:anchor="_Toc41">
             <w:r>
               <w:t xml:space="preserve">Appendix A: Quick Reference</w:t>
             </w:r>
@@ -684,7 +1006,7 @@
             </w:r>
             <w:r>
               <w:fldChar w:fldCharType="begin" w:dirty="true"/>
-              <w:instrText xml:space="preserve">PAGEREF _Toc27 \h</w:instrText>
+              <w:instrText xml:space="preserve">PAGEREF _Toc41 \h</w:instrText>
               <w:fldChar w:fldCharType="separate"/>
               <w:fldChar w:fldCharType="end"/>
             </w:r>
@@ -697,7 +1019,7 @@
               <w:tab w:val="right" w:pos="9360" w:leader="dot"/>
             </w:tabs>
           </w:pPr>
-          <w:hyperlink w:history="1" w:anchor="_Toc28">
+          <w:hyperlink w:history="1" w:anchor="_Toc42">
             <w:r>
               <w:t xml:space="preserve">Appendix B: Glossary</w:t>
             </w:r>
@@ -706,7 +1028,7 @@
             </w:r>
             <w:r>
               <w:fldChar w:fldCharType="begin" w:dirty="true"/>
-              <w:instrText xml:space="preserve">PAGEREF _Toc28 \h</w:instrText>
+              <w:instrText xml:space="preserve">PAGEREF _Toc42 \h</w:instrText>
               <w:fldChar w:fldCharType="separate"/>
               <w:fldChar w:fldCharType="end"/>
             </w:r>
@@ -719,7 +1041,7 @@
               <w:tab w:val="right" w:pos="9360" w:leader="dot"/>
             </w:tabs>
           </w:pPr>
-          <w:hyperlink w:history="1" w:anchor="_Toc29">
+          <w:hyperlink w:history="1" w:anchor="_Toc43">
             <w:r>
               <w:t xml:space="preserve">Appendix C: Recommended Resources</w:t>
             </w:r>
@@ -728,7 +1050,7 @@
             </w:r>
             <w:r>
               <w:fldChar w:fldCharType="begin" w:dirty="true"/>
-              <w:instrText xml:space="preserve">PAGEREF _Toc29 \h</w:instrText>
+              <w:instrText xml:space="preserve">PAGEREF _Toc43 \h</w:instrText>
               <w:fldChar w:fldCharType="separate"/>
               <w:fldChar w:fldCharType="end"/>
             </w:r>
@@ -761,7 +1083,7 @@
       </w:r>
     </w:p>
     <w:p>
-      <w:hyperlink w:history="1" r:id="rIdsrewhw3gyace1zepgqfij">
+      <w:hyperlink w:history="1" r:id="rIdnqqbeeqflwe5kr4txe1zc">
         <w:r>
           <w:rPr>
             <w:rStyle w:val="Hyperlink"/>
@@ -2191,106 +2513,95 @@
         <w:spacing w:after="160"/>
       </w:pPr>
       <w:r>
-        <w:t xml:space="preserve">When a third-party library is not modeled, you extend the standard libraries by adding sources, sinks, or flow summaries. Model packs let you distribute these extensions independently of queries.</w:t>
-      </w:r>
-    </w:p>
-    <w:p>
-      <w:pPr>
-        <w:spacing w:after="160"/>
-      </w:pPr>
-      <w:r>
-        <w:t xml:space="preserve">Example of an additional taint step (conceptual):</w:t>
-      </w:r>
-    </w:p>
-    <w:p>
-      <w:pPr>
-        <w:spacing w:after="40"/>
-      </w:pPr>
-      <w:r>
-        <w:rPr>
-          <w:rFonts w:ascii="Consolas" w:cs="Consolas" w:eastAsia="Consolas" w:hAnsi="Consolas"/>
-          <w:sz w:val="18"/>
-          <w:szCs w:val="18"/>
-        </w:rPr>
-        <w:t xml:space="preserve">predicate isAdditionalFlowStep(DataFlow::Node pred, DataFlow::Node succ) {</w:t>
-      </w:r>
-    </w:p>
-    <w:p>
-      <w:pPr>
-        <w:spacing w:after="40"/>
-      </w:pPr>
-      <w:r>
-        <w:rPr>
-          <w:rFonts w:ascii="Consolas" w:cs="Consolas" w:eastAsia="Consolas" w:hAnsi="Consolas"/>
-          <w:sz w:val="18"/>
-          <w:szCs w:val="18"/>
-        </w:rPr>
-        <w:t xml:space="preserve">  // model a custom sanitizer or propagator</w:t>
-      </w:r>
-    </w:p>
-    <w:p>
-      <w:pPr>
-        <w:spacing w:after="40"/>
-      </w:pPr>
-      <w:r>
-        <w:rPr>
-          <w:rFonts w:ascii="Consolas" w:cs="Consolas" w:eastAsia="Consolas" w:hAnsi="Consolas"/>
-          <w:sz w:val="18"/>
-          <w:szCs w:val="18"/>
-        </w:rPr>
-        <w:t xml:space="preserve">  exists(CallExpr c |</w:t>
-      </w:r>
-    </w:p>
-    <w:p>
-      <w:pPr>
-        <w:spacing w:after="40"/>
-      </w:pPr>
-      <w:r>
-        <w:rPr>
-          <w:rFonts w:ascii="Consolas" w:cs="Consolas" w:eastAsia="Consolas" w:hAnsi="Consolas"/>
-          <w:sz w:val="18"/>
-          <w:szCs w:val="18"/>
-        </w:rPr>
-        <w:t xml:space="preserve">    c.getCalleeName() = "myTransform" and</w:t>
-      </w:r>
-    </w:p>
-    <w:p>
-      <w:pPr>
-        <w:spacing w:after="40"/>
-      </w:pPr>
-      <w:r>
-        <w:rPr>
-          <w:rFonts w:ascii="Consolas" w:cs="Consolas" w:eastAsia="Consolas" w:hAnsi="Consolas"/>
-          <w:sz w:val="18"/>
-          <w:szCs w:val="18"/>
-        </w:rPr>
-        <w:t xml:space="preserve">    pred = c.getArgument(0).flow() and</w:t>
-      </w:r>
-    </w:p>
-    <w:p>
-      <w:pPr>
-        <w:spacing w:after="40"/>
-      </w:pPr>
-      <w:r>
-        <w:rPr>
-          <w:rFonts w:ascii="Consolas" w:cs="Consolas" w:eastAsia="Consolas" w:hAnsi="Consolas"/>
-          <w:sz w:val="18"/>
-          <w:szCs w:val="18"/>
-        </w:rPr>
-        <w:t xml:space="preserve">    succ = c.flow()</w:t>
-      </w:r>
-    </w:p>
-    <w:p>
-      <w:pPr>
-        <w:spacing w:after="40"/>
-      </w:pPr>
-      <w:r>
-        <w:rPr>
-          <w:rFonts w:ascii="Consolas" w:cs="Consolas" w:eastAsia="Consolas" w:hAnsi="Consolas"/>
-          <w:sz w:val="18"/>
-          <w:szCs w:val="18"/>
-        </w:rPr>
-        <w:t xml:space="preserve">  )</w:t>
+        <w:t xml:space="preserve">When the standard CodeQL libraries do not model a framework, library, or custom API that your code uses, you extend them. Extensions improve both recall (finding more true positives) and precision (reducing false positives).</w:t>
+      </w:r>
+    </w:p>
+    <w:p>
+      <w:pPr>
+        <w:pStyle w:val="Heading2"/>
+      </w:pPr>
+      <w:bookmarkStart w:name="_Toc22" w:id="22"/>
+      <w:r>
+        <w:t xml:space="preserve">Why Extend Libraries</w:t>
+      </w:r>
+      <w:bookmarkEnd w:id="22"/>
+    </w:p>
+    <w:p>
+      <w:pPr>
+        <w:spacing w:after="160"/>
+      </w:pPr>
+      <w:r>
+        <w:t xml:space="preserve">Default models cover many popular libraries, but real-world codebases often use internal frameworks, niche packages, or custom wrappers. Modeling these lets existing security queries automatically understand your code.</w:t>
+      </w:r>
+    </w:p>
+    <w:p>
+      <w:pPr>
+        <w:pStyle w:val="Heading2"/>
+      </w:pPr>
+      <w:bookmarkStart w:name="_Toc23" w:id="23"/>
+      <w:r>
+        <w:t xml:space="preserve">Custom Sources</w:t>
+      </w:r>
+      <w:bookmarkEnd w:id="23"/>
+    </w:p>
+    <w:p>
+      <w:pPr>
+        <w:spacing w:after="160"/>
+      </w:pPr>
+      <w:r>
+        <w:t xml:space="preserve">A common extension is to mark additional functions as remote flow sources. The example in examples/chapter10/custom-source.ql shows the pattern:</w:t>
+      </w:r>
+    </w:p>
+    <w:p>
+      <w:pPr>
+        <w:spacing w:after="40"/>
+      </w:pPr>
+      <w:r>
+        <w:rPr>
+          <w:rFonts w:ascii="Consolas" w:cs="Consolas" w:eastAsia="Consolas" w:hAnsi="Consolas"/>
+          <w:sz w:val="18"/>
+          <w:szCs w:val="18"/>
+        </w:rPr>
+        <w:t xml:space="preserve">class CustomRemoteSource extends RemoteFlowSource {</w:t>
+      </w:r>
+    </w:p>
+    <w:p>
+      <w:pPr>
+        <w:spacing w:after="40"/>
+      </w:pPr>
+      <w:r>
+        <w:rPr>
+          <w:rFonts w:ascii="Consolas" w:cs="Consolas" w:eastAsia="Consolas" w:hAnsi="Consolas"/>
+          <w:sz w:val="18"/>
+          <w:szCs w:val="18"/>
+        </w:rPr>
+        <w:t xml:space="preserve">  CustomRemoteSource() {</w:t>
+      </w:r>
+    </w:p>
+    <w:p>
+      <w:pPr>
+        <w:spacing w:after="40"/>
+      </w:pPr>
+      <w:r>
+        <w:rPr>
+          <w:rFonts w:ascii="Consolas" w:cs="Consolas" w:eastAsia="Consolas" w:hAnsi="Consolas"/>
+          <w:sz w:val="18"/>
+          <w:szCs w:val="18"/>
+        </w:rPr>
+        <w:t xml:space="preserve">    this = any(CallExpr c | c.getCalleeName() = "getUserInput").flow()</w:t>
+      </w:r>
+    </w:p>
+    <w:p>
+      <w:pPr>
+        <w:spacing w:after="40"/>
+      </w:pPr>
+      <w:r>
+        <w:rPr>
+          <w:rFonts w:ascii="Consolas" w:cs="Consolas" w:eastAsia="Consolas" w:hAnsi="Consolas"/>
+          <w:sz w:val="18"/>
+          <w:szCs w:val="18"/>
+        </w:rPr>
+        <w:t xml:space="preserve">  }</w:t>
       </w:r>
     </w:p>
     <w:p>
@@ -2311,7 +2622,33 @@
         <w:spacing w:after="160"/>
       </w:pPr>
       <w:r>
-        <w:t xml:space="preserve">Complete model-pack examples are in examples/chapter10/.</w:t>
+        <w:t xml:space="preserve">Once defined, any query that looks for RemoteFlowSource will automatically include your custom source.</w:t>
+      </w:r>
+    </w:p>
+    <w:p>
+      <w:pPr>
+        <w:pStyle w:val="Heading2"/>
+      </w:pPr>
+      <w:bookmarkStart w:name="_Toc24" w:id="24"/>
+      <w:r>
+        <w:t xml:space="preserve">Additional Flow Steps and Summaries</w:t>
+      </w:r>
+      <w:bookmarkEnd w:id="24"/>
+    </w:p>
+    <w:p>
+      <w:pPr>
+        <w:spacing w:after="160"/>
+      </w:pPr>
+      <w:r>
+        <w:t xml:space="preserve">You can also add flow summaries so that taint propagates through library functions that transform data without the default models knowing about them. Model packs (data extension files) let you publish these extensions separately from queries so they can be shared and versioned.</w:t>
+      </w:r>
+    </w:p>
+    <w:p>
+      <w:pPr>
+        <w:spacing w:after="160"/>
+      </w:pPr>
+      <w:r>
+        <w:t xml:space="preserve">See examples/chapter10/ for the custom-source example and README with further notes.</w:t>
       </w:r>
     </w:p>
     <w:p>
@@ -2319,31 +2656,49 @@
         <w:pStyle w:val="Heading1"/>
         <w:pageBreakBefore/>
       </w:pPr>
-      <w:bookmarkStart w:name="_Toc22" w:id="22"/>
+      <w:bookmarkStart w:name="_Toc25" w:id="25"/>
       <w:r>
         <w:t xml:space="preserve">Chapter 11: Query Packs, Suites, Metadata, and Production Use</w:t>
       </w:r>
-      <w:bookmarkEnd w:id="22"/>
-    </w:p>
-    <w:p>
-      <w:pPr>
-        <w:spacing w:after="160"/>
-      </w:pPr>
-      <w:r>
-        <w:t xml:space="preserve">A qlpack.yml defines a pack. Query suites (qls files) select which queries run. Metadata drives severity, precision, and help text in GitHub code scanning.</w:t>
-      </w:r>
-    </w:p>
-    <w:p>
-      <w:pPr>
-        <w:spacing w:after="40"/>
-      </w:pPr>
-      <w:r>
-        <w:rPr>
-          <w:rFonts w:ascii="Consolas" w:cs="Consolas" w:eastAsia="Consolas" w:hAnsi="Consolas"/>
-          <w:sz w:val="18"/>
-          <w:szCs w:val="18"/>
-        </w:rPr>
-        <w:t xml:space="preserve">name: my-org/my-queries</w:t>
+      <w:bookmarkEnd w:id="25"/>
+    </w:p>
+    <w:p>
+      <w:pPr>
+        <w:spacing w:after="160"/>
+      </w:pPr>
+      <w:r>
+        <w:t xml:space="preserve">CodeQL packs are the unit of distribution for queries, libraries, and models. A pack is defined by a qlpack.yml file and can declare dependencies on the official standard libraries.</w:t>
+      </w:r>
+    </w:p>
+    <w:p>
+      <w:pPr>
+        <w:pStyle w:val="Heading2"/>
+      </w:pPr>
+      <w:bookmarkStart w:name="_Toc26" w:id="26"/>
+      <w:r>
+        <w:t xml:space="preserve">Pack Structure</w:t>
+      </w:r>
+      <w:bookmarkEnd w:id="26"/>
+    </w:p>
+    <w:p>
+      <w:pPr>
+        <w:spacing w:after="160"/>
+      </w:pPr>
+      <w:r>
+        <w:t xml:space="preserve">Example qlpack.yml (see examples/chapter11/qlpack.yml):</w:t>
+      </w:r>
+    </w:p>
+    <w:p>
+      <w:pPr>
+        <w:spacing w:after="40"/>
+      </w:pPr>
+      <w:r>
+        <w:rPr>
+          <w:rFonts w:ascii="Consolas" w:cs="Consolas" w:eastAsia="Consolas" w:hAnsi="Consolas"/>
+          <w:sz w:val="18"/>
+          <w:szCs w:val="18"/>
+        </w:rPr>
+        <w:t xml:space="preserve">name: mustlearn/example-queries</w:t>
       </w:r>
     </w:p>
     <w:p>
@@ -2383,6 +2738,50 @@
           <w:szCs w:val="18"/>
         </w:rPr>
         <w:t xml:space="preserve">  codeql/javascript-all: "*"</w:t>
+      </w:r>
+    </w:p>
+    <w:p>
+      <w:pPr>
+        <w:pStyle w:val="Heading2"/>
+      </w:pPr>
+      <w:bookmarkStart w:name="_Toc27" w:id="27"/>
+      <w:r>
+        <w:t xml:space="preserve">Query Suites</w:t>
+      </w:r>
+      <w:bookmarkEnd w:id="27"/>
+    </w:p>
+    <w:p>
+      <w:pPr>
+        <w:spacing w:after="160"/>
+      </w:pPr>
+      <w:r>
+        <w:t xml:space="preserve">Suites (.qls files) control which queries run. You can include or exclude by kind, tags, or path. An example suite is in examples/chapter11/example-suite.qls.</w:t>
+      </w:r>
+    </w:p>
+    <w:p>
+      <w:pPr>
+        <w:pStyle w:val="Heading2"/>
+      </w:pPr>
+      <w:bookmarkStart w:name="_Toc28" w:id="28"/>
+      <w:r>
+        <w:t xml:space="preserve">Metadata Best Practices</w:t>
+      </w:r>
+      <w:bookmarkEnd w:id="28"/>
+    </w:p>
+    <w:p>
+      <w:pPr>
+        <w:spacing w:after="160"/>
+      </w:pPr>
+      <w:r>
+        <w:t xml:space="preserve">Every production query should include complete metadata: unique @id, clear @name and @description, appropriate @kind (problem or path-problem), and severity. Good metadata makes results actionable in GitHub code scanning and improves query help pages.</w:t>
+      </w:r>
+    </w:p>
+    <w:p>
+      <w:pPr>
+        <w:spacing w:after="160"/>
+      </w:pPr>
+      <w:r>
+        <w:t xml:space="preserve">Always write expected-result tests before promoting a query to a shared pack.</w:t>
       </w:r>
     </w:p>
     <w:p>
@@ -2390,26 +2789,98 @@
         <w:pStyle w:val="Heading1"/>
         <w:pageBreakBefore/>
       </w:pPr>
-      <w:bookmarkStart w:name="_Toc23" w:id="23"/>
+      <w:bookmarkStart w:name="_Toc29" w:id="29"/>
       <w:r>
         <w:t xml:space="preserve">Chapter 12: Integrating CodeQL into Development Workflows</w:t>
       </w:r>
-      <w:bookmarkEnd w:id="23"/>
-    </w:p>
-    <w:p>
-      <w:pPr>
-        <w:spacing w:after="160"/>
-      </w:pPr>
-      <w:r>
-        <w:t xml:space="preserve">The standard GitHub Actions workflow uses github/codeql-action. You can pin query packs, choose suites, and upload SARIF. For other CI systems download the CodeQL bundle and invoke the CLI.</w:t>
-      </w:r>
-    </w:p>
-    <w:p>
-      <w:pPr>
-        <w:spacing w:after="160"/>
-      </w:pPr>
-      <w:r>
-        <w:t xml:space="preserve">Multi-repository variant analysis (MRVA) lets you run a single query against thousands of repositories. Configuration examples are in examples/chapter12/.</w:t>
+      <w:bookmarkEnd w:id="29"/>
+    </w:p>
+    <w:p>
+      <w:pPr>
+        <w:spacing w:after="160"/>
+      </w:pPr>
+      <w:r>
+        <w:t xml:space="preserve">The most common integration is the CodeQL GitHub Action. It creates the database, runs queries, and uploads SARIF results so alerts appear in the Security tab.</w:t>
+      </w:r>
+    </w:p>
+    <w:p>
+      <w:pPr>
+        <w:pStyle w:val="Heading2"/>
+      </w:pPr>
+      <w:bookmarkStart w:name="_Toc30" w:id="30"/>
+      <w:r>
+        <w:t xml:space="preserve">Sample Workflow</w:t>
+      </w:r>
+      <w:bookmarkEnd w:id="30"/>
+    </w:p>
+    <w:p>
+      <w:pPr>
+        <w:spacing w:after="160"/>
+      </w:pPr>
+      <w:r>
+        <w:t xml:space="preserve">A ready-to-use workflow is provided at examples/chapter12/codeql-analysis.yml. Key customizations include:</w:t>
+      </w:r>
+    </w:p>
+    <w:p>
+      <w:pPr>
+        <w:pStyle w:val="ListParagraph"/>
+        <w:numPr>
+          <w:ilvl w:val="0"/>
+          <w:numId w:val="3"/>
+        </w:numPr>
+      </w:pPr>
+      <w:r>
+        <w:t xml:space="preserve">languages matrix for multi-language repositories</w:t>
+      </w:r>
+    </w:p>
+    <w:p>
+      <w:pPr>
+        <w:pStyle w:val="ListParagraph"/>
+        <w:numPr>
+          <w:ilvl w:val="0"/>
+          <w:numId w:val="3"/>
+        </w:numPr>
+      </w:pPr>
+      <w:r>
+        <w:t xml:space="preserve">queries: security-extended or a custom pack</w:t>
+      </w:r>
+    </w:p>
+    <w:p>
+      <w:pPr>
+        <w:pStyle w:val="ListParagraph"/>
+        <w:numPr>
+          <w:ilvl w:val="0"/>
+          <w:numId w:val="3"/>
+        </w:numPr>
+      </w:pPr>
+      <w:r>
+        <w:t xml:space="preserve">build-mode or explicit build commands for compiled languages</w:t>
+      </w:r>
+    </w:p>
+    <w:p>
+      <w:pPr>
+        <w:pStyle w:val="Heading2"/>
+      </w:pPr>
+      <w:bookmarkStart w:name="_Toc31" w:id="31"/>
+      <w:r>
+        <w:t xml:space="preserve">Other CI Systems</w:t>
+      </w:r>
+      <w:bookmarkEnd w:id="31"/>
+    </w:p>
+    <w:p>
+      <w:pPr>
+        <w:spacing w:after="160"/>
+      </w:pPr>
+      <w:r>
+        <w:t xml:space="preserve">Download the CodeQL bundle, run the CLI to create a database and execute queries, then upload the resulting SARIF. Multi-repository variant analysis (MRVA) is available for research-scale runs across many repositories.</w:t>
+      </w:r>
+    </w:p>
+    <w:p>
+      <w:pPr>
+        <w:spacing w:after="160"/>
+      </w:pPr>
+      <w:r>
+        <w:t xml:space="preserve">Full workflow and notes are in examples/chapter12/.</w:t>
       </w:r>
     </w:p>
     <w:p>
@@ -2417,18 +2888,106 @@
         <w:pStyle w:val="Heading1"/>
         <w:pageBreakBefore/>
       </w:pPr>
-      <w:bookmarkStart w:name="_Toc24" w:id="24"/>
+      <w:bookmarkStart w:name="_Toc32" w:id="32"/>
       <w:r>
         <w:t xml:space="preserve">Chapter 13: Advanced Techniques and Performance</w:t>
       </w:r>
-      <w:bookmarkEnd w:id="24"/>
-    </w:p>
-    <w:p>
-      <w:pPr>
-        <w:spacing w:after="160"/>
-      </w:pPr>
-      <w:r>
-        <w:t xml:space="preserve">Use recursion carefully, prefer library predicates over hand-rolled joins, and profile slow queries. Partial-flow debugging and intermediate result inspection are invaluable when paths are missing.</w:t>
+      <w:bookmarkEnd w:id="32"/>
+    </w:p>
+    <w:p>
+      <w:pPr>
+        <w:spacing w:after="160"/>
+      </w:pPr>
+      <w:r>
+        <w:t xml:space="preserve">As queries grow more complex, performance and maintainability become critical. Prefer small, focused predicates that the optimizer can handle efficiently.</w:t>
+      </w:r>
+    </w:p>
+    <w:p>
+      <w:pPr>
+        <w:pStyle w:val="Heading2"/>
+      </w:pPr>
+      <w:bookmarkStart w:name="_Toc33" w:id="33"/>
+      <w:r>
+        <w:t xml:space="preserve">Performance-Conscious Predicates</w:t>
+      </w:r>
+      <w:bookmarkEnd w:id="33"/>
+    </w:p>
+    <w:p>
+      <w:pPr>
+        <w:spacing w:after="160"/>
+      </w:pPr>
+      <w:r>
+        <w:t xml:space="preserve">The example in examples/chapter13/performance-predicate.ql shows a tighter predicate that avoids unnecessary work:</w:t>
+      </w:r>
+    </w:p>
+    <w:p>
+      <w:pPr>
+        <w:spacing w:after="40"/>
+      </w:pPr>
+      <w:r>
+        <w:rPr>
+          <w:rFonts w:ascii="Consolas" w:cs="Consolas" w:eastAsia="Consolas" w:hAnsi="Consolas"/>
+          <w:sz w:val="18"/>
+          <w:szCs w:val="18"/>
+        </w:rPr>
+        <w:t xml:space="preserve">predicate isDirectEval(CallExpr c) {</w:t>
+      </w:r>
+    </w:p>
+    <w:p>
+      <w:pPr>
+        <w:spacing w:after="40"/>
+      </w:pPr>
+      <w:r>
+        <w:rPr>
+          <w:rFonts w:ascii="Consolas" w:cs="Consolas" w:eastAsia="Consolas" w:hAnsi="Consolas"/>
+          <w:sz w:val="18"/>
+          <w:szCs w:val="18"/>
+        </w:rPr>
+        <w:t xml:space="preserve">  c.getCalleeName() = "eval" and</w:t>
+      </w:r>
+    </w:p>
+    <w:p>
+      <w:pPr>
+        <w:spacing w:after="40"/>
+      </w:pPr>
+      <w:r>
+        <w:rPr>
+          <w:rFonts w:ascii="Consolas" w:cs="Consolas" w:eastAsia="Consolas" w:hAnsi="Consolas"/>
+          <w:sz w:val="18"/>
+          <w:szCs w:val="18"/>
+        </w:rPr>
+        <w:t xml:space="preserve">  not c.getCallee().(Function).getName().regexpMatch(".*wrapper.*")</w:t>
+      </w:r>
+    </w:p>
+    <w:p>
+      <w:pPr>
+        <w:spacing w:after="40"/>
+      </w:pPr>
+      <w:r>
+        <w:rPr>
+          <w:rFonts w:ascii="Consolas" w:cs="Consolas" w:eastAsia="Consolas" w:hAnsi="Consolas"/>
+          <w:sz w:val="18"/>
+          <w:szCs w:val="18"/>
+        </w:rPr>
+        <w:t xml:space="preserve">}</w:t>
+      </w:r>
+    </w:p>
+    <w:p>
+      <w:pPr>
+        <w:pStyle w:val="Heading2"/>
+      </w:pPr>
+      <w:bookmarkStart w:name="_Toc34" w:id="34"/>
+      <w:r>
+        <w:t xml:space="preserve">Debugging and Optimization</w:t>
+      </w:r>
+      <w:bookmarkEnd w:id="34"/>
+    </w:p>
+    <w:p>
+      <w:pPr>
+        <w:spacing w:after="160"/>
+      </w:pPr>
+      <w:r>
+        <w:t xml:space="preserve">Use partial flow debugging when expected paths do not appear. Profile slow queries, reduce the scope of configurations, and leverage existing library predicates instead of reimplementing joins. Modular design (predicates in reusable modules) improves both speed and readability.</w:t>
       </w:r>
     </w:p>
     <w:p>
@@ -2436,18 +2995,122 @@
         <w:pStyle w:val="Heading1"/>
         <w:pageBreakBefore/>
       </w:pPr>
-      <w:bookmarkStart w:name="_Toc25" w:id="25"/>
+      <w:bookmarkStart w:name="_Toc35" w:id="35"/>
       <w:r>
         <w:t xml:space="preserve">Chapter 14: Real-World Case Studies and Patterns</w:t>
       </w:r>
-      <w:bookmarkEnd w:id="25"/>
-    </w:p>
-    <w:p>
-      <w:pPr>
-        <w:spacing w:after="160"/>
-      </w:pPr>
-      <w:r>
-        <w:t xml:space="preserve">Study the GitHub Security Lab Zero-to-Hero series and the Secure Code Game. Common patterns include remote-flow sources, DOM sinks, SQL sinks, command-injection sinks, and path-traversal sinks. The repository includes simplified case-study queries under examples/chapter14/.</w:t>
+      <w:bookmarkEnd w:id="35"/>
+    </w:p>
+    <w:p>
+      <w:pPr>
+        <w:spacing w:after="160"/>
+      </w:pPr>
+      <w:r>
+        <w:t xml:space="preserve">Studying published research and the GitHub Security Lab Zero-to-Hero series is the fastest way to internalize effective query patterns. Common classes include injection flaws, XSS, path traversal, and insecure deserialization.</w:t>
+      </w:r>
+    </w:p>
+    <w:p>
+      <w:pPr>
+        <w:pStyle w:val="Heading2"/>
+      </w:pPr>
+      <w:bookmarkStart w:name="_Toc36" w:id="36"/>
+      <w:r>
+        <w:t xml:space="preserve">SQL Injection Example</w:t>
+      </w:r>
+      <w:bookmarkEnd w:id="36"/>
+    </w:p>
+    <w:p>
+      <w:pPr>
+        <w:spacing w:after="160"/>
+      </w:pPr>
+      <w:r>
+        <w:t xml:space="preserve">A simplified path-query case study is in examples/chapter14/sql-injection-example.ql. It demonstrates the standard source-to-sink structure used in production security queries:</w:t>
+      </w:r>
+    </w:p>
+    <w:p>
+      <w:pPr>
+        <w:spacing w:after="40"/>
+      </w:pPr>
+      <w:r>
+        <w:rPr>
+          <w:rFonts w:ascii="Consolas" w:cs="Consolas" w:eastAsia="Consolas" w:hAnsi="Consolas"/>
+          <w:sz w:val="18"/>
+          <w:szCs w:val="18"/>
+        </w:rPr>
+        <w:t xml:space="preserve">module SqlConfig implements DataFlow::ConfigSig {</w:t>
+      </w:r>
+    </w:p>
+    <w:p>
+      <w:pPr>
+        <w:spacing w:after="40"/>
+      </w:pPr>
+      <w:r>
+        <w:rPr>
+          <w:rFonts w:ascii="Consolas" w:cs="Consolas" w:eastAsia="Consolas" w:hAnsi="Consolas"/>
+          <w:sz w:val="18"/>
+          <w:szCs w:val="18"/>
+        </w:rPr>
+        <w:t xml:space="preserve">  predicate isSource(DataFlow::Node n) { n instanceof RemoteFlowSource }</w:t>
+      </w:r>
+    </w:p>
+    <w:p>
+      <w:pPr>
+        <w:spacing w:after="40"/>
+      </w:pPr>
+      <w:r>
+        <w:rPr>
+          <w:rFonts w:ascii="Consolas" w:cs="Consolas" w:eastAsia="Consolas" w:hAnsi="Consolas"/>
+          <w:sz w:val="18"/>
+          <w:szCs w:val="18"/>
+        </w:rPr>
+        <w:t xml:space="preserve">  predicate isSink(DataFlow::Node n) {</w:t>
+      </w:r>
+    </w:p>
+    <w:p>
+      <w:pPr>
+        <w:spacing w:after="40"/>
+      </w:pPr>
+      <w:r>
+        <w:rPr>
+          <w:rFonts w:ascii="Consolas" w:cs="Consolas" w:eastAsia="Consolas" w:hAnsi="Consolas"/>
+          <w:sz w:val="18"/>
+          <w:szCs w:val="18"/>
+        </w:rPr>
+        <w:t xml:space="preserve">    n.asExpr().(CallExpr).getCalleeName() = "query"</w:t>
+      </w:r>
+    </w:p>
+    <w:p>
+      <w:pPr>
+        <w:spacing w:after="40"/>
+      </w:pPr>
+      <w:r>
+        <w:rPr>
+          <w:rFonts w:ascii="Consolas" w:cs="Consolas" w:eastAsia="Consolas" w:hAnsi="Consolas"/>
+          <w:sz w:val="18"/>
+          <w:szCs w:val="18"/>
+        </w:rPr>
+        <w:t xml:space="preserve">  }</w:t>
+      </w:r>
+    </w:p>
+    <w:p>
+      <w:pPr>
+        <w:spacing w:after="40"/>
+      </w:pPr>
+      <w:r>
+        <w:rPr>
+          <w:rFonts w:ascii="Consolas" w:cs="Consolas" w:eastAsia="Consolas" w:hAnsi="Consolas"/>
+          <w:sz w:val="18"/>
+          <w:szCs w:val="18"/>
+        </w:rPr>
+        <w:t xml:space="preserve">}</w:t>
+      </w:r>
+    </w:p>
+    <w:p>
+      <w:pPr>
+        <w:spacing w:after="160"/>
+      </w:pPr>
+      <w:r>
+        <w:t xml:space="preserve">Replace the placeholder sink with a real modeled sink (or extend the library) for production use. Additional case-study queries can be added to examples/chapter14/.</w:t>
       </w:r>
     </w:p>
     <w:p>
@@ -2455,18 +3118,80 @@
         <w:pStyle w:val="Heading1"/>
         <w:pageBreakBefore/>
       </w:pPr>
-      <w:bookmarkStart w:name="_Toc26" w:id="26"/>
+      <w:bookmarkStart w:name="_Toc37" w:id="37"/>
       <w:r>
         <w:t xml:space="preserve">Chapter 15: Best Practices, Common Pitfalls, and Next Steps</w:t>
       </w:r>
-      <w:bookmarkEnd w:id="26"/>
-    </w:p>
-    <w:p>
-      <w:pPr>
-        <w:spacing w:after="160"/>
-      </w:pPr>
-      <w:r>
-        <w:t xml:space="preserve">Write small, testable predicates. Document metadata thoroughly. Reduce false positives with precise barriers. Contribute high-quality queries and models back to the official CodeQL repository. Keep the companion repository updated as CodeQL evolves.</w:t>
+      <w:bookmarkEnd w:id="37"/>
+    </w:p>
+    <w:p>
+      <w:pPr>
+        <w:spacing w:after="160"/>
+      </w:pPr>
+      <w:r>
+        <w:t xml:space="preserve">Successful CodeQL use rests on a few consistent habits.</w:t>
+      </w:r>
+    </w:p>
+    <w:p>
+      <w:pPr>
+        <w:pStyle w:val="Heading2"/>
+      </w:pPr>
+      <w:bookmarkStart w:name="_Toc38" w:id="38"/>
+      <w:r>
+        <w:t xml:space="preserve">Writing and Testing</w:t>
+      </w:r>
+      <w:bookmarkEnd w:id="38"/>
+    </w:p>
+    <w:p>
+      <w:pPr>
+        <w:spacing w:after="160"/>
+      </w:pPr>
+      <w:r>
+        <w:t xml:space="preserve">Keep predicates small and single-purpose. Document every query with complete metadata. Create expected-result tests that cover both vulnerable and safe cases. The checklist in examples/chapter15/README.md summarizes these practices.</w:t>
+      </w:r>
+    </w:p>
+    <w:p>
+      <w:pPr>
+        <w:pStyle w:val="Heading2"/>
+      </w:pPr>
+      <w:bookmarkStart w:name="_Toc39" w:id="39"/>
+      <w:r>
+        <w:t xml:space="preserve">Reducing False Positives</w:t>
+      </w:r>
+      <w:bookmarkEnd w:id="39"/>
+    </w:p>
+    <w:p>
+      <w:pPr>
+        <w:spacing w:after="160"/>
+      </w:pPr>
+      <w:r>
+        <w:t xml:space="preserve">Use precise barriers and flow state when needed. Model sanitizers explicitly. Prefer library models over ad-hoc joins.</w:t>
+      </w:r>
+    </w:p>
+    <w:p>
+      <w:pPr>
+        <w:pStyle w:val="Heading2"/>
+      </w:pPr>
+      <w:bookmarkStart w:name="_Toc40" w:id="40"/>
+      <w:r>
+        <w:t xml:space="preserve">Contributing and Staying Current</w:t>
+      </w:r>
+      <w:bookmarkEnd w:id="40"/>
+    </w:p>
+    <w:p>
+      <w:pPr>
+        <w:spacing w:after="160"/>
+      </w:pPr>
+      <w:r>
+        <w:t xml:space="preserve">High-quality queries and models can be contributed to the official CodeQL repository. Watch the changelog for extractor and library improvements. Keep the companion repository for this book updated as you add more examples.</w:t>
+      </w:r>
+    </w:p>
+    <w:p>
+      <w:pPr>
+        <w:spacing w:after="160"/>
+      </w:pPr>
+      <w:r>
+        <w:t xml:space="preserve">You now have the foundation to write, extend, package, and operationalize CodeQL queries. The examples in each chapter folder are ready to run and adapt.</w:t>
       </w:r>
     </w:p>
     <w:p>
@@ -2474,18 +3199,18 @@
         <w:pStyle w:val="Heading1"/>
         <w:pageBreakBefore/>
       </w:pPr>
-      <w:bookmarkStart w:name="_Toc27" w:id="27"/>
+      <w:bookmarkStart w:name="_Toc41" w:id="41"/>
       <w:r>
         <w:t xml:space="preserve">Appendix A: Quick Reference</w:t>
       </w:r>
-      <w:bookmarkEnd w:id="27"/>
-    </w:p>
-    <w:p>
-      <w:pPr>
-        <w:spacing w:after="160"/>
-      </w:pPr>
-      <w:r>
-        <w:t xml:space="preserve">CLI commands, path-query template, essential metadata fields, and links to every example file in the repository.</w:t>
+      <w:bookmarkEnd w:id="41"/>
+    </w:p>
+    <w:p>
+      <w:pPr>
+        <w:spacing w:after="160"/>
+      </w:pPr>
+      <w:r>
+        <w:t xml:space="preserve">CLI commands, path-query template, essential metadata fields, and links to every example file in the repository (organized by chapter).</w:t>
       </w:r>
     </w:p>
     <w:p>
@@ -2493,11 +3218,11 @@
         <w:pStyle w:val="Heading1"/>
         <w:pageBreakBefore/>
       </w:pPr>
-      <w:bookmarkStart w:name="_Toc28" w:id="28"/>
+      <w:bookmarkStart w:name="_Toc42" w:id="42"/>
       <w:r>
         <w:t xml:space="preserve">Appendix B: Glossary</w:t>
       </w:r>
-      <w:bookmarkEnd w:id="28"/>
+      <w:bookmarkEnd w:id="42"/>
     </w:p>
     <w:p>
       <w:pPr>
@@ -2512,11 +3237,11 @@
         <w:pStyle w:val="Heading1"/>
         <w:pageBreakBefore/>
       </w:pPr>
-      <w:bookmarkStart w:name="_Toc29" w:id="29"/>
+      <w:bookmarkStart w:name="_Toc43" w:id="43"/>
       <w:r>
         <w:t xml:space="preserve">Appendix C: Recommended Resources</w:t>
       </w:r>
-      <w:bookmarkEnd w:id="29"/>
+      <w:bookmarkEnd w:id="43"/>
     </w:p>
     <w:p>
       <w:pPr>

</xml_diff>

<commit_message>
Expand book with integrated foundations, deep core chapters, and exercises
</commit_message>
<xml_diff>
--- a/Book_Version/MustLearnCodeQL.docx
+++ b/Book_Version/MustLearnCodeQL.docx
@@ -15,15 +15,45 @@
         <w:pStyle w:val="Subtitle"/>
       </w:pPr>
       <w:r>
-        <w:t xml:space="preserve">Data Flow, Taint Tracking, and Library Extension — with Examples and Exercises</w:t>
-      </w:r>
-    </w:p>
-    <w:p>
-      <w:pPr>
-        <w:spacing w:before="200"/>
+        <w:t xml:space="preserve">A Practical Guide to Semantic Code Analysis with Examples and Exercises</w:t>
+      </w:r>
+    </w:p>
+    <w:p>
+      <w:pPr>
+        <w:spacing w:before="300"/>
         <w:jc w:val="center"/>
       </w:pPr>
-      <w:hyperlink w:history="1" r:id="rIdg77gi8ekeg3tk7m098zli">
+      <w:r>
+        <w:rPr>
+          <w:b/>
+          <w:bCs/>
+          <w:sz w:val="28"/>
+          <w:szCs w:val="28"/>
+        </w:rPr>
+        <w:t xml:space="preserve">Rod Trent</w:t>
+      </w:r>
+    </w:p>
+    <w:p>
+      <w:pPr>
+        <w:spacing w:before="80"/>
+        <w:jc w:val="center"/>
+      </w:pPr>
+      <w:r>
+        <w:rPr>
+          <w:i/>
+          <w:iCs/>
+          <w:sz w:val="22"/>
+          <w:szCs w:val="22"/>
+        </w:rPr>
+        <w:t xml:space="preserve">2026</w:t>
+      </w:r>
+    </w:p>
+    <w:p>
+      <w:pPr>
+        <w:spacing w:before="300"/>
+        <w:jc w:val="center"/>
+      </w:pPr>
+      <w:hyperlink w:history="1" r:id="rIdze9lf6jzvcttt48pl77wt">
         <w:r>
           <w:rPr>
             <w:rStyle w:val="Hyperlink"/>
@@ -38,19 +68,31 @@
         <w:pageBreakBefore/>
       </w:pPr>
       <w:r>
-        <w:t xml:space="preserve">How to Use the Examples and Exercises</w:t>
-      </w:r>
-    </w:p>
-    <w:p>
-      <w:pPr>
-        <w:spacing w:after="120"/>
-      </w:pPr>
-      <w:r>
-        <w:rPr>
-          <w:sz w:val="22"/>
-          <w:szCs w:val="22"/>
-        </w:rPr>
-        <w:t xml:space="preserve">This edition adds concrete exercises and additional starter queries for the core chapters. All files are in the companion repository. For each exercise: read the prompt, open the starter .ql file, complete the TODO, run it against a test database, and compare your result with the expected outcome described below.</w:t>
+        <w:t xml:space="preserve">How to Use This Book</w:t>
+      </w:r>
+    </w:p>
+    <w:p>
+      <w:pPr>
+        <w:spacing w:after="130"/>
+      </w:pPr>
+      <w:r>
+        <w:rPr>
+          <w:sz w:val="22"/>
+          <w:szCs w:val="22"/>
+        </w:rPr>
+        <w:t xml:space="preserve">This book teaches CodeQL from first principles through production use, with special depth on data-flow analysis, taint tracking, and library extension. Every major topic includes explanations, complete code examples, and hands-on exercises. All starter files and solutions guidance live in the companion repository under examples/chapterNN/.</w:t>
+      </w:r>
+    </w:p>
+    <w:p>
+      <w:pPr>
+        <w:spacing w:after="130"/>
+      </w:pPr>
+      <w:r>
+        <w:rPr>
+          <w:sz w:val="22"/>
+          <w:szCs w:val="22"/>
+        </w:rPr>
+        <w:t xml:space="preserve">Create a small database, open the referenced .ql files, complete the exercises, and compare your results with the expected outcomes. JavaScript is used for most examples; the patterns transfer directly to other languages.</w:t>
       </w:r>
     </w:p>
     <w:p>
@@ -59,79 +101,87 @@
         <w:pageBreakBefore/>
       </w:pPr>
       <w:r>
-        <w:t xml:space="preserve">Chapter 8: Data Flow Analysis — Examples and Exercises</w:t>
-      </w:r>
-    </w:p>
-    <w:p>
-      <w:pPr>
-        <w:pStyle w:val="Heading2"/>
-      </w:pPr>
-      <w:r>
-        <w:t xml:space="preserve">Core Example</w:t>
-      </w:r>
-    </w:p>
-    <w:p>
-      <w:pPr>
-        <w:spacing w:after="120"/>
-      </w:pPr>
-      <w:r>
-        <w:rPr>
-          <w:sz w:val="22"/>
-          <w:szCs w:val="22"/>
-        </w:rPr>
-        <w:t xml:space="preserve">The global-flow skeleton in examples/chapter08/global-flow-skeleton.ql is your starting point. Run it, then modify the source and sink predicates.</w:t>
-      </w:r>
-    </w:p>
-    <w:p>
-      <w:pPr>
-        <w:pStyle w:val="Heading2"/>
-      </w:pPr>
-      <w:r>
-        <w:t xml:space="preserve">Exercise 8.1: Local vs Global</w:t>
-      </w:r>
-    </w:p>
-    <w:p>
-      <w:pPr>
-        <w:spacing w:after="120"/>
-      </w:pPr>
-      <w:r>
-        <w:rPr>
-          <w:sz w:val="22"/>
-          <w:szCs w:val="22"/>
-        </w:rPr>
-        <w:t xml:space="preserve">Create a small function that assigns a remote value to a local variable and passes it to a sink inside the same function. Write both a local-flow query and a global-flow query. Confirm both report the issue. Then move the sink into a helper function and observe that only the global query still reports it.</w:t>
-      </w:r>
-    </w:p>
-    <w:p>
-      <w:pPr>
-        <w:pStyle w:val="Heading2"/>
-      </w:pPr>
-      <w:r>
-        <w:t xml:space="preserve">Exercise 8.2: Additional Flow Step</w:t>
-      </w:r>
-    </w:p>
-    <w:p>
-      <w:pPr>
-        <w:spacing w:after="120"/>
-      </w:pPr>
-      <w:r>
-        <w:rPr>
-          <w:sz w:val="22"/>
-          <w:szCs w:val="22"/>
-        </w:rPr>
-        <w:t xml:space="preserve">Add an isAdditionalFlowStep that models a function called transform(data) which returns its argument unchanged. Verify that flow now continues through calls to transform.</w:t>
-      </w:r>
-    </w:p>
-    <w:p>
-      <w:pPr>
-        <w:spacing w:after="120"/>
-      </w:pPr>
-      <w:r>
-        <w:rPr>
-          <w:sz w:val="22"/>
-          <w:szCs w:val="22"/>
-        </w:rPr>
-        <w:t xml:space="preserve">Expected outcome: paths that previously stopped at transform now continue to the sink.</w:t>
+        <w:t xml:space="preserve">Chapters 1–7: Foundations</w:t>
+      </w:r>
+    </w:p>
+    <w:p>
+      <w:pPr>
+        <w:pStyle w:val="Heading2"/>
+      </w:pPr>
+      <w:r>
+        <w:t xml:space="preserve">Why CodeQL</w:t>
+      </w:r>
+    </w:p>
+    <w:p>
+      <w:pPr>
+        <w:spacing w:after="130"/>
+      </w:pPr>
+      <w:r>
+        <w:rPr>
+          <w:sz w:val="22"/>
+          <w:szCs w:val="22"/>
+        </w:rPr>
+        <w:t xml:space="preserve">CodeQL turns source code into a queryable relational database containing the AST, control flow, and data-flow foundations. This enables precise variant analysis: encode a vulnerability pattern once and find every instance, then enforce it in CI. Traditional pattern matchers miss multi-function flows; CodeQL does not.</w:t>
+      </w:r>
+    </w:p>
+    <w:p>
+      <w:pPr>
+        <w:pStyle w:val="Heading2"/>
+      </w:pPr>
+      <w:r>
+        <w:t xml:space="preserve">Setup and Databases</w:t>
+      </w:r>
+    </w:p>
+    <w:p>
+      <w:pPr>
+        <w:spacing w:after="130"/>
+      </w:pPr>
+      <w:r>
+        <w:rPr>
+          <w:sz w:val="22"/>
+          <w:szCs w:val="22"/>
+        </w:rPr>
+        <w:t xml:space="preserve">Use the CLI (codeql database create ...), the VS Code extension, or Codespaces. Databases are language-specific snapshots. Interpreted languages extract directly; compiled languages require monitoring a build. Inspect with codeql database info. Examples and commands are in examples/chapter03/.</w:t>
+      </w:r>
+    </w:p>
+    <w:p>
+      <w:pPr>
+        <w:pStyle w:val="Heading2"/>
+      </w:pPr>
+      <w:r>
+        <w:t xml:space="preserve">QL Basics and Predicates</w:t>
+      </w:r>
+    </w:p>
+    <w:p>
+      <w:pPr>
+        <w:spacing w:after="130"/>
+      </w:pPr>
+      <w:r>
+        <w:rPr>
+          <w:sz w:val="22"/>
+          <w:szCs w:val="22"/>
+        </w:rPr>
+        <w:t xml:space="preserve">QL is declarative. Queries use from/where/select. Predicates are reusable named relations and may be recursive. Custom predicates improve clarity and performance. See examples/chapter05/eval-call.ql and examples/chapter06/interesting-calls.ql.</w:t>
+      </w:r>
+    </w:p>
+    <w:p>
+      <w:pPr>
+        <w:pStyle w:val="Heading2"/>
+      </w:pPr>
+      <w:r>
+        <w:t xml:space="preserve">Language Libraries</w:t>
+      </w:r>
+    </w:p>
+    <w:p>
+      <w:pPr>
+        <w:spacing w:after="130"/>
+      </w:pPr>
+      <w:r>
+        <w:rPr>
+          <w:sz w:val="22"/>
+          <w:szCs w:val="22"/>
+        </w:rPr>
+        <w:t xml:space="preserve">Standard libraries provide classes such as Function, CallExpr, and RemoteFlowSource. Start broad, inspect results, then refine. Navigation style is consistent across languages once you learn the class names.</w:t>
       </w:r>
     </w:p>
     <w:p>
@@ -140,111 +190,231 @@
         <w:pageBreakBefore/>
       </w:pPr>
       <w:r>
-        <w:t xml:space="preserve">Chapter 9: Taint Tracking and Path Queries — Examples and Exercises</w:t>
-      </w:r>
-    </w:p>
-    <w:p>
-      <w:pPr>
-        <w:pStyle w:val="Heading2"/>
-      </w:pPr>
-      <w:r>
-        <w:t xml:space="preserve">Complete XSS Example</w:t>
-      </w:r>
-    </w:p>
-    <w:p>
-      <w:pPr>
-        <w:spacing w:after="120"/>
-      </w:pPr>
-      <w:r>
-        <w:rPr>
-          <w:sz w:val="22"/>
-          <w:szCs w:val="22"/>
-        </w:rPr>
-        <w:t xml:space="preserve">examples/chapter09/xss-path.ql is a full working path query. Study its metadata, configuration, and select clause.</w:t>
-      </w:r>
-    </w:p>
-    <w:p>
-      <w:pPr>
-        <w:pStyle w:val="Heading2"/>
-      </w:pPr>
-      <w:r>
-        <w:t xml:space="preserve">Exercise 9.1: SQL Injection Starter</w:t>
-      </w:r>
-    </w:p>
-    <w:p>
-      <w:pPr>
-        <w:spacing w:after="120"/>
-      </w:pPr>
-      <w:r>
-        <w:rPr>
-          <w:sz w:val="22"/>
-          <w:szCs w:val="22"/>
-        </w:rPr>
-        <w:t xml:space="preserve">Open examples/chapter09/exercise-sql-injection.ql. The sink is a placeholder. Replace it with a more realistic condition (or keep it and create matching sample code). Run the query and confirm paths are reported only for unsanitized inputs.</w:t>
-      </w:r>
-    </w:p>
-    <w:p>
-      <w:pPr>
-        <w:spacing w:after="120"/>
-      </w:pPr>
-      <w:r>
-        <w:rPr>
-          <w:sz w:val="22"/>
-          <w:szCs w:val="22"/>
-        </w:rPr>
-        <w:t xml:space="preserve">Expected outcome: at least one path from a RemoteFlowSource to your sink; no path when a barrier is present.</w:t>
-      </w:r>
-    </w:p>
-    <w:p>
-      <w:pPr>
-        <w:pStyle w:val="Heading2"/>
-      </w:pPr>
-      <w:r>
-        <w:t xml:space="preserve">Exercise 9.2: Add a Barrier</w:t>
-      </w:r>
-    </w:p>
-    <w:p>
-      <w:pPr>
-        <w:spacing w:after="120"/>
-      </w:pPr>
-      <w:r>
-        <w:rPr>
-          <w:sz w:val="22"/>
-          <w:szCs w:val="22"/>
-        </w:rPr>
-        <w:t xml:space="preserve">Open examples/chapter09/exercise-add-barrier.ql. Implement the isBarrier predicate so that flow stops at calls to sanitize or escapeHtml. Re-run and verify false positives disappear while true positives remain.</w:t>
-      </w:r>
-    </w:p>
-    <w:p>
-      <w:pPr>
-        <w:spacing w:after="120"/>
-      </w:pPr>
-      <w:r>
-        <w:rPr>
-          <w:sz w:val="22"/>
-          <w:szCs w:val="22"/>
-        </w:rPr>
-        <w:t xml:space="preserve">Expected outcome: paths through the sanitizer are eliminated; paths that bypass it are still reported.</w:t>
-      </w:r>
-    </w:p>
-    <w:p>
-      <w:pPr>
-        <w:pStyle w:val="Heading2"/>
-      </w:pPr>
-      <w:r>
-        <w:t xml:space="preserve">Exercise 9.3: Partial Flow Debugging</w:t>
-      </w:r>
-    </w:p>
-    <w:p>
-      <w:pPr>
-        <w:spacing w:after="120"/>
-      </w:pPr>
-      <w:r>
-        <w:rPr>
-          <w:sz w:val="22"/>
-          <w:szCs w:val="22"/>
-        </w:rPr>
-        <w:t xml:space="preserve">Intentionally break a source predicate so no full path exists. Use partial-flow features (or temporary selects) to discover the last node reached. Restore the source and confirm the full path reappears.</w:t>
+        <w:t xml:space="preserve">Chapter 8: Data Flow Analysis</w:t>
+      </w:r>
+    </w:p>
+    <w:p>
+      <w:pPr>
+        <w:pStyle w:val="Heading2"/>
+      </w:pPr>
+      <w:r>
+        <w:t xml:space="preserve">Local and Global Flow</w:t>
+      </w:r>
+    </w:p>
+    <w:p>
+      <w:pPr>
+        <w:spacing w:after="130"/>
+      </w:pPr>
+      <w:r>
+        <w:rPr>
+          <w:sz w:val="22"/>
+          <w:szCs w:val="22"/>
+        </w:rPr>
+        <w:t xml:space="preserve">Local data flow stays inside one function and is fast. Global data flow crosses calls and is required for most security queries. Both use DataFlow nodes that abstract over syntax so queries survive refactoring.</w:t>
+      </w:r>
+    </w:p>
+    <w:p>
+      <w:pPr>
+        <w:pStyle w:val="Heading2"/>
+      </w:pPr>
+      <w:r>
+        <w:t xml:space="preserve">Configuration Example</w:t>
+      </w:r>
+    </w:p>
+    <w:p>
+      <w:pPr>
+        <w:spacing w:after="10" w:before="10"/>
+      </w:pPr>
+      <w:r>
+        <w:rPr>
+          <w:rFonts w:ascii="Consolas" w:cs="Consolas" w:eastAsia="Consolas" w:hAnsi="Consolas"/>
+          <w:sz w:val="18"/>
+          <w:szCs w:val="18"/>
+        </w:rPr>
+        <w:t xml:space="preserve">module MyConfig implements DataFlow::ConfigSig {</w:t>
+      </w:r>
+    </w:p>
+    <w:p>
+      <w:pPr>
+        <w:spacing w:after="10" w:before="10"/>
+      </w:pPr>
+      <w:r>
+        <w:rPr>
+          <w:rFonts w:ascii="Consolas" w:cs="Consolas" w:eastAsia="Consolas" w:hAnsi="Consolas"/>
+          <w:sz w:val="18"/>
+          <w:szCs w:val="18"/>
+        </w:rPr>
+        <w:t xml:space="preserve">  predicate isSource(DataFlow::Node n) { n instanceof RemoteFlowSource }</w:t>
+      </w:r>
+    </w:p>
+    <w:p>
+      <w:pPr>
+        <w:spacing w:after="10" w:before="10"/>
+      </w:pPr>
+      <w:r>
+        <w:rPr>
+          <w:rFonts w:ascii="Consolas" w:cs="Consolas" w:eastAsia="Consolas" w:hAnsi="Consolas"/>
+          <w:sz w:val="18"/>
+          <w:szCs w:val="18"/>
+        </w:rPr>
+        <w:t xml:space="preserve">  predicate isSink(DataFlow::Node n) { n instanceof DomBasedXssSink }</w:t>
+      </w:r>
+    </w:p>
+    <w:p>
+      <w:pPr>
+        <w:spacing w:after="10" w:before="10"/>
+      </w:pPr>
+      <w:r>
+        <w:rPr>
+          <w:rFonts w:ascii="Consolas" w:cs="Consolas" w:eastAsia="Consolas" w:hAnsi="Consolas"/>
+          <w:sz w:val="18"/>
+          <w:szCs w:val="18"/>
+        </w:rPr>
+        <w:t xml:space="preserve">}</w:t>
+      </w:r>
+    </w:p>
+    <w:p>
+      <w:pPr>
+        <w:spacing w:after="10" w:before="10"/>
+      </w:pPr>
+      <w:r>
+        <w:rPr>
+          <w:rFonts w:ascii="Consolas" w:cs="Consolas" w:eastAsia="Consolas" w:hAnsi="Consolas"/>
+          <w:sz w:val="18"/>
+          <w:szCs w:val="18"/>
+        </w:rPr>
+        <w:t xml:space="preserve">module MyFlow = DataFlow::Global&lt;MyConfig&gt;;</w:t>
+      </w:r>
+    </w:p>
+    <w:p>
+      <w:pPr>
+        <w:spacing w:after="10" w:before="10"/>
+      </w:pPr>
+      <w:r>
+        <w:rPr>
+          <w:rFonts w:ascii="Consolas" w:cs="Consolas" w:eastAsia="Consolas" w:hAnsi="Consolas"/>
+          <w:sz w:val="18"/>
+          <w:szCs w:val="18"/>
+        </w:rPr>
+        <w:t xml:space="preserve">from MyFlow::PathNode source, MyFlow::PathNode sink</w:t>
+      </w:r>
+    </w:p>
+    <w:p>
+      <w:pPr>
+        <w:spacing w:after="10" w:before="10"/>
+      </w:pPr>
+      <w:r>
+        <w:rPr>
+          <w:rFonts w:ascii="Consolas" w:cs="Consolas" w:eastAsia="Consolas" w:hAnsi="Consolas"/>
+          <w:sz w:val="18"/>
+          <w:szCs w:val="18"/>
+        </w:rPr>
+        <w:t xml:space="preserve">where MyFlow::flowPath(source, sink)</w:t>
+      </w:r>
+    </w:p>
+    <w:p>
+      <w:pPr>
+        <w:spacing w:after="10" w:before="10"/>
+      </w:pPr>
+      <w:r>
+        <w:rPr>
+          <w:rFonts w:ascii="Consolas" w:cs="Consolas" w:eastAsia="Consolas" w:hAnsi="Consolas"/>
+          <w:sz w:val="18"/>
+          <w:szCs w:val="18"/>
+        </w:rPr>
+        <w:t xml:space="preserve">select sink.getNode(), source, sink, "Flow detected."</w:t>
+      </w:r>
+    </w:p>
+    <w:p>
+      <w:pPr>
+        <w:spacing w:after="130"/>
+      </w:pPr>
+      <w:r>
+        <w:rPr>
+          <w:sz w:val="22"/>
+          <w:szCs w:val="22"/>
+        </w:rPr>
+        <w:t xml:space="preserve">Full skeleton: examples/chapter08/global-flow-skeleton.ql. Prefer TaintTracking::Global for security work.</w:t>
+      </w:r>
+    </w:p>
+    <w:p>
+      <w:pPr>
+        <w:pStyle w:val="Heading2"/>
+      </w:pPr>
+      <w:r>
+        <w:t xml:space="preserve">Additional Steps and Barriers</w:t>
+      </w:r>
+    </w:p>
+    <w:p>
+      <w:pPr>
+        <w:spacing w:after="130"/>
+      </w:pPr>
+      <w:r>
+        <w:rPr>
+          <w:sz w:val="22"/>
+          <w:szCs w:val="22"/>
+        </w:rPr>
+        <w:t xml:space="preserve">Implement isAdditionalFlowStep to model library transformations. Implement isBarrier to stop flow at sanitizers. Add one change at a time and re-test.</w:t>
+      </w:r>
+    </w:p>
+    <w:p>
+      <w:pPr>
+        <w:pStyle w:val="Heading2"/>
+      </w:pPr>
+      <w:r>
+        <w:t xml:space="preserve">Exercise 8.1 – Local versus Global</w:t>
+      </w:r>
+    </w:p>
+    <w:p>
+      <w:pPr>
+        <w:spacing w:after="130"/>
+      </w:pPr>
+      <w:r>
+        <w:rPr>
+          <w:sz w:val="22"/>
+          <w:szCs w:val="22"/>
+        </w:rPr>
+        <w:t xml:space="preserve">Write a function that passes remote input to a sink in the same function. Confirm both local and global queries report it. Move the sink to a helper. Only the global query should still report the issue.</w:t>
+      </w:r>
+    </w:p>
+    <w:p>
+      <w:pPr>
+        <w:pStyle w:val="Heading2"/>
+      </w:pPr>
+      <w:r>
+        <w:t xml:space="preserve">Exercise 8.2 – Additional Flow Step</w:t>
+      </w:r>
+    </w:p>
+    <w:p>
+      <w:pPr>
+        <w:spacing w:after="130"/>
+      </w:pPr>
+      <w:r>
+        <w:rPr>
+          <w:sz w:val="22"/>
+          <w:szCs w:val="22"/>
+        </w:rPr>
+        <w:t xml:space="preserve">Model a pass-through function transform(data). Verify paths that previously stopped now continue. Expected: new paths appear only after the step is added.</w:t>
+      </w:r>
+    </w:p>
+    <w:p>
+      <w:pPr>
+        <w:pStyle w:val="Heading2"/>
+      </w:pPr>
+      <w:r>
+        <w:t xml:space="preserve">Debugging and Performance</w:t>
+      </w:r>
+    </w:p>
+    <w:p>
+      <w:pPr>
+        <w:spacing w:after="130"/>
+      </w:pPr>
+      <w:r>
+        <w:rPr>
+          <w:sz w:val="22"/>
+          <w:szCs w:val="22"/>
+        </w:rPr>
+        <w:t xml:space="preserve">When paths are missing, select sources and sinks independently, then use partial flow. Keep configurations precise. Local flow is always cheaper when it suffices.</w:t>
       </w:r>
     </w:p>
     <w:p>
@@ -253,99 +423,127 @@
         <w:pageBreakBefore/>
       </w:pPr>
       <w:r>
-        <w:t xml:space="preserve">Chapter 10: Library Extension — Examples and Exercises</w:t>
-      </w:r>
-    </w:p>
-    <w:p>
-      <w:pPr>
-        <w:pStyle w:val="Heading2"/>
-      </w:pPr>
-      <w:r>
-        <w:t xml:space="preserve">Custom Source Example</w:t>
-      </w:r>
-    </w:p>
-    <w:p>
-      <w:pPr>
-        <w:spacing w:after="120"/>
-      </w:pPr>
-      <w:r>
-        <w:rPr>
-          <w:sz w:val="22"/>
-          <w:szCs w:val="22"/>
-        </w:rPr>
-        <w:t xml:space="preserve">examples/chapter10/custom-source.ql shows subclassing RemoteFlowSource. Run a standard XSS or SQL query before and after adding this class and observe the new results.</w:t>
-      </w:r>
-    </w:p>
-    <w:p>
-      <w:pPr>
-        <w:pStyle w:val="Heading2"/>
-      </w:pPr>
-      <w:r>
-        <w:t xml:space="preserve">Exercise 10.1: Second Custom Source</w:t>
-      </w:r>
-    </w:p>
-    <w:p>
-      <w:pPr>
-        <w:spacing w:after="120"/>
-      </w:pPr>
-      <w:r>
-        <w:rPr>
-          <w:sz w:val="22"/>
-          <w:szCs w:val="22"/>
-        </w:rPr>
-        <w:t xml:space="preserve">Extend the custom source example with a second origin, for example calls to readUntrustedFile(). Confirm both origins are treated as sources by an existing taint-tracking query.</w:t>
-      </w:r>
-    </w:p>
-    <w:p>
-      <w:pPr>
-        <w:pStyle w:val="Heading2"/>
-      </w:pPr>
-      <w:r>
-        <w:t xml:space="preserve">Exercise 10.2: Custom Sink</w:t>
-      </w:r>
-    </w:p>
-    <w:p>
-      <w:pPr>
-        <w:spacing w:after="120"/>
-      </w:pPr>
-      <w:r>
-        <w:rPr>
-          <w:sz w:val="22"/>
-          <w:szCs w:val="22"/>
-        </w:rPr>
-        <w:t xml:space="preserve">Open examples/chapter10/exercise-custom-sink.ql. Turn the candidate into a proper modeled sink (subclass or predicate) and reference it from a taint-tracking configuration. Verify that previously invisible flows to dangerousExecute are now reported.</w:t>
-      </w:r>
-    </w:p>
-    <w:p>
-      <w:pPr>
-        <w:spacing w:after="120"/>
-      </w:pPr>
-      <w:r>
-        <w:rPr>
-          <w:sz w:val="22"/>
-          <w:szCs w:val="22"/>
-        </w:rPr>
-        <w:t xml:space="preserve">Expected outcome: the query reports paths that end at your new sink and ignores unrelated calls.</w:t>
-      </w:r>
-    </w:p>
-    <w:p>
-      <w:pPr>
-        <w:pStyle w:val="Heading2"/>
-      </w:pPr>
-      <w:r>
-        <w:t xml:space="preserve">Exercise 10.3: Model Pack Sketch</w:t>
-      </w:r>
-    </w:p>
-    <w:p>
-      <w:pPr>
-        <w:spacing w:after="120"/>
-      </w:pPr>
-      <w:r>
-        <w:rPr>
-          <w:sz w:val="22"/>
-          <w:szCs w:val="22"/>
-        </w:rPr>
-        <w:t xml:space="preserve">Create a minimal qlpack.yml that could serve as a model pack containing your custom source and sink. Document the dependency an application query pack would need. (Full publishing steps are in the packs chapter.)</w:t>
+        <w:t xml:space="preserve">Chapter 9: Taint Tracking and Path Queries</w:t>
+      </w:r>
+    </w:p>
+    <w:p>
+      <w:pPr>
+        <w:pStyle w:val="Heading2"/>
+      </w:pPr>
+      <w:r>
+        <w:t xml:space="preserve">Taint versus Pure Data Flow</w:t>
+      </w:r>
+    </w:p>
+    <w:p>
+      <w:pPr>
+        <w:spacing w:after="130"/>
+      </w:pPr>
+      <w:r>
+        <w:rPr>
+          <w:sz w:val="22"/>
+          <w:szCs w:val="22"/>
+        </w:rPr>
+        <w:t xml:space="preserve">Taint tracking propagates through derived values. It matches the security model that anything computed from untrusted input remains untrusted until sanitized. Path queries (@kind path-problem) display the full path.</w:t>
+      </w:r>
+    </w:p>
+    <w:p>
+      <w:pPr>
+        <w:pStyle w:val="Heading2"/>
+      </w:pPr>
+      <w:r>
+        <w:t xml:space="preserve">Complete XSS Path Query</w:t>
+      </w:r>
+    </w:p>
+    <w:p>
+      <w:pPr>
+        <w:spacing w:after="130"/>
+      </w:pPr>
+      <w:r>
+        <w:rPr>
+          <w:sz w:val="22"/>
+          <w:szCs w:val="22"/>
+        </w:rPr>
+        <w:t xml:space="preserve">Study examples/chapter09/xss-path.ql for metadata, configuration, PathGraph import, and the required select form.</w:t>
+      </w:r>
+    </w:p>
+    <w:p>
+      <w:pPr>
+        <w:pStyle w:val="Heading2"/>
+      </w:pPr>
+      <w:r>
+        <w:t xml:space="preserve">Exercise 9.1 – SQL Injection</w:t>
+      </w:r>
+    </w:p>
+    <w:p>
+      <w:pPr>
+        <w:spacing w:after="130"/>
+      </w:pPr>
+      <w:r>
+        <w:rPr>
+          <w:sz w:val="22"/>
+          <w:szCs w:val="22"/>
+        </w:rPr>
+        <w:t xml:space="preserve">Open examples/chapter09/exercise-sql-injection.ql. Refine the sink predicate. Create sample code with and without sanitization. Expected: paths reported only for unsanitized flows.</w:t>
+      </w:r>
+    </w:p>
+    <w:p>
+      <w:pPr>
+        <w:pStyle w:val="Heading2"/>
+      </w:pPr>
+      <w:r>
+        <w:t xml:space="preserve">Exercise 9.2 – Add a Barrier</w:t>
+      </w:r>
+    </w:p>
+    <w:p>
+      <w:pPr>
+        <w:spacing w:after="130"/>
+      </w:pPr>
+      <w:r>
+        <w:rPr>
+          <w:sz w:val="22"/>
+          <w:szCs w:val="22"/>
+        </w:rPr>
+        <w:t xml:space="preserve">Open examples/chapter09/exercise-add-barrier.ql. Implement isBarrier for sanitize or escapeHtml. Expected: paths through the sanitizer disappear; bypassing paths remain.</w:t>
+      </w:r>
+    </w:p>
+    <w:p>
+      <w:pPr>
+        <w:pStyle w:val="Heading2"/>
+      </w:pPr>
+      <w:r>
+        <w:t xml:space="preserve">Exercise 9.3 – Partial-Flow Debugging</w:t>
+      </w:r>
+    </w:p>
+    <w:p>
+      <w:pPr>
+        <w:spacing w:after="130"/>
+      </w:pPr>
+      <w:r>
+        <w:rPr>
+          <w:sz w:val="22"/>
+          <w:szCs w:val="22"/>
+        </w:rPr>
+        <w:t xml:space="preserve">Break the source predicate so no complete path exists. Use partial flow or intermediate selects to find the last reached node. Restore the source and confirm the path returns.</w:t>
+      </w:r>
+    </w:p>
+    <w:p>
+      <w:pPr>
+        <w:pStyle w:val="Heading2"/>
+      </w:pPr>
+      <w:r>
+        <w:t xml:space="preserve">Flow State and Pitfalls</w:t>
+      </w:r>
+    </w:p>
+    <w:p>
+      <w:pPr>
+        <w:spacing w:after="130"/>
+      </w:pPr>
+      <w:r>
+        <w:rPr>
+          <w:sz w:val="22"/>
+          <w:szCs w:val="22"/>
+        </w:rPr>
+        <w:t xml:space="preserve">Flow state tracks extra properties (e.g., “has been encoded”). Common pitfalls: overly broad sources, missing wrapper models, barriers that are too strong, and incomplete databases. Always maintain positive and negative tests.</w:t>
       </w:r>
     </w:p>
     <w:p>
@@ -354,67 +552,127 @@
         <w:pageBreakBefore/>
       </w:pPr>
       <w:r>
-        <w:t xml:space="preserve">Additional Practice Exercises</w:t>
-      </w:r>
-    </w:p>
-    <w:p>
-      <w:pPr>
-        <w:pStyle w:val="Heading2"/>
-      </w:pPr>
-      <w:r>
-        <w:t xml:space="preserve">Exercise A: Precision Tuning</w:t>
-      </w:r>
-    </w:p>
-    <w:p>
-      <w:pPr>
-        <w:spacing w:after="120"/>
-      </w:pPr>
-      <w:r>
-        <w:rPr>
-          <w:sz w:val="22"/>
-          <w:szCs w:val="22"/>
-        </w:rPr>
-        <w:t xml:space="preserve">Take the XSS path query. Add a barrier for one encoder. Measure (by inspection) how many alerts disappear. Remove the barrier and add an additional flow step for a wrapper function. Observe the opposite effect.</w:t>
-      </w:r>
-    </w:p>
-    <w:p>
-      <w:pPr>
-        <w:pStyle w:val="Heading2"/>
-      </w:pPr>
-      <w:r>
-        <w:t xml:space="preserve">Exercise B: Metadata and Help</w:t>
-      </w:r>
-    </w:p>
-    <w:p>
-      <w:pPr>
-        <w:spacing w:after="120"/>
-      </w:pPr>
-      <w:r>
-        <w:rPr>
-          <w:sz w:val="22"/>
-          <w:szCs w:val="22"/>
-        </w:rPr>
-        <w:t xml:space="preserve">Add complete metadata (@precision, @problem.severity, @tags) to one of your exercise queries. Generate or hand-write a short query-help markdown file explaining the issue and the remediation.</w:t>
-      </w:r>
-    </w:p>
-    <w:p>
-      <w:pPr>
-        <w:pStyle w:val="Heading2"/>
-      </w:pPr>
-      <w:r>
-        <w:t xml:space="preserve">Exercise C: Positive and Negative Tests</w:t>
-      </w:r>
-    </w:p>
-    <w:p>
-      <w:pPr>
-        <w:spacing w:after="120"/>
-      </w:pPr>
-      <w:r>
-        <w:rPr>
-          <w:sz w:val="22"/>
-          <w:szCs w:val="22"/>
-        </w:rPr>
-        <w:t xml:space="preserve">For any query you completed above, create two tiny source files: one that must alert and one that must not. Run the query against a database built from those files and record the expected results. This is the beginning of a proper test suite.</w:t>
+        <w:t xml:space="preserve">Chapter 10: CodeQL Library Extension</w:t>
+      </w:r>
+    </w:p>
+    <w:p>
+      <w:pPr>
+        <w:pStyle w:val="Heading2"/>
+      </w:pPr>
+      <w:r>
+        <w:t xml:space="preserve">Custom Sources</w:t>
+      </w:r>
+    </w:p>
+    <w:p>
+      <w:pPr>
+        <w:spacing w:after="130"/>
+      </w:pPr>
+      <w:r>
+        <w:rPr>
+          <w:sz w:val="22"/>
+          <w:szCs w:val="22"/>
+        </w:rPr>
+        <w:t xml:space="preserve">Subclass RemoteFlowSource (example: examples/chapter10/custom-source.ql). Existing queries automatically pick up the new source.</w:t>
+      </w:r>
+    </w:p>
+    <w:p>
+      <w:pPr>
+        <w:pStyle w:val="Heading2"/>
+      </w:pPr>
+      <w:r>
+        <w:t xml:space="preserve">Exercise 10.1 – Second Source</w:t>
+      </w:r>
+    </w:p>
+    <w:p>
+      <w:pPr>
+        <w:spacing w:after="130"/>
+      </w:pPr>
+      <w:r>
+        <w:rPr>
+          <w:sz w:val="22"/>
+          <w:szCs w:val="22"/>
+        </w:rPr>
+        <w:t xml:space="preserve">Add another origin such as readUntrustedFile(). Confirm a standard taint query now reports both.</w:t>
+      </w:r>
+    </w:p>
+    <w:p>
+      <w:pPr>
+        <w:pStyle w:val="Heading2"/>
+      </w:pPr>
+      <w:r>
+        <w:t xml:space="preserve">Custom Sinks and Summaries</w:t>
+      </w:r>
+    </w:p>
+    <w:p>
+      <w:pPr>
+        <w:spacing w:after="130"/>
+      </w:pPr>
+      <w:r>
+        <w:rPr>
+          <w:sz w:val="22"/>
+          <w:szCs w:val="22"/>
+        </w:rPr>
+        <w:t xml:space="preserve">Model internal APIs as sinks so standard queries understand them. Flow summaries describe simple argument-to-result relationships and are preferred when applicable.</w:t>
+      </w:r>
+    </w:p>
+    <w:p>
+      <w:pPr>
+        <w:pStyle w:val="Heading2"/>
+      </w:pPr>
+      <w:r>
+        <w:t xml:space="preserve">Exercise 10.2 – Custom Sink</w:t>
+      </w:r>
+    </w:p>
+    <w:p>
+      <w:pPr>
+        <w:spacing w:after="130"/>
+      </w:pPr>
+      <w:r>
+        <w:rPr>
+          <w:sz w:val="22"/>
+          <w:szCs w:val="22"/>
+        </w:rPr>
+        <w:t xml:space="preserve">Complete examples/chapter10/exercise-custom-sink.ql. Turn dangerousExecute into a modeled sink and reference it from a configuration. Expected: previously invisible flows are now reported; unrelated calls are ignored.</w:t>
+      </w:r>
+    </w:p>
+    <w:p>
+      <w:pPr>
+        <w:pStyle w:val="Heading2"/>
+      </w:pPr>
+      <w:r>
+        <w:t xml:space="preserve">Model Packs and Testing</w:t>
+      </w:r>
+    </w:p>
+    <w:p>
+      <w:pPr>
+        <w:spacing w:after="130"/>
+      </w:pPr>
+      <w:r>
+        <w:rPr>
+          <w:sz w:val="22"/>
+          <w:szCs w:val="22"/>
+        </w:rPr>
+        <w:t xml:space="preserve">Package extensions as model packs. Test with true-positive and true-negative cases. An incorrect model affects every dependent query, so tests are mandatory. Exercise 10.3: sketch a qlpack.yml for your models.</w:t>
+      </w:r>
+    </w:p>
+    <w:p>
+      <w:pPr>
+        <w:pStyle w:val="Heading2"/>
+      </w:pPr>
+      <w:r>
+        <w:t xml:space="preserve">Language Notes</w:t>
+      </w:r>
+    </w:p>
+    <w:p>
+      <w:pPr>
+        <w:spacing w:after="130"/>
+      </w:pPr>
+      <w:r>
+        <w:rPr>
+          <w:sz w:val="22"/>
+          <w:szCs w:val="22"/>
+        </w:rPr>
+        <w:t xml:space="preserve">JavaScript/Python often use API graphs; Java/C# subclass existing classes; C/C++ uses summaries. Copy a similar standard-library model and adapt it.</w:t>
       </w:r>
     </w:p>
     <w:p>
@@ -423,103 +681,172 @@
         <w:pageBreakBefore/>
       </w:pPr>
       <w:r>
-        <w:t xml:space="preserve">Quick Reference for the New Examples</w:t>
-      </w:r>
-    </w:p>
-    <w:p>
-      <w:pPr>
-        <w:spacing w:after="120"/>
-      </w:pPr>
-      <w:r>
-        <w:rPr>
-          <w:sz w:val="22"/>
-          <w:szCs w:val="22"/>
-        </w:rPr>
-        <w:t xml:space="preserve">examples/chapter08/global-flow-skeleton.ql — starting configuration</w:t>
-      </w:r>
-    </w:p>
-    <w:p>
-      <w:pPr>
-        <w:spacing w:after="120"/>
-      </w:pPr>
-      <w:r>
-        <w:rPr>
-          <w:sz w:val="22"/>
-          <w:szCs w:val="22"/>
-        </w:rPr>
-        <w:t xml:space="preserve">examples/chapter09/xss-path.ql — complete path query</w:t>
-      </w:r>
-    </w:p>
-    <w:p>
-      <w:pPr>
-        <w:spacing w:after="120"/>
-      </w:pPr>
-      <w:r>
-        <w:rPr>
-          <w:sz w:val="22"/>
-          <w:szCs w:val="22"/>
-        </w:rPr>
-        <w:t xml:space="preserve">examples/chapter09/exercise-sql-injection.ql — SQL exercise</w:t>
-      </w:r>
-    </w:p>
-    <w:p>
-      <w:pPr>
-        <w:spacing w:after="120"/>
-      </w:pPr>
-      <w:r>
-        <w:rPr>
-          <w:sz w:val="22"/>
-          <w:szCs w:val="22"/>
-        </w:rPr>
-        <w:t xml:space="preserve">examples/chapter09/exercise-add-barrier.ql — barrier exercise</w:t>
-      </w:r>
-    </w:p>
-    <w:p>
-      <w:pPr>
-        <w:spacing w:after="120"/>
-      </w:pPr>
-      <w:r>
-        <w:rPr>
-          <w:sz w:val="22"/>
-          <w:szCs w:val="22"/>
-        </w:rPr>
-        <w:t xml:space="preserve">examples/chapter10/custom-source.ql — custom source</w:t>
-      </w:r>
-    </w:p>
-    <w:p>
-      <w:pPr>
-        <w:spacing w:after="120"/>
-      </w:pPr>
-      <w:r>
-        <w:rPr>
-          <w:sz w:val="22"/>
-          <w:szCs w:val="22"/>
-        </w:rPr>
-        <w:t xml:space="preserve">examples/chapter10/exercise-custom-sink.ql — custom sink exercise</w:t>
-      </w:r>
-    </w:p>
-    <w:p>
-      <w:pPr>
-        <w:spacing w:after="120"/>
-      </w:pPr>
-      <w:r>
-        <w:rPr>
-          <w:sz w:val="22"/>
-          <w:szCs w:val="22"/>
-        </w:rPr>
-        <w:t xml:space="preserve">Each EXERCISES.md file in those folders repeats the prompts for offline use.</w:t>
-      </w:r>
-    </w:p>
-    <w:p>
-      <w:pPr>
-        <w:spacing w:before="300"/>
+        <w:t xml:space="preserve">Chapter 11: Packs, Suites, Metadata, and Production</w:t>
+      </w:r>
+    </w:p>
+    <w:p>
+      <w:pPr>
+        <w:spacing w:after="130"/>
+      </w:pPr>
+      <w:r>
+        <w:rPr>
+          <w:sz w:val="22"/>
+          <w:szCs w:val="22"/>
+        </w:rPr>
+        <w:t xml:space="preserve">qlpack.yml defines packs and dependencies. .qls files select queries. Complete metadata and expected-result tests are required. Examples in examples/chapter11/.</w:t>
+      </w:r>
+    </w:p>
+    <w:p>
+      <w:pPr>
+        <w:pStyle w:val="Heading1"/>
+        <w:pageBreakBefore/>
+      </w:pPr>
+      <w:r>
+        <w:t xml:space="preserve">Chapter 12: CI Integration</w:t>
+      </w:r>
+    </w:p>
+    <w:p>
+      <w:pPr>
+        <w:spacing w:after="130"/>
+      </w:pPr>
+      <w:r>
+        <w:rPr>
+          <w:sz w:val="22"/>
+          <w:szCs w:val="22"/>
+        </w:rPr>
+        <w:t xml:space="preserve">Use the CodeQL GitHub Action (examples/chapter12/codeql-analysis.yml) or the CLI bundle in other systems. Upload SARIF. MRVA supports large-scale variant analysis.</w:t>
+      </w:r>
+    </w:p>
+    <w:p>
+      <w:pPr>
+        <w:pStyle w:val="Heading1"/>
+        <w:pageBreakBefore/>
+      </w:pPr>
+      <w:r>
+        <w:t xml:space="preserve">Chapter 13: Performance and Advanced Debugging</w:t>
+      </w:r>
+    </w:p>
+    <w:p>
+      <w:pPr>
+        <w:spacing w:after="130"/>
+      </w:pPr>
+      <w:r>
+        <w:rPr>
+          <w:sz w:val="22"/>
+          <w:szCs w:val="22"/>
+        </w:rPr>
+        <w:t xml:space="preserve">Small predicates, library helpers, and partial-flow debugging solve most issues. See examples/chapter13/performance-predicate.ql.</w:t>
+      </w:r>
+    </w:p>
+    <w:p>
+      <w:pPr>
+        <w:pStyle w:val="Heading1"/>
+        <w:pageBreakBefore/>
+      </w:pPr>
+      <w:r>
+        <w:t xml:space="preserve">Chapter 14: Case Studies</w:t>
+      </w:r>
+    </w:p>
+    <w:p>
+      <w:pPr>
+        <w:spacing w:after="130"/>
+      </w:pPr>
+      <w:r>
+        <w:rPr>
+          <w:sz w:val="22"/>
+          <w:szCs w:val="22"/>
+        </w:rPr>
+        <w:t xml:space="preserve">Study Security Lab Zero-to-Hero write-ups. examples/chapter14/sql-injection-example.ql shows the skeleton. Combine with your extensions for real coverage.</w:t>
+      </w:r>
+    </w:p>
+    <w:p>
+      <w:pPr>
+        <w:pStyle w:val="Heading1"/>
+        <w:pageBreakBefore/>
+      </w:pPr>
+      <w:r>
+        <w:t xml:space="preserve">Chapter 15: Best Practices and Next Steps</w:t>
+      </w:r>
+    </w:p>
+    <w:p>
+      <w:pPr>
+        <w:spacing w:after="130"/>
+      </w:pPr>
+      <w:r>
+        <w:rPr>
+          <w:sz w:val="22"/>
+          <w:szCs w:val="22"/>
+        </w:rPr>
+        <w:t xml:space="preserve">Small tested predicates, library extension over duplication, precise barriers, and upstream contribution are the habits that scale. You now have the tools and exercises to build production queries.</w:t>
+      </w:r>
+    </w:p>
+    <w:p>
+      <w:pPr>
+        <w:pStyle w:val="Heading1"/>
+        <w:pageBreakBefore/>
+      </w:pPr>
+      <w:r>
+        <w:t xml:space="preserve">Appendix: Exercise Index</w:t>
+      </w:r>
+    </w:p>
+    <w:p>
+      <w:pPr>
+        <w:spacing w:after="130"/>
+      </w:pPr>
+      <w:r>
+        <w:rPr>
+          <w:sz w:val="22"/>
+          <w:szCs w:val="22"/>
+        </w:rPr>
+        <w:t xml:space="preserve">Chapter 8: local vs global; additional flow step.</w:t>
+      </w:r>
+    </w:p>
+    <w:p>
+      <w:pPr>
+        <w:spacing w:after="130"/>
+      </w:pPr>
+      <w:r>
+        <w:rPr>
+          <w:sz w:val="22"/>
+          <w:szCs w:val="22"/>
+        </w:rPr>
+        <w:t xml:space="preserve">Chapter 9: SQL injection starter; add barrier; partial-flow debugging.</w:t>
+      </w:r>
+    </w:p>
+    <w:p>
+      <w:pPr>
+        <w:spacing w:after="130"/>
+      </w:pPr>
+      <w:r>
+        <w:rPr>
+          <w:sz w:val="22"/>
+          <w:szCs w:val="22"/>
+        </w:rPr>
+        <w:t xml:space="preserve">Chapter 10: second source; custom sink; model-pack sketch.</w:t>
+      </w:r>
+    </w:p>
+    <w:p>
+      <w:pPr>
+        <w:spacing w:after="130"/>
+      </w:pPr>
+      <w:r>
+        <w:rPr>
+          <w:sz w:val="22"/>
+          <w:szCs w:val="22"/>
+        </w:rPr>
+        <w:t xml:space="preserve">All starter files and EXERCISES.md prompts are in the repository.</w:t>
+      </w:r>
+    </w:p>
+    <w:p>
+      <w:pPr>
+        <w:spacing w:before="400"/>
       </w:pPr>
       <w:r>
         <w:rPr>
           <w:i/>
           <w:iCs/>
         </w:rPr>
-        <w:t xml:space="preserve">End of expanded examples and exercises edition</w:t>
+        <w:t xml:space="preserve">End of Must Learn CodeQL</w:t>
       </w:r>
     </w:p>
     <w:sectPr>
@@ -578,13 +905,29 @@
       <w:jc w:val="center"/>
     </w:pPr>
     <w:r>
+      <w:rPr>
+        <w:sz w:val="18"/>
+        <w:szCs w:val="18"/>
+      </w:rPr>
       <w:t xml:space="preserve">Page </w:t>
     </w:r>
     <w:r>
+      <w:rPr>
+        <w:sz w:val="18"/>
+        <w:szCs w:val="18"/>
+      </w:rPr>
       <w:fldChar w:fldCharType="begin"/>
       <w:instrText xml:space="preserve">PAGE</w:instrText>
       <w:fldChar w:fldCharType="separate"/>
       <w:fldChar w:fldCharType="end"/>
+    </w:r>
+    <w:r>
+      <w:rPr>
+        <w:color w:val="666666"/>
+        <w:sz w:val="18"/>
+        <w:szCs w:val="18"/>
+      </w:rPr>
+      <w:t xml:space="preserve"> | github.com/rod-trent/MustLearnCodeQL</w:t>
     </w:r>
   </w:p>
 </w:ftr>
@@ -637,10 +980,11 @@
       <w:rPr>
         <w:i/>
         <w:iCs/>
-        <w:sz w:val="16"/>
-        <w:szCs w:val="16"/>
+        <w:color w:val="666666"/>
+        <w:sz w:val="18"/>
+        <w:szCs w:val="18"/>
       </w:rPr>
-      <w:t xml:space="preserve">Must Learn CodeQL — Examples &amp; Exercises</w:t>
+      <w:t xml:space="preserve">Must Learn CodeQL</w:t>
     </w:r>
   </w:p>
 </w:hdr>
@@ -917,7 +1261,7 @@
     <w:next w:val="Normal"/>
     <w:qFormat/>
     <w:pPr>
-      <w:spacing w:after="180" w:before="360"/>
+      <w:spacing w:after="160" w:before="360"/>
       <w:outlineLvl w:val="0"/>
     </w:pPr>
     <w:rPr>
@@ -935,7 +1279,7 @@
     <w:next w:val="Normal"/>
     <w:qFormat/>
     <w:pPr>
-      <w:spacing w:after="120" w:before="240"/>
+      <w:spacing w:after="100" w:before="240"/>
       <w:outlineLvl w:val="1"/>
     </w:pPr>
     <w:rPr>
@@ -959,15 +1303,15 @@
       <w:b/>
       <w:bCs/>
       <w:color w:val="1F4E79"/>
-      <w:sz w:val="44"/>
-      <w:szCs w:val="44"/>
+      <w:sz w:val="48"/>
+      <w:szCs w:val="48"/>
     </w:rPr>
   </w:style>
   <w:style w:type="paragraph" w:styleId="Subtitle">
     <w:name w:val="Subtitle"/>
     <w:basedOn w:val="Normal"/>
     <w:pPr>
-      <w:spacing w:after="200" w:before="0"/>
+      <w:spacing w:after="240" w:before="0"/>
       <w:jc w:val="center"/>
     </w:pPr>
     <w:rPr>

</xml_diff>

<commit_message>
Substantially expand taint tracking chapter with sources, sinks, barriers, path queries, flow state, debugging, and exercises
</commit_message>
<xml_diff>
--- a/Book_Version/MustLearnCodeQL.docx
+++ b/Book_Version/MustLearnCodeQL.docx
@@ -4,7 +4,7 @@
   <w:body>
     <w:p>
       <w:pPr>
-        <w:spacing w:after="120"/>
+        <w:spacing w:after="100"/>
         <w:jc w:val="center"/>
       </w:pPr>
       <w:r>
@@ -12,15 +12,15 @@
           <w:b/>
           <w:bCs/>
           <w:color w:val="1F4E79"/>
-          <w:sz w:val="48"/>
-          <w:szCs w:val="48"/>
+          <w:sz w:val="46"/>
+          <w:szCs w:val="46"/>
         </w:rPr>
         <w:t xml:space="preserve">Must Learn CodeQL</w:t>
       </w:r>
     </w:p>
     <w:p>
       <w:pPr>
-        <w:spacing w:after="200"/>
+        <w:spacing w:after="160"/>
         <w:jc w:val="center"/>
       </w:pPr>
       <w:r>
@@ -28,8 +28,8 @@
           <w:i/>
           <w:iCs/>
           <w:color w:val="5B9BD5"/>
-          <w:sz w:val="24"/>
-          <w:szCs w:val="24"/>
+          <w:sz w:val="22"/>
+          <w:szCs w:val="22"/>
         </w:rPr>
         <w:t xml:space="preserve">A Practical Guide to Semantic Code Analysis</w:t>
       </w:r>
@@ -40,18 +40,18 @@
       </w:pPr>
       <w:r>
         <w:rPr>
-          <w:sz w:val="22"/>
-          <w:szCs w:val="22"/>
+          <w:sz w:val="20"/>
+          <w:szCs w:val="20"/>
         </w:rPr>
         <w:t xml:space="preserve">Rod Trent • 2026</w:t>
       </w:r>
     </w:p>
     <w:p>
       <w:pPr>
-        <w:spacing w:before="120"/>
+        <w:spacing w:before="80"/>
         <w:jc w:val="center"/>
       </w:pPr>
-      <w:hyperlink w:history="1" r:id="rId5be9xnzvbf8hn36pcy6ky">
+      <w:hyperlink w:history="1" r:id="rIdlfdbtqpnfat6ienljtaxp">
         <w:r>
           <w:rPr>
             <w:rStyle w:val="Hyperlink"/>
@@ -134,7 +134,7 @@
           </w:pPr>
           <w:hyperlink w:history="1" w:anchor="_Toc3">
             <w:r>
-              <w:t xml:space="preserve">Chapters 1–9 Summary</w:t>
+              <w:t xml:space="preserve">Foundations (Chapters 1–8)</w:t>
             </w:r>
             <w:r>
               <w:tab/>
@@ -156,7 +156,7 @@
           </w:pPr>
           <w:hyperlink w:history="1" w:anchor="_Toc4">
             <w:r>
-              <w:t xml:space="preserve">Chapter 10: CodeQL Library Extension</w:t>
+              <w:t xml:space="preserve">Chapter 9: Taint Tracking and Path Queries</w:t>
             </w:r>
             <w:r>
               <w:tab/>
@@ -179,7 +179,7 @@
           </w:pPr>
           <w:hyperlink w:history="1" w:anchor="_Toc5">
             <w:r>
-              <w:t xml:space="preserve">Why Library Extension Matters</w:t>
+              <w:t xml:space="preserve">What Taint Tracking Adds</w:t>
             </w:r>
             <w:r>
               <w:tab/>
@@ -202,7 +202,7 @@
           </w:pPr>
           <w:hyperlink w:history="1" w:anchor="_Toc6">
             <w:r>
-              <w:t xml:space="preserve">Adding Custom Sources</w:t>
+              <w:t xml:space="preserve">Sources</w:t>
             </w:r>
             <w:r>
               <w:tab/>
@@ -225,7 +225,7 @@
           </w:pPr>
           <w:hyperlink w:history="1" w:anchor="_Toc7">
             <w:r>
-              <w:t xml:space="preserve">Adding Custom Sinks</w:t>
+              <w:t xml:space="preserve">Sinks</w:t>
             </w:r>
             <w:r>
               <w:tab/>
@@ -248,7 +248,7 @@
           </w:pPr>
           <w:hyperlink w:history="1" w:anchor="_Toc8">
             <w:r>
-              <w:t xml:space="preserve">Flow Summaries and Additional Steps</w:t>
+              <w:t xml:space="preserve">Barriers (Sanitizers)</w:t>
             </w:r>
             <w:r>
               <w:tab/>
@@ -271,7 +271,7 @@
           </w:pPr>
           <w:hyperlink w:history="1" w:anchor="_Toc9">
             <w:r>
-              <w:t xml:space="preserve">Model Packs</w:t>
+              <w:t xml:space="preserve">The Path-Query Form</w:t>
             </w:r>
             <w:r>
               <w:tab/>
@@ -294,7 +294,7 @@
           </w:pPr>
           <w:hyperlink w:history="1" w:anchor="_Toc10">
             <w:r>
-              <w:t xml:space="preserve">Testing Extensions Thoroughly</w:t>
+              <w:t xml:space="preserve">Additional Flow Steps</w:t>
             </w:r>
             <w:r>
               <w:tab/>
@@ -317,7 +317,7 @@
           </w:pPr>
           <w:hyperlink w:history="1" w:anchor="_Toc11">
             <w:r>
-              <w:t xml:space="preserve">Language-Specific Patterns</w:t>
+              <w:t xml:space="preserve">Flow State for Higher Precision</w:t>
             </w:r>
             <w:r>
               <w:tab/>
@@ -340,7 +340,7 @@
           </w:pPr>
           <w:hyperlink w:history="1" w:anchor="_Toc12">
             <w:r>
-              <w:t xml:space="preserve">Exercises</w:t>
+              <w:t xml:space="preserve">Partial-Flow Debugging</w:t>
             </w:r>
             <w:r>
               <w:tab/>
@@ -363,7 +363,7 @@
           </w:pPr>
           <w:hyperlink w:history="1" w:anchor="_Toc13">
             <w:r>
-              <w:t xml:space="preserve">Contribution and Maintenance</w:t>
+              <w:t xml:space="preserve">Exercises</w:t>
             </w:r>
             <w:r>
               <w:tab/>
@@ -386,7 +386,7 @@
           </w:pPr>
           <w:hyperlink w:history="1" w:anchor="_Toc14">
             <w:r>
-              <w:t xml:space="preserve">Putting Extensions to Work</w:t>
+              <w:t xml:space="preserve">Common Pitfalls</w:t>
             </w:r>
             <w:r>
               <w:tab/>
@@ -401,14 +401,15 @@
         </w:p>
         <w:p>
           <w:pPr>
-            <w:pStyle w:val="TOC1"/>
+            <w:pStyle w:val="TOC2"/>
             <w:tabs>
               <w:tab w:val="right" w:pos="9648" w:leader="dot"/>
             </w:tabs>
+            <w:ind w:left="220"/>
           </w:pPr>
           <w:hyperlink w:history="1" w:anchor="_Toc15">
             <w:r>
-              <w:t xml:space="preserve">Chapter 11: Packs, Suites, and Production Use</w:t>
+              <w:t xml:space="preserve">Moving to Production</w:t>
             </w:r>
             <w:r>
               <w:tab/>
@@ -430,7 +431,7 @@
           </w:pPr>
           <w:hyperlink w:history="1" w:anchor="_Toc16">
             <w:r>
-              <w:t xml:space="preserve">Chapter 12: CI Integration</w:t>
+              <w:t xml:space="preserve">Chapter 10: Library Extension</w:t>
             </w:r>
             <w:r>
               <w:tab/>
@@ -452,7 +453,7 @@
           </w:pPr>
           <w:hyperlink w:history="1" w:anchor="_Toc17">
             <w:r>
-              <w:t xml:space="preserve">Chapter 13: Performance and Debugging</w:t>
+              <w:t xml:space="preserve">Chapter 11: Packs, Suites, and Production Use</w:t>
             </w:r>
             <w:r>
               <w:tab/>
@@ -474,7 +475,7 @@
           </w:pPr>
           <w:hyperlink w:history="1" w:anchor="_Toc18">
             <w:r>
-              <w:t xml:space="preserve">Chapter 14: Case Studies</w:t>
+              <w:t xml:space="preserve">Chapter 12: CI Integration</w:t>
             </w:r>
             <w:r>
               <w:tab/>
@@ -496,7 +497,7 @@
           </w:pPr>
           <w:hyperlink w:history="1" w:anchor="_Toc19">
             <w:r>
-              <w:t xml:space="preserve">Chapter 15: Best Practices</w:t>
+              <w:t xml:space="preserve">Chapter 13: Performance and Debugging</w:t>
             </w:r>
             <w:r>
               <w:tab/>
@@ -518,7 +519,7 @@
           </w:pPr>
           <w:hyperlink w:history="1" w:anchor="_Toc20">
             <w:r>
-              <w:t xml:space="preserve">Appendix</w:t>
+              <w:t xml:space="preserve">Chapter 14: Case Studies</w:t>
             </w:r>
             <w:r>
               <w:tab/>
@@ -526,6 +527,50 @@
             <w:r>
               <w:fldChar w:fldCharType="begin" w:dirty="true"/>
               <w:instrText xml:space="preserve">PAGEREF _Toc20 \h</w:instrText>
+              <w:fldChar w:fldCharType="separate"/>
+              <w:fldChar w:fldCharType="end"/>
+            </w:r>
+          </w:hyperlink>
+        </w:p>
+        <w:p>
+          <w:pPr>
+            <w:pStyle w:val="TOC1"/>
+            <w:tabs>
+              <w:tab w:val="right" w:pos="9648" w:leader="dot"/>
+            </w:tabs>
+          </w:pPr>
+          <w:hyperlink w:history="1" w:anchor="_Toc21">
+            <w:r>
+              <w:t xml:space="preserve">Chapter 15: Best Practices</w:t>
+            </w:r>
+            <w:r>
+              <w:tab/>
+            </w:r>
+            <w:r>
+              <w:fldChar w:fldCharType="begin" w:dirty="true"/>
+              <w:instrText xml:space="preserve">PAGEREF _Toc21 \h</w:instrText>
+              <w:fldChar w:fldCharType="separate"/>
+              <w:fldChar w:fldCharType="end"/>
+            </w:r>
+          </w:hyperlink>
+        </w:p>
+        <w:p>
+          <w:pPr>
+            <w:pStyle w:val="TOC1"/>
+            <w:tabs>
+              <w:tab w:val="right" w:pos="9648" w:leader="dot"/>
+            </w:tabs>
+          </w:pPr>
+          <w:hyperlink w:history="1" w:anchor="_Toc22">
+            <w:r>
+              <w:t xml:space="preserve">Appendix</w:t>
+            </w:r>
+            <w:r>
+              <w:tab/>
+            </w:r>
+            <w:r>
+              <w:fldChar w:fldCharType="begin" w:dirty="true"/>
+              <w:instrText xml:space="preserve">PAGEREF _Toc22 \h</w:instrText>
               <w:fldChar w:fldCharType="separate"/>
               <w:fldChar w:fldCharType="end"/>
             </w:r>
@@ -551,14 +596,14 @@
     </w:p>
     <w:p>
       <w:pPr>
-        <w:spacing w:after="120" w:line="276"/>
-      </w:pPr>
-      <w:r>
-        <w:rPr>
-          <w:sz w:val="22"/>
-          <w:szCs w:val="22"/>
-        </w:rPr>
-        <w:t xml:space="preserve">Chapter 10 on library extension has been expanded with additional explanations, modeling patterns, testing guidance, and exercises. Starter files are in examples/chapter10/.</w:t>
+        <w:spacing w:after="110" w:line="276"/>
+      </w:pPr>
+      <w:r>
+        <w:rPr>
+          <w:sz w:val="22"/>
+          <w:szCs w:val="22"/>
+        </w:rPr>
+        <w:t xml:space="preserve">This version substantially expands the taint-tracking chapter (Chapter 9) with additional concepts, complete examples, refinement techniques, debugging, and exercises. Related starters are in examples/chapter09/.</w:t>
       </w:r>
     </w:p>
     <w:p>
@@ -568,20 +613,20 @@
       </w:pPr>
       <w:bookmarkStart w:name="_Toc3" w:id="3"/>
       <w:r>
-        <w:t xml:space="preserve">Chapters 1–9 Summary</w:t>
+        <w:t xml:space="preserve">Foundations (Chapters 1–8)</w:t>
       </w:r>
       <w:bookmarkEnd w:id="3"/>
     </w:p>
     <w:p>
       <w:pPr>
-        <w:spacing w:after="120" w:line="276"/>
-      </w:pPr>
-      <w:r>
-        <w:rPr>
-          <w:sz w:val="22"/>
-          <w:szCs w:val="22"/>
-        </w:rPr>
-        <w:t xml:space="preserve">Earlier chapters cover why CodeQL exists, database creation, QL fundamentals, custom predicates, first queries, language libraries, data-flow analysis, and taint tracking with path queries. Configurations define sources and sinks; barriers and additional flow steps refine precision. Exercises for data flow and taint tracking are in examples/chapter08/ and examples/chapter09/.</w:t>
+        <w:spacing w:after="110" w:line="276"/>
+      </w:pPr>
+      <w:r>
+        <w:rPr>
+          <w:sz w:val="22"/>
+          <w:szCs w:val="22"/>
+        </w:rPr>
+        <w:t xml:space="preserve">CodeQL extracts a relational model of code so you can write declarative queries. Databases are created with the CLI or VS Code extension. QL uses predicates, classes, and modules. Data-flow analysis (Chapter 8) tracks where values travel using configurations that define sources and sinks, optional additional steps, and barriers. Global flow crosses functions; local flow does not. These foundations are required before taint tracking.</w:t>
       </w:r>
     </w:p>
     <w:p>
@@ -591,7 +636,7 @@
       </w:pPr>
       <w:bookmarkStart w:name="_Toc4" w:id="4"/>
       <w:r>
-        <w:t xml:space="preserve">Chapter 10: CodeQL Library Extension</w:t>
+        <w:t xml:space="preserve">Chapter 9: Taint Tracking and Path Queries</w:t>
       </w:r>
       <w:bookmarkEnd w:id="4"/>
     </w:p>
@@ -601,32 +646,32 @@
       </w:pPr>
       <w:bookmarkStart w:name="_Toc5" w:id="5"/>
       <w:r>
-        <w:t xml:space="preserve">Why Library Extension Matters</w:t>
+        <w:t xml:space="preserve">What Taint Tracking Adds</w:t>
       </w:r>
       <w:bookmarkEnd w:id="5"/>
     </w:p>
     <w:p>
       <w:pPr>
-        <w:spacing w:after="120" w:line="276"/>
-      </w:pPr>
-      <w:r>
-        <w:rPr>
-          <w:sz w:val="22"/>
-          <w:szCs w:val="22"/>
-        </w:rPr>
-        <w:t xml:space="preserve">The standard CodeQL libraries contain high-quality models for many popular frameworks and APIs, but they cannot anticipate every internal helper, every thin wrapper around a dangerous function, or every niche third-party package your organization uses. Without extensions, taint stops at the boundary of an unmodeled function and real vulnerabilities are missed. With extensions, every existing security query automatically understands your code.</w:t>
-      </w:r>
-    </w:p>
-    <w:p>
-      <w:pPr>
-        <w:spacing w:after="120" w:line="276"/>
-      </w:pPr>
-      <w:r>
-        <w:rPr>
-          <w:sz w:val="22"/>
-          <w:szCs w:val="22"/>
-        </w:rPr>
-        <w:t xml:space="preserve">Extension is almost always more effective than rewriting queries. One accurate model of an internal executeQuery method improves every SQL-injection query at once. One accurate model of a getUserInput helper improves every query that looks for remote flow. The leverage is the reason modeling is preferred.</w:t>
+        <w:spacing w:after="110" w:line="276"/>
+      </w:pPr>
+      <w:r>
+        <w:rPr>
+          <w:sz w:val="22"/>
+          <w:szCs w:val="22"/>
+        </w:rPr>
+        <w:t xml:space="preserve">Pure data flow follows a value as it is copied from one location to another. Taint tracking goes further: any value computed from a tainted input is itself considered tainted until a barrier explicitly clears it. If user input is concatenated with a string, passed through a formatter, substringed, or stored and later retrieved, the result remains tainted. This matches how attackers actually exploit injection and cross-site scripting flaws.</w:t>
+      </w:r>
+    </w:p>
+    <w:p>
+      <w:pPr>
+        <w:spacing w:after="110" w:line="276"/>
+      </w:pPr>
+      <w:r>
+        <w:rPr>
+          <w:sz w:val="22"/>
+          <w:szCs w:val="22"/>
+        </w:rPr>
+        <w:t xml:space="preserve">Almost every production security query in CodeQL—SQL injection, command injection, XSS, path traversal, open redirect, and many others—is implemented as a taint-tracking query. Understanding the configuration, the path-query form, barriers, and debugging is therefore the highest-leverage skill in the system.</w:t>
       </w:r>
     </w:p>
     <w:p>
@@ -635,35 +680,265 @@
       </w:pPr>
       <w:bookmarkStart w:name="_Toc6" w:id="6"/>
       <w:r>
-        <w:t xml:space="preserve">Adding Custom Sources</w:t>
+        <w:t xml:space="preserve">Sources</w:t>
       </w:r>
       <w:bookmarkEnd w:id="6"/>
     </w:p>
     <w:p>
       <w:pPr>
-        <w:spacing w:after="120" w:line="276"/>
-      </w:pPr>
-      <w:r>
-        <w:rPr>
-          <w:sz w:val="22"/>
-          <w:szCs w:val="22"/>
-        </w:rPr>
-        <w:t xml:space="preserve">The most common extension recognizes additional functions as sources of untrusted data. Subclass the appropriate remote-flow-source class:</w:t>
-      </w:r>
-    </w:p>
-    <w:p>
-      <w:pPr>
-        <w:spacing w:after="30" w:before="100"/>
-      </w:pPr>
-    </w:p>
-    <w:p>
-      <w:pPr>
-        <w:pBdr>
-          <w:left w:val="single" w:color="2E75B6" w:sz="18" w:space="10"/>
-        </w:pBdr>
-        <w:shd w:fill="F7F9FC" w:val="clear"/>
-        <w:spacing w:after="0" w:line="240"/>
-        <w:ind w:left="400"/>
+        <w:spacing w:after="110" w:line="276"/>
+      </w:pPr>
+      <w:r>
+        <w:rPr>
+          <w:sz w:val="22"/>
+          <w:szCs w:val="22"/>
+        </w:rPr>
+        <w:t xml:space="preserve">A source is a node that produces untrusted data. The standard libraries define RemoteFlowSource (and language-specific equivalents) for HTTP parameters, query strings, request bodies, headers, and similar inputs. In real codebases you almost always need additional sources: internal request wrappers, message-queue consumers, file uploads, environment variables read from untrusted contexts, or deserialization entry points. Adding them is done by subclassing the appropriate source class or by writing a predicate that identifies the nodes (see Chapter 10).</w:t>
+      </w:r>
+    </w:p>
+    <w:p>
+      <w:pPr>
+        <w:pStyle w:val="Heading2"/>
+      </w:pPr>
+      <w:bookmarkStart w:name="_Toc7" w:id="7"/>
+      <w:r>
+        <w:t xml:space="preserve">Sinks</w:t>
+      </w:r>
+      <w:bookmarkEnd w:id="7"/>
+    </w:p>
+    <w:p>
+      <w:pPr>
+        <w:spacing w:after="110" w:line="276"/>
+      </w:pPr>
+      <w:r>
+        <w:rPr>
+          <w:sz w:val="22"/>
+          <w:szCs w:val="22"/>
+        </w:rPr>
+        <w:t xml:space="preserve">A sink is a node where tainted data can cause harm. Examples include SQL execution APIs, shell command functions, HTML or JavaScript writers, file-system calls that interpret a path, LDAP query builders, and logging functions that might later be viewed in a privileged context. The libraries already model many common sinks. When your code uses a data-access layer or framework helper, you extend the sink classes so existing queries recognize them.</w:t>
+      </w:r>
+    </w:p>
+    <w:p>
+      <w:pPr>
+        <w:pStyle w:val="Heading2"/>
+      </w:pPr>
+      <w:bookmarkStart w:name="_Toc8" w:id="8"/>
+      <w:r>
+        <w:t xml:space="preserve">Barriers (Sanitizers)</w:t>
+      </w:r>
+      <w:bookmarkEnd w:id="8"/>
+    </w:p>
+    <w:p>
+      <w:pPr>
+        <w:spacing w:after="110" w:line="276"/>
+      </w:pPr>
+      <w:r>
+        <w:rPr>
+          <w:sz w:val="22"/>
+          <w:szCs w:val="22"/>
+        </w:rPr>
+        <w:t xml:space="preserve">A barrier is a node that removes taint. Typical barriers are encoding functions (HTML, URL, JavaScript), validation routines that reject malicious input, prepared-statement parameter binding, and allow-list checks. Implementing isBarrier inside the configuration is the main way to eliminate false positives. Barriers should be as precise as possible; an overly broad barrier silently drops true positives.</w:t>
+      </w:r>
+    </w:p>
+    <w:p>
+      <w:pPr>
+        <w:pStyle w:val="Heading2"/>
+      </w:pPr>
+      <w:bookmarkStart w:name="_Toc9" w:id="9"/>
+      <w:r>
+        <w:t xml:space="preserve">The Path-Query Form</w:t>
+      </w:r>
+      <w:bookmarkEnd w:id="9"/>
+    </w:p>
+    <w:p>
+      <w:pPr>
+        <w:spacing w:after="110" w:line="276"/>
+      </w:pPr>
+      <w:r>
+        <w:rPr>
+          <w:sz w:val="22"/>
+          <w:szCs w:val="22"/>
+        </w:rPr>
+        <w:t xml:space="preserve">To display the path from source to sink, the query must be annotated @kind path-problem, import the PathGraph, and use a select clause that supplies the sink node, the source path node, the sink path node, and a message. The tooling then renders the full path in GitHub and in the editor.</w:t>
+      </w:r>
+    </w:p>
+    <w:p>
+      <w:pPr>
+        <w:spacing w:after="110" w:line="276"/>
+      </w:pPr>
+      <w:r>
+        <w:rPr>
+          <w:sz w:val="22"/>
+          <w:szCs w:val="22"/>
+        </w:rPr>
+        <w:t xml:space="preserve">Complete DOM XSS example:</w:t>
+      </w:r>
+    </w:p>
+    <w:p>
+      <w:pPr>
+        <w:spacing w:after="20" w:before="80"/>
+      </w:pPr>
+    </w:p>
+    <w:p>
+      <w:pPr>
+        <w:pBdr>
+          <w:left w:val="single" w:color="2E75B6" w:sz="16" w:space="8"/>
+        </w:pBdr>
+        <w:shd w:fill="F7F9FC" w:val="clear"/>
+        <w:spacing w:after="0" w:line="240"/>
+        <w:ind w:left="360"/>
+      </w:pPr>
+      <w:r>
+        <w:rPr>
+          <w:rFonts w:ascii="Consolas" w:cs="Consolas" w:eastAsia="Consolas" w:hAnsi="Consolas"/>
+          <w:color w:val="1E293B"/>
+          <w:sz w:val="18"/>
+          <w:szCs w:val="18"/>
+        </w:rPr>
+        <w:t xml:space="preserve">/**</w:t>
+      </w:r>
+    </w:p>
+    <w:p>
+      <w:pPr>
+        <w:pBdr>
+          <w:left w:val="single" w:color="2E75B6" w:sz="16" w:space="8"/>
+        </w:pBdr>
+        <w:shd w:fill="F7F9FC" w:val="clear"/>
+        <w:spacing w:after="0" w:line="240"/>
+        <w:ind w:left="360"/>
+      </w:pPr>
+      <w:r>
+        <w:rPr>
+          <w:rFonts w:ascii="Consolas" w:cs="Consolas" w:eastAsia="Consolas" w:hAnsi="Consolas"/>
+          <w:color w:val="1E293B"/>
+          <w:sz w:val="18"/>
+          <w:szCs w:val="18"/>
+        </w:rPr>
+        <w:t xml:space="preserve"> * @kind path-problem</w:t>
+      </w:r>
+    </w:p>
+    <w:p>
+      <w:pPr>
+        <w:pBdr>
+          <w:left w:val="single" w:color="2E75B6" w:sz="16" w:space="8"/>
+        </w:pBdr>
+        <w:shd w:fill="F7F9FC" w:val="clear"/>
+        <w:spacing w:after="0" w:line="240"/>
+        <w:ind w:left="360"/>
+      </w:pPr>
+      <w:r>
+        <w:rPr>
+          <w:rFonts w:ascii="Consolas" w:cs="Consolas" w:eastAsia="Consolas" w:hAnsi="Consolas"/>
+          <w:color w:val="1E293B"/>
+          <w:sz w:val="18"/>
+          <w:szCs w:val="18"/>
+        </w:rPr>
+        <w:t xml:space="preserve"> * @id mustlearn/dom-xss</w:t>
+      </w:r>
+    </w:p>
+    <w:p>
+      <w:pPr>
+        <w:pBdr>
+          <w:left w:val="single" w:color="2E75B6" w:sz="16" w:space="8"/>
+        </w:pBdr>
+        <w:shd w:fill="F7F9FC" w:val="clear"/>
+        <w:spacing w:after="0" w:line="240"/>
+        <w:ind w:left="360"/>
+      </w:pPr>
+      <w:r>
+        <w:rPr>
+          <w:rFonts w:ascii="Consolas" w:cs="Consolas" w:eastAsia="Consolas" w:hAnsi="Consolas"/>
+          <w:color w:val="1E293B"/>
+          <w:sz w:val="18"/>
+          <w:szCs w:val="18"/>
+        </w:rPr>
+        <w:t xml:space="preserve"> * @name DOM-based XSS</w:t>
+      </w:r>
+    </w:p>
+    <w:p>
+      <w:pPr>
+        <w:pBdr>
+          <w:left w:val="single" w:color="2E75B6" w:sz="16" w:space="8"/>
+        </w:pBdr>
+        <w:shd w:fill="F7F9FC" w:val="clear"/>
+        <w:spacing w:after="0" w:line="240"/>
+        <w:ind w:left="360"/>
+      </w:pPr>
+      <w:r>
+        <w:rPr>
+          <w:rFonts w:ascii="Consolas" w:cs="Consolas" w:eastAsia="Consolas" w:hAnsi="Consolas"/>
+          <w:color w:val="1E293B"/>
+          <w:sz w:val="18"/>
+          <w:szCs w:val="18"/>
+        </w:rPr>
+        <w:t xml:space="preserve"> * @description Tainted data reaches a DOM XSS sink.</w:t>
+      </w:r>
+    </w:p>
+    <w:p>
+      <w:pPr>
+        <w:pBdr>
+          <w:left w:val="single" w:color="2E75B6" w:sz="16" w:space="8"/>
+        </w:pBdr>
+        <w:shd w:fill="F7F9FC" w:val="clear"/>
+        <w:spacing w:after="0" w:line="240"/>
+        <w:ind w:left="360"/>
+      </w:pPr>
+      <w:r>
+        <w:rPr>
+          <w:rFonts w:ascii="Consolas" w:cs="Consolas" w:eastAsia="Consolas" w:hAnsi="Consolas"/>
+          <w:color w:val="1E293B"/>
+          <w:sz w:val="18"/>
+          <w:szCs w:val="18"/>
+        </w:rPr>
+        <w:t xml:space="preserve"> * @problem.severity error</w:t>
+      </w:r>
+    </w:p>
+    <w:p>
+      <w:pPr>
+        <w:pBdr>
+          <w:left w:val="single" w:color="2E75B6" w:sz="16" w:space="8"/>
+        </w:pBdr>
+        <w:shd w:fill="F7F9FC" w:val="clear"/>
+        <w:spacing w:after="0" w:line="240"/>
+        <w:ind w:left="360"/>
+      </w:pPr>
+      <w:r>
+        <w:rPr>
+          <w:rFonts w:ascii="Consolas" w:cs="Consolas" w:eastAsia="Consolas" w:hAnsi="Consolas"/>
+          <w:color w:val="1E293B"/>
+          <w:sz w:val="18"/>
+          <w:szCs w:val="18"/>
+        </w:rPr>
+        <w:t xml:space="preserve"> * @precision high</w:t>
+      </w:r>
+    </w:p>
+    <w:p>
+      <w:pPr>
+        <w:pBdr>
+          <w:left w:val="single" w:color="2E75B6" w:sz="16" w:space="8"/>
+        </w:pBdr>
+        <w:shd w:fill="F7F9FC" w:val="clear"/>
+        <w:spacing w:after="0" w:line="240"/>
+        <w:ind w:left="360"/>
+      </w:pPr>
+      <w:r>
+        <w:rPr>
+          <w:rFonts w:ascii="Consolas" w:cs="Consolas" w:eastAsia="Consolas" w:hAnsi="Consolas"/>
+          <w:color w:val="1E293B"/>
+          <w:sz w:val="18"/>
+          <w:szCs w:val="18"/>
+        </w:rPr>
+        <w:t xml:space="preserve"> */</w:t>
+      </w:r>
+    </w:p>
+    <w:p>
+      <w:pPr>
+        <w:pBdr>
+          <w:left w:val="single" w:color="2E75B6" w:sz="16" w:space="8"/>
+        </w:pBdr>
+        <w:shd w:fill="F7F9FC" w:val="clear"/>
+        <w:spacing w:after="0" w:line="240"/>
+        <w:ind w:left="360"/>
       </w:pPr>
       <w:r>
         <w:rPr>
@@ -678,11 +953,11 @@
     <w:p>
       <w:pPr>
         <w:pBdr>
-          <w:left w:val="single" w:color="2E75B6" w:sz="18" w:space="10"/>
-        </w:pBdr>
-        <w:shd w:fill="F7F9FC" w:val="clear"/>
-        <w:spacing w:after="0" w:line="240"/>
-        <w:ind w:left="400"/>
+          <w:left w:val="single" w:color="2E75B6" w:sz="16" w:space="8"/>
+        </w:pBdr>
+        <w:shd w:fill="F7F9FC" w:val="clear"/>
+        <w:spacing w:after="0" w:line="240"/>
+        <w:ind w:left="360"/>
       </w:pPr>
       <w:r>
         <w:rPr>
@@ -697,125 +972,68 @@
     <w:p>
       <w:pPr>
         <w:pBdr>
-          <w:left w:val="single" w:color="2E75B6" w:sz="18" w:space="10"/>
-        </w:pBdr>
-        <w:shd w:fill="F7F9FC" w:val="clear"/>
-        <w:spacing w:after="0" w:line="240"/>
-        <w:ind w:left="400"/>
-      </w:pPr>
-      <w:r>
-        <w:rPr>
-          <w:rFonts w:ascii="Consolas" w:cs="Consolas" w:eastAsia="Consolas" w:hAnsi="Consolas"/>
-          <w:color w:val="1E293B"/>
-          <w:sz w:val="18"/>
-          <w:szCs w:val="18"/>
-        </w:rPr>
-        <w:t xml:space="preserve">/**</w:t>
-      </w:r>
-    </w:p>
-    <w:p>
-      <w:pPr>
-        <w:pBdr>
-          <w:left w:val="single" w:color="2E75B6" w:sz="18" w:space="10"/>
-        </w:pBdr>
-        <w:shd w:fill="F7F9FC" w:val="clear"/>
-        <w:spacing w:after="0" w:line="240"/>
-        <w:ind w:left="400"/>
-      </w:pPr>
-      <w:r>
-        <w:rPr>
-          <w:rFonts w:ascii="Consolas" w:cs="Consolas" w:eastAsia="Consolas" w:hAnsi="Consolas"/>
-          <w:color w:val="1E293B"/>
-          <w:sz w:val="18"/>
-          <w:szCs w:val="18"/>
-        </w:rPr>
-        <w:t xml:space="preserve"> * Treat calls to getUserInput as remote flow sources.</w:t>
-      </w:r>
-    </w:p>
-    <w:p>
-      <w:pPr>
-        <w:pBdr>
-          <w:left w:val="single" w:color="2E75B6" w:sz="18" w:space="10"/>
-        </w:pBdr>
-        <w:shd w:fill="F7F9FC" w:val="clear"/>
-        <w:spacing w:after="0" w:line="240"/>
-        <w:ind w:left="400"/>
-      </w:pPr>
-      <w:r>
-        <w:rPr>
-          <w:rFonts w:ascii="Consolas" w:cs="Consolas" w:eastAsia="Consolas" w:hAnsi="Consolas"/>
-          <w:color w:val="1E293B"/>
-          <w:sz w:val="18"/>
-          <w:szCs w:val="18"/>
-        </w:rPr>
-        <w:t xml:space="preserve"> */</w:t>
-      </w:r>
-    </w:p>
-    <w:p>
-      <w:pPr>
-        <w:pBdr>
-          <w:left w:val="single" w:color="2E75B6" w:sz="18" w:space="10"/>
-        </w:pBdr>
-        <w:shd w:fill="F7F9FC" w:val="clear"/>
-        <w:spacing w:after="0" w:line="240"/>
-        <w:ind w:left="400"/>
-      </w:pPr>
-      <w:r>
-        <w:rPr>
-          <w:rFonts w:ascii="Consolas" w:cs="Consolas" w:eastAsia="Consolas" w:hAnsi="Consolas"/>
-          <w:color w:val="1E293B"/>
-          <w:sz w:val="18"/>
-          <w:szCs w:val="18"/>
-        </w:rPr>
-        <w:t xml:space="preserve">class CustomRemoteSource extends RemoteFlowSource {</w:t>
-      </w:r>
-    </w:p>
-    <w:p>
-      <w:pPr>
-        <w:pBdr>
-          <w:left w:val="single" w:color="2E75B6" w:sz="18" w:space="10"/>
-        </w:pBdr>
-        <w:shd w:fill="F7F9FC" w:val="clear"/>
-        <w:spacing w:after="0" w:line="240"/>
-        <w:ind w:left="400"/>
-      </w:pPr>
-      <w:r>
-        <w:rPr>
-          <w:rFonts w:ascii="Consolas" w:cs="Consolas" w:eastAsia="Consolas" w:hAnsi="Consolas"/>
-          <w:color w:val="1E293B"/>
-          <w:sz w:val="18"/>
-          <w:szCs w:val="18"/>
-        </w:rPr>
-        <w:t xml:space="preserve">  CustomRemoteSource() {</w:t>
-      </w:r>
-    </w:p>
-    <w:p>
-      <w:pPr>
-        <w:pBdr>
-          <w:left w:val="single" w:color="2E75B6" w:sz="18" w:space="10"/>
-        </w:pBdr>
-        <w:shd w:fill="F7F9FC" w:val="clear"/>
-        <w:spacing w:after="0" w:line="240"/>
-        <w:ind w:left="400"/>
-      </w:pPr>
-      <w:r>
-        <w:rPr>
-          <w:rFonts w:ascii="Consolas" w:cs="Consolas" w:eastAsia="Consolas" w:hAnsi="Consolas"/>
-          <w:color w:val="1E293B"/>
-          <w:sz w:val="18"/>
-          <w:szCs w:val="18"/>
-        </w:rPr>
-        <w:t xml:space="preserve">    this = any(CallExpr c | c.getCalleeName() = "getUserInput").flow()</w:t>
-      </w:r>
-    </w:p>
-    <w:p>
-      <w:pPr>
-        <w:pBdr>
-          <w:left w:val="single" w:color="2E75B6" w:sz="18" w:space="10"/>
-        </w:pBdr>
-        <w:shd w:fill="F7F9FC" w:val="clear"/>
-        <w:spacing w:after="0" w:line="240"/>
-        <w:ind w:left="400"/>
+          <w:left w:val="single" w:color="2E75B6" w:sz="16" w:space="8"/>
+        </w:pBdr>
+        <w:shd w:fill="F7F9FC" w:val="clear"/>
+        <w:spacing w:after="0" w:line="240"/>
+        <w:ind w:left="360"/>
+      </w:pPr>
+      <w:r>
+        <w:rPr>
+          <w:rFonts w:ascii="Consolas" w:cs="Consolas" w:eastAsia="Consolas" w:hAnsi="Consolas"/>
+          <w:color w:val="1E293B"/>
+          <w:sz w:val="18"/>
+          <w:szCs w:val="18"/>
+        </w:rPr>
+        <w:t xml:space="preserve">module XssConfig implements DataFlow::ConfigSig {</w:t>
+      </w:r>
+    </w:p>
+    <w:p>
+      <w:pPr>
+        <w:pBdr>
+          <w:left w:val="single" w:color="2E75B6" w:sz="16" w:space="8"/>
+        </w:pBdr>
+        <w:shd w:fill="F7F9FC" w:val="clear"/>
+        <w:spacing w:after="0" w:line="240"/>
+        <w:ind w:left="360"/>
+      </w:pPr>
+      <w:r>
+        <w:rPr>
+          <w:rFonts w:ascii="Consolas" w:cs="Consolas" w:eastAsia="Consolas" w:hAnsi="Consolas"/>
+          <w:color w:val="1E293B"/>
+          <w:sz w:val="18"/>
+          <w:szCs w:val="18"/>
+        </w:rPr>
+        <w:t xml:space="preserve">  predicate isSource(DataFlow::Node n) {</w:t>
+      </w:r>
+    </w:p>
+    <w:p>
+      <w:pPr>
+        <w:pBdr>
+          <w:left w:val="single" w:color="2E75B6" w:sz="16" w:space="8"/>
+        </w:pBdr>
+        <w:shd w:fill="F7F9FC" w:val="clear"/>
+        <w:spacing w:after="0" w:line="240"/>
+        <w:ind w:left="360"/>
+      </w:pPr>
+      <w:r>
+        <w:rPr>
+          <w:rFonts w:ascii="Consolas" w:cs="Consolas" w:eastAsia="Consolas" w:hAnsi="Consolas"/>
+          <w:color w:val="1E293B"/>
+          <w:sz w:val="18"/>
+          <w:szCs w:val="18"/>
+        </w:rPr>
+        <w:t xml:space="preserve">    n instanceof RemoteFlowSource</w:t>
+      </w:r>
+    </w:p>
+    <w:p>
+      <w:pPr>
+        <w:pBdr>
+          <w:left w:val="single" w:color="2E75B6" w:sz="16" w:space="8"/>
+        </w:pBdr>
+        <w:shd w:fill="F7F9FC" w:val="clear"/>
+        <w:spacing w:after="0" w:line="240"/>
+        <w:ind w:left="360"/>
       </w:pPr>
       <w:r>
         <w:rPr>
@@ -830,11 +1048,182 @@
     <w:p>
       <w:pPr>
         <w:pBdr>
-          <w:left w:val="single" w:color="2E75B6" w:sz="18" w:space="10"/>
-        </w:pBdr>
-        <w:shd w:fill="F7F9FC" w:val="clear"/>
-        <w:spacing w:after="0" w:line="240"/>
-        <w:ind w:left="400"/>
+          <w:left w:val="single" w:color="2E75B6" w:sz="16" w:space="8"/>
+        </w:pBdr>
+        <w:shd w:fill="F7F9FC" w:val="clear"/>
+        <w:spacing w:after="0" w:line="240"/>
+        <w:ind w:left="360"/>
+      </w:pPr>
+      <w:r>
+        <w:rPr>
+          <w:rFonts w:ascii="Consolas" w:cs="Consolas" w:eastAsia="Consolas" w:hAnsi="Consolas"/>
+          <w:color w:val="1E293B"/>
+          <w:sz w:val="18"/>
+          <w:szCs w:val="18"/>
+        </w:rPr>
+        <w:t xml:space="preserve">  predicate isSink(DataFlow::Node n) {</w:t>
+      </w:r>
+    </w:p>
+    <w:p>
+      <w:pPr>
+        <w:pBdr>
+          <w:left w:val="single" w:color="2E75B6" w:sz="16" w:space="8"/>
+        </w:pBdr>
+        <w:shd w:fill="F7F9FC" w:val="clear"/>
+        <w:spacing w:after="0" w:line="240"/>
+        <w:ind w:left="360"/>
+      </w:pPr>
+      <w:r>
+        <w:rPr>
+          <w:rFonts w:ascii="Consolas" w:cs="Consolas" w:eastAsia="Consolas" w:hAnsi="Consolas"/>
+          <w:color w:val="1E293B"/>
+          <w:sz w:val="18"/>
+          <w:szCs w:val="18"/>
+        </w:rPr>
+        <w:t xml:space="preserve">    n instanceof DomBasedXssSink</w:t>
+      </w:r>
+    </w:p>
+    <w:p>
+      <w:pPr>
+        <w:pBdr>
+          <w:left w:val="single" w:color="2E75B6" w:sz="16" w:space="8"/>
+        </w:pBdr>
+        <w:shd w:fill="F7F9FC" w:val="clear"/>
+        <w:spacing w:after="0" w:line="240"/>
+        <w:ind w:left="360"/>
+      </w:pPr>
+      <w:r>
+        <w:rPr>
+          <w:rFonts w:ascii="Consolas" w:cs="Consolas" w:eastAsia="Consolas" w:hAnsi="Consolas"/>
+          <w:color w:val="1E293B"/>
+          <w:sz w:val="18"/>
+          <w:szCs w:val="18"/>
+        </w:rPr>
+        <w:t xml:space="preserve">  }</w:t>
+      </w:r>
+    </w:p>
+    <w:p>
+      <w:pPr>
+        <w:pBdr>
+          <w:left w:val="single" w:color="2E75B6" w:sz="16" w:space="8"/>
+        </w:pBdr>
+        <w:shd w:fill="F7F9FC" w:val="clear"/>
+        <w:spacing w:after="0" w:line="240"/>
+        <w:ind w:left="360"/>
+      </w:pPr>
+      <w:r>
+        <w:rPr>
+          <w:rFonts w:ascii="Consolas" w:cs="Consolas" w:eastAsia="Consolas" w:hAnsi="Consolas"/>
+          <w:color w:val="1E293B"/>
+          <w:sz w:val="18"/>
+          <w:szCs w:val="18"/>
+        </w:rPr>
+        <w:t xml:space="preserve">  predicate isBarrier(DataFlow::Node n) {</w:t>
+      </w:r>
+    </w:p>
+    <w:p>
+      <w:pPr>
+        <w:pBdr>
+          <w:left w:val="single" w:color="2E75B6" w:sz="16" w:space="8"/>
+        </w:pBdr>
+        <w:shd w:fill="F7F9FC" w:val="clear"/>
+        <w:spacing w:after="0" w:line="240"/>
+        <w:ind w:left="360"/>
+      </w:pPr>
+      <w:r>
+        <w:rPr>
+          <w:rFonts w:ascii="Consolas" w:cs="Consolas" w:eastAsia="Consolas" w:hAnsi="Consolas"/>
+          <w:color w:val="1E293B"/>
+          <w:sz w:val="18"/>
+          <w:szCs w:val="18"/>
+        </w:rPr>
+        <w:t xml:space="preserve">    n = any(CallExpr c |</w:t>
+      </w:r>
+    </w:p>
+    <w:p>
+      <w:pPr>
+        <w:pBdr>
+          <w:left w:val="single" w:color="2E75B6" w:sz="16" w:space="8"/>
+        </w:pBdr>
+        <w:shd w:fill="F7F9FC" w:val="clear"/>
+        <w:spacing w:after="0" w:line="240"/>
+        <w:ind w:left="360"/>
+      </w:pPr>
+      <w:r>
+        <w:rPr>
+          <w:rFonts w:ascii="Consolas" w:cs="Consolas" w:eastAsia="Consolas" w:hAnsi="Consolas"/>
+          <w:color w:val="1E293B"/>
+          <w:sz w:val="18"/>
+          <w:szCs w:val="18"/>
+        </w:rPr>
+        <w:t xml:space="preserve">      c.getCalleeName() = "encodeURI" or</w:t>
+      </w:r>
+    </w:p>
+    <w:p>
+      <w:pPr>
+        <w:pBdr>
+          <w:left w:val="single" w:color="2E75B6" w:sz="16" w:space="8"/>
+        </w:pBdr>
+        <w:shd w:fill="F7F9FC" w:val="clear"/>
+        <w:spacing w:after="0" w:line="240"/>
+        <w:ind w:left="360"/>
+      </w:pPr>
+      <w:r>
+        <w:rPr>
+          <w:rFonts w:ascii="Consolas" w:cs="Consolas" w:eastAsia="Consolas" w:hAnsi="Consolas"/>
+          <w:color w:val="1E293B"/>
+          <w:sz w:val="18"/>
+          <w:szCs w:val="18"/>
+        </w:rPr>
+        <w:t xml:space="preserve">      c.getCalleeName() = "escapeHtml"</w:t>
+      </w:r>
+    </w:p>
+    <w:p>
+      <w:pPr>
+        <w:pBdr>
+          <w:left w:val="single" w:color="2E75B6" w:sz="16" w:space="8"/>
+        </w:pBdr>
+        <w:shd w:fill="F7F9FC" w:val="clear"/>
+        <w:spacing w:after="0" w:line="240"/>
+        <w:ind w:left="360"/>
+      </w:pPr>
+      <w:r>
+        <w:rPr>
+          <w:rFonts w:ascii="Consolas" w:cs="Consolas" w:eastAsia="Consolas" w:hAnsi="Consolas"/>
+          <w:color w:val="1E293B"/>
+          <w:sz w:val="18"/>
+          <w:szCs w:val="18"/>
+        </w:rPr>
+        <w:t xml:space="preserve">    ).flow()</w:t>
+      </w:r>
+    </w:p>
+    <w:p>
+      <w:pPr>
+        <w:pBdr>
+          <w:left w:val="single" w:color="2E75B6" w:sz="16" w:space="8"/>
+        </w:pBdr>
+        <w:shd w:fill="F7F9FC" w:val="clear"/>
+        <w:spacing w:after="0" w:line="240"/>
+        <w:ind w:left="360"/>
+      </w:pPr>
+      <w:r>
+        <w:rPr>
+          <w:rFonts w:ascii="Consolas" w:cs="Consolas" w:eastAsia="Consolas" w:hAnsi="Consolas"/>
+          <w:color w:val="1E293B"/>
+          <w:sz w:val="18"/>
+          <w:szCs w:val="18"/>
+        </w:rPr>
+        <w:t xml:space="preserve">  }</w:t>
+      </w:r>
+    </w:p>
+    <w:p>
+      <w:pPr>
+        <w:pBdr>
+          <w:left w:val="single" w:color="2E75B6" w:sz="16" w:space="8"/>
+        </w:pBdr>
+        <w:shd w:fill="F7F9FC" w:val="clear"/>
+        <w:spacing w:after="0" w:line="240"/>
+        <w:ind w:left="360"/>
       </w:pPr>
       <w:r>
         <w:rPr>
@@ -848,303 +1237,399 @@
     </w:p>
     <w:p>
       <w:pPr>
-        <w:spacing w:after="120" w:before="30"/>
-      </w:pPr>
-    </w:p>
-    <w:p>
-      <w:pPr>
-        <w:spacing w:after="120" w:line="276"/>
-      </w:pPr>
-      <w:r>
-        <w:rPr>
-          <w:sz w:val="22"/>
-          <w:szCs w:val="22"/>
-        </w:rPr>
-        <w:t xml:space="preserve">Once this class is in scope, every query that looks for RemoteFlowSource will include calls to getUserInput. The complete file is examples/chapter10/custom-source.ql. You can write analogous subclasses for file reads, message-bus payloads, environment variables, or any other origin your threat model considers untrusted.</w:t>
+        <w:pBdr>
+          <w:left w:val="single" w:color="2E75B6" w:sz="16" w:space="8"/>
+        </w:pBdr>
+        <w:shd w:fill="F7F9FC" w:val="clear"/>
+        <w:spacing w:after="0" w:line="240"/>
+        <w:ind w:left="360"/>
+      </w:pPr>
+      <w:r>
+        <w:rPr>
+          <w:rFonts w:ascii="Consolas" w:cs="Consolas" w:eastAsia="Consolas" w:hAnsi="Consolas"/>
+          <w:color w:val="1E293B"/>
+          <w:sz w:val="18"/>
+          <w:szCs w:val="18"/>
+        </w:rPr>
+        <w:t xml:space="preserve"> </w:t>
+      </w:r>
+    </w:p>
+    <w:p>
+      <w:pPr>
+        <w:pBdr>
+          <w:left w:val="single" w:color="2E75B6" w:sz="16" w:space="8"/>
+        </w:pBdr>
+        <w:shd w:fill="F7F9FC" w:val="clear"/>
+        <w:spacing w:after="0" w:line="240"/>
+        <w:ind w:left="360"/>
+      </w:pPr>
+      <w:r>
+        <w:rPr>
+          <w:rFonts w:ascii="Consolas" w:cs="Consolas" w:eastAsia="Consolas" w:hAnsi="Consolas"/>
+          <w:color w:val="1E293B"/>
+          <w:sz w:val="18"/>
+          <w:szCs w:val="18"/>
+        </w:rPr>
+        <w:t xml:space="preserve">module XssFlow = TaintTracking::Global&lt;XssConfig&gt;;</w:t>
+      </w:r>
+    </w:p>
+    <w:p>
+      <w:pPr>
+        <w:pBdr>
+          <w:left w:val="single" w:color="2E75B6" w:sz="16" w:space="8"/>
+        </w:pBdr>
+        <w:shd w:fill="F7F9FC" w:val="clear"/>
+        <w:spacing w:after="0" w:line="240"/>
+        <w:ind w:left="360"/>
+      </w:pPr>
+      <w:r>
+        <w:rPr>
+          <w:rFonts w:ascii="Consolas" w:cs="Consolas" w:eastAsia="Consolas" w:hAnsi="Consolas"/>
+          <w:color w:val="1E293B"/>
+          <w:sz w:val="18"/>
+          <w:szCs w:val="18"/>
+        </w:rPr>
+        <w:t xml:space="preserve">import XssFlow::PathGraph</w:t>
+      </w:r>
+    </w:p>
+    <w:p>
+      <w:pPr>
+        <w:pBdr>
+          <w:left w:val="single" w:color="2E75B6" w:sz="16" w:space="8"/>
+        </w:pBdr>
+        <w:shd w:fill="F7F9FC" w:val="clear"/>
+        <w:spacing w:after="0" w:line="240"/>
+        <w:ind w:left="360"/>
+      </w:pPr>
+      <w:r>
+        <w:rPr>
+          <w:rFonts w:ascii="Consolas" w:cs="Consolas" w:eastAsia="Consolas" w:hAnsi="Consolas"/>
+          <w:color w:val="1E293B"/>
+          <w:sz w:val="18"/>
+          <w:szCs w:val="18"/>
+        </w:rPr>
+        <w:t xml:space="preserve"> </w:t>
+      </w:r>
+    </w:p>
+    <w:p>
+      <w:pPr>
+        <w:pBdr>
+          <w:left w:val="single" w:color="2E75B6" w:sz="16" w:space="8"/>
+        </w:pBdr>
+        <w:shd w:fill="F7F9FC" w:val="clear"/>
+        <w:spacing w:after="0" w:line="240"/>
+        <w:ind w:left="360"/>
+      </w:pPr>
+      <w:r>
+        <w:rPr>
+          <w:rFonts w:ascii="Consolas" w:cs="Consolas" w:eastAsia="Consolas" w:hAnsi="Consolas"/>
+          <w:color w:val="1E293B"/>
+          <w:sz w:val="18"/>
+          <w:szCs w:val="18"/>
+        </w:rPr>
+        <w:t xml:space="preserve">from XssFlow::PathNode source, XssFlow::PathNode sink</w:t>
+      </w:r>
+    </w:p>
+    <w:p>
+      <w:pPr>
+        <w:pBdr>
+          <w:left w:val="single" w:color="2E75B6" w:sz="16" w:space="8"/>
+        </w:pBdr>
+        <w:shd w:fill="F7F9FC" w:val="clear"/>
+        <w:spacing w:after="0" w:line="240"/>
+        <w:ind w:left="360"/>
+      </w:pPr>
+      <w:r>
+        <w:rPr>
+          <w:rFonts w:ascii="Consolas" w:cs="Consolas" w:eastAsia="Consolas" w:hAnsi="Consolas"/>
+          <w:color w:val="1E293B"/>
+          <w:sz w:val="18"/>
+          <w:szCs w:val="18"/>
+        </w:rPr>
+        <w:t xml:space="preserve">where XssFlow::flowPath(source, sink)</w:t>
+      </w:r>
+    </w:p>
+    <w:p>
+      <w:pPr>
+        <w:pBdr>
+          <w:left w:val="single" w:color="2E75B6" w:sz="16" w:space="8"/>
+        </w:pBdr>
+        <w:shd w:fill="F7F9FC" w:val="clear"/>
+        <w:spacing w:after="0" w:line="240"/>
+        <w:ind w:left="360"/>
+      </w:pPr>
+      <w:r>
+        <w:rPr>
+          <w:rFonts w:ascii="Consolas" w:cs="Consolas" w:eastAsia="Consolas" w:hAnsi="Consolas"/>
+          <w:color w:val="1E293B"/>
+          <w:sz w:val="18"/>
+          <w:szCs w:val="18"/>
+        </w:rPr>
+        <w:t xml:space="preserve">select sink.getNode(), source, sink,</w:t>
+      </w:r>
+    </w:p>
+    <w:p>
+      <w:pPr>
+        <w:pBdr>
+          <w:left w:val="single" w:color="2E75B6" w:sz="16" w:space="8"/>
+        </w:pBdr>
+        <w:shd w:fill="F7F9FC" w:val="clear"/>
+        <w:spacing w:after="0" w:line="240"/>
+        <w:ind w:left="360"/>
+      </w:pPr>
+      <w:r>
+        <w:rPr>
+          <w:rFonts w:ascii="Consolas" w:cs="Consolas" w:eastAsia="Consolas" w:hAnsi="Consolas"/>
+          <w:color w:val="1E293B"/>
+          <w:sz w:val="18"/>
+          <w:szCs w:val="18"/>
+        </w:rPr>
+        <w:t xml:space="preserve">  "XSS via $@.", source.getNode(), "user-controlled input"</w:t>
+      </w:r>
+    </w:p>
+    <w:p>
+      <w:pPr>
+        <w:spacing w:after="100" w:before="20"/>
+      </w:pPr>
+    </w:p>
+    <w:p>
+      <w:pPr>
+        <w:spacing w:after="110" w:line="276"/>
+      </w:pPr>
+      <w:r>
+        <w:rPr>
+          <w:sz w:val="22"/>
+          <w:szCs w:val="22"/>
+        </w:rPr>
+        <w:t xml:space="preserve">The query is at examples/chapter09/xss-path.ql. The $@ syntax in the message creates a hyperlink back to the source, which helps developers understand the alert.</w:t>
       </w:r>
     </w:p>
     <w:p>
       <w:pPr>
         <w:pStyle w:val="Heading2"/>
       </w:pPr>
-      <w:bookmarkStart w:name="_Toc7" w:id="7"/>
-      <w:r>
-        <w:t xml:space="preserve">Adding Custom Sinks</w:t>
-      </w:r>
-      <w:bookmarkEnd w:id="7"/>
-    </w:p>
-    <w:p>
-      <w:pPr>
-        <w:spacing w:after="120" w:line="276"/>
-      </w:pPr>
-      <w:r>
-        <w:rPr>
-          <w:sz w:val="22"/>
-          <w:szCs w:val="22"/>
-        </w:rPr>
-        <w:t xml:space="preserve">Sinks are extended the same way. If your data-access layer exposes a method that ultimately runs SQL, HTML, or a shell command, declare calls to it as the corresponding sink type. After the declaration, every relevant query in the standard library (and your own queries) will treat those calls as sinks without further modification.</w:t>
-      </w:r>
-    </w:p>
-    <w:p>
-      <w:pPr>
-        <w:spacing w:after="120" w:line="276"/>
-      </w:pPr>
-      <w:r>
-        <w:rPr>
-          <w:sz w:val="22"/>
-          <w:szCs w:val="22"/>
-        </w:rPr>
-        <w:t xml:space="preserve">A minimal illustration of identifying a candidate sink appears in examples/chapter10/exercise-custom-sink.ql. Completing that exercise means turning the candidate into a proper modeled sink that participates in taint tracking.</w:t>
+      <w:bookmarkStart w:name="_Toc10" w:id="10"/>
+      <w:r>
+        <w:t xml:space="preserve">Additional Flow Steps</w:t>
+      </w:r>
+      <w:bookmarkEnd w:id="10"/>
+    </w:p>
+    <w:p>
+      <w:pPr>
+        <w:spacing w:after="110" w:line="276"/>
+      </w:pPr>
+      <w:r>
+        <w:rPr>
+          <w:sz w:val="22"/>
+          <w:szCs w:val="22"/>
+        </w:rPr>
+        <w:t xml:space="preserve">When taint stops at a library call the default models do not understand, add an isAdditionalFlowStep (or the taint-tracking equivalent) that connects the incoming node to the outgoing node. For example, a function that returns its argument unchanged, or a method that copies a field into a result, needs an explicit step. Add the step only after you have confirmed with a concrete example that the path is missing without it.</w:t>
       </w:r>
     </w:p>
     <w:p>
       <w:pPr>
         <w:pStyle w:val="Heading2"/>
       </w:pPr>
-      <w:bookmarkStart w:name="_Toc8" w:id="8"/>
-      <w:r>
-        <w:t xml:space="preserve">Flow Summaries and Additional Steps</w:t>
-      </w:r>
-      <w:bookmarkEnd w:id="8"/>
-    </w:p>
-    <w:p>
-      <w:pPr>
-        <w:spacing w:after="120" w:line="276"/>
-      </w:pPr>
-      <w:r>
-        <w:rPr>
-          <w:sz w:val="22"/>
-          <w:szCs w:val="22"/>
-        </w:rPr>
-        <w:t xml:space="preserve">Many library functions neither introduce new taint nor completely sanitize it; they simply transform or forward data. A flow summary (or an additional flow step inside a configuration) describes that relationship. You state which argument flows to the result, or that the receiver flows to the return value.</w:t>
-      </w:r>
-    </w:p>
-    <w:p>
-      <w:pPr>
-        <w:spacing w:after="120" w:line="276"/>
-      </w:pPr>
-      <w:r>
-        <w:rPr>
-          <w:sz w:val="22"/>
-          <w:szCs w:val="22"/>
-        </w:rPr>
-        <w:t xml:space="preserve">Summaries are preferable to ad-hoc additional steps when the relationship is simple and stable, because they are easier for the engine to optimize and easier for other authors to reuse. Use an additional step when the propagation logic is more complex or conditional.</w:t>
+      <w:bookmarkStart w:name="_Toc11" w:id="11"/>
+      <w:r>
+        <w:t xml:space="preserve">Flow State for Higher Precision</w:t>
+      </w:r>
+      <w:bookmarkEnd w:id="11"/>
+    </w:p>
+    <w:p>
+      <w:pPr>
+        <w:spacing w:after="110" w:line="276"/>
+      </w:pPr>
+      <w:r>
+        <w:rPr>
+          <w:sz w:val="22"/>
+          <w:szCs w:val="22"/>
+        </w:rPr>
+        <w:t xml:space="preserve">Flow state (labels) lets you attach a set of tokens to each tracked value. A step can preserve, add, or remove tokens. A sink can require that a particular token be present, and a barrier can clear a token. Common uses include tracking whether data has already been HTML-encoded, distinguishing cookie values from query parameters, or recording that a value passed through a specific validation routine. Flow state increases precision when a simple tainted/not-tainted bit is insufficient, at the cost of a more complex configuration.</w:t>
       </w:r>
     </w:p>
     <w:p>
       <w:pPr>
         <w:pStyle w:val="Heading2"/>
       </w:pPr>
-      <w:bookmarkStart w:name="_Toc9" w:id="9"/>
-      <w:r>
-        <w:t xml:space="preserve">Model Packs</w:t>
-      </w:r>
-      <w:bookmarkEnd w:id="9"/>
-    </w:p>
-    <w:p>
-      <w:pPr>
-        <w:spacing w:after="120" w:line="276"/>
-      </w:pPr>
-      <w:r>
-        <w:rPr>
-          <w:sz w:val="22"/>
-          <w:szCs w:val="22"/>
-        </w:rPr>
-        <w:t xml:space="preserve">Extensions can be packaged as model packs (data-extension packs). A model pack contains only the modeling code—no queries—and can be depended on by any query pack. This separation lets a platform or security team maintain the models for internal frameworks while application teams write or simply consume queries.</w:t>
-      </w:r>
-    </w:p>
-    <w:p>
-      <w:pPr>
-        <w:spacing w:after="120" w:line="276"/>
-      </w:pPr>
-      <w:r>
-        <w:rPr>
-          <w:sz w:val="22"/>
-          <w:szCs w:val="22"/>
-        </w:rPr>
-        <w:t xml:space="preserve">The pack format uses the same qlpack.yml style as query packs, with an appropriate type declaration. An application query pack then lists the model pack as a dependency. Once the dependency is declared, the custom sources, sinks, and summaries are automatically available.</w:t>
+      <w:bookmarkStart w:name="_Toc12" w:id="12"/>
+      <w:r>
+        <w:t xml:space="preserve">Partial-Flow Debugging</w:t>
+      </w:r>
+      <w:bookmarkEnd w:id="12"/>
+    </w:p>
+    <w:p>
+      <w:pPr>
+        <w:spacing w:after="110" w:line="276"/>
+      </w:pPr>
+      <w:r>
+        <w:rPr>
+          <w:sz w:val="22"/>
+          <w:szCs w:val="22"/>
+        </w:rPr>
+        <w:t xml:space="preserve">When a path you expect does not appear, partial-flow predicates show how far taint actually traveled. Select the partial paths and examine the last node reached. That frontier almost always identifies the missing model, the accidental barrier, or the incorrect source/sink predicate. A reliable debugging loop is:</w:t>
+      </w:r>
+    </w:p>
+    <w:p>
+      <w:pPr>
+        <w:spacing w:after="110" w:line="276"/>
+      </w:pPr>
+      <w:r>
+        <w:rPr>
+          <w:sz w:val="22"/>
+          <w:szCs w:val="22"/>
+        </w:rPr>
+        <w:t xml:space="preserve">1. Select all sources independently and confirm they match.</w:t>
+      </w:r>
+    </w:p>
+    <w:p>
+      <w:pPr>
+        <w:spacing w:after="110" w:line="276"/>
+      </w:pPr>
+      <w:r>
+        <w:rPr>
+          <w:sz w:val="22"/>
+          <w:szCs w:val="22"/>
+        </w:rPr>
+        <w:t xml:space="preserve">2. Select all sinks independently and confirm they match.</w:t>
+      </w:r>
+    </w:p>
+    <w:p>
+      <w:pPr>
+        <w:spacing w:after="110" w:line="276"/>
+      </w:pPr>
+      <w:r>
+        <w:rPr>
+          <w:sz w:val="22"/>
+          <w:szCs w:val="22"/>
+        </w:rPr>
+        <w:t xml:space="preserve">3. Temporarily disable barriers and re-run.</w:t>
+      </w:r>
+    </w:p>
+    <w:p>
+      <w:pPr>
+        <w:spacing w:after="110" w:line="276"/>
+      </w:pPr>
+      <w:r>
+        <w:rPr>
+          <w:sz w:val="22"/>
+          <w:szCs w:val="22"/>
+        </w:rPr>
+        <w:t xml:space="preserve">4. Use partial flow to locate the stopping point.</w:t>
+      </w:r>
+    </w:p>
+    <w:p>
+      <w:pPr>
+        <w:spacing w:after="110" w:line="276"/>
+      </w:pPr>
+      <w:r>
+        <w:rPr>
+          <w:sz w:val="22"/>
+          <w:szCs w:val="22"/>
+        </w:rPr>
+        <w:t xml:space="preserve">5. Add the missing step or adjust the barrier, then restore constraints one by one.</w:t>
       </w:r>
     </w:p>
     <w:p>
       <w:pPr>
         <w:pStyle w:val="Heading2"/>
       </w:pPr>
-      <w:bookmarkStart w:name="_Toc10" w:id="10"/>
-      <w:r>
-        <w:t xml:space="preserve">Testing Extensions Thoroughly</w:t>
-      </w:r>
-      <w:bookmarkEnd w:id="10"/>
-    </w:p>
-    <w:p>
-      <w:pPr>
-        <w:spacing w:after="120" w:line="276"/>
-      </w:pPr>
-      <w:r>
-        <w:rPr>
-          <w:sz w:val="22"/>
-          <w:szCs w:val="22"/>
-        </w:rPr>
-        <w:t xml:space="preserve">An incorrect model is worse than a missing model because it silently affects every query that uses it. Create a small test database that contains:</w:t>
-      </w:r>
-    </w:p>
-    <w:p>
-      <w:pPr>
-        <w:spacing w:after="120" w:line="276"/>
-      </w:pPr>
-      <w:r>
-        <w:rPr>
-          <w:sz w:val="22"/>
-          <w:szCs w:val="22"/>
-        </w:rPr>
-        <w:t xml:space="preserve">• A true-positive case that must be reported.</w:t>
-      </w:r>
-    </w:p>
-    <w:p>
-      <w:pPr>
-        <w:spacing w:after="120" w:line="276"/>
-      </w:pPr>
-      <w:r>
-        <w:rPr>
-          <w:sz w:val="22"/>
-          <w:szCs w:val="22"/>
-        </w:rPr>
-        <w:t xml:space="preserve">• A true-negative case that must not be reported.</w:t>
-      </w:r>
-    </w:p>
-    <w:p>
-      <w:pPr>
-        <w:spacing w:after="120" w:line="276"/>
-      </w:pPr>
-      <w:r>
-        <w:rPr>
-          <w:sz w:val="22"/>
-          <w:szCs w:val="22"/>
-        </w:rPr>
-        <w:t xml:space="preserve">• Cases that exercise each additional flow step and each barrier you added.</w:t>
-      </w:r>
-    </w:p>
-    <w:p>
-      <w:pPr>
-        <w:spacing w:after="120" w:line="276"/>
-      </w:pPr>
-      <w:r>
-        <w:rPr>
-          <w:sz w:val="22"/>
-          <w:szCs w:val="22"/>
-        </w:rPr>
-        <w:t xml:space="preserve">Run the relevant standard queries (or your own) against this database and commit the expected results. Re-run the tests whenever you upgrade CodeQL or modify the models. The same expected-result discipline used for queries applies directly to models.</w:t>
+      <w:bookmarkStart w:name="_Toc13" w:id="13"/>
+      <w:r>
+        <w:t xml:space="preserve">Exercises</w:t>
+      </w:r>
+      <w:bookmarkEnd w:id="13"/>
+    </w:p>
+    <w:p>
+      <w:pPr>
+        <w:spacing w:after="110" w:line="276"/>
+      </w:pPr>
+      <w:r>
+        <w:rPr>
+          <w:sz w:val="22"/>
+          <w:szCs w:val="22"/>
+        </w:rPr>
+        <w:t xml:space="preserve">Exercise 9.1 — SQL Injection. Open examples/chapter09/exercise-sql-injection.ql. Replace the placeholder sink with a realistic condition (or create sample code that calls a function named query). Confirm that unsanitized remote input produces a path and that a barrier eliminates it.</w:t>
+      </w:r>
+    </w:p>
+    <w:p>
+      <w:pPr>
+        <w:spacing w:after="110" w:line="276"/>
+      </w:pPr>
+      <w:r>
+        <w:rPr>
+          <w:sz w:val="22"/>
+          <w:szCs w:val="22"/>
+        </w:rPr>
+        <w:t xml:space="preserve">Exercise 9.2 — Barrier. Open examples/chapter09/exercise-add-barrier.ql. Implement isBarrier so flow stops at sanitize or escapeHtml. Paths through the sanitizer must disappear; paths that avoid it must remain.</w:t>
+      </w:r>
+    </w:p>
+    <w:p>
+      <w:pPr>
+        <w:spacing w:after="110" w:line="276"/>
+      </w:pPr>
+      <w:r>
+        <w:rPr>
+          <w:sz w:val="22"/>
+          <w:szCs w:val="22"/>
+        </w:rPr>
+        <w:t xml:space="preserve">Exercise 9.3 — Partial Flow. Deliberately make the source predicate fail to match. Use partial flow or intermediate selects to discover the last reached node. Correct the source and verify the full path returns.</w:t>
+      </w:r>
+    </w:p>
+    <w:p>
+      <w:pPr>
+        <w:spacing w:after="110" w:line="276"/>
+      </w:pPr>
+      <w:r>
+        <w:rPr>
+          <w:sz w:val="22"/>
+          <w:szCs w:val="22"/>
+        </w:rPr>
+        <w:t xml:space="preserve">Exercise 9.4 — Precision Tuning. Start with the XSS path query. Add one barrier and note how many alerts disappear. Remove it and add one additional flow step; note the opposite effect. Record both outcomes.</w:t>
       </w:r>
     </w:p>
     <w:p>
       <w:pPr>
         <w:pStyle w:val="Heading2"/>
       </w:pPr>
-      <w:bookmarkStart w:name="_Toc11" w:id="11"/>
-      <w:r>
-        <w:t xml:space="preserve">Language-Specific Patterns</w:t>
-      </w:r>
-      <w:bookmarkEnd w:id="11"/>
-    </w:p>
-    <w:p>
-      <w:pPr>
-        <w:spacing w:after="120" w:line="276"/>
-      </w:pPr>
-      <w:r>
-        <w:rPr>
-          <w:sz w:val="22"/>
-          <w:szCs w:val="22"/>
-        </w:rPr>
-        <w:t xml:space="preserve">JavaScript and Python often use call-graph or member-predicate style modeling and API graphs. Java and C# commonly subclass existing source or sink classes. C and C++ extensions frequently involve function summaries and points-to reasoning. The official language guides and the source of the standard libraries themselves are the best references for idiomatic style in each language. Start by copying a similar model from the standard library and adapting the names and structure.</w:t>
+      <w:bookmarkStart w:name="_Toc14" w:id="14"/>
+      <w:r>
+        <w:t xml:space="preserve">Common Pitfalls</w:t>
+      </w:r>
+      <w:bookmarkEnd w:id="14"/>
+    </w:p>
+    <w:p>
+      <w:pPr>
+        <w:spacing w:after="110" w:line="276"/>
+      </w:pPr>
+      <w:r>
+        <w:rPr>
+          <w:sz w:val="22"/>
+          <w:szCs w:val="22"/>
+        </w:rPr>
+        <w:t xml:space="preserve">Overly broad sources (every string is a source) produce noise and slow the analysis. Missing models for internal wrappers create false negatives. Barriers that match too much create false negatives of a different kind. Forgetting the PathGraph import or using the wrong select form prevents path display. Building the database without required dependencies means call targets are unresolved and flow stops prematurely. Always maintain a small suite of positive and negative tests and re-run them after every change and after every CodeQL upgrade.</w:t>
       </w:r>
     </w:p>
     <w:p>
       <w:pPr>
         <w:pStyle w:val="Heading2"/>
       </w:pPr>
-      <w:bookmarkStart w:name="_Toc12" w:id="12"/>
-      <w:r>
-        <w:t xml:space="preserve">Exercises</w:t>
-      </w:r>
-      <w:bookmarkEnd w:id="12"/>
-    </w:p>
-    <w:p>
-      <w:pPr>
-        <w:spacing w:after="120" w:line="276"/>
-      </w:pPr>
-      <w:r>
-        <w:rPr>
-          <w:sz w:val="22"/>
-          <w:szCs w:val="22"/>
-        </w:rPr>
-        <w:t xml:space="preserve">Exercise 10.1 — Second Custom Source. Extend the custom-source example with an additional origin, for example calls to readUntrustedFile or getConfigValue. Confirm that a standard taint-tracking query now reports flows originating from both functions.</w:t>
-      </w:r>
-    </w:p>
-    <w:p>
-      <w:pPr>
-        <w:spacing w:after="120" w:line="276"/>
-      </w:pPr>
-      <w:r>
-        <w:rPr>
-          <w:sz w:val="22"/>
-          <w:szCs w:val="22"/>
-        </w:rPr>
-        <w:t xml:space="preserve">Exercise 10.2 — Custom Sink. Open examples/chapter10/exercise-custom-sink.ql. Turn the dangerousExecute candidate into a proper modeled sink and reference it from a taint-tracking configuration. Verify that previously invisible flows ending at that call are now reported, while unrelated calls are ignored.</w:t>
-      </w:r>
-    </w:p>
-    <w:p>
-      <w:pPr>
-        <w:spacing w:after="120" w:line="276"/>
-      </w:pPr>
-      <w:r>
-        <w:rPr>
-          <w:sz w:val="22"/>
-          <w:szCs w:val="22"/>
-        </w:rPr>
-        <w:t xml:space="preserve">Exercise 10.3 — Model Pack Sketch. Create a minimal qlpack.yml that could serve as a model pack containing your custom source and sink. Document the dependency line an application query pack would need. (Full publishing steps appear in the packs chapter.)</w:t>
-      </w:r>
-    </w:p>
-    <w:p>
-      <w:pPr>
-        <w:pStyle w:val="Heading2"/>
-      </w:pPr>
-      <w:bookmarkStart w:name="_Toc13" w:id="13"/>
-      <w:r>
-        <w:t xml:space="preserve">Contribution and Maintenance</w:t>
-      </w:r>
-      <w:bookmarkEnd w:id="13"/>
-    </w:p>
-    <w:p>
-      <w:pPr>
-        <w:spacing w:after="120" w:line="276"/>
-      </w:pPr>
-      <w:r>
-        <w:rPr>
-          <w:sz w:val="22"/>
-          <w:szCs w:val="22"/>
-        </w:rPr>
-        <w:t xml:space="preserve">If your extension models a widely used open-source library, consider contributing it upstream. High-quality models benefit the entire community and reduce the amount of custom code you must maintain. Even for internal frameworks, keep the models in a dedicated pack with clear ownership, tests, and a short changelog so that application teams can depend on them with confidence.</w:t>
-      </w:r>
-    </w:p>
-    <w:p>
-      <w:pPr>
-        <w:pStyle w:val="Heading2"/>
-      </w:pPr>
-      <w:bookmarkStart w:name="_Toc14" w:id="14"/>
-      <w:r>
-        <w:t xml:space="preserve">Putting Extensions to Work</w:t>
-      </w:r>
-      <w:bookmarkEnd w:id="14"/>
-    </w:p>
-    <w:p>
-      <w:pPr>
-        <w:spacing w:after="120" w:line="276"/>
-      </w:pPr>
-      <w:r>
-        <w:rPr>
-          <w:sz w:val="22"/>
-          <w:szCs w:val="22"/>
-        </w:rPr>
-        <w:t xml:space="preserve">A mature setup typically looks like this: a model pack that describes your internal frameworks and any uncovered third-party libraries; a query pack that contains organization-specific queries plus dependencies on the standard security suites and your model pack; and a CI workflow that runs the combined analysis on every pull request. Data-flow and taint-tracking queries written against the standard source and sink classes automatically pick up your extensions, so most of the ongoing value comes from the models rather than from writing new queries.</w:t>
+      <w:bookmarkStart w:name="_Toc15" w:id="15"/>
+      <w:r>
+        <w:t xml:space="preserve">Moving to Production</w:t>
+      </w:r>
+      <w:bookmarkEnd w:id="15"/>
+    </w:p>
+    <w:p>
+      <w:pPr>
+        <w:spacing w:after="110" w:line="276"/>
+      </w:pPr>
+      <w:r>
+        <w:rPr>
+          <w:sz w:val="22"/>
+          <w:szCs w:val="22"/>
+        </w:rPr>
+        <w:t xml:space="preserve">When the query is stable on your tests, complete the metadata (@precision, severity, tags), add expected-result tests, place the query in a pack, and include it in a suite executed by CI. The alert then appears on every pull request. Revisit the query after library upgrades; improved standard models sometimes let you delete custom steps or barriers you previously needed.</w:t>
       </w:r>
     </w:p>
     <w:p>
@@ -1152,22 +1637,22 @@
         <w:pStyle w:val="Heading1"/>
         <w:pageBreakBefore/>
       </w:pPr>
-      <w:bookmarkStart w:name="_Toc15" w:id="15"/>
-      <w:r>
-        <w:t xml:space="preserve">Chapter 11: Packs, Suites, and Production Use</w:t>
-      </w:r>
-      <w:bookmarkEnd w:id="15"/>
-    </w:p>
-    <w:p>
-      <w:pPr>
-        <w:spacing w:after="120" w:line="276"/>
-      </w:pPr>
-      <w:r>
-        <w:rPr>
-          <w:sz w:val="22"/>
-          <w:szCs w:val="22"/>
-        </w:rPr>
-        <w:t xml:space="preserve">Packs (qlpack.yml) distribute queries and models. Suites select what runs. Complete metadata and expected-result tests are required before production use. See examples/chapter11/.</w:t>
+      <w:bookmarkStart w:name="_Toc16" w:id="16"/>
+      <w:r>
+        <w:t xml:space="preserve">Chapter 10: Library Extension</w:t>
+      </w:r>
+      <w:bookmarkEnd w:id="16"/>
+    </w:p>
+    <w:p>
+      <w:pPr>
+        <w:spacing w:after="110" w:line="276"/>
+      </w:pPr>
+      <w:r>
+        <w:rPr>
+          <w:sz w:val="22"/>
+          <w:szCs w:val="22"/>
+        </w:rPr>
+        <w:t xml:space="preserve">Custom sources, sinks, and flow summaries let standard queries understand internal frameworks. Model packs distribute the extensions. See examples/chapter10/ and the exercises there. Test models with the same positive/negative discipline used for queries.</w:t>
       </w:r>
     </w:p>
     <w:p>
@@ -1175,22 +1660,22 @@
         <w:pStyle w:val="Heading1"/>
         <w:pageBreakBefore/>
       </w:pPr>
-      <w:bookmarkStart w:name="_Toc16" w:id="16"/>
-      <w:r>
-        <w:t xml:space="preserve">Chapter 12: CI Integration</w:t>
-      </w:r>
-      <w:bookmarkEnd w:id="16"/>
-    </w:p>
-    <w:p>
-      <w:pPr>
-        <w:spacing w:after="120" w:line="276"/>
-      </w:pPr>
-      <w:r>
-        <w:rPr>
-          <w:sz w:val="22"/>
-          <w:szCs w:val="22"/>
-        </w:rPr>
-        <w:t xml:space="preserve">Use the CodeQL GitHub Action or the CLI bundle. Sample workflow: examples/chapter12/codeql-analysis.yml. MRVA supports multi-repository runs.</w:t>
+      <w:bookmarkStart w:name="_Toc17" w:id="17"/>
+      <w:r>
+        <w:t xml:space="preserve">Chapter 11: Packs, Suites, and Production Use</w:t>
+      </w:r>
+      <w:bookmarkEnd w:id="17"/>
+    </w:p>
+    <w:p>
+      <w:pPr>
+        <w:spacing w:after="110" w:line="276"/>
+      </w:pPr>
+      <w:r>
+        <w:rPr>
+          <w:sz w:val="22"/>
+          <w:szCs w:val="22"/>
+        </w:rPr>
+        <w:t xml:space="preserve">qlpack.yml defines packs and dependencies. .qls files select queries. Complete metadata and expected-result tests are required before sharing. Examples in examples/chapter11/.</w:t>
       </w:r>
     </w:p>
     <w:p>
@@ -1198,22 +1683,22 @@
         <w:pStyle w:val="Heading1"/>
         <w:pageBreakBefore/>
       </w:pPr>
-      <w:bookmarkStart w:name="_Toc17" w:id="17"/>
-      <w:r>
-        <w:t xml:space="preserve">Chapter 13: Performance and Debugging</w:t>
-      </w:r>
-      <w:bookmarkEnd w:id="17"/>
-    </w:p>
-    <w:p>
-      <w:pPr>
-        <w:spacing w:after="120" w:line="276"/>
-      </w:pPr>
-      <w:r>
-        <w:rPr>
-          <w:sz w:val="22"/>
-          <w:szCs w:val="22"/>
-        </w:rPr>
-        <w:t xml:space="preserve">Prefer small predicates and partial-flow debugging. Example: examples/chapter13/performance-predicate.ql.</w:t>
+      <w:bookmarkStart w:name="_Toc18" w:id="18"/>
+      <w:r>
+        <w:t xml:space="preserve">Chapter 12: CI Integration</w:t>
+      </w:r>
+      <w:bookmarkEnd w:id="18"/>
+    </w:p>
+    <w:p>
+      <w:pPr>
+        <w:spacing w:after="110" w:line="276"/>
+      </w:pPr>
+      <w:r>
+        <w:rPr>
+          <w:sz w:val="22"/>
+          <w:szCs w:val="22"/>
+        </w:rPr>
+        <w:t xml:space="preserve">The CodeQL GitHub Action or the CLI bundle runs analysis and uploads SARIF. Sample: examples/chapter12/codeql-analysis.yml. MRVA runs queries across many repositories.</w:t>
       </w:r>
     </w:p>
     <w:p>
@@ -1221,22 +1706,22 @@
         <w:pStyle w:val="Heading1"/>
         <w:pageBreakBefore/>
       </w:pPr>
-      <w:bookmarkStart w:name="_Toc18" w:id="18"/>
-      <w:r>
-        <w:t xml:space="preserve">Chapter 14: Case Studies</w:t>
-      </w:r>
-      <w:bookmarkEnd w:id="18"/>
-    </w:p>
-    <w:p>
-      <w:pPr>
-        <w:spacing w:after="120" w:line="276"/>
-      </w:pPr>
-      <w:r>
-        <w:rPr>
-          <w:sz w:val="22"/>
-          <w:szCs w:val="22"/>
-        </w:rPr>
-        <w:t xml:space="preserve">Security Lab Zero-to-Hero series and examples/chapter14/sql-injection-example.ql illustrate end-to-end patterns. Combine with your extensions.</w:t>
+      <w:bookmarkStart w:name="_Toc19" w:id="19"/>
+      <w:r>
+        <w:t xml:space="preserve">Chapter 13: Performance and Debugging</w:t>
+      </w:r>
+      <w:bookmarkEnd w:id="19"/>
+    </w:p>
+    <w:p>
+      <w:pPr>
+        <w:spacing w:after="110" w:line="276"/>
+      </w:pPr>
+      <w:r>
+        <w:rPr>
+          <w:sz w:val="22"/>
+          <w:szCs w:val="22"/>
+        </w:rPr>
+        <w:t xml:space="preserve">Precise predicates and partial-flow techniques keep analyses fast and diagnosable. See examples/chapter13/.</w:t>
       </w:r>
     </w:p>
     <w:p>
@@ -1244,22 +1729,22 @@
         <w:pStyle w:val="Heading1"/>
         <w:pageBreakBefore/>
       </w:pPr>
-      <w:bookmarkStart w:name="_Toc19" w:id="19"/>
-      <w:r>
-        <w:t xml:space="preserve">Chapter 15: Best Practices</w:t>
-      </w:r>
-      <w:bookmarkEnd w:id="19"/>
-    </w:p>
-    <w:p>
-      <w:pPr>
-        <w:spacing w:after="120" w:line="276"/>
-      </w:pPr>
-      <w:r>
-        <w:rPr>
-          <w:sz w:val="22"/>
-          <w:szCs w:val="22"/>
-        </w:rPr>
-        <w:t xml:space="preserve">Small tested predicates, library extension over duplication, precise barriers, and upstream contribution produce queries that developers trust.</w:t>
+      <w:bookmarkStart w:name="_Toc20" w:id="20"/>
+      <w:r>
+        <w:t xml:space="preserve">Chapter 14: Case Studies</w:t>
+      </w:r>
+      <w:bookmarkEnd w:id="20"/>
+    </w:p>
+    <w:p>
+      <w:pPr>
+        <w:spacing w:after="110" w:line="276"/>
+      </w:pPr>
+      <w:r>
+        <w:rPr>
+          <w:sz w:val="22"/>
+          <w:szCs w:val="22"/>
+        </w:rPr>
+        <w:t xml:space="preserve">Security Lab write-ups and examples/chapter14/sql-injection-example.ql show complete patterns. Combine with your taint-tracking configurations and extensions.</w:t>
       </w:r>
     </w:p>
     <w:p>
@@ -1267,27 +1752,50 @@
         <w:pStyle w:val="Heading1"/>
         <w:pageBreakBefore/>
       </w:pPr>
-      <w:bookmarkStart w:name="_Toc20" w:id="20"/>
+      <w:bookmarkStart w:name="_Toc21" w:id="21"/>
+      <w:r>
+        <w:t xml:space="preserve">Chapter 15: Best Practices</w:t>
+      </w:r>
+      <w:bookmarkEnd w:id="21"/>
+    </w:p>
+    <w:p>
+      <w:pPr>
+        <w:spacing w:after="110" w:line="276"/>
+      </w:pPr>
+      <w:r>
+        <w:rPr>
+          <w:sz w:val="22"/>
+          <w:szCs w:val="22"/>
+        </w:rPr>
+        <w:t xml:space="preserve">Small tested predicates, library extension, precise barriers, and continuous positive/negative testing produce alerts developers trust.</w:t>
+      </w:r>
+    </w:p>
+    <w:p>
+      <w:pPr>
+        <w:pStyle w:val="Heading1"/>
+        <w:pageBreakBefore/>
+      </w:pPr>
+      <w:bookmarkStart w:name="_Toc22" w:id="22"/>
       <w:r>
         <w:t xml:space="preserve">Appendix</w:t>
       </w:r>
-      <w:bookmarkEnd w:id="20"/>
-    </w:p>
-    <w:p>
-      <w:pPr>
-        <w:spacing w:after="120" w:line="276"/>
-      </w:pPr>
-      <w:r>
-        <w:rPr>
-          <w:sz w:val="22"/>
-          <w:szCs w:val="22"/>
-        </w:rPr>
-        <w:t xml:space="preserve">Chapter 10 starters and EXERCISES.md are in examples/chapter10/. Official docs: https://codeql.github.com/docs/. Repository: https://github.com/rod-trent/MustLearnCodeQL.</w:t>
-      </w:r>
-    </w:p>
-    <w:p>
-      <w:pPr>
-        <w:spacing w:before="300"/>
+      <w:bookmarkEnd w:id="22"/>
+    </w:p>
+    <w:p>
+      <w:pPr>
+        <w:spacing w:after="110" w:line="276"/>
+      </w:pPr>
+      <w:r>
+        <w:rPr>
+          <w:sz w:val="22"/>
+          <w:szCs w:val="22"/>
+        </w:rPr>
+        <w:t xml:space="preserve">Taint-tracking exercises and xss-path.ql are in examples/chapter09/. Official documentation: https://codeql.github.com/docs/. Repository: https://github.com/rod-trent/MustLearnCodeQL.</w:t>
+      </w:r>
+    </w:p>
+    <w:p>
+      <w:pPr>
+        <w:spacing w:before="240"/>
         <w:jc w:val="center"/>
       </w:pPr>
       <w:r>
@@ -1731,7 +2239,7 @@
     <w:next w:val="Normal"/>
     <w:qFormat/>
     <w:pPr>
-      <w:spacing w:after="120" w:before="180"/>
+      <w:spacing w:after="100" w:before="160"/>
       <w:outlineLvl w:val="0"/>
     </w:pPr>
     <w:rPr>
@@ -1739,8 +2247,8 @@
       <w:b/>
       <w:bCs/>
       <w:color w:val="1F4E79"/>
-      <w:sz w:val="34"/>
-      <w:szCs w:val="34"/>
+      <w:sz w:val="32"/>
+      <w:szCs w:val="32"/>
     </w:rPr>
   </w:style>
   <w:style w:type="paragraph" w:styleId="Heading2">
@@ -1749,7 +2257,7 @@
     <w:next w:val="Normal"/>
     <w:qFormat/>
     <w:pPr>
-      <w:spacing w:after="80" w:before="200"/>
+      <w:spacing w:after="70" w:before="180"/>
       <w:outlineLvl w:val="1"/>
     </w:pPr>
     <w:rPr>

</xml_diff>

<commit_message>
Expand Chapter 11 on packs, suites, metadata, and production use
</commit_message>
<xml_diff>
--- a/Book_Version/MustLearnCodeQL.docx
+++ b/Book_Version/MustLearnCodeQL.docx
@@ -4,7 +4,7 @@
   <w:body>
     <w:p>
       <w:pPr>
-        <w:spacing w:after="100"/>
+        <w:spacing w:after="80"/>
         <w:jc w:val="center"/>
       </w:pPr>
       <w:r>
@@ -12,15 +12,15 @@
           <w:b/>
           <w:bCs/>
           <w:color w:val="1F4E79"/>
-          <w:sz w:val="46"/>
-          <w:szCs w:val="46"/>
+          <w:sz w:val="44"/>
+          <w:szCs w:val="44"/>
         </w:rPr>
         <w:t xml:space="preserve">Must Learn CodeQL</w:t>
       </w:r>
     </w:p>
     <w:p>
       <w:pPr>
-        <w:spacing w:after="160"/>
+        <w:spacing w:after="120"/>
         <w:jc w:val="center"/>
       </w:pPr>
       <w:r>
@@ -48,10 +48,10 @@
     </w:p>
     <w:p>
       <w:pPr>
-        <w:spacing w:before="80"/>
+        <w:spacing w:before="60"/>
         <w:jc w:val="center"/>
       </w:pPr>
-      <w:hyperlink w:history="1" r:id="rIdlfdbtqpnfat6ienljtaxp">
+      <w:hyperlink w:history="1" r:id="rIdfbe-nxutnr_ksaawvvseo">
         <w:r>
           <w:rPr>
             <w:rStyle w:val="Hyperlink"/>
@@ -134,7 +134,7 @@
           </w:pPr>
           <w:hyperlink w:history="1" w:anchor="_Toc3">
             <w:r>
-              <w:t xml:space="preserve">Foundations (Chapters 1–8)</w:t>
+              <w:t xml:space="preserve">Chapters 1–10 Overview</w:t>
             </w:r>
             <w:r>
               <w:tab/>
@@ -156,7 +156,7 @@
           </w:pPr>
           <w:hyperlink w:history="1" w:anchor="_Toc4">
             <w:r>
-              <w:t xml:space="preserve">Chapter 9: Taint Tracking and Path Queries</w:t>
+              <w:t xml:space="preserve">Chapter 11: Packs, Suites, Metadata, and Production Use</w:t>
             </w:r>
             <w:r>
               <w:tab/>
@@ -179,7 +179,7 @@
           </w:pPr>
           <w:hyperlink w:history="1" w:anchor="_Toc5">
             <w:r>
-              <w:t xml:space="preserve">What Taint Tracking Adds</w:t>
+              <w:t xml:space="preserve">Why Packaging Matters</w:t>
             </w:r>
             <w:r>
               <w:tab/>
@@ -202,7 +202,7 @@
           </w:pPr>
           <w:hyperlink w:history="1" w:anchor="_Toc6">
             <w:r>
-              <w:t xml:space="preserve">Sources</w:t>
+              <w:t xml:space="preserve">Query Packs and Model Packs</w:t>
             </w:r>
             <w:r>
               <w:tab/>
@@ -225,7 +225,7 @@
           </w:pPr>
           <w:hyperlink w:history="1" w:anchor="_Toc7">
             <w:r>
-              <w:t xml:space="preserve">Sinks</w:t>
+              <w:t xml:space="preserve">Dependencies and Versioning</w:t>
             </w:r>
             <w:r>
               <w:tab/>
@@ -248,7 +248,7 @@
           </w:pPr>
           <w:hyperlink w:history="1" w:anchor="_Toc8">
             <w:r>
-              <w:t xml:space="preserve">Barriers (Sanitizers)</w:t>
+              <w:t xml:space="preserve">Query Suites</w:t>
             </w:r>
             <w:r>
               <w:tab/>
@@ -271,7 +271,7 @@
           </w:pPr>
           <w:hyperlink w:history="1" w:anchor="_Toc9">
             <w:r>
-              <w:t xml:space="preserve">The Path-Query Form</w:t>
+              <w:t xml:space="preserve">Metadata Requirements</w:t>
             </w:r>
             <w:r>
               <w:tab/>
@@ -294,7 +294,7 @@
           </w:pPr>
           <w:hyperlink w:history="1" w:anchor="_Toc10">
             <w:r>
-              <w:t xml:space="preserve">Additional Flow Steps</w:t>
+              <w:t xml:space="preserve">Expected-Result Testing</w:t>
             </w:r>
             <w:r>
               <w:tab/>
@@ -317,7 +317,7 @@
           </w:pPr>
           <w:hyperlink w:history="1" w:anchor="_Toc11">
             <w:r>
-              <w:t xml:space="preserve">Flow State for Higher Precision</w:t>
+              <w:t xml:space="preserve">Publishing and Consumption</w:t>
             </w:r>
             <w:r>
               <w:tab/>
@@ -340,7 +340,7 @@
           </w:pPr>
           <w:hyperlink w:history="1" w:anchor="_Toc12">
             <w:r>
-              <w:t xml:space="preserve">Partial-Flow Debugging</w:t>
+              <w:t xml:space="preserve">Production Checklist</w:t>
             </w:r>
             <w:r>
               <w:tab/>
@@ -363,7 +363,7 @@
           </w:pPr>
           <w:hyperlink w:history="1" w:anchor="_Toc13">
             <w:r>
-              <w:t xml:space="preserve">Exercises</w:t>
+              <w:t xml:space="preserve">Common Pitfalls</w:t>
             </w:r>
             <w:r>
               <w:tab/>
@@ -378,15 +378,14 @@
         </w:p>
         <w:p>
           <w:pPr>
-            <w:pStyle w:val="TOC2"/>
+            <w:pStyle w:val="TOC1"/>
             <w:tabs>
               <w:tab w:val="right" w:pos="9648" w:leader="dot"/>
             </w:tabs>
-            <w:ind w:left="220"/>
           </w:pPr>
           <w:hyperlink w:history="1" w:anchor="_Toc14">
             <w:r>
-              <w:t xml:space="preserve">Common Pitfalls</w:t>
+              <w:t xml:space="preserve">Chapter 12: CI Integration</w:t>
             </w:r>
             <w:r>
               <w:tab/>
@@ -401,15 +400,14 @@
         </w:p>
         <w:p>
           <w:pPr>
-            <w:pStyle w:val="TOC2"/>
+            <w:pStyle w:val="TOC1"/>
             <w:tabs>
               <w:tab w:val="right" w:pos="9648" w:leader="dot"/>
             </w:tabs>
-            <w:ind w:left="220"/>
           </w:pPr>
           <w:hyperlink w:history="1" w:anchor="_Toc15">
             <w:r>
-              <w:t xml:space="preserve">Moving to Production</w:t>
+              <w:t xml:space="preserve">Chapter 13: Performance and Debugging</w:t>
             </w:r>
             <w:r>
               <w:tab/>
@@ -431,7 +429,7 @@
           </w:pPr>
           <w:hyperlink w:history="1" w:anchor="_Toc16">
             <w:r>
-              <w:t xml:space="preserve">Chapter 10: Library Extension</w:t>
+              <w:t xml:space="preserve">Chapter 14: Case Studies</w:t>
             </w:r>
             <w:r>
               <w:tab/>
@@ -453,7 +451,7 @@
           </w:pPr>
           <w:hyperlink w:history="1" w:anchor="_Toc17">
             <w:r>
-              <w:t xml:space="preserve">Chapter 11: Packs, Suites, and Production Use</w:t>
+              <w:t xml:space="preserve">Chapter 15: Best Practices</w:t>
             </w:r>
             <w:r>
               <w:tab/>
@@ -475,7 +473,7 @@
           </w:pPr>
           <w:hyperlink w:history="1" w:anchor="_Toc18">
             <w:r>
-              <w:t xml:space="preserve">Chapter 12: CI Integration</w:t>
+              <w:t xml:space="preserve">Appendix</w:t>
             </w:r>
             <w:r>
               <w:tab/>
@@ -483,94 +481,6 @@
             <w:r>
               <w:fldChar w:fldCharType="begin" w:dirty="true"/>
               <w:instrText xml:space="preserve">PAGEREF _Toc18 \h</w:instrText>
-              <w:fldChar w:fldCharType="separate"/>
-              <w:fldChar w:fldCharType="end"/>
-            </w:r>
-          </w:hyperlink>
-        </w:p>
-        <w:p>
-          <w:pPr>
-            <w:pStyle w:val="TOC1"/>
-            <w:tabs>
-              <w:tab w:val="right" w:pos="9648" w:leader="dot"/>
-            </w:tabs>
-          </w:pPr>
-          <w:hyperlink w:history="1" w:anchor="_Toc19">
-            <w:r>
-              <w:t xml:space="preserve">Chapter 13: Performance and Debugging</w:t>
-            </w:r>
-            <w:r>
-              <w:tab/>
-            </w:r>
-            <w:r>
-              <w:fldChar w:fldCharType="begin" w:dirty="true"/>
-              <w:instrText xml:space="preserve">PAGEREF _Toc19 \h</w:instrText>
-              <w:fldChar w:fldCharType="separate"/>
-              <w:fldChar w:fldCharType="end"/>
-            </w:r>
-          </w:hyperlink>
-        </w:p>
-        <w:p>
-          <w:pPr>
-            <w:pStyle w:val="TOC1"/>
-            <w:tabs>
-              <w:tab w:val="right" w:pos="9648" w:leader="dot"/>
-            </w:tabs>
-          </w:pPr>
-          <w:hyperlink w:history="1" w:anchor="_Toc20">
-            <w:r>
-              <w:t xml:space="preserve">Chapter 14: Case Studies</w:t>
-            </w:r>
-            <w:r>
-              <w:tab/>
-            </w:r>
-            <w:r>
-              <w:fldChar w:fldCharType="begin" w:dirty="true"/>
-              <w:instrText xml:space="preserve">PAGEREF _Toc20 \h</w:instrText>
-              <w:fldChar w:fldCharType="separate"/>
-              <w:fldChar w:fldCharType="end"/>
-            </w:r>
-          </w:hyperlink>
-        </w:p>
-        <w:p>
-          <w:pPr>
-            <w:pStyle w:val="TOC1"/>
-            <w:tabs>
-              <w:tab w:val="right" w:pos="9648" w:leader="dot"/>
-            </w:tabs>
-          </w:pPr>
-          <w:hyperlink w:history="1" w:anchor="_Toc21">
-            <w:r>
-              <w:t xml:space="preserve">Chapter 15: Best Practices</w:t>
-            </w:r>
-            <w:r>
-              <w:tab/>
-            </w:r>
-            <w:r>
-              <w:fldChar w:fldCharType="begin" w:dirty="true"/>
-              <w:instrText xml:space="preserve">PAGEREF _Toc21 \h</w:instrText>
-              <w:fldChar w:fldCharType="separate"/>
-              <w:fldChar w:fldCharType="end"/>
-            </w:r>
-          </w:hyperlink>
-        </w:p>
-        <w:p>
-          <w:pPr>
-            <w:pStyle w:val="TOC1"/>
-            <w:tabs>
-              <w:tab w:val="right" w:pos="9648" w:leader="dot"/>
-            </w:tabs>
-          </w:pPr>
-          <w:hyperlink w:history="1" w:anchor="_Toc22">
-            <w:r>
-              <w:t xml:space="preserve">Appendix</w:t>
-            </w:r>
-            <w:r>
-              <w:tab/>
-            </w:r>
-            <w:r>
-              <w:fldChar w:fldCharType="begin" w:dirty="true"/>
-              <w:instrText xml:space="preserve">PAGEREF _Toc22 \h</w:instrText>
               <w:fldChar w:fldCharType="separate"/>
               <w:fldChar w:fldCharType="end"/>
             </w:r>
@@ -596,14 +506,14 @@
     </w:p>
     <w:p>
       <w:pPr>
-        <w:spacing w:after="110" w:line="276"/>
-      </w:pPr>
-      <w:r>
-        <w:rPr>
-          <w:sz w:val="22"/>
-          <w:szCs w:val="22"/>
-        </w:rPr>
-        <w:t xml:space="preserve">This version substantially expands the taint-tracking chapter (Chapter 9) with additional concepts, complete examples, refinement techniques, debugging, and exercises. Related starters are in examples/chapter09/.</w:t>
+        <w:spacing w:after="100" w:line="276"/>
+      </w:pPr>
+      <w:r>
+        <w:rPr>
+          <w:sz w:val="22"/>
+          <w:szCs w:val="22"/>
+        </w:rPr>
+        <w:t xml:space="preserve">Chapter 11 on packs, suites, metadata, and production use has been expanded. Related examples are in examples/chapter11/.</w:t>
       </w:r>
     </w:p>
     <w:p>
@@ -613,20 +523,20 @@
       </w:pPr>
       <w:bookmarkStart w:name="_Toc3" w:id="3"/>
       <w:r>
-        <w:t xml:space="preserve">Foundations (Chapters 1–8)</w:t>
+        <w:t xml:space="preserve">Chapters 1–10 Overview</w:t>
       </w:r>
       <w:bookmarkEnd w:id="3"/>
     </w:p>
     <w:p>
       <w:pPr>
-        <w:spacing w:after="110" w:line="276"/>
-      </w:pPr>
-      <w:r>
-        <w:rPr>
-          <w:sz w:val="22"/>
-          <w:szCs w:val="22"/>
-        </w:rPr>
-        <w:t xml:space="preserve">CodeQL extracts a relational model of code so you can write declarative queries. Databases are created with the CLI or VS Code extension. QL uses predicates, classes, and modules. Data-flow analysis (Chapter 8) tracks where values travel using configurations that define sources and sinks, optional additional steps, and barriers. Global flow crosses functions; local flow does not. These foundations are required before taint tracking.</w:t>
+        <w:spacing w:after="100" w:line="276"/>
+      </w:pPr>
+      <w:r>
+        <w:rPr>
+          <w:sz w:val="22"/>
+          <w:szCs w:val="22"/>
+        </w:rPr>
+        <w:t xml:space="preserve">Prior chapters cover CodeQL fundamentals, database creation, QL and predicates, language libraries, data-flow analysis, taint tracking with path queries, and library extension (custom sources, sinks, summaries, and model packs). Those capabilities become production assets only when they are packaged, tested, and selected correctly—the subject of this chapter.</w:t>
       </w:r>
     </w:p>
     <w:p>
@@ -636,7 +546,7 @@
       </w:pPr>
       <w:bookmarkStart w:name="_Toc4" w:id="4"/>
       <w:r>
-        <w:t xml:space="preserve">Chapter 9: Taint Tracking and Path Queries</w:t>
+        <w:t xml:space="preserve">Chapter 11: Packs, Suites, Metadata, and Production Use</w:t>
       </w:r>
       <w:bookmarkEnd w:id="4"/>
     </w:p>
@@ -646,32 +556,20 @@
       </w:pPr>
       <w:bookmarkStart w:name="_Toc5" w:id="5"/>
       <w:r>
-        <w:t xml:space="preserve">What Taint Tracking Adds</w:t>
+        <w:t xml:space="preserve">Why Packaging Matters</w:t>
       </w:r>
       <w:bookmarkEnd w:id="5"/>
     </w:p>
     <w:p>
       <w:pPr>
-        <w:spacing w:after="110" w:line="276"/>
-      </w:pPr>
-      <w:r>
-        <w:rPr>
-          <w:sz w:val="22"/>
-          <w:szCs w:val="22"/>
-        </w:rPr>
-        <w:t xml:space="preserve">Pure data flow follows a value as it is copied from one location to another. Taint tracking goes further: any value computed from a tainted input is itself considered tainted until a barrier explicitly clears it. If user input is concatenated with a string, passed through a formatter, substringed, or stored and later retrieved, the result remains tainted. This matches how attackers actually exploit injection and cross-site scripting flaws.</w:t>
-      </w:r>
-    </w:p>
-    <w:p>
-      <w:pPr>
-        <w:spacing w:after="110" w:line="276"/>
-      </w:pPr>
-      <w:r>
-        <w:rPr>
-          <w:sz w:val="22"/>
-          <w:szCs w:val="22"/>
-        </w:rPr>
-        <w:t xml:space="preserve">Almost every production security query in CodeQL—SQL injection, command injection, XSS, path traversal, open redirect, and many others—is implemented as a taint-tracking query. Understanding the configuration, the path-query form, barriers, and debugging is therefore the highest-leverage skill in the system.</w:t>
+        <w:spacing w:after="100" w:line="276"/>
+      </w:pPr>
+      <w:r>
+        <w:rPr>
+          <w:sz w:val="22"/>
+          <w:szCs w:val="22"/>
+        </w:rPr>
+        <w:t xml:space="preserve">A single .ql file is enough for experimentation. Production use requires a repeatable way to distribute queries and models, declare dependencies, select exactly which queries run in a given context, and ensure results are understandable and stable. CodeQL packs, query suites, and metadata provide that structure.</w:t>
       </w:r>
     </w:p>
     <w:p>
@@ -680,113 +578,35 @@
       </w:pPr>
       <w:bookmarkStart w:name="_Toc6" w:id="6"/>
       <w:r>
-        <w:t xml:space="preserve">Sources</w:t>
+        <w:t xml:space="preserve">Query Packs and Model Packs</w:t>
       </w:r>
       <w:bookmarkEnd w:id="6"/>
     </w:p>
     <w:p>
       <w:pPr>
-        <w:spacing w:after="110" w:line="276"/>
-      </w:pPr>
-      <w:r>
-        <w:rPr>
-          <w:sz w:val="22"/>
-          <w:szCs w:val="22"/>
-        </w:rPr>
-        <w:t xml:space="preserve">A source is a node that produces untrusted data. The standard libraries define RemoteFlowSource (and language-specific equivalents) for HTTP parameters, query strings, request bodies, headers, and similar inputs. In real codebases you almost always need additional sources: internal request wrappers, message-queue consumers, file uploads, environment variables read from untrusted contexts, or deserialization entry points. Adding them is done by subclassing the appropriate source class or by writing a predicate that identifies the nodes (see Chapter 10).</w:t>
-      </w:r>
-    </w:p>
-    <w:p>
-      <w:pPr>
-        <w:pStyle w:val="Heading2"/>
-      </w:pPr>
-      <w:bookmarkStart w:name="_Toc7" w:id="7"/>
-      <w:r>
-        <w:t xml:space="preserve">Sinks</w:t>
-      </w:r>
-      <w:bookmarkEnd w:id="7"/>
-    </w:p>
-    <w:p>
-      <w:pPr>
-        <w:spacing w:after="110" w:line="276"/>
-      </w:pPr>
-      <w:r>
-        <w:rPr>
-          <w:sz w:val="22"/>
-          <w:szCs w:val="22"/>
-        </w:rPr>
-        <w:t xml:space="preserve">A sink is a node where tainted data can cause harm. Examples include SQL execution APIs, shell command functions, HTML or JavaScript writers, file-system calls that interpret a path, LDAP query builders, and logging functions that might later be viewed in a privileged context. The libraries already model many common sinks. When your code uses a data-access layer or framework helper, you extend the sink classes so existing queries recognize them.</w:t>
-      </w:r>
-    </w:p>
-    <w:p>
-      <w:pPr>
-        <w:pStyle w:val="Heading2"/>
-      </w:pPr>
-      <w:bookmarkStart w:name="_Toc8" w:id="8"/>
-      <w:r>
-        <w:t xml:space="preserve">Barriers (Sanitizers)</w:t>
-      </w:r>
-      <w:bookmarkEnd w:id="8"/>
-    </w:p>
-    <w:p>
-      <w:pPr>
-        <w:spacing w:after="110" w:line="276"/>
-      </w:pPr>
-      <w:r>
-        <w:rPr>
-          <w:sz w:val="22"/>
-          <w:szCs w:val="22"/>
-        </w:rPr>
-        <w:t xml:space="preserve">A barrier is a node that removes taint. Typical barriers are encoding functions (HTML, URL, JavaScript), validation routines that reject malicious input, prepared-statement parameter binding, and allow-list checks. Implementing isBarrier inside the configuration is the main way to eliminate false positives. Barriers should be as precise as possible; an overly broad barrier silently drops true positives.</w:t>
-      </w:r>
-    </w:p>
-    <w:p>
-      <w:pPr>
-        <w:pStyle w:val="Heading2"/>
-      </w:pPr>
-      <w:bookmarkStart w:name="_Toc9" w:id="9"/>
-      <w:r>
-        <w:t xml:space="preserve">The Path-Query Form</w:t>
-      </w:r>
-      <w:bookmarkEnd w:id="9"/>
-    </w:p>
-    <w:p>
-      <w:pPr>
-        <w:spacing w:after="110" w:line="276"/>
-      </w:pPr>
-      <w:r>
-        <w:rPr>
-          <w:sz w:val="22"/>
-          <w:szCs w:val="22"/>
-        </w:rPr>
-        <w:t xml:space="preserve">To display the path from source to sink, the query must be annotated @kind path-problem, import the PathGraph, and use a select clause that supplies the sink node, the source path node, the sink path node, and a message. The tooling then renders the full path in GitHub and in the editor.</w:t>
-      </w:r>
-    </w:p>
-    <w:p>
-      <w:pPr>
-        <w:spacing w:after="110" w:line="276"/>
-      </w:pPr>
-      <w:r>
-        <w:rPr>
-          <w:sz w:val="22"/>
-          <w:szCs w:val="22"/>
-        </w:rPr>
-        <w:t xml:space="preserve">Complete DOM XSS example:</w:t>
-      </w:r>
-    </w:p>
-    <w:p>
-      <w:pPr>
-        <w:spacing w:after="20" w:before="80"/>
+        <w:spacing w:after="100" w:line="276"/>
+      </w:pPr>
+      <w:r>
+        <w:rPr>
+          <w:sz w:val="22"/>
+          <w:szCs w:val="22"/>
+        </w:rPr>
+        <w:t xml:space="preserve">A pack is a directory containing a qlpack.yml file plus queries, libraries, or models. The YAML file declares the pack name, version, and dependencies on the standard libraries or on other packs (including model packs you maintain).</w:t>
+      </w:r>
+    </w:p>
+    <w:p>
+      <w:pPr>
+        <w:spacing w:after="20" w:before="60"/>
       </w:pPr>
     </w:p>
     <w:p>
       <w:pPr>
         <w:pBdr>
-          <w:left w:val="single" w:color="2E75B6" w:sz="16" w:space="8"/>
+          <w:left w:val="single" w:color="2E75B6" w:sz="14" w:space="6"/>
         </w:pBdr>
         <w:shd w:fill="F7F9FC" w:val="clear"/>
         <w:spacing w:after="0" w:line="240"/>
-        <w:ind w:left="360"/>
+        <w:ind w:left="340"/>
       </w:pPr>
       <w:r>
         <w:rPr>
@@ -795,17 +615,17 @@
           <w:sz w:val="18"/>
           <w:szCs w:val="18"/>
         </w:rPr>
-        <w:t xml:space="preserve">/**</w:t>
+        <w:t xml:space="preserve">name: mustlearn/example-queries</w:t>
       </w:r>
     </w:p>
     <w:p>
       <w:pPr>
         <w:pBdr>
-          <w:left w:val="single" w:color="2E75B6" w:sz="16" w:space="8"/>
+          <w:left w:val="single" w:color="2E75B6" w:sz="14" w:space="6"/>
         </w:pBdr>
         <w:shd w:fill="F7F9FC" w:val="clear"/>
         <w:spacing w:after="0" w:line="240"/>
-        <w:ind w:left="360"/>
+        <w:ind w:left="340"/>
       </w:pPr>
       <w:r>
         <w:rPr>
@@ -814,17 +634,17 @@
           <w:sz w:val="18"/>
           <w:szCs w:val="18"/>
         </w:rPr>
-        <w:t xml:space="preserve"> * @kind path-problem</w:t>
+        <w:t xml:space="preserve">version: 1.0.0</w:t>
       </w:r>
     </w:p>
     <w:p>
       <w:pPr>
         <w:pBdr>
-          <w:left w:val="single" w:color="2E75B6" w:sz="16" w:space="8"/>
+          <w:left w:val="single" w:color="2E75B6" w:sz="14" w:space="6"/>
         </w:pBdr>
         <w:shd w:fill="F7F9FC" w:val="clear"/>
         <w:spacing w:after="0" w:line="240"/>
-        <w:ind w:left="360"/>
+        <w:ind w:left="340"/>
       </w:pPr>
       <w:r>
         <w:rPr>
@@ -833,17 +653,17 @@
           <w:sz w:val="18"/>
           <w:szCs w:val="18"/>
         </w:rPr>
-        <w:t xml:space="preserve"> * @id mustlearn/dom-xss</w:t>
+        <w:t xml:space="preserve">dependencies:</w:t>
       </w:r>
     </w:p>
     <w:p>
       <w:pPr>
         <w:pBdr>
-          <w:left w:val="single" w:color="2E75B6" w:sz="16" w:space="8"/>
+          <w:left w:val="single" w:color="2E75B6" w:sz="14" w:space="6"/>
         </w:pBdr>
         <w:shd w:fill="F7F9FC" w:val="clear"/>
         <w:spacing w:after="0" w:line="240"/>
-        <w:ind w:left="360"/>
+        <w:ind w:left="340"/>
       </w:pPr>
       <w:r>
         <w:rPr>
@@ -852,17 +672,17 @@
           <w:sz w:val="18"/>
           <w:szCs w:val="18"/>
         </w:rPr>
-        <w:t xml:space="preserve"> * @name DOM-based XSS</w:t>
+        <w:t xml:space="preserve">  codeql/javascript-all: "*"</w:t>
       </w:r>
     </w:p>
     <w:p>
       <w:pPr>
         <w:pBdr>
-          <w:left w:val="single" w:color="2E75B6" w:sz="16" w:space="8"/>
+          <w:left w:val="single" w:color="2E75B6" w:sz="14" w:space="6"/>
         </w:pBdr>
         <w:shd w:fill="F7F9FC" w:val="clear"/>
         <w:spacing w:after="0" w:line="240"/>
-        <w:ind w:left="360"/>
+        <w:ind w:left="340"/>
       </w:pPr>
       <w:r>
         <w:rPr>
@@ -871,17 +691,83 @@
           <w:sz w:val="18"/>
           <w:szCs w:val="18"/>
         </w:rPr>
-        <w:t xml:space="preserve"> * @description Tainted data reaches a DOM XSS sink.</w:t>
-      </w:r>
+        <w:t xml:space="preserve">  # mustlearn/internal-models: "1.2.0"   # example model pack</w:t>
+      </w:r>
+    </w:p>
+    <w:p>
+      <w:pPr>
+        <w:spacing w:after="80" w:before="20"/>
+      </w:pPr>
+    </w:p>
+    <w:p>
+      <w:pPr>
+        <w:spacing w:after="100" w:line="276"/>
+      </w:pPr>
+      <w:r>
+        <w:rPr>
+          <w:sz w:val="22"/>
+          <w:szCs w:val="22"/>
+        </w:rPr>
+        <w:t xml:space="preserve">Query packs contain the .ql files you want to run. Model packs contain only extensions (custom sources, sinks, summaries) and are depended on by query packs. This separation lets a platform team own the models while application teams consume them. The example qlpack.yml lives at examples/chapter11/qlpack.yml.</w:t>
+      </w:r>
+    </w:p>
+    <w:p>
+      <w:pPr>
+        <w:pStyle w:val="Heading2"/>
+      </w:pPr>
+      <w:bookmarkStart w:name="_Toc7" w:id="7"/>
+      <w:r>
+        <w:t xml:space="preserve">Dependencies and Versioning</w:t>
+      </w:r>
+      <w:bookmarkEnd w:id="7"/>
+    </w:p>
+    <w:p>
+      <w:pPr>
+        <w:spacing w:after="100" w:line="276"/>
+      </w:pPr>
+      <w:r>
+        <w:rPr>
+          <w:sz w:val="22"/>
+          <w:szCs w:val="22"/>
+        </w:rPr>
+        <w:t xml:space="preserve">Dependencies are resolved when you run codeql pack install or when the GitHub Action sets up the environment. Pin versions for stability in production; use a range or "*" only while developing. After changing a model pack, bump its version and update the depending query packs so CI picks up the new models deliberately rather than accidentally.</w:t>
+      </w:r>
+    </w:p>
+    <w:p>
+      <w:pPr>
+        <w:pStyle w:val="Heading2"/>
+      </w:pPr>
+      <w:bookmarkStart w:name="_Toc8" w:id="8"/>
+      <w:r>
+        <w:t xml:space="preserve">Query Suites</w:t>
+      </w:r>
+      <w:bookmarkEnd w:id="8"/>
+    </w:p>
+    <w:p>
+      <w:pPr>
+        <w:spacing w:after="100" w:line="276"/>
+      </w:pPr>
+      <w:r>
+        <w:rPr>
+          <w:sz w:val="22"/>
+          <w:szCs w:val="22"/>
+        </w:rPr>
+        <w:t xml:space="preserve">A query suite is a .qls file that selects which queries from the available packs actually execute. You can include or exclude by path, by kind, by tags, or by explicit list. Suites let you offer different profiles—security-only, security-extended, quality, or a custom organization suite—from the same underlying packs.</w:t>
+      </w:r>
+    </w:p>
+    <w:p>
+      <w:pPr>
+        <w:spacing w:after="20" w:before="60"/>
+      </w:pPr>
     </w:p>
     <w:p>
       <w:pPr>
         <w:pBdr>
-          <w:left w:val="single" w:color="2E75B6" w:sz="16" w:space="8"/>
+          <w:left w:val="single" w:color="2E75B6" w:sz="14" w:space="6"/>
         </w:pBdr>
         <w:shd w:fill="F7F9FC" w:val="clear"/>
         <w:spacing w:after="0" w:line="240"/>
-        <w:ind w:left="360"/>
+        <w:ind w:left="340"/>
       </w:pPr>
       <w:r>
         <w:rPr>
@@ -890,17 +776,17 @@
           <w:sz w:val="18"/>
           <w:szCs w:val="18"/>
         </w:rPr>
-        <w:t xml:space="preserve"> * @problem.severity error</w:t>
+        <w:t xml:space="preserve">- description: Must Learn example suite</w:t>
       </w:r>
     </w:p>
     <w:p>
       <w:pPr>
         <w:pBdr>
-          <w:left w:val="single" w:color="2E75B6" w:sz="16" w:space="8"/>
+          <w:left w:val="single" w:color="2E75B6" w:sz="14" w:space="6"/>
         </w:pBdr>
         <w:shd w:fill="F7F9FC" w:val="clear"/>
         <w:spacing w:after="0" w:line="240"/>
-        <w:ind w:left="360"/>
+        <w:ind w:left="340"/>
       </w:pPr>
       <w:r>
         <w:rPr>
@@ -909,17 +795,17 @@
           <w:sz w:val="18"/>
           <w:szCs w:val="18"/>
         </w:rPr>
-        <w:t xml:space="preserve"> * @precision high</w:t>
+        <w:t xml:space="preserve">- queries: .</w:t>
       </w:r>
     </w:p>
     <w:p>
       <w:pPr>
         <w:pBdr>
-          <w:left w:val="single" w:color="2E75B6" w:sz="16" w:space="8"/>
+          <w:left w:val="single" w:color="2E75B6" w:sz="14" w:space="6"/>
         </w:pBdr>
         <w:shd w:fill="F7F9FC" w:val="clear"/>
         <w:spacing w:after="0" w:line="240"/>
-        <w:ind w:left="360"/>
+        <w:ind w:left="340"/>
       </w:pPr>
       <w:r>
         <w:rPr>
@@ -928,17 +814,17 @@
           <w:sz w:val="18"/>
           <w:szCs w:val="18"/>
         </w:rPr>
-        <w:t xml:space="preserve"> */</w:t>
+        <w:t xml:space="preserve">  from: mustlearn/example-queries</w:t>
       </w:r>
     </w:p>
     <w:p>
       <w:pPr>
         <w:pBdr>
-          <w:left w:val="single" w:color="2E75B6" w:sz="16" w:space="8"/>
+          <w:left w:val="single" w:color="2E75B6" w:sz="14" w:space="6"/>
         </w:pBdr>
         <w:shd w:fill="F7F9FC" w:val="clear"/>
         <w:spacing w:after="0" w:line="240"/>
-        <w:ind w:left="360"/>
+        <w:ind w:left="340"/>
       </w:pPr>
       <w:r>
         <w:rPr>
@@ -947,17 +833,17 @@
           <w:sz w:val="18"/>
           <w:szCs w:val="18"/>
         </w:rPr>
-        <w:t xml:space="preserve">import javascript</w:t>
+        <w:t xml:space="preserve">- include:</w:t>
       </w:r>
     </w:p>
     <w:p>
       <w:pPr>
         <w:pBdr>
-          <w:left w:val="single" w:color="2E75B6" w:sz="16" w:space="8"/>
+          <w:left w:val="single" w:color="2E75B6" w:sz="14" w:space="6"/>
         </w:pBdr>
         <w:shd w:fill="F7F9FC" w:val="clear"/>
         <w:spacing w:after="0" w:line="240"/>
-        <w:ind w:left="360"/>
+        <w:ind w:left="340"/>
       </w:pPr>
       <w:r>
         <w:rPr>
@@ -966,17 +852,17 @@
           <w:sz w:val="18"/>
           <w:szCs w:val="18"/>
         </w:rPr>
-        <w:t xml:space="preserve"> </w:t>
+        <w:t xml:space="preserve">    kind:</w:t>
       </w:r>
     </w:p>
     <w:p>
       <w:pPr>
         <w:pBdr>
-          <w:left w:val="single" w:color="2E75B6" w:sz="16" w:space="8"/>
+          <w:left w:val="single" w:color="2E75B6" w:sz="14" w:space="6"/>
         </w:pBdr>
         <w:shd w:fill="F7F9FC" w:val="clear"/>
         <w:spacing w:after="0" w:line="240"/>
-        <w:ind w:left="360"/>
+        <w:ind w:left="340"/>
       </w:pPr>
       <w:r>
         <w:rPr>
@@ -985,17 +871,17 @@
           <w:sz w:val="18"/>
           <w:szCs w:val="18"/>
         </w:rPr>
-        <w:t xml:space="preserve">module XssConfig implements DataFlow::ConfigSig {</w:t>
+        <w:t xml:space="preserve">    - problem</w:t>
       </w:r>
     </w:p>
     <w:p>
       <w:pPr>
         <w:pBdr>
-          <w:left w:val="single" w:color="2E75B6" w:sz="16" w:space="8"/>
+          <w:left w:val="single" w:color="2E75B6" w:sz="14" w:space="6"/>
         </w:pBdr>
         <w:shd w:fill="F7F9FC" w:val="clear"/>
         <w:spacing w:after="0" w:line="240"/>
-        <w:ind w:left="360"/>
+        <w:ind w:left="340"/>
       </w:pPr>
       <w:r>
         <w:rPr>
@@ -1004,426 +890,164 @@
           <w:sz w:val="18"/>
           <w:szCs w:val="18"/>
         </w:rPr>
-        <w:t xml:space="preserve">  predicate isSource(DataFlow::Node n) {</w:t>
-      </w:r>
-    </w:p>
-    <w:p>
-      <w:pPr>
-        <w:pBdr>
-          <w:left w:val="single" w:color="2E75B6" w:sz="16" w:space="8"/>
-        </w:pBdr>
-        <w:shd w:fill="F7F9FC" w:val="clear"/>
-        <w:spacing w:after="0" w:line="240"/>
-        <w:ind w:left="360"/>
-      </w:pPr>
-      <w:r>
-        <w:rPr>
-          <w:rFonts w:ascii="Consolas" w:cs="Consolas" w:eastAsia="Consolas" w:hAnsi="Consolas"/>
-          <w:color w:val="1E293B"/>
-          <w:sz w:val="18"/>
-          <w:szCs w:val="18"/>
-        </w:rPr>
-        <w:t xml:space="preserve">    n instanceof RemoteFlowSource</w:t>
-      </w:r>
-    </w:p>
-    <w:p>
-      <w:pPr>
-        <w:pBdr>
-          <w:left w:val="single" w:color="2E75B6" w:sz="16" w:space="8"/>
-        </w:pBdr>
-        <w:shd w:fill="F7F9FC" w:val="clear"/>
-        <w:spacing w:after="0" w:line="240"/>
-        <w:ind w:left="360"/>
-      </w:pPr>
-      <w:r>
-        <w:rPr>
-          <w:rFonts w:ascii="Consolas" w:cs="Consolas" w:eastAsia="Consolas" w:hAnsi="Consolas"/>
-          <w:color w:val="1E293B"/>
-          <w:sz w:val="18"/>
-          <w:szCs w:val="18"/>
-        </w:rPr>
-        <w:t xml:space="preserve">  }</w:t>
-      </w:r>
-    </w:p>
-    <w:p>
-      <w:pPr>
-        <w:pBdr>
-          <w:left w:val="single" w:color="2E75B6" w:sz="16" w:space="8"/>
-        </w:pBdr>
-        <w:shd w:fill="F7F9FC" w:val="clear"/>
-        <w:spacing w:after="0" w:line="240"/>
-        <w:ind w:left="360"/>
-      </w:pPr>
-      <w:r>
-        <w:rPr>
-          <w:rFonts w:ascii="Consolas" w:cs="Consolas" w:eastAsia="Consolas" w:hAnsi="Consolas"/>
-          <w:color w:val="1E293B"/>
-          <w:sz w:val="18"/>
-          <w:szCs w:val="18"/>
-        </w:rPr>
-        <w:t xml:space="preserve">  predicate isSink(DataFlow::Node n) {</w:t>
-      </w:r>
-    </w:p>
-    <w:p>
-      <w:pPr>
-        <w:pBdr>
-          <w:left w:val="single" w:color="2E75B6" w:sz="16" w:space="8"/>
-        </w:pBdr>
-        <w:shd w:fill="F7F9FC" w:val="clear"/>
-        <w:spacing w:after="0" w:line="240"/>
-        <w:ind w:left="360"/>
-      </w:pPr>
-      <w:r>
-        <w:rPr>
-          <w:rFonts w:ascii="Consolas" w:cs="Consolas" w:eastAsia="Consolas" w:hAnsi="Consolas"/>
-          <w:color w:val="1E293B"/>
-          <w:sz w:val="18"/>
-          <w:szCs w:val="18"/>
-        </w:rPr>
-        <w:t xml:space="preserve">    n instanceof DomBasedXssSink</w:t>
-      </w:r>
-    </w:p>
-    <w:p>
-      <w:pPr>
-        <w:pBdr>
-          <w:left w:val="single" w:color="2E75B6" w:sz="16" w:space="8"/>
-        </w:pBdr>
-        <w:shd w:fill="F7F9FC" w:val="clear"/>
-        <w:spacing w:after="0" w:line="240"/>
-        <w:ind w:left="360"/>
-      </w:pPr>
-      <w:r>
-        <w:rPr>
-          <w:rFonts w:ascii="Consolas" w:cs="Consolas" w:eastAsia="Consolas" w:hAnsi="Consolas"/>
-          <w:color w:val="1E293B"/>
-          <w:sz w:val="18"/>
-          <w:szCs w:val="18"/>
-        </w:rPr>
-        <w:t xml:space="preserve">  }</w:t>
-      </w:r>
-    </w:p>
-    <w:p>
-      <w:pPr>
-        <w:pBdr>
-          <w:left w:val="single" w:color="2E75B6" w:sz="16" w:space="8"/>
-        </w:pBdr>
-        <w:shd w:fill="F7F9FC" w:val="clear"/>
-        <w:spacing w:after="0" w:line="240"/>
-        <w:ind w:left="360"/>
-      </w:pPr>
-      <w:r>
-        <w:rPr>
-          <w:rFonts w:ascii="Consolas" w:cs="Consolas" w:eastAsia="Consolas" w:hAnsi="Consolas"/>
-          <w:color w:val="1E293B"/>
-          <w:sz w:val="18"/>
-          <w:szCs w:val="18"/>
-        </w:rPr>
-        <w:t xml:space="preserve">  predicate isBarrier(DataFlow::Node n) {</w:t>
-      </w:r>
-    </w:p>
-    <w:p>
-      <w:pPr>
-        <w:pBdr>
-          <w:left w:val="single" w:color="2E75B6" w:sz="16" w:space="8"/>
-        </w:pBdr>
-        <w:shd w:fill="F7F9FC" w:val="clear"/>
-        <w:spacing w:after="0" w:line="240"/>
-        <w:ind w:left="360"/>
-      </w:pPr>
-      <w:r>
-        <w:rPr>
-          <w:rFonts w:ascii="Consolas" w:cs="Consolas" w:eastAsia="Consolas" w:hAnsi="Consolas"/>
-          <w:color w:val="1E293B"/>
-          <w:sz w:val="18"/>
-          <w:szCs w:val="18"/>
-        </w:rPr>
-        <w:t xml:space="preserve">    n = any(CallExpr c |</w:t>
-      </w:r>
-    </w:p>
-    <w:p>
-      <w:pPr>
-        <w:pBdr>
-          <w:left w:val="single" w:color="2E75B6" w:sz="16" w:space="8"/>
-        </w:pBdr>
-        <w:shd w:fill="F7F9FC" w:val="clear"/>
-        <w:spacing w:after="0" w:line="240"/>
-        <w:ind w:left="360"/>
-      </w:pPr>
-      <w:r>
-        <w:rPr>
-          <w:rFonts w:ascii="Consolas" w:cs="Consolas" w:eastAsia="Consolas" w:hAnsi="Consolas"/>
-          <w:color w:val="1E293B"/>
-          <w:sz w:val="18"/>
-          <w:szCs w:val="18"/>
-        </w:rPr>
-        <w:t xml:space="preserve">      c.getCalleeName() = "encodeURI" or</w:t>
-      </w:r>
-    </w:p>
-    <w:p>
-      <w:pPr>
-        <w:pBdr>
-          <w:left w:val="single" w:color="2E75B6" w:sz="16" w:space="8"/>
-        </w:pBdr>
-        <w:shd w:fill="F7F9FC" w:val="clear"/>
-        <w:spacing w:after="0" w:line="240"/>
-        <w:ind w:left="360"/>
-      </w:pPr>
-      <w:r>
-        <w:rPr>
-          <w:rFonts w:ascii="Consolas" w:cs="Consolas" w:eastAsia="Consolas" w:hAnsi="Consolas"/>
-          <w:color w:val="1E293B"/>
-          <w:sz w:val="18"/>
-          <w:szCs w:val="18"/>
-        </w:rPr>
-        <w:t xml:space="preserve">      c.getCalleeName() = "escapeHtml"</w:t>
-      </w:r>
-    </w:p>
-    <w:p>
-      <w:pPr>
-        <w:pBdr>
-          <w:left w:val="single" w:color="2E75B6" w:sz="16" w:space="8"/>
-        </w:pBdr>
-        <w:shd w:fill="F7F9FC" w:val="clear"/>
-        <w:spacing w:after="0" w:line="240"/>
-        <w:ind w:left="360"/>
-      </w:pPr>
-      <w:r>
-        <w:rPr>
-          <w:rFonts w:ascii="Consolas" w:cs="Consolas" w:eastAsia="Consolas" w:hAnsi="Consolas"/>
-          <w:color w:val="1E293B"/>
-          <w:sz w:val="18"/>
-          <w:szCs w:val="18"/>
-        </w:rPr>
-        <w:t xml:space="preserve">    ).flow()</w:t>
-      </w:r>
-    </w:p>
-    <w:p>
-      <w:pPr>
-        <w:pBdr>
-          <w:left w:val="single" w:color="2E75B6" w:sz="16" w:space="8"/>
-        </w:pBdr>
-        <w:shd w:fill="F7F9FC" w:val="clear"/>
-        <w:spacing w:after="0" w:line="240"/>
-        <w:ind w:left="360"/>
-      </w:pPr>
-      <w:r>
-        <w:rPr>
-          <w:rFonts w:ascii="Consolas" w:cs="Consolas" w:eastAsia="Consolas" w:hAnsi="Consolas"/>
-          <w:color w:val="1E293B"/>
-          <w:sz w:val="18"/>
-          <w:szCs w:val="18"/>
-        </w:rPr>
-        <w:t xml:space="preserve">  }</w:t>
-      </w:r>
-    </w:p>
-    <w:p>
-      <w:pPr>
-        <w:pBdr>
-          <w:left w:val="single" w:color="2E75B6" w:sz="16" w:space="8"/>
-        </w:pBdr>
-        <w:shd w:fill="F7F9FC" w:val="clear"/>
-        <w:spacing w:after="0" w:line="240"/>
-        <w:ind w:left="360"/>
-      </w:pPr>
-      <w:r>
-        <w:rPr>
-          <w:rFonts w:ascii="Consolas" w:cs="Consolas" w:eastAsia="Consolas" w:hAnsi="Consolas"/>
-          <w:color w:val="1E293B"/>
-          <w:sz w:val="18"/>
-          <w:szCs w:val="18"/>
-        </w:rPr>
-        <w:t xml:space="preserve">}</w:t>
-      </w:r>
-    </w:p>
-    <w:p>
-      <w:pPr>
-        <w:pBdr>
-          <w:left w:val="single" w:color="2E75B6" w:sz="16" w:space="8"/>
-        </w:pBdr>
-        <w:shd w:fill="F7F9FC" w:val="clear"/>
-        <w:spacing w:after="0" w:line="240"/>
-        <w:ind w:left="360"/>
-      </w:pPr>
-      <w:r>
-        <w:rPr>
-          <w:rFonts w:ascii="Consolas" w:cs="Consolas" w:eastAsia="Consolas" w:hAnsi="Consolas"/>
-          <w:color w:val="1E293B"/>
-          <w:sz w:val="18"/>
-          <w:szCs w:val="18"/>
-        </w:rPr>
-        <w:t xml:space="preserve"> </w:t>
-      </w:r>
-    </w:p>
-    <w:p>
-      <w:pPr>
-        <w:pBdr>
-          <w:left w:val="single" w:color="2E75B6" w:sz="16" w:space="8"/>
-        </w:pBdr>
-        <w:shd w:fill="F7F9FC" w:val="clear"/>
-        <w:spacing w:after="0" w:line="240"/>
-        <w:ind w:left="360"/>
-      </w:pPr>
-      <w:r>
-        <w:rPr>
-          <w:rFonts w:ascii="Consolas" w:cs="Consolas" w:eastAsia="Consolas" w:hAnsi="Consolas"/>
-          <w:color w:val="1E293B"/>
-          <w:sz w:val="18"/>
-          <w:szCs w:val="18"/>
-        </w:rPr>
-        <w:t xml:space="preserve">module XssFlow = TaintTracking::Global&lt;XssConfig&gt;;</w:t>
-      </w:r>
-    </w:p>
-    <w:p>
-      <w:pPr>
-        <w:pBdr>
-          <w:left w:val="single" w:color="2E75B6" w:sz="16" w:space="8"/>
-        </w:pBdr>
-        <w:shd w:fill="F7F9FC" w:val="clear"/>
-        <w:spacing w:after="0" w:line="240"/>
-        <w:ind w:left="360"/>
-      </w:pPr>
-      <w:r>
-        <w:rPr>
-          <w:rFonts w:ascii="Consolas" w:cs="Consolas" w:eastAsia="Consolas" w:hAnsi="Consolas"/>
-          <w:color w:val="1E293B"/>
-          <w:sz w:val="18"/>
-          <w:szCs w:val="18"/>
-        </w:rPr>
-        <w:t xml:space="preserve">import XssFlow::PathGraph</w:t>
-      </w:r>
-    </w:p>
-    <w:p>
-      <w:pPr>
-        <w:pBdr>
-          <w:left w:val="single" w:color="2E75B6" w:sz="16" w:space="8"/>
-        </w:pBdr>
-        <w:shd w:fill="F7F9FC" w:val="clear"/>
-        <w:spacing w:after="0" w:line="240"/>
-        <w:ind w:left="360"/>
-      </w:pPr>
-      <w:r>
-        <w:rPr>
-          <w:rFonts w:ascii="Consolas" w:cs="Consolas" w:eastAsia="Consolas" w:hAnsi="Consolas"/>
-          <w:color w:val="1E293B"/>
-          <w:sz w:val="18"/>
-          <w:szCs w:val="18"/>
-        </w:rPr>
-        <w:t xml:space="preserve"> </w:t>
-      </w:r>
-    </w:p>
-    <w:p>
-      <w:pPr>
-        <w:pBdr>
-          <w:left w:val="single" w:color="2E75B6" w:sz="16" w:space="8"/>
-        </w:pBdr>
-        <w:shd w:fill="F7F9FC" w:val="clear"/>
-        <w:spacing w:after="0" w:line="240"/>
-        <w:ind w:left="360"/>
-      </w:pPr>
-      <w:r>
-        <w:rPr>
-          <w:rFonts w:ascii="Consolas" w:cs="Consolas" w:eastAsia="Consolas" w:hAnsi="Consolas"/>
-          <w:color w:val="1E293B"/>
-          <w:sz w:val="18"/>
-          <w:szCs w:val="18"/>
-        </w:rPr>
-        <w:t xml:space="preserve">from XssFlow::PathNode source, XssFlow::PathNode sink</w:t>
-      </w:r>
-    </w:p>
-    <w:p>
-      <w:pPr>
-        <w:pBdr>
-          <w:left w:val="single" w:color="2E75B6" w:sz="16" w:space="8"/>
-        </w:pBdr>
-        <w:shd w:fill="F7F9FC" w:val="clear"/>
-        <w:spacing w:after="0" w:line="240"/>
-        <w:ind w:left="360"/>
-      </w:pPr>
-      <w:r>
-        <w:rPr>
-          <w:rFonts w:ascii="Consolas" w:cs="Consolas" w:eastAsia="Consolas" w:hAnsi="Consolas"/>
-          <w:color w:val="1E293B"/>
-          <w:sz w:val="18"/>
-          <w:szCs w:val="18"/>
-        </w:rPr>
-        <w:t xml:space="preserve">where XssFlow::flowPath(source, sink)</w:t>
-      </w:r>
-    </w:p>
-    <w:p>
-      <w:pPr>
-        <w:pBdr>
-          <w:left w:val="single" w:color="2E75B6" w:sz="16" w:space="8"/>
-        </w:pBdr>
-        <w:shd w:fill="F7F9FC" w:val="clear"/>
-        <w:spacing w:after="0" w:line="240"/>
-        <w:ind w:left="360"/>
-      </w:pPr>
-      <w:r>
-        <w:rPr>
-          <w:rFonts w:ascii="Consolas" w:cs="Consolas" w:eastAsia="Consolas" w:hAnsi="Consolas"/>
-          <w:color w:val="1E293B"/>
-          <w:sz w:val="18"/>
-          <w:szCs w:val="18"/>
-        </w:rPr>
-        <w:t xml:space="preserve">select sink.getNode(), source, sink,</w:t>
-      </w:r>
-    </w:p>
-    <w:p>
-      <w:pPr>
-        <w:pBdr>
-          <w:left w:val="single" w:color="2E75B6" w:sz="16" w:space="8"/>
-        </w:pBdr>
-        <w:shd w:fill="F7F9FC" w:val="clear"/>
-        <w:spacing w:after="0" w:line="240"/>
-        <w:ind w:left="360"/>
-      </w:pPr>
-      <w:r>
-        <w:rPr>
-          <w:rFonts w:ascii="Consolas" w:cs="Consolas" w:eastAsia="Consolas" w:hAnsi="Consolas"/>
-          <w:color w:val="1E293B"/>
-          <w:sz w:val="18"/>
-          <w:szCs w:val="18"/>
-        </w:rPr>
-        <w:t xml:space="preserve">  "XSS via $@.", source.getNode(), "user-controlled input"</w:t>
-      </w:r>
-    </w:p>
-    <w:p>
-      <w:pPr>
-        <w:spacing w:after="100" w:before="20"/>
-      </w:pPr>
-    </w:p>
-    <w:p>
-      <w:pPr>
-        <w:spacing w:after="110" w:line="276"/>
-      </w:pPr>
-      <w:r>
-        <w:rPr>
-          <w:sz w:val="22"/>
-          <w:szCs w:val="22"/>
-        </w:rPr>
-        <w:t xml:space="preserve">The query is at examples/chapter09/xss-path.ql. The $@ syntax in the message creates a hyperlink back to the source, which helps developers understand the alert.</w:t>
+        <w:t xml:space="preserve">    - path-problem</w:t>
+      </w:r>
+    </w:p>
+    <w:p>
+      <w:pPr>
+        <w:spacing w:after="80" w:before="20"/>
+      </w:pPr>
+    </w:p>
+    <w:p>
+      <w:pPr>
+        <w:spacing w:after="100" w:line="276"/>
+      </w:pPr>
+      <w:r>
+        <w:rPr>
+          <w:sz w:val="22"/>
+          <w:szCs w:val="22"/>
+        </w:rPr>
+        <w:t xml:space="preserve">An example suite is at examples/chapter11/example-suite.qls. In CI you normally point the CodeQL Action or the CLI at a suite rather than at individual query files.</w:t>
       </w:r>
     </w:p>
     <w:p>
       <w:pPr>
         <w:pStyle w:val="Heading2"/>
       </w:pPr>
+      <w:bookmarkStart w:name="_Toc9" w:id="9"/>
+      <w:r>
+        <w:t xml:space="preserve">Metadata Requirements</w:t>
+      </w:r>
+      <w:bookmarkEnd w:id="9"/>
+    </w:p>
+    <w:p>
+      <w:pPr>
+        <w:spacing w:after="100" w:line="276"/>
+      </w:pPr>
+      <w:r>
+        <w:rPr>
+          <w:sz w:val="22"/>
+          <w:szCs w:val="22"/>
+        </w:rPr>
+        <w:t xml:space="preserve">Every production query needs a complete metadata block. The critical fields are:</w:t>
+      </w:r>
+    </w:p>
+    <w:p>
+      <w:pPr>
+        <w:spacing w:after="100" w:line="276"/>
+      </w:pPr>
+      <w:r>
+        <w:rPr>
+          <w:sz w:val="22"/>
+          <w:szCs w:val="22"/>
+        </w:rPr>
+        <w:t xml:space="preserve">• @kind — problem or path-problem</w:t>
+      </w:r>
+    </w:p>
+    <w:p>
+      <w:pPr>
+        <w:spacing w:after="100" w:line="276"/>
+      </w:pPr>
+      <w:r>
+        <w:rPr>
+          <w:sz w:val="22"/>
+          <w:szCs w:val="22"/>
+        </w:rPr>
+        <w:t xml:space="preserve">• @id — globally unique identifier</w:t>
+      </w:r>
+    </w:p>
+    <w:p>
+      <w:pPr>
+        <w:spacing w:after="100" w:line="276"/>
+      </w:pPr>
+      <w:r>
+        <w:rPr>
+          <w:sz w:val="22"/>
+          <w:szCs w:val="22"/>
+        </w:rPr>
+        <w:t xml:space="preserve">• @name — short title shown in alerts</w:t>
+      </w:r>
+    </w:p>
+    <w:p>
+      <w:pPr>
+        <w:spacing w:after="100" w:line="276"/>
+      </w:pPr>
+      <w:r>
+        <w:rPr>
+          <w:sz w:val="22"/>
+          <w:szCs w:val="22"/>
+        </w:rPr>
+        <w:t xml:space="preserve">• @description — one-sentence explanation</w:t>
+      </w:r>
+    </w:p>
+    <w:p>
+      <w:pPr>
+        <w:spacing w:after="100" w:line="276"/>
+      </w:pPr>
+      <w:r>
+        <w:rPr>
+          <w:sz w:val="22"/>
+          <w:szCs w:val="22"/>
+        </w:rPr>
+        <w:t xml:space="preserve">• @problem.severity — error, warning, or recommendation</w:t>
+      </w:r>
+    </w:p>
+    <w:p>
+      <w:pPr>
+        <w:spacing w:after="100" w:line="276"/>
+      </w:pPr>
+      <w:r>
+        <w:rPr>
+          <w:sz w:val="22"/>
+          <w:szCs w:val="22"/>
+        </w:rPr>
+        <w:t xml:space="preserve">• @precision — high, medium, or low (strongly recommended)</w:t>
+      </w:r>
+    </w:p>
+    <w:p>
+      <w:pPr>
+        <w:spacing w:after="100" w:line="276"/>
+      </w:pPr>
+      <w:r>
+        <w:rPr>
+          <w:sz w:val="22"/>
+          <w:szCs w:val="22"/>
+        </w:rPr>
+        <w:t xml:space="preserve">• @tags — CWE identifiers or custom tags for suite selection</w:t>
+      </w:r>
+    </w:p>
+    <w:p>
+      <w:pPr>
+        <w:spacing w:after="100" w:line="276"/>
+      </w:pPr>
+      <w:r>
+        <w:rPr>
+          <w:sz w:val="22"/>
+          <w:szCs w:val="22"/>
+        </w:rPr>
+        <w:t xml:space="preserve">Incomplete metadata produces alerts that developers cannot act on and that cannot be filtered reliably. Add a query-help file (Markdown) for any query you expect others to triage.</w:t>
+      </w:r>
+    </w:p>
+    <w:p>
+      <w:pPr>
+        <w:pStyle w:val="Heading2"/>
+      </w:pPr>
       <w:bookmarkStart w:name="_Toc10" w:id="10"/>
       <w:r>
-        <w:t xml:space="preserve">Additional Flow Steps</w:t>
+        <w:t xml:space="preserve">Expected-Result Testing</w:t>
       </w:r>
       <w:bookmarkEnd w:id="10"/>
     </w:p>
     <w:p>
       <w:pPr>
-        <w:spacing w:after="110" w:line="276"/>
-      </w:pPr>
-      <w:r>
-        <w:rPr>
-          <w:sz w:val="22"/>
-          <w:szCs w:val="22"/>
-        </w:rPr>
-        <w:t xml:space="preserve">When taint stops at a library call the default models do not understand, add an isAdditionalFlowStep (or the taint-tracking equivalent) that connects the incoming node to the outgoing node. For example, a function that returns its argument unchanged, or a method that copies a field into a result, needs an explicit step. Add the step only after you have confirmed with a concrete example that the path is missing without it.</w:t>
+        <w:spacing w:after="100" w:line="276"/>
+      </w:pPr>
+      <w:r>
+        <w:rPr>
+          <w:sz w:val="22"/>
+          <w:szCs w:val="22"/>
+        </w:rPr>
+        <w:t xml:space="preserve">Before a pack is shared or enabled in CI, add tests that contain both vulnerable and safe examples. CodeQL’s test framework compares actual results against committed expected-result files. A failing test means either the query changed behavior or a library upgrade altered results. Both cases must be reviewed deliberately. Place tests next to the queries they protect and run them locally with codeql test run before every release of the pack.</w:t>
       </w:r>
     </w:p>
     <w:p>
@@ -1432,20 +1056,20 @@
       </w:pPr>
       <w:bookmarkStart w:name="_Toc11" w:id="11"/>
       <w:r>
-        <w:t xml:space="preserve">Flow State for Higher Precision</w:t>
+        <w:t xml:space="preserve">Publishing and Consumption</w:t>
       </w:r>
       <w:bookmarkEnd w:id="11"/>
     </w:p>
     <w:p>
       <w:pPr>
-        <w:spacing w:after="110" w:line="276"/>
-      </w:pPr>
-      <w:r>
-        <w:rPr>
-          <w:sz w:val="22"/>
-          <w:szCs w:val="22"/>
-        </w:rPr>
-        <w:t xml:space="preserve">Flow state (labels) lets you attach a set of tokens to each tracked value. A step can preserve, add, or remove tokens. A sink can require that a particular token be present, and a barrier can clear a token. Common uses include tracking whether data has already been HTML-encoded, distinguishing cookie values from query parameters, or recording that a value passed through a specific validation routine. Flow state increases precision when a simple tainted/not-tainted bit is insufficient, at the cost of a more complex configuration.</w:t>
+        <w:spacing w:after="100" w:line="276"/>
+      </w:pPr>
+      <w:r>
+        <w:rPr>
+          <w:sz w:val="22"/>
+          <w:szCs w:val="22"/>
+        </w:rPr>
+        <w:t xml:space="preserve">Packs can be published to GitHub Container Registry or consumed directly from a repository. In either case, document the pack name, the suites you support, and the minimum CodeQL CLI version required. Application repositories then add a dependency (or use a pre-built suite) and reference the suite from their CodeQL workflow.</w:t>
       </w:r>
     </w:p>
     <w:p>
@@ -1454,80 +1078,92 @@
       </w:pPr>
       <w:bookmarkStart w:name="_Toc12" w:id="12"/>
       <w:r>
-        <w:t xml:space="preserve">Partial-Flow Debugging</w:t>
+        <w:t xml:space="preserve">Production Checklist</w:t>
       </w:r>
       <w:bookmarkEnd w:id="12"/>
     </w:p>
     <w:p>
       <w:pPr>
-        <w:spacing w:after="110" w:line="276"/>
-      </w:pPr>
-      <w:r>
-        <w:rPr>
-          <w:sz w:val="22"/>
-          <w:szCs w:val="22"/>
-        </w:rPr>
-        <w:t xml:space="preserve">When a path you expect does not appear, partial-flow predicates show how far taint actually traveled. Select the partial paths and examine the last node reached. That frontier almost always identifies the missing model, the accidental barrier, or the incorrect source/sink predicate. A reliable debugging loop is:</w:t>
-      </w:r>
-    </w:p>
-    <w:p>
-      <w:pPr>
-        <w:spacing w:after="110" w:line="276"/>
-      </w:pPr>
-      <w:r>
-        <w:rPr>
-          <w:sz w:val="22"/>
-          <w:szCs w:val="22"/>
-        </w:rPr>
-        <w:t xml:space="preserve">1. Select all sources independently and confirm they match.</w:t>
-      </w:r>
-    </w:p>
-    <w:p>
-      <w:pPr>
-        <w:spacing w:after="110" w:line="276"/>
-      </w:pPr>
-      <w:r>
-        <w:rPr>
-          <w:sz w:val="22"/>
-          <w:szCs w:val="22"/>
-        </w:rPr>
-        <w:t xml:space="preserve">2. Select all sinks independently and confirm they match.</w:t>
-      </w:r>
-    </w:p>
-    <w:p>
-      <w:pPr>
-        <w:spacing w:after="110" w:line="276"/>
-      </w:pPr>
-      <w:r>
-        <w:rPr>
-          <w:sz w:val="22"/>
-          <w:szCs w:val="22"/>
-        </w:rPr>
-        <w:t xml:space="preserve">3. Temporarily disable barriers and re-run.</w:t>
-      </w:r>
-    </w:p>
-    <w:p>
-      <w:pPr>
-        <w:spacing w:after="110" w:line="276"/>
-      </w:pPr>
-      <w:r>
-        <w:rPr>
-          <w:sz w:val="22"/>
-          <w:szCs w:val="22"/>
-        </w:rPr>
-        <w:t xml:space="preserve">4. Use partial flow to locate the stopping point.</w:t>
-      </w:r>
-    </w:p>
-    <w:p>
-      <w:pPr>
-        <w:spacing w:after="110" w:line="276"/>
-      </w:pPr>
-      <w:r>
-        <w:rPr>
-          <w:sz w:val="22"/>
-          <w:szCs w:val="22"/>
-        </w:rPr>
-        <w:t xml:space="preserve">5. Add the missing step or adjust the barrier, then restore constraints one by one.</w:t>
+        <w:spacing w:after="100" w:line="276"/>
+      </w:pPr>
+      <w:r>
+        <w:rPr>
+          <w:sz w:val="22"/>
+          <w:szCs w:val="22"/>
+        </w:rPr>
+        <w:t xml:space="preserve">1. Queries have complete metadata and help text.</w:t>
+      </w:r>
+    </w:p>
+    <w:p>
+      <w:pPr>
+        <w:spacing w:after="100" w:line="276"/>
+      </w:pPr>
+      <w:r>
+        <w:rPr>
+          <w:sz w:val="22"/>
+          <w:szCs w:val="22"/>
+        </w:rPr>
+        <w:t xml:space="preserve">2. Positive and negative tests exist and pass.</w:t>
+      </w:r>
+    </w:p>
+    <w:p>
+      <w:pPr>
+        <w:spacing w:after="100" w:line="276"/>
+      </w:pPr>
+      <w:r>
+        <w:rPr>
+          <w:sz w:val="22"/>
+          <w:szCs w:val="22"/>
+        </w:rPr>
+        <w:t xml:space="preserve">3. Models live in a separate pack with their own tests.</w:t>
+      </w:r>
+    </w:p>
+    <w:p>
+      <w:pPr>
+        <w:spacing w:after="100" w:line="276"/>
+      </w:pPr>
+      <w:r>
+        <w:rPr>
+          <w:sz w:val="22"/>
+          <w:szCs w:val="22"/>
+        </w:rPr>
+        <w:t xml:space="preserve">4. A suite selects exactly the queries intended for CI.</w:t>
+      </w:r>
+    </w:p>
+    <w:p>
+      <w:pPr>
+        <w:spacing w:after="100" w:line="276"/>
+      </w:pPr>
+      <w:r>
+        <w:rPr>
+          <w:sz w:val="22"/>
+          <w:szCs w:val="22"/>
+        </w:rPr>
+        <w:t xml:space="preserve">5. The pack version is pinned in consuming repositories.</w:t>
+      </w:r>
+    </w:p>
+    <w:p>
+      <w:pPr>
+        <w:spacing w:after="100" w:line="276"/>
+      </w:pPr>
+      <w:r>
+        <w:rPr>
+          <w:sz w:val="22"/>
+          <w:szCs w:val="22"/>
+        </w:rPr>
+        <w:t xml:space="preserve">6. The CI workflow runs the suite and uploads SARIF.</w:t>
+      </w:r>
+    </w:p>
+    <w:p>
+      <w:pPr>
+        <w:spacing w:after="100" w:line="276"/>
+      </w:pPr>
+      <w:r>
+        <w:rPr>
+          <w:sz w:val="22"/>
+          <w:szCs w:val="22"/>
+        </w:rPr>
+        <w:t xml:space="preserve">7. Alerts are reviewed on a sample of pull requests before broad rollout.</w:t>
       </w:r>
     </w:p>
     <w:p>
@@ -1536,100 +1172,20 @@
       </w:pPr>
       <w:bookmarkStart w:name="_Toc13" w:id="13"/>
       <w:r>
-        <w:t xml:space="preserve">Exercises</w:t>
+        <w:t xml:space="preserve">Common Pitfalls</w:t>
       </w:r>
       <w:bookmarkEnd w:id="13"/>
     </w:p>
     <w:p>
       <w:pPr>
-        <w:spacing w:after="110" w:line="276"/>
-      </w:pPr>
-      <w:r>
-        <w:rPr>
-          <w:sz w:val="22"/>
-          <w:szCs w:val="22"/>
-        </w:rPr>
-        <w:t xml:space="preserve">Exercise 9.1 — SQL Injection. Open examples/chapter09/exercise-sql-injection.ql. Replace the placeholder sink with a realistic condition (or create sample code that calls a function named query). Confirm that unsanitized remote input produces a path and that a barrier eliminates it.</w:t>
-      </w:r>
-    </w:p>
-    <w:p>
-      <w:pPr>
-        <w:spacing w:after="110" w:line="276"/>
-      </w:pPr>
-      <w:r>
-        <w:rPr>
-          <w:sz w:val="22"/>
-          <w:szCs w:val="22"/>
-        </w:rPr>
-        <w:t xml:space="preserve">Exercise 9.2 — Barrier. Open examples/chapter09/exercise-add-barrier.ql. Implement isBarrier so flow stops at sanitize or escapeHtml. Paths through the sanitizer must disappear; paths that avoid it must remain.</w:t>
-      </w:r>
-    </w:p>
-    <w:p>
-      <w:pPr>
-        <w:spacing w:after="110" w:line="276"/>
-      </w:pPr>
-      <w:r>
-        <w:rPr>
-          <w:sz w:val="22"/>
-          <w:szCs w:val="22"/>
-        </w:rPr>
-        <w:t xml:space="preserve">Exercise 9.3 — Partial Flow. Deliberately make the source predicate fail to match. Use partial flow or intermediate selects to discover the last reached node. Correct the source and verify the full path returns.</w:t>
-      </w:r>
-    </w:p>
-    <w:p>
-      <w:pPr>
-        <w:spacing w:after="110" w:line="276"/>
-      </w:pPr>
-      <w:r>
-        <w:rPr>
-          <w:sz w:val="22"/>
-          <w:szCs w:val="22"/>
-        </w:rPr>
-        <w:t xml:space="preserve">Exercise 9.4 — Precision Tuning. Start with the XSS path query. Add one barrier and note how many alerts disappear. Remove it and add one additional flow step; note the opposite effect. Record both outcomes.</w:t>
-      </w:r>
-    </w:p>
-    <w:p>
-      <w:pPr>
-        <w:pStyle w:val="Heading2"/>
-      </w:pPr>
-      <w:bookmarkStart w:name="_Toc14" w:id="14"/>
-      <w:r>
-        <w:t xml:space="preserve">Common Pitfalls</w:t>
-      </w:r>
-      <w:bookmarkEnd w:id="14"/>
-    </w:p>
-    <w:p>
-      <w:pPr>
-        <w:spacing w:after="110" w:line="276"/>
-      </w:pPr>
-      <w:r>
-        <w:rPr>
-          <w:sz w:val="22"/>
-          <w:szCs w:val="22"/>
-        </w:rPr>
-        <w:t xml:space="preserve">Overly broad sources (every string is a source) produce noise and slow the analysis. Missing models for internal wrappers create false negatives. Barriers that match too much create false negatives of a different kind. Forgetting the PathGraph import or using the wrong select form prevents path display. Building the database without required dependencies means call targets are unresolved and flow stops prematurely. Always maintain a small suite of positive and negative tests and re-run them after every change and after every CodeQL upgrade.</w:t>
-      </w:r>
-    </w:p>
-    <w:p>
-      <w:pPr>
-        <w:pStyle w:val="Heading2"/>
-      </w:pPr>
-      <w:bookmarkStart w:name="_Toc15" w:id="15"/>
-      <w:r>
-        <w:t xml:space="preserve">Moving to Production</w:t>
-      </w:r>
-      <w:bookmarkEnd w:id="15"/>
-    </w:p>
-    <w:p>
-      <w:pPr>
-        <w:spacing w:after="110" w:line="276"/>
-      </w:pPr>
-      <w:r>
-        <w:rPr>
-          <w:sz w:val="22"/>
-          <w:szCs w:val="22"/>
-        </w:rPr>
-        <w:t xml:space="preserve">When the query is stable on your tests, complete the metadata (@precision, severity, tags), add expected-result tests, place the query in a pack, and include it in a suite executed by CI. The alert then appears on every pull request. Revisit the query after library upgrades; improved standard models sometimes let you delete custom steps or barriers you previously needed.</w:t>
+        <w:spacing w:after="100" w:line="276"/>
+      </w:pPr>
+      <w:r>
+        <w:rPr>
+          <w:sz w:val="22"/>
+          <w:szCs w:val="22"/>
+        </w:rPr>
+        <w:t xml:space="preserve">Missing or incorrect @kind prevents path display. Duplicate @id values collide in GitHub code scanning. Suites that accidentally include experimental queries create noise. Forgetting to bump a model-pack version leaves CI running stale models. Tests that only cover the happy path miss precision regressions. Address these before enabling a suite organization-wide.</w:t>
       </w:r>
     </w:p>
     <w:p>
@@ -1637,22 +1193,22 @@
         <w:pStyle w:val="Heading1"/>
         <w:pageBreakBefore/>
       </w:pPr>
-      <w:bookmarkStart w:name="_Toc16" w:id="16"/>
-      <w:r>
-        <w:t xml:space="preserve">Chapter 10: Library Extension</w:t>
-      </w:r>
-      <w:bookmarkEnd w:id="16"/>
-    </w:p>
-    <w:p>
-      <w:pPr>
-        <w:spacing w:after="110" w:line="276"/>
-      </w:pPr>
-      <w:r>
-        <w:rPr>
-          <w:sz w:val="22"/>
-          <w:szCs w:val="22"/>
-        </w:rPr>
-        <w:t xml:space="preserve">Custom sources, sinks, and flow summaries let standard queries understand internal frameworks. Model packs distribute the extensions. See examples/chapter10/ and the exercises there. Test models with the same positive/negative discipline used for queries.</w:t>
+      <w:bookmarkStart w:name="_Toc14" w:id="14"/>
+      <w:r>
+        <w:t xml:space="preserve">Chapter 12: CI Integration</w:t>
+      </w:r>
+      <w:bookmarkEnd w:id="14"/>
+    </w:p>
+    <w:p>
+      <w:pPr>
+        <w:spacing w:after="100" w:line="276"/>
+      </w:pPr>
+      <w:r>
+        <w:rPr>
+          <w:sz w:val="22"/>
+          <w:szCs w:val="22"/>
+        </w:rPr>
+        <w:t xml:space="preserve">The CodeQL GitHub Action or the CLI bundle executes the suite you defined in Chapter 11 and uploads SARIF. Sample workflow: examples/chapter12/codeql-analysis.yml. MRVA extends the same packs to many repositories.</w:t>
       </w:r>
     </w:p>
     <w:p>
@@ -1660,22 +1216,22 @@
         <w:pStyle w:val="Heading1"/>
         <w:pageBreakBefore/>
       </w:pPr>
-      <w:bookmarkStart w:name="_Toc17" w:id="17"/>
-      <w:r>
-        <w:t xml:space="preserve">Chapter 11: Packs, Suites, and Production Use</w:t>
-      </w:r>
-      <w:bookmarkEnd w:id="17"/>
-    </w:p>
-    <w:p>
-      <w:pPr>
-        <w:spacing w:after="110" w:line="276"/>
-      </w:pPr>
-      <w:r>
-        <w:rPr>
-          <w:sz w:val="22"/>
-          <w:szCs w:val="22"/>
-        </w:rPr>
-        <w:t xml:space="preserve">qlpack.yml defines packs and dependencies. .qls files select queries. Complete metadata and expected-result tests are required before sharing. Examples in examples/chapter11/.</w:t>
+      <w:bookmarkStart w:name="_Toc15" w:id="15"/>
+      <w:r>
+        <w:t xml:space="preserve">Chapter 13: Performance and Debugging</w:t>
+      </w:r>
+      <w:bookmarkEnd w:id="15"/>
+    </w:p>
+    <w:p>
+      <w:pPr>
+        <w:spacing w:after="100" w:line="276"/>
+      </w:pPr>
+      <w:r>
+        <w:rPr>
+          <w:sz w:val="22"/>
+          <w:szCs w:val="22"/>
+        </w:rPr>
+        <w:t xml:space="preserve">Keep predicates precise. Use partial-flow debugging when paths are missing. See examples/chapter13/.</w:t>
       </w:r>
     </w:p>
     <w:p>
@@ -1683,22 +1239,22 @@
         <w:pStyle w:val="Heading1"/>
         <w:pageBreakBefore/>
       </w:pPr>
-      <w:bookmarkStart w:name="_Toc18" w:id="18"/>
-      <w:r>
-        <w:t xml:space="preserve">Chapter 12: CI Integration</w:t>
-      </w:r>
-      <w:bookmarkEnd w:id="18"/>
-    </w:p>
-    <w:p>
-      <w:pPr>
-        <w:spacing w:after="110" w:line="276"/>
-      </w:pPr>
-      <w:r>
-        <w:rPr>
-          <w:sz w:val="22"/>
-          <w:szCs w:val="22"/>
-        </w:rPr>
-        <w:t xml:space="preserve">The CodeQL GitHub Action or the CLI bundle runs analysis and uploads SARIF. Sample: examples/chapter12/codeql-analysis.yml. MRVA runs queries across many repositories.</w:t>
+      <w:bookmarkStart w:name="_Toc16" w:id="16"/>
+      <w:r>
+        <w:t xml:space="preserve">Chapter 14: Case Studies</w:t>
+      </w:r>
+      <w:bookmarkEnd w:id="16"/>
+    </w:p>
+    <w:p>
+      <w:pPr>
+        <w:spacing w:after="100" w:line="276"/>
+      </w:pPr>
+      <w:r>
+        <w:rPr>
+          <w:sz w:val="22"/>
+          <w:szCs w:val="22"/>
+        </w:rPr>
+        <w:t xml:space="preserve">Published analyses and examples/chapter14/ illustrate complete source-to-sink queries that belong in a production pack.</w:t>
       </w:r>
     </w:p>
     <w:p>
@@ -1706,22 +1262,22 @@
         <w:pStyle w:val="Heading1"/>
         <w:pageBreakBefore/>
       </w:pPr>
-      <w:bookmarkStart w:name="_Toc19" w:id="19"/>
-      <w:r>
-        <w:t xml:space="preserve">Chapter 13: Performance and Debugging</w:t>
-      </w:r>
-      <w:bookmarkEnd w:id="19"/>
-    </w:p>
-    <w:p>
-      <w:pPr>
-        <w:spacing w:after="110" w:line="276"/>
-      </w:pPr>
-      <w:r>
-        <w:rPr>
-          <w:sz w:val="22"/>
-          <w:szCs w:val="22"/>
-        </w:rPr>
-        <w:t xml:space="preserve">Precise predicates and partial-flow techniques keep analyses fast and diagnosable. See examples/chapter13/.</w:t>
+      <w:bookmarkStart w:name="_Toc17" w:id="17"/>
+      <w:r>
+        <w:t xml:space="preserve">Chapter 15: Best Practices</w:t>
+      </w:r>
+      <w:bookmarkEnd w:id="17"/>
+    </w:p>
+    <w:p>
+      <w:pPr>
+        <w:spacing w:after="100" w:line="276"/>
+      </w:pPr>
+      <w:r>
+        <w:rPr>
+          <w:sz w:val="22"/>
+          <w:szCs w:val="22"/>
+        </w:rPr>
+        <w:t xml:space="preserve">Package models separately, test everything, pin versions, and contribute stable models upstream.</w:t>
       </w:r>
     </w:p>
     <w:p>
@@ -1729,73 +1285,27 @@
         <w:pStyle w:val="Heading1"/>
         <w:pageBreakBefore/>
       </w:pPr>
-      <w:bookmarkStart w:name="_Toc20" w:id="20"/>
-      <w:r>
-        <w:t xml:space="preserve">Chapter 14: Case Studies</w:t>
-      </w:r>
-      <w:bookmarkEnd w:id="20"/>
-    </w:p>
-    <w:p>
-      <w:pPr>
-        <w:spacing w:after="110" w:line="276"/>
-      </w:pPr>
-      <w:r>
-        <w:rPr>
-          <w:sz w:val="22"/>
-          <w:szCs w:val="22"/>
-        </w:rPr>
-        <w:t xml:space="preserve">Security Lab write-ups and examples/chapter14/sql-injection-example.ql show complete patterns. Combine with your taint-tracking configurations and extensions.</w:t>
-      </w:r>
-    </w:p>
-    <w:p>
-      <w:pPr>
-        <w:pStyle w:val="Heading1"/>
-        <w:pageBreakBefore/>
-      </w:pPr>
-      <w:bookmarkStart w:name="_Toc21" w:id="21"/>
-      <w:r>
-        <w:t xml:space="preserve">Chapter 15: Best Practices</w:t>
-      </w:r>
-      <w:bookmarkEnd w:id="21"/>
-    </w:p>
-    <w:p>
-      <w:pPr>
-        <w:spacing w:after="110" w:line="276"/>
-      </w:pPr>
-      <w:r>
-        <w:rPr>
-          <w:sz w:val="22"/>
-          <w:szCs w:val="22"/>
-        </w:rPr>
-        <w:t xml:space="preserve">Small tested predicates, library extension, precise barriers, and continuous positive/negative testing produce alerts developers trust.</w:t>
-      </w:r>
-    </w:p>
-    <w:p>
-      <w:pPr>
-        <w:pStyle w:val="Heading1"/>
-        <w:pageBreakBefore/>
-      </w:pPr>
-      <w:bookmarkStart w:name="_Toc22" w:id="22"/>
+      <w:bookmarkStart w:name="_Toc18" w:id="18"/>
       <w:r>
         <w:t xml:space="preserve">Appendix</w:t>
       </w:r>
-      <w:bookmarkEnd w:id="22"/>
-    </w:p>
-    <w:p>
-      <w:pPr>
-        <w:spacing w:after="110" w:line="276"/>
-      </w:pPr>
-      <w:r>
-        <w:rPr>
-          <w:sz w:val="22"/>
-          <w:szCs w:val="22"/>
-        </w:rPr>
-        <w:t xml:space="preserve">Taint-tracking exercises and xss-path.ql are in examples/chapter09/. Official documentation: https://codeql.github.com/docs/. Repository: https://github.com/rod-trent/MustLearnCodeQL.</w:t>
-      </w:r>
-    </w:p>
-    <w:p>
-      <w:pPr>
-        <w:spacing w:before="240"/>
+      <w:bookmarkEnd w:id="18"/>
+    </w:p>
+    <w:p>
+      <w:pPr>
+        <w:spacing w:after="100" w:line="276"/>
+      </w:pPr>
+      <w:r>
+        <w:rPr>
+          <w:sz w:val="22"/>
+          <w:szCs w:val="22"/>
+        </w:rPr>
+        <w:t xml:space="preserve">Chapter 11 examples: examples/chapter11/qlpack.yml and example-suite.qls. Official docs: https://codeql.github.com/docs/. Repository: https://github.com/rod-trent/MustLearnCodeQL.</w:t>
+      </w:r>
+    </w:p>
+    <w:p>
+      <w:pPr>
+        <w:spacing w:before="200"/>
         <w:jc w:val="center"/>
       </w:pPr>
       <w:r>
@@ -2239,7 +1749,7 @@
     <w:next w:val="Normal"/>
     <w:qFormat/>
     <w:pPr>
-      <w:spacing w:after="100" w:before="160"/>
+      <w:spacing w:after="80" w:before="140"/>
       <w:outlineLvl w:val="0"/>
     </w:pPr>
     <w:rPr>
@@ -2257,7 +1767,7 @@
     <w:next w:val="Normal"/>
     <w:qFormat/>
     <w:pPr>
-      <w:spacing w:after="70" w:before="180"/>
+      <w:spacing w:after="60" w:before="160"/>
       <w:outlineLvl w:val="1"/>
     </w:pPr>
     <w:rPr>

</xml_diff>

<commit_message>
Expand Chapter 12 on CI integration, GitHub Actions, and MRVA
</commit_message>
<xml_diff>
--- a/Book_Version/MustLearnCodeQL.docx
+++ b/Book_Version/MustLearnCodeQL.docx
@@ -4,7 +4,7 @@
   <w:body>
     <w:p>
       <w:pPr>
-        <w:spacing w:after="80"/>
+        <w:spacing w:after="60"/>
         <w:jc w:val="center"/>
       </w:pPr>
       <w:r>
@@ -12,15 +12,15 @@
           <w:b/>
           <w:bCs/>
           <w:color w:val="1F4E79"/>
-          <w:sz w:val="44"/>
-          <w:szCs w:val="44"/>
+          <w:sz w:val="42"/>
+          <w:szCs w:val="42"/>
         </w:rPr>
         <w:t xml:space="preserve">Must Learn CodeQL</w:t>
       </w:r>
     </w:p>
     <w:p>
       <w:pPr>
-        <w:spacing w:after="120"/>
+        <w:spacing w:after="100"/>
         <w:jc w:val="center"/>
       </w:pPr>
       <w:r>
@@ -28,30 +28,30 @@
           <w:i/>
           <w:iCs/>
           <w:color w:val="5B9BD5"/>
-          <w:sz w:val="22"/>
-          <w:szCs w:val="22"/>
-        </w:rPr>
-        <w:t xml:space="preserve">A Practical Guide to Semantic Code Analysis</w:t>
-      </w:r>
-    </w:p>
-    <w:p>
-      <w:pPr>
-        <w:jc w:val="center"/>
-      </w:pPr>
-      <w:r>
-        <w:rPr>
           <w:sz w:val="20"/>
           <w:szCs w:val="20"/>
         </w:rPr>
+        <w:t xml:space="preserve">A Practical Guide to Semantic Code Analysis</w:t>
+      </w:r>
+    </w:p>
+    <w:p>
+      <w:pPr>
+        <w:jc w:val="center"/>
+      </w:pPr>
+      <w:r>
+        <w:rPr>
+          <w:sz w:val="18"/>
+          <w:szCs w:val="18"/>
+        </w:rPr>
         <w:t xml:space="preserve">Rod Trent • 2026</w:t>
       </w:r>
     </w:p>
     <w:p>
       <w:pPr>
-        <w:spacing w:before="60"/>
+        <w:spacing w:before="40"/>
         <w:jc w:val="center"/>
       </w:pPr>
-      <w:hyperlink w:history="1" r:id="rIdfbe-nxutnr_ksaawvvseo">
+      <w:hyperlink w:history="1" r:id="rIdj4qcyd7ntp-wbt7ggyu77">
         <w:r>
           <w:rPr>
             <w:rStyle w:val="Hyperlink"/>
@@ -134,7 +134,7 @@
           </w:pPr>
           <w:hyperlink w:history="1" w:anchor="_Toc3">
             <w:r>
-              <w:t xml:space="preserve">Chapters 1–10 Overview</w:t>
+              <w:t xml:space="preserve">Prior Chapters</w:t>
             </w:r>
             <w:r>
               <w:tab/>
@@ -156,7 +156,7 @@
           </w:pPr>
           <w:hyperlink w:history="1" w:anchor="_Toc4">
             <w:r>
-              <w:t xml:space="preserve">Chapter 11: Packs, Suites, Metadata, and Production Use</w:t>
+              <w:t xml:space="preserve">Chapter 12: Integrating CodeQL into Development Workflows</w:t>
             </w:r>
             <w:r>
               <w:tab/>
@@ -179,7 +179,7 @@
           </w:pPr>
           <w:hyperlink w:history="1" w:anchor="_Toc5">
             <w:r>
-              <w:t xml:space="preserve">Why Packaging Matters</w:t>
+              <w:t xml:space="preserve">Why CI Integration Matters</w:t>
             </w:r>
             <w:r>
               <w:tab/>
@@ -202,7 +202,7 @@
           </w:pPr>
           <w:hyperlink w:history="1" w:anchor="_Toc6">
             <w:r>
-              <w:t xml:space="preserve">Query Packs and Model Packs</w:t>
+              <w:t xml:space="preserve">GitHub Code Scanning and the CodeQL Action</w:t>
             </w:r>
             <w:r>
               <w:tab/>
@@ -225,7 +225,7 @@
           </w:pPr>
           <w:hyperlink w:history="1" w:anchor="_Toc7">
             <w:r>
-              <w:t xml:space="preserve">Dependencies and Versioning</w:t>
+              <w:t xml:space="preserve">Minimal Workflow Sketch</w:t>
             </w:r>
             <w:r>
               <w:tab/>
@@ -248,7 +248,7 @@
           </w:pPr>
           <w:hyperlink w:history="1" w:anchor="_Toc8">
             <w:r>
-              <w:t xml:space="preserve">Query Suites</w:t>
+              <w:t xml:space="preserve">Other Continuous Integration Systems</w:t>
             </w:r>
             <w:r>
               <w:tab/>
@@ -271,7 +271,7 @@
           </w:pPr>
           <w:hyperlink w:history="1" w:anchor="_Toc9">
             <w:r>
-              <w:t xml:space="preserve">Metadata Requirements</w:t>
+              <w:t xml:space="preserve">Multi-Repository Variant Analysis</w:t>
             </w:r>
             <w:r>
               <w:tab/>
@@ -294,7 +294,7 @@
           </w:pPr>
           <w:hyperlink w:history="1" w:anchor="_Toc10">
             <w:r>
-              <w:t xml:space="preserve">Expected-Result Testing</w:t>
+              <w:t xml:space="preserve">Rollout Practices</w:t>
             </w:r>
             <w:r>
               <w:tab/>
@@ -317,7 +317,7 @@
           </w:pPr>
           <w:hyperlink w:history="1" w:anchor="_Toc11">
             <w:r>
-              <w:t xml:space="preserve">Publishing and Consumption</w:t>
+              <w:t xml:space="preserve">Common Integration Pitfalls</w:t>
             </w:r>
             <w:r>
               <w:tab/>
@@ -332,15 +332,14 @@
         </w:p>
         <w:p>
           <w:pPr>
-            <w:pStyle w:val="TOC2"/>
+            <w:pStyle w:val="TOC1"/>
             <w:tabs>
               <w:tab w:val="right" w:pos="9648" w:leader="dot"/>
             </w:tabs>
-            <w:ind w:left="220"/>
           </w:pPr>
           <w:hyperlink w:history="1" w:anchor="_Toc12">
             <w:r>
-              <w:t xml:space="preserve">Production Checklist</w:t>
+              <w:t xml:space="preserve">Chapter 13: Performance and Debugging</w:t>
             </w:r>
             <w:r>
               <w:tab/>
@@ -355,15 +354,14 @@
         </w:p>
         <w:p>
           <w:pPr>
-            <w:pStyle w:val="TOC2"/>
+            <w:pStyle w:val="TOC1"/>
             <w:tabs>
               <w:tab w:val="right" w:pos="9648" w:leader="dot"/>
             </w:tabs>
-            <w:ind w:left="220"/>
           </w:pPr>
           <w:hyperlink w:history="1" w:anchor="_Toc13">
             <w:r>
-              <w:t xml:space="preserve">Common Pitfalls</w:t>
+              <w:t xml:space="preserve">Chapter 14: Case Studies</w:t>
             </w:r>
             <w:r>
               <w:tab/>
@@ -385,7 +383,7 @@
           </w:pPr>
           <w:hyperlink w:history="1" w:anchor="_Toc14">
             <w:r>
-              <w:t xml:space="preserve">Chapter 12: CI Integration</w:t>
+              <w:t xml:space="preserve">Chapter 15: Best Practices</w:t>
             </w:r>
             <w:r>
               <w:tab/>
@@ -407,7 +405,7 @@
           </w:pPr>
           <w:hyperlink w:history="1" w:anchor="_Toc15">
             <w:r>
-              <w:t xml:space="preserve">Chapter 13: Performance and Debugging</w:t>
+              <w:t xml:space="preserve">Appendix</w:t>
             </w:r>
             <w:r>
               <w:tab/>
@@ -415,72 +413,6 @@
             <w:r>
               <w:fldChar w:fldCharType="begin" w:dirty="true"/>
               <w:instrText xml:space="preserve">PAGEREF _Toc15 \h</w:instrText>
-              <w:fldChar w:fldCharType="separate"/>
-              <w:fldChar w:fldCharType="end"/>
-            </w:r>
-          </w:hyperlink>
-        </w:p>
-        <w:p>
-          <w:pPr>
-            <w:pStyle w:val="TOC1"/>
-            <w:tabs>
-              <w:tab w:val="right" w:pos="9648" w:leader="dot"/>
-            </w:tabs>
-          </w:pPr>
-          <w:hyperlink w:history="1" w:anchor="_Toc16">
-            <w:r>
-              <w:t xml:space="preserve">Chapter 14: Case Studies</w:t>
-            </w:r>
-            <w:r>
-              <w:tab/>
-            </w:r>
-            <w:r>
-              <w:fldChar w:fldCharType="begin" w:dirty="true"/>
-              <w:instrText xml:space="preserve">PAGEREF _Toc16 \h</w:instrText>
-              <w:fldChar w:fldCharType="separate"/>
-              <w:fldChar w:fldCharType="end"/>
-            </w:r>
-          </w:hyperlink>
-        </w:p>
-        <w:p>
-          <w:pPr>
-            <w:pStyle w:val="TOC1"/>
-            <w:tabs>
-              <w:tab w:val="right" w:pos="9648" w:leader="dot"/>
-            </w:tabs>
-          </w:pPr>
-          <w:hyperlink w:history="1" w:anchor="_Toc17">
-            <w:r>
-              <w:t xml:space="preserve">Chapter 15: Best Practices</w:t>
-            </w:r>
-            <w:r>
-              <w:tab/>
-            </w:r>
-            <w:r>
-              <w:fldChar w:fldCharType="begin" w:dirty="true"/>
-              <w:instrText xml:space="preserve">PAGEREF _Toc17 \h</w:instrText>
-              <w:fldChar w:fldCharType="separate"/>
-              <w:fldChar w:fldCharType="end"/>
-            </w:r>
-          </w:hyperlink>
-        </w:p>
-        <w:p>
-          <w:pPr>
-            <w:pStyle w:val="TOC1"/>
-            <w:tabs>
-              <w:tab w:val="right" w:pos="9648" w:leader="dot"/>
-            </w:tabs>
-          </w:pPr>
-          <w:hyperlink w:history="1" w:anchor="_Toc18">
-            <w:r>
-              <w:t xml:space="preserve">Appendix</w:t>
-            </w:r>
-            <w:r>
-              <w:tab/>
-            </w:r>
-            <w:r>
-              <w:fldChar w:fldCharType="begin" w:dirty="true"/>
-              <w:instrText xml:space="preserve">PAGEREF _Toc18 \h</w:instrText>
               <w:fldChar w:fldCharType="separate"/>
               <w:fldChar w:fldCharType="end"/>
             </w:r>
@@ -506,14 +438,14 @@
     </w:p>
     <w:p>
       <w:pPr>
-        <w:spacing w:after="100" w:line="276"/>
+        <w:spacing w:after="90" w:line="276"/>
       </w:pPr>
       <w:r>
         <w:rPr>
           <w:sz w:val="22"/>
           <w:szCs w:val="22"/>
         </w:rPr>
-        <w:t xml:space="preserve">Chapter 11 on packs, suites, metadata, and production use has been expanded. Related examples are in examples/chapter11/.</w:t>
+        <w:t xml:space="preserve">Chapter 12 on CI integration has been expanded. The sample workflow is in examples/chapter12/codeql-analysis.yml.</w:t>
       </w:r>
     </w:p>
     <w:p>
@@ -523,20 +455,20 @@
       </w:pPr>
       <w:bookmarkStart w:name="_Toc3" w:id="3"/>
       <w:r>
-        <w:t xml:space="preserve">Chapters 1–10 Overview</w:t>
+        <w:t xml:space="preserve">Prior Chapters</w:t>
       </w:r>
       <w:bookmarkEnd w:id="3"/>
     </w:p>
     <w:p>
       <w:pPr>
-        <w:spacing w:after="100" w:line="276"/>
+        <w:spacing w:after="90" w:line="276"/>
       </w:pPr>
       <w:r>
         <w:rPr>
           <w:sz w:val="22"/>
           <w:szCs w:val="22"/>
         </w:rPr>
-        <w:t xml:space="preserve">Prior chapters cover CodeQL fundamentals, database creation, QL and predicates, language libraries, data-flow analysis, taint tracking with path queries, and library extension (custom sources, sinks, summaries, and model packs). Those capabilities become production assets only when they are packaged, tested, and selected correctly—the subject of this chapter.</w:t>
+        <w:t xml:space="preserve">Chapters 1–11 cover fundamentals through packaging: databases, QL, data flow, taint tracking, library extension, packs, suites, and metadata. This chapter shows how to run those packs automatically.</w:t>
       </w:r>
     </w:p>
     <w:p>
@@ -546,7 +478,7 @@
       </w:pPr>
       <w:bookmarkStart w:name="_Toc4" w:id="4"/>
       <w:r>
-        <w:t xml:space="preserve">Chapter 11: Packs, Suites, Metadata, and Production Use</w:t>
+        <w:t xml:space="preserve">Chapter 12: Integrating CodeQL into Development Workflows</w:t>
       </w:r>
       <w:bookmarkEnd w:id="4"/>
     </w:p>
@@ -556,20 +488,20 @@
       </w:pPr>
       <w:bookmarkStart w:name="_Toc5" w:id="5"/>
       <w:r>
-        <w:t xml:space="preserve">Why Packaging Matters</w:t>
+        <w:t xml:space="preserve">Why CI Integration Matters</w:t>
       </w:r>
       <w:bookmarkEnd w:id="5"/>
     </w:p>
     <w:p>
       <w:pPr>
-        <w:spacing w:after="100" w:line="276"/>
+        <w:spacing w:after="90" w:line="276"/>
       </w:pPr>
       <w:r>
         <w:rPr>
           <w:sz w:val="22"/>
           <w:szCs w:val="22"/>
         </w:rPr>
-        <w:t xml:space="preserve">A single .ql file is enough for experimentation. Production use requires a repeatable way to distribute queries and models, declare dependencies, select exactly which queries run in a given context, and ensure results are understandable and stable. CodeQL packs, query suites, and metadata provide that structure.</w:t>
+        <w:t xml:space="preserve">A query that is run only by hand protects nothing after the first week. Embedding CodeQL in continuous integration turns every pull request into an opportunity to catch regressions and new variants of known issues. Alerts appear where developers already work, with paths and severity, so triage is immediate.</w:t>
       </w:r>
     </w:p>
     <w:p>
@@ -578,35 +510,117 @@
       </w:pPr>
       <w:bookmarkStart w:name="_Toc6" w:id="6"/>
       <w:r>
-        <w:t xml:space="preserve">Query Packs and Model Packs</w:t>
+        <w:t xml:space="preserve">GitHub Code Scanning and the CodeQL Action</w:t>
       </w:r>
       <w:bookmarkEnd w:id="6"/>
     </w:p>
     <w:p>
       <w:pPr>
-        <w:spacing w:after="100" w:line="276"/>
+        <w:spacing w:after="90" w:line="276"/>
       </w:pPr>
       <w:r>
         <w:rPr>
           <w:sz w:val="22"/>
           <w:szCs w:val="22"/>
         </w:rPr>
-        <w:t xml:space="preserve">A pack is a directory containing a qlpack.yml file plus queries, libraries, or models. The YAML file declares the pack name, version, and dependencies on the standard libraries or on other packs (including model packs you maintain).</w:t>
-      </w:r>
-    </w:p>
-    <w:p>
-      <w:pPr>
-        <w:spacing w:after="20" w:before="60"/>
+        <w:t xml:space="preserve">The most common setup uses the official CodeQL GitHub Action. The workflow checks out the repository, initializes CodeQL for the desired languages, optionally builds the project, runs the selected queries or suite, and uploads the SARIF results. Alerts then appear in the repository Security tab and as pull-request comments.</w:t>
+      </w:r>
+    </w:p>
+    <w:p>
+      <w:pPr>
+        <w:spacing w:after="90" w:line="276"/>
+      </w:pPr>
+      <w:r>
+        <w:rPr>
+          <w:sz w:val="22"/>
+          <w:szCs w:val="22"/>
+        </w:rPr>
+        <w:t xml:space="preserve">A complete, adaptable workflow is provided at examples/chapter12/codeql-analysis.yml. Key points you will customize:</w:t>
+      </w:r>
+    </w:p>
+    <w:p>
+      <w:pPr>
+        <w:spacing w:after="90" w:line="276"/>
+      </w:pPr>
+      <w:r>
+        <w:rPr>
+          <w:sz w:val="22"/>
+          <w:szCs w:val="22"/>
+        </w:rPr>
+        <w:t xml:space="preserve">• Language matrix (javascript, python, java, cpp, etc.)</w:t>
+      </w:r>
+    </w:p>
+    <w:p>
+      <w:pPr>
+        <w:spacing w:after="90" w:line="276"/>
+      </w:pPr>
+      <w:r>
+        <w:rPr>
+          <w:sz w:val="22"/>
+          <w:szCs w:val="22"/>
+        </w:rPr>
+        <w:t xml:space="preserve">• Queries or packs/suites to run (built-in security-extended or your own pack)</w:t>
+      </w:r>
+    </w:p>
+    <w:p>
+      <w:pPr>
+        <w:spacing w:after="90" w:line="276"/>
+      </w:pPr>
+      <w:r>
+        <w:rPr>
+          <w:sz w:val="22"/>
+          <w:szCs w:val="22"/>
+        </w:rPr>
+        <w:t xml:space="preserve">• Build mode or explicit build command for compiled languages</w:t>
+      </w:r>
+    </w:p>
+    <w:p>
+      <w:pPr>
+        <w:spacing w:after="90" w:line="276"/>
+      </w:pPr>
+      <w:r>
+        <w:rPr>
+          <w:sz w:val="22"/>
+          <w:szCs w:val="22"/>
+        </w:rPr>
+        <w:t xml:space="preserve">• Paths to ignore (generated code, vendored dependencies)</w:t>
+      </w:r>
+    </w:p>
+    <w:p>
+      <w:pPr>
+        <w:spacing w:after="90" w:line="276"/>
+      </w:pPr>
+      <w:r>
+        <w:rPr>
+          <w:sz w:val="22"/>
+          <w:szCs w:val="22"/>
+        </w:rPr>
+        <w:t xml:space="preserve">• Permissions required for security-events: write</w:t>
+      </w:r>
+    </w:p>
+    <w:p>
+      <w:pPr>
+        <w:pStyle w:val="Heading2"/>
+      </w:pPr>
+      <w:bookmarkStart w:name="_Toc7" w:id="7"/>
+      <w:r>
+        <w:t xml:space="preserve">Minimal Workflow Sketch</w:t>
+      </w:r>
+      <w:bookmarkEnd w:id="7"/>
+    </w:p>
+    <w:p>
+      <w:pPr>
+        <w:spacing w:after="15" w:before="50"/>
       </w:pPr>
     </w:p>
     <w:p>
       <w:pPr>
         <w:pBdr>
-          <w:left w:val="single" w:color="2E75B6" w:sz="14" w:space="6"/>
+          <w:left w:val="single" w:color="2E75B6" w:sz="12" w:space="6"/>
         </w:pBdr>
         <w:shd w:fill="F7F9FC" w:val="clear"/>
         <w:spacing w:after="0" w:line="240"/>
-        <w:ind w:left="340"/>
+        <w:ind w:left="320"/>
       </w:pPr>
       <w:r>
         <w:rPr>
@@ -615,17 +629,17 @@
           <w:sz w:val="18"/>
           <w:szCs w:val="18"/>
         </w:rPr>
-        <w:t xml:space="preserve">name: mustlearn/example-queries</w:t>
+        <w:t xml:space="preserve">name: CodeQL</w:t>
       </w:r>
     </w:p>
     <w:p>
       <w:pPr>
         <w:pBdr>
-          <w:left w:val="single" w:color="2E75B6" w:sz="14" w:space="6"/>
+          <w:left w:val="single" w:color="2E75B6" w:sz="12" w:space="6"/>
         </w:pBdr>
         <w:shd w:fill="F7F9FC" w:val="clear"/>
         <w:spacing w:after="0" w:line="240"/>
-        <w:ind w:left="340"/>
+        <w:ind w:left="320"/>
       </w:pPr>
       <w:r>
         <w:rPr>
@@ -634,17 +648,17 @@
           <w:sz w:val="18"/>
           <w:szCs w:val="18"/>
         </w:rPr>
-        <w:t xml:space="preserve">version: 1.0.0</w:t>
+        <w:t xml:space="preserve">on:</w:t>
       </w:r>
     </w:p>
     <w:p>
       <w:pPr>
         <w:pBdr>
-          <w:left w:val="single" w:color="2E75B6" w:sz="14" w:space="6"/>
+          <w:left w:val="single" w:color="2E75B6" w:sz="12" w:space="6"/>
         </w:pBdr>
         <w:shd w:fill="F7F9FC" w:val="clear"/>
         <w:spacing w:after="0" w:line="240"/>
-        <w:ind w:left="340"/>
+        <w:ind w:left="320"/>
       </w:pPr>
       <w:r>
         <w:rPr>
@@ -653,17 +667,17 @@
           <w:sz w:val="18"/>
           <w:szCs w:val="18"/>
         </w:rPr>
-        <w:t xml:space="preserve">dependencies:</w:t>
+        <w:t xml:space="preserve">  push:</w:t>
       </w:r>
     </w:p>
     <w:p>
       <w:pPr>
         <w:pBdr>
-          <w:left w:val="single" w:color="2E75B6" w:sz="14" w:space="6"/>
+          <w:left w:val="single" w:color="2E75B6" w:sz="12" w:space="6"/>
         </w:pBdr>
         <w:shd w:fill="F7F9FC" w:val="clear"/>
         <w:spacing w:after="0" w:line="240"/>
-        <w:ind w:left="340"/>
+        <w:ind w:left="320"/>
       </w:pPr>
       <w:r>
         <w:rPr>
@@ -672,17 +686,17 @@
           <w:sz w:val="18"/>
           <w:szCs w:val="18"/>
         </w:rPr>
-        <w:t xml:space="preserve">  codeql/javascript-all: "*"</w:t>
+        <w:t xml:space="preserve">    branches: [ main ]</w:t>
       </w:r>
     </w:p>
     <w:p>
       <w:pPr>
         <w:pBdr>
-          <w:left w:val="single" w:color="2E75B6" w:sz="14" w:space="6"/>
+          <w:left w:val="single" w:color="2E75B6" w:sz="12" w:space="6"/>
         </w:pBdr>
         <w:shd w:fill="F7F9FC" w:val="clear"/>
         <w:spacing w:after="0" w:line="240"/>
-        <w:ind w:left="340"/>
+        <w:ind w:left="320"/>
       </w:pPr>
       <w:r>
         <w:rPr>
@@ -691,83 +705,17 @@
           <w:sz w:val="18"/>
           <w:szCs w:val="18"/>
         </w:rPr>
-        <w:t xml:space="preserve">  # mustlearn/internal-models: "1.2.0"   # example model pack</w:t>
-      </w:r>
-    </w:p>
-    <w:p>
-      <w:pPr>
-        <w:spacing w:after="80" w:before="20"/>
-      </w:pPr>
-    </w:p>
-    <w:p>
-      <w:pPr>
-        <w:spacing w:after="100" w:line="276"/>
-      </w:pPr>
-      <w:r>
-        <w:rPr>
-          <w:sz w:val="22"/>
-          <w:szCs w:val="22"/>
-        </w:rPr>
-        <w:t xml:space="preserve">Query packs contain the .ql files you want to run. Model packs contain only extensions (custom sources, sinks, summaries) and are depended on by query packs. This separation lets a platform team own the models while application teams consume them. The example qlpack.yml lives at examples/chapter11/qlpack.yml.</w:t>
-      </w:r>
-    </w:p>
-    <w:p>
-      <w:pPr>
-        <w:pStyle w:val="Heading2"/>
-      </w:pPr>
-      <w:bookmarkStart w:name="_Toc7" w:id="7"/>
-      <w:r>
-        <w:t xml:space="preserve">Dependencies and Versioning</w:t>
-      </w:r>
-      <w:bookmarkEnd w:id="7"/>
-    </w:p>
-    <w:p>
-      <w:pPr>
-        <w:spacing w:after="100" w:line="276"/>
-      </w:pPr>
-      <w:r>
-        <w:rPr>
-          <w:sz w:val="22"/>
-          <w:szCs w:val="22"/>
-        </w:rPr>
-        <w:t xml:space="preserve">Dependencies are resolved when you run codeql pack install or when the GitHub Action sets up the environment. Pin versions for stability in production; use a range or "*" only while developing. After changing a model pack, bump its version and update the depending query packs so CI picks up the new models deliberately rather than accidentally.</w:t>
-      </w:r>
-    </w:p>
-    <w:p>
-      <w:pPr>
-        <w:pStyle w:val="Heading2"/>
-      </w:pPr>
-      <w:bookmarkStart w:name="_Toc8" w:id="8"/>
-      <w:r>
-        <w:t xml:space="preserve">Query Suites</w:t>
-      </w:r>
-      <w:bookmarkEnd w:id="8"/>
-    </w:p>
-    <w:p>
-      <w:pPr>
-        <w:spacing w:after="100" w:line="276"/>
-      </w:pPr>
-      <w:r>
-        <w:rPr>
-          <w:sz w:val="22"/>
-          <w:szCs w:val="22"/>
-        </w:rPr>
-        <w:t xml:space="preserve">A query suite is a .qls file that selects which queries from the available packs actually execute. You can include or exclude by path, by kind, by tags, or by explicit list. Suites let you offer different profiles—security-only, security-extended, quality, or a custom organization suite—from the same underlying packs.</w:t>
-      </w:r>
-    </w:p>
-    <w:p>
-      <w:pPr>
-        <w:spacing w:after="20" w:before="60"/>
-      </w:pPr>
+        <w:t xml:space="preserve">  pull_request:</w:t>
+      </w:r>
     </w:p>
     <w:p>
       <w:pPr>
         <w:pBdr>
-          <w:left w:val="single" w:color="2E75B6" w:sz="14" w:space="6"/>
+          <w:left w:val="single" w:color="2E75B6" w:sz="12" w:space="6"/>
         </w:pBdr>
         <w:shd w:fill="F7F9FC" w:val="clear"/>
         <w:spacing w:after="0" w:line="240"/>
-        <w:ind w:left="340"/>
+        <w:ind w:left="320"/>
       </w:pPr>
       <w:r>
         <w:rPr>
@@ -776,17 +724,17 @@
           <w:sz w:val="18"/>
           <w:szCs w:val="18"/>
         </w:rPr>
-        <w:t xml:space="preserve">- description: Must Learn example suite</w:t>
+        <w:t xml:space="preserve">jobs:</w:t>
       </w:r>
     </w:p>
     <w:p>
       <w:pPr>
         <w:pBdr>
-          <w:left w:val="single" w:color="2E75B6" w:sz="14" w:space="6"/>
+          <w:left w:val="single" w:color="2E75B6" w:sz="12" w:space="6"/>
         </w:pBdr>
         <w:shd w:fill="F7F9FC" w:val="clear"/>
         <w:spacing w:after="0" w:line="240"/>
-        <w:ind w:left="340"/>
+        <w:ind w:left="320"/>
       </w:pPr>
       <w:r>
         <w:rPr>
@@ -795,17 +743,17 @@
           <w:sz w:val="18"/>
           <w:szCs w:val="18"/>
         </w:rPr>
-        <w:t xml:space="preserve">- queries: .</w:t>
+        <w:t xml:space="preserve">  analyze:</w:t>
       </w:r>
     </w:p>
     <w:p>
       <w:pPr>
         <w:pBdr>
-          <w:left w:val="single" w:color="2E75B6" w:sz="14" w:space="6"/>
+          <w:left w:val="single" w:color="2E75B6" w:sz="12" w:space="6"/>
         </w:pBdr>
         <w:shd w:fill="F7F9FC" w:val="clear"/>
         <w:spacing w:after="0" w:line="240"/>
-        <w:ind w:left="340"/>
+        <w:ind w:left="320"/>
       </w:pPr>
       <w:r>
         <w:rPr>
@@ -814,17 +762,17 @@
           <w:sz w:val="18"/>
           <w:szCs w:val="18"/>
         </w:rPr>
-        <w:t xml:space="preserve">  from: mustlearn/example-queries</w:t>
+        <w:t xml:space="preserve">    runs-on: ubuntu-latest</w:t>
       </w:r>
     </w:p>
     <w:p>
       <w:pPr>
         <w:pBdr>
-          <w:left w:val="single" w:color="2E75B6" w:sz="14" w:space="6"/>
+          <w:left w:val="single" w:color="2E75B6" w:sz="12" w:space="6"/>
         </w:pBdr>
         <w:shd w:fill="F7F9FC" w:val="clear"/>
         <w:spacing w:after="0" w:line="240"/>
-        <w:ind w:left="340"/>
+        <w:ind w:left="320"/>
       </w:pPr>
       <w:r>
         <w:rPr>
@@ -833,17 +781,17 @@
           <w:sz w:val="18"/>
           <w:szCs w:val="18"/>
         </w:rPr>
-        <w:t xml:space="preserve">- include:</w:t>
+        <w:t xml:space="preserve">    permissions:</w:t>
       </w:r>
     </w:p>
     <w:p>
       <w:pPr>
         <w:pBdr>
-          <w:left w:val="single" w:color="2E75B6" w:sz="14" w:space="6"/>
+          <w:left w:val="single" w:color="2E75B6" w:sz="12" w:space="6"/>
         </w:pBdr>
         <w:shd w:fill="F7F9FC" w:val="clear"/>
         <w:spacing w:after="0" w:line="240"/>
-        <w:ind w:left="340"/>
+        <w:ind w:left="320"/>
       </w:pPr>
       <w:r>
         <w:rPr>
@@ -852,17 +800,17 @@
           <w:sz w:val="18"/>
           <w:szCs w:val="18"/>
         </w:rPr>
-        <w:t xml:space="preserve">    kind:</w:t>
+        <w:t xml:space="preserve">      security-events: write</w:t>
       </w:r>
     </w:p>
     <w:p>
       <w:pPr>
         <w:pBdr>
-          <w:left w:val="single" w:color="2E75B6" w:sz="14" w:space="6"/>
+          <w:left w:val="single" w:color="2E75B6" w:sz="12" w:space="6"/>
         </w:pBdr>
         <w:shd w:fill="F7F9FC" w:val="clear"/>
         <w:spacing w:after="0" w:line="240"/>
-        <w:ind w:left="340"/>
+        <w:ind w:left="320"/>
       </w:pPr>
       <w:r>
         <w:rPr>
@@ -871,17 +819,17 @@
           <w:sz w:val="18"/>
           <w:szCs w:val="18"/>
         </w:rPr>
-        <w:t xml:space="preserve">    - problem</w:t>
+        <w:t xml:space="preserve">    steps:</w:t>
       </w:r>
     </w:p>
     <w:p>
       <w:pPr>
         <w:pBdr>
-          <w:left w:val="single" w:color="2E75B6" w:sz="14" w:space="6"/>
+          <w:left w:val="single" w:color="2E75B6" w:sz="12" w:space="6"/>
         </w:pBdr>
         <w:shd w:fill="F7F9FC" w:val="clear"/>
         <w:spacing w:after="0" w:line="240"/>
-        <w:ind w:left="340"/>
+        <w:ind w:left="320"/>
       </w:pPr>
       <w:r>
         <w:rPr>
@@ -890,422 +838,304 @@
           <w:sz w:val="18"/>
           <w:szCs w:val="18"/>
         </w:rPr>
-        <w:t xml:space="preserve">    - path-problem</w:t>
-      </w:r>
-    </w:p>
-    <w:p>
-      <w:pPr>
-        <w:spacing w:after="80" w:before="20"/>
-      </w:pPr>
-    </w:p>
-    <w:p>
-      <w:pPr>
-        <w:spacing w:after="100" w:line="276"/>
+        <w:t xml:space="preserve">      - uses: actions/checkout@v4</w:t>
+      </w:r>
+    </w:p>
+    <w:p>
+      <w:pPr>
+        <w:pBdr>
+          <w:left w:val="single" w:color="2E75B6" w:sz="12" w:space="6"/>
+        </w:pBdr>
+        <w:shd w:fill="F7F9FC" w:val="clear"/>
+        <w:spacing w:after="0" w:line="240"/>
+        <w:ind w:left="320"/>
+      </w:pPr>
+      <w:r>
+        <w:rPr>
+          <w:rFonts w:ascii="Consolas" w:cs="Consolas" w:eastAsia="Consolas" w:hAnsi="Consolas"/>
+          <w:color w:val="1E293B"/>
+          <w:sz w:val="18"/>
+          <w:szCs w:val="18"/>
+        </w:rPr>
+        <w:t xml:space="preserve">      - uses: github/codeql-action/init@v3</w:t>
+      </w:r>
+    </w:p>
+    <w:p>
+      <w:pPr>
+        <w:pBdr>
+          <w:left w:val="single" w:color="2E75B6" w:sz="12" w:space="6"/>
+        </w:pBdr>
+        <w:shd w:fill="F7F9FC" w:val="clear"/>
+        <w:spacing w:after="0" w:line="240"/>
+        <w:ind w:left="320"/>
+      </w:pPr>
+      <w:r>
+        <w:rPr>
+          <w:rFonts w:ascii="Consolas" w:cs="Consolas" w:eastAsia="Consolas" w:hAnsi="Consolas"/>
+          <w:color w:val="1E293B"/>
+          <w:sz w:val="18"/>
+          <w:szCs w:val="18"/>
+        </w:rPr>
+        <w:t xml:space="preserve">        with:</w:t>
+      </w:r>
+    </w:p>
+    <w:p>
+      <w:pPr>
+        <w:pBdr>
+          <w:left w:val="single" w:color="2E75B6" w:sz="12" w:space="6"/>
+        </w:pBdr>
+        <w:shd w:fill="F7F9FC" w:val="clear"/>
+        <w:spacing w:after="0" w:line="240"/>
+        <w:ind w:left="320"/>
+      </w:pPr>
+      <w:r>
+        <w:rPr>
+          <w:rFonts w:ascii="Consolas" w:cs="Consolas" w:eastAsia="Consolas" w:hAnsi="Consolas"/>
+          <w:color w:val="1E293B"/>
+          <w:sz w:val="18"/>
+          <w:szCs w:val="18"/>
+        </w:rPr>
+        <w:t xml:space="preserve">          languages: javascript</w:t>
+      </w:r>
+    </w:p>
+    <w:p>
+      <w:pPr>
+        <w:pBdr>
+          <w:left w:val="single" w:color="2E75B6" w:sz="12" w:space="6"/>
+        </w:pBdr>
+        <w:shd w:fill="F7F9FC" w:val="clear"/>
+        <w:spacing w:after="0" w:line="240"/>
+        <w:ind w:left="320"/>
+      </w:pPr>
+      <w:r>
+        <w:rPr>
+          <w:rFonts w:ascii="Consolas" w:cs="Consolas" w:eastAsia="Consolas" w:hAnsi="Consolas"/>
+          <w:color w:val="1E293B"/>
+          <w:sz w:val="18"/>
+          <w:szCs w:val="18"/>
+        </w:rPr>
+        <w:t xml:space="preserve">          queries: security-extended</w:t>
+      </w:r>
+    </w:p>
+    <w:p>
+      <w:pPr>
+        <w:pBdr>
+          <w:left w:val="single" w:color="2E75B6" w:sz="12" w:space="6"/>
+        </w:pBdr>
+        <w:shd w:fill="F7F9FC" w:val="clear"/>
+        <w:spacing w:after="0" w:line="240"/>
+        <w:ind w:left="320"/>
+      </w:pPr>
+      <w:r>
+        <w:rPr>
+          <w:rFonts w:ascii="Consolas" w:cs="Consolas" w:eastAsia="Consolas" w:hAnsi="Consolas"/>
+          <w:color w:val="1E293B"/>
+          <w:sz w:val="18"/>
+          <w:szCs w:val="18"/>
+        </w:rPr>
+        <w:t xml:space="preserve">      - uses: github/codeql-action/analyze@v3</w:t>
+      </w:r>
+    </w:p>
+    <w:p>
+      <w:pPr>
+        <w:spacing w:after="70" w:before="15"/>
+      </w:pPr>
+    </w:p>
+    <w:p>
+      <w:pPr>
+        <w:spacing w:after="90" w:line="276"/>
       </w:pPr>
       <w:r>
         <w:rPr>
           <w:sz w:val="22"/>
           <w:szCs w:val="22"/>
         </w:rPr>
-        <w:t xml:space="preserve">An example suite is at examples/chapter11/example-suite.qls. In CI you normally point the CodeQL Action or the CLI at a suite rather than at individual query files.</w:t>
+        <w:t xml:space="preserve">For a custom pack or suite, replace the queries value with a pack reference or a path to your .qls file. Compiled languages usually need an explicit build step between init and analyze, or a configured build mode.</w:t>
       </w:r>
     </w:p>
     <w:p>
       <w:pPr>
         <w:pStyle w:val="Heading2"/>
       </w:pPr>
-      <w:bookmarkStart w:name="_Toc9" w:id="9"/>
-      <w:r>
-        <w:t xml:space="preserve">Metadata Requirements</w:t>
-      </w:r>
-      <w:bookmarkEnd w:id="9"/>
-    </w:p>
-    <w:p>
-      <w:pPr>
-        <w:spacing w:after="100" w:line="276"/>
+      <w:bookmarkStart w:name="_Toc8" w:id="8"/>
+      <w:r>
+        <w:t xml:space="preserve">Other Continuous Integration Systems</w:t>
+      </w:r>
+      <w:bookmarkEnd w:id="8"/>
+    </w:p>
+    <w:p>
+      <w:pPr>
+        <w:spacing w:after="90" w:line="276"/>
       </w:pPr>
       <w:r>
         <w:rPr>
           <w:sz w:val="22"/>
           <w:szCs w:val="22"/>
         </w:rPr>
-        <w:t xml:space="preserve">Every production query needs a complete metadata block. The critical fields are:</w:t>
-      </w:r>
-    </w:p>
-    <w:p>
-      <w:pPr>
-        <w:spacing w:after="100" w:line="276"/>
+        <w:t xml:space="preserve">If you use Jenkins, Azure Pipelines, GitLab CI, or another system, download the CodeQL CLI bundle, create the database with the same commands shown in earlier chapters, run the queries or suite, and upload the resulting SARIF file to GitHub (via the API or the codeql github upload-results command). The packs, suites, and metadata you prepared in Chapter 11 work unchanged.</w:t>
+      </w:r>
+    </w:p>
+    <w:p>
+      <w:pPr>
+        <w:pStyle w:val="Heading2"/>
+      </w:pPr>
+      <w:bookmarkStart w:name="_Toc9" w:id="9"/>
+      <w:r>
+        <w:t xml:space="preserve">Multi-Repository Variant Analysis</w:t>
+      </w:r>
+      <w:bookmarkEnd w:id="9"/>
+    </w:p>
+    <w:p>
+      <w:pPr>
+        <w:spacing w:after="90" w:line="276"/>
       </w:pPr>
       <w:r>
         <w:rPr>
           <w:sz w:val="22"/>
           <w:szCs w:val="22"/>
         </w:rPr>
-        <w:t xml:space="preserve">• @kind — problem or path-problem</w:t>
-      </w:r>
-    </w:p>
-    <w:p>
-      <w:pPr>
-        <w:spacing w:after="100" w:line="276"/>
+        <w:t xml:space="preserve">For research or organization-wide hunting, multi-repository variant analysis (MRVA) runs a single query or suite against a large set of repositories. This is the same mechanism used by security researchers to discover new vulnerability variants at scale. Results can be exported and triaged centrally. MRVA complements per-repository CI: CI prevents regressions; MRVA finds historical and cross-repo instances.</w:t>
+      </w:r>
+    </w:p>
+    <w:p>
+      <w:pPr>
+        <w:pStyle w:val="Heading2"/>
+      </w:pPr>
+      <w:bookmarkStart w:name="_Toc10" w:id="10"/>
+      <w:r>
+        <w:t xml:space="preserve">Rollout Practices</w:t>
+      </w:r>
+      <w:bookmarkEnd w:id="10"/>
+    </w:p>
+    <w:p>
+      <w:pPr>
+        <w:spacing w:after="90" w:line="276"/>
       </w:pPr>
       <w:r>
         <w:rPr>
           <w:sz w:val="22"/>
           <w:szCs w:val="22"/>
         </w:rPr>
-        <w:t xml:space="preserve">• @id — globally unique identifier</w:t>
-      </w:r>
-    </w:p>
-    <w:p>
-      <w:pPr>
-        <w:spacing w:after="100" w:line="276"/>
+        <w:t xml:space="preserve">Start with a single repository and the default security suite. Review the first set of alerts, add barriers or models for the noisiest false positives, then expand. When you introduce custom packs, pin their versions. Monitor alert volume and fix rate. Provide a short internal guide that explains how to read a path alert and how to request a model update when an internal framework is involved.</w:t>
+      </w:r>
+    </w:p>
+    <w:p>
+      <w:pPr>
+        <w:pStyle w:val="Heading2"/>
+      </w:pPr>
+      <w:bookmarkStart w:name="_Toc11" w:id="11"/>
+      <w:r>
+        <w:t xml:space="preserve">Common Integration Pitfalls</w:t>
+      </w:r>
+      <w:bookmarkEnd w:id="11"/>
+    </w:p>
+    <w:p>
+      <w:pPr>
+        <w:spacing w:after="90" w:line="276"/>
       </w:pPr>
       <w:r>
         <w:rPr>
           <w:sz w:val="22"/>
           <w:szCs w:val="22"/>
         </w:rPr>
-        <w:t xml:space="preserve">• @name — short title shown in alerts</w:t>
-      </w:r>
-    </w:p>
-    <w:p>
-      <w:pPr>
-        <w:spacing w:after="100" w:line="276"/>
+        <w:t xml:space="preserve">Missing security-events permission prevents upload. Forgetting the build step for compiled languages produces empty or incomplete databases. Pointing at the wrong suite silently runs too many or too few queries. Unpinned pack versions cause sudden alert changes after an upstream update. Generated or third-party code that is not excluded creates noise. Address these before enabling the workflow on many repositories.</w:t>
+      </w:r>
+    </w:p>
+    <w:p>
+      <w:pPr>
+        <w:pStyle w:val="Heading1"/>
+        <w:pageBreakBefore/>
+      </w:pPr>
+      <w:bookmarkStart w:name="_Toc12" w:id="12"/>
+      <w:r>
+        <w:t xml:space="preserve">Chapter 13: Performance and Debugging</w:t>
+      </w:r>
+      <w:bookmarkEnd w:id="12"/>
+    </w:p>
+    <w:p>
+      <w:pPr>
+        <w:spacing w:after="90" w:line="276"/>
       </w:pPr>
       <w:r>
         <w:rPr>
           <w:sz w:val="22"/>
           <w:szCs w:val="22"/>
         </w:rPr>
-        <w:t xml:space="preserve">• @description — one-sentence explanation</w:t>
-      </w:r>
-    </w:p>
-    <w:p>
-      <w:pPr>
-        <w:spacing w:after="100" w:line="276"/>
+        <w:t xml:space="preserve">Precise predicates and partial-flow debugging keep CI runs fast and results trustworthy. See examples/chapter13/.</w:t>
+      </w:r>
+    </w:p>
+    <w:p>
+      <w:pPr>
+        <w:pStyle w:val="Heading1"/>
+        <w:pageBreakBefore/>
+      </w:pPr>
+      <w:bookmarkStart w:name="_Toc13" w:id="13"/>
+      <w:r>
+        <w:t xml:space="preserve">Chapter 14: Case Studies</w:t>
+      </w:r>
+      <w:bookmarkEnd w:id="13"/>
+    </w:p>
+    <w:p>
+      <w:pPr>
+        <w:spacing w:after="90" w:line="276"/>
       </w:pPr>
       <w:r>
         <w:rPr>
           <w:sz w:val="22"/>
           <w:szCs w:val="22"/>
         </w:rPr>
-        <w:t xml:space="preserve">• @problem.severity — error, warning, or recommendation</w:t>
-      </w:r>
-    </w:p>
-    <w:p>
-      <w:pPr>
-        <w:spacing w:after="100" w:line="276"/>
+        <w:t xml:space="preserve">Published queries and examples/chapter14/ show patterns ready to place in the packs you run in CI.</w:t>
+      </w:r>
+    </w:p>
+    <w:p>
+      <w:pPr>
+        <w:pStyle w:val="Heading1"/>
+        <w:pageBreakBefore/>
+      </w:pPr>
+      <w:bookmarkStart w:name="_Toc14" w:id="14"/>
+      <w:r>
+        <w:t xml:space="preserve">Chapter 15: Best Practices</w:t>
+      </w:r>
+      <w:bookmarkEnd w:id="14"/>
+    </w:p>
+    <w:p>
+      <w:pPr>
+        <w:spacing w:after="90" w:line="276"/>
       </w:pPr>
       <w:r>
         <w:rPr>
           <w:sz w:val="22"/>
           <w:szCs w:val="22"/>
         </w:rPr>
-        <w:t xml:space="preserve">• @precision — high, medium, or low (strongly recommended)</w:t>
-      </w:r>
-    </w:p>
-    <w:p>
-      <w:pPr>
-        <w:spacing w:after="100" w:line="276"/>
+        <w:t xml:space="preserve">Pin versions, test before enabling organization-wide, and keep models and queries in separate packs.</w:t>
+      </w:r>
+    </w:p>
+    <w:p>
+      <w:pPr>
+        <w:pStyle w:val="Heading1"/>
+        <w:pageBreakBefore/>
+      </w:pPr>
+      <w:bookmarkStart w:name="_Toc15" w:id="15"/>
+      <w:r>
+        <w:t xml:space="preserve">Appendix</w:t>
+      </w:r>
+      <w:bookmarkEnd w:id="15"/>
+    </w:p>
+    <w:p>
+      <w:pPr>
+        <w:spacing w:after="90" w:line="276"/>
       </w:pPr>
       <w:r>
         <w:rPr>
           <w:sz w:val="22"/>
           <w:szCs w:val="22"/>
         </w:rPr>
-        <w:t xml:space="preserve">• @tags — CWE identifiers or custom tags for suite selection</w:t>
-      </w:r>
-    </w:p>
-    <w:p>
-      <w:pPr>
-        <w:spacing w:after="100" w:line="276"/>
-      </w:pPr>
-      <w:r>
-        <w:rPr>
-          <w:sz w:val="22"/>
-          <w:szCs w:val="22"/>
-        </w:rPr>
-        <w:t xml:space="preserve">Incomplete metadata produces alerts that developers cannot act on and that cannot be filtered reliably. Add a query-help file (Markdown) for any query you expect others to triage.</w:t>
-      </w:r>
-    </w:p>
-    <w:p>
-      <w:pPr>
-        <w:pStyle w:val="Heading2"/>
-      </w:pPr>
-      <w:bookmarkStart w:name="_Toc10" w:id="10"/>
-      <w:r>
-        <w:t xml:space="preserve">Expected-Result Testing</w:t>
-      </w:r>
-      <w:bookmarkEnd w:id="10"/>
-    </w:p>
-    <w:p>
-      <w:pPr>
-        <w:spacing w:after="100" w:line="276"/>
-      </w:pPr>
-      <w:r>
-        <w:rPr>
-          <w:sz w:val="22"/>
-          <w:szCs w:val="22"/>
-        </w:rPr>
-        <w:t xml:space="preserve">Before a pack is shared or enabled in CI, add tests that contain both vulnerable and safe examples. CodeQL’s test framework compares actual results against committed expected-result files. A failing test means either the query changed behavior or a library upgrade altered results. Both cases must be reviewed deliberately. Place tests next to the queries they protect and run them locally with codeql test run before every release of the pack.</w:t>
-      </w:r>
-    </w:p>
-    <w:p>
-      <w:pPr>
-        <w:pStyle w:val="Heading2"/>
-      </w:pPr>
-      <w:bookmarkStart w:name="_Toc11" w:id="11"/>
-      <w:r>
-        <w:t xml:space="preserve">Publishing and Consumption</w:t>
-      </w:r>
-      <w:bookmarkEnd w:id="11"/>
-    </w:p>
-    <w:p>
-      <w:pPr>
-        <w:spacing w:after="100" w:line="276"/>
-      </w:pPr>
-      <w:r>
-        <w:rPr>
-          <w:sz w:val="22"/>
-          <w:szCs w:val="22"/>
-        </w:rPr>
-        <w:t xml:space="preserve">Packs can be published to GitHub Container Registry or consumed directly from a repository. In either case, document the pack name, the suites you support, and the minimum CodeQL CLI version required. Application repositories then add a dependency (or use a pre-built suite) and reference the suite from their CodeQL workflow.</w:t>
-      </w:r>
-    </w:p>
-    <w:p>
-      <w:pPr>
-        <w:pStyle w:val="Heading2"/>
-      </w:pPr>
-      <w:bookmarkStart w:name="_Toc12" w:id="12"/>
-      <w:r>
-        <w:t xml:space="preserve">Production Checklist</w:t>
-      </w:r>
-      <w:bookmarkEnd w:id="12"/>
-    </w:p>
-    <w:p>
-      <w:pPr>
-        <w:spacing w:after="100" w:line="276"/>
-      </w:pPr>
-      <w:r>
-        <w:rPr>
-          <w:sz w:val="22"/>
-          <w:szCs w:val="22"/>
-        </w:rPr>
-        <w:t xml:space="preserve">1. Queries have complete metadata and help text.</w:t>
-      </w:r>
-    </w:p>
-    <w:p>
-      <w:pPr>
-        <w:spacing w:after="100" w:line="276"/>
-      </w:pPr>
-      <w:r>
-        <w:rPr>
-          <w:sz w:val="22"/>
-          <w:szCs w:val="22"/>
-        </w:rPr>
-        <w:t xml:space="preserve">2. Positive and negative tests exist and pass.</w:t>
-      </w:r>
-    </w:p>
-    <w:p>
-      <w:pPr>
-        <w:spacing w:after="100" w:line="276"/>
-      </w:pPr>
-      <w:r>
-        <w:rPr>
-          <w:sz w:val="22"/>
-          <w:szCs w:val="22"/>
-        </w:rPr>
-        <w:t xml:space="preserve">3. Models live in a separate pack with their own tests.</w:t>
-      </w:r>
-    </w:p>
-    <w:p>
-      <w:pPr>
-        <w:spacing w:after="100" w:line="276"/>
-      </w:pPr>
-      <w:r>
-        <w:rPr>
-          <w:sz w:val="22"/>
-          <w:szCs w:val="22"/>
-        </w:rPr>
-        <w:t xml:space="preserve">4. A suite selects exactly the queries intended for CI.</w:t>
-      </w:r>
-    </w:p>
-    <w:p>
-      <w:pPr>
-        <w:spacing w:after="100" w:line="276"/>
-      </w:pPr>
-      <w:r>
-        <w:rPr>
-          <w:sz w:val="22"/>
-          <w:szCs w:val="22"/>
-        </w:rPr>
-        <w:t xml:space="preserve">5. The pack version is pinned in consuming repositories.</w:t>
-      </w:r>
-    </w:p>
-    <w:p>
-      <w:pPr>
-        <w:spacing w:after="100" w:line="276"/>
-      </w:pPr>
-      <w:r>
-        <w:rPr>
-          <w:sz w:val="22"/>
-          <w:szCs w:val="22"/>
-        </w:rPr>
-        <w:t xml:space="preserve">6. The CI workflow runs the suite and uploads SARIF.</w:t>
-      </w:r>
-    </w:p>
-    <w:p>
-      <w:pPr>
-        <w:spacing w:after="100" w:line="276"/>
-      </w:pPr>
-      <w:r>
-        <w:rPr>
-          <w:sz w:val="22"/>
-          <w:szCs w:val="22"/>
-        </w:rPr>
-        <w:t xml:space="preserve">7. Alerts are reviewed on a sample of pull requests before broad rollout.</w:t>
-      </w:r>
-    </w:p>
-    <w:p>
-      <w:pPr>
-        <w:pStyle w:val="Heading2"/>
-      </w:pPr>
-      <w:bookmarkStart w:name="_Toc13" w:id="13"/>
-      <w:r>
-        <w:t xml:space="preserve">Common Pitfalls</w:t>
-      </w:r>
-      <w:bookmarkEnd w:id="13"/>
-    </w:p>
-    <w:p>
-      <w:pPr>
-        <w:spacing w:after="100" w:line="276"/>
-      </w:pPr>
-      <w:r>
-        <w:rPr>
-          <w:sz w:val="22"/>
-          <w:szCs w:val="22"/>
-        </w:rPr>
-        <w:t xml:space="preserve">Missing or incorrect @kind prevents path display. Duplicate @id values collide in GitHub code scanning. Suites that accidentally include experimental queries create noise. Forgetting to bump a model-pack version leaves CI running stale models. Tests that only cover the happy path miss precision regressions. Address these before enabling a suite organization-wide.</w:t>
-      </w:r>
-    </w:p>
-    <w:p>
-      <w:pPr>
-        <w:pStyle w:val="Heading1"/>
-        <w:pageBreakBefore/>
-      </w:pPr>
-      <w:bookmarkStart w:name="_Toc14" w:id="14"/>
-      <w:r>
-        <w:t xml:space="preserve">Chapter 12: CI Integration</w:t>
-      </w:r>
-      <w:bookmarkEnd w:id="14"/>
-    </w:p>
-    <w:p>
-      <w:pPr>
-        <w:spacing w:after="100" w:line="276"/>
-      </w:pPr>
-      <w:r>
-        <w:rPr>
-          <w:sz w:val="22"/>
-          <w:szCs w:val="22"/>
-        </w:rPr>
-        <w:t xml:space="preserve">The CodeQL GitHub Action or the CLI bundle executes the suite you defined in Chapter 11 and uploads SARIF. Sample workflow: examples/chapter12/codeql-analysis.yml. MRVA extends the same packs to many repositories.</w:t>
-      </w:r>
-    </w:p>
-    <w:p>
-      <w:pPr>
-        <w:pStyle w:val="Heading1"/>
-        <w:pageBreakBefore/>
-      </w:pPr>
-      <w:bookmarkStart w:name="_Toc15" w:id="15"/>
-      <w:r>
-        <w:t xml:space="preserve">Chapter 13: Performance and Debugging</w:t>
-      </w:r>
-      <w:bookmarkEnd w:id="15"/>
-    </w:p>
-    <w:p>
-      <w:pPr>
-        <w:spacing w:after="100" w:line="276"/>
-      </w:pPr>
-      <w:r>
-        <w:rPr>
-          <w:sz w:val="22"/>
-          <w:szCs w:val="22"/>
-        </w:rPr>
-        <w:t xml:space="preserve">Keep predicates precise. Use partial-flow debugging when paths are missing. See examples/chapter13/.</w:t>
-      </w:r>
-    </w:p>
-    <w:p>
-      <w:pPr>
-        <w:pStyle w:val="Heading1"/>
-        <w:pageBreakBefore/>
-      </w:pPr>
-      <w:bookmarkStart w:name="_Toc16" w:id="16"/>
-      <w:r>
-        <w:t xml:space="preserve">Chapter 14: Case Studies</w:t>
-      </w:r>
-      <w:bookmarkEnd w:id="16"/>
-    </w:p>
-    <w:p>
-      <w:pPr>
-        <w:spacing w:after="100" w:line="276"/>
-      </w:pPr>
-      <w:r>
-        <w:rPr>
-          <w:sz w:val="22"/>
-          <w:szCs w:val="22"/>
-        </w:rPr>
-        <w:t xml:space="preserve">Published analyses and examples/chapter14/ illustrate complete source-to-sink queries that belong in a production pack.</w:t>
-      </w:r>
-    </w:p>
-    <w:p>
-      <w:pPr>
-        <w:pStyle w:val="Heading1"/>
-        <w:pageBreakBefore/>
-      </w:pPr>
-      <w:bookmarkStart w:name="_Toc17" w:id="17"/>
-      <w:r>
-        <w:t xml:space="preserve">Chapter 15: Best Practices</w:t>
-      </w:r>
-      <w:bookmarkEnd w:id="17"/>
-    </w:p>
-    <w:p>
-      <w:pPr>
-        <w:spacing w:after="100" w:line="276"/>
-      </w:pPr>
-      <w:r>
-        <w:rPr>
-          <w:sz w:val="22"/>
-          <w:szCs w:val="22"/>
-        </w:rPr>
-        <w:t xml:space="preserve">Package models separately, test everything, pin versions, and contribute stable models upstream.</w:t>
-      </w:r>
-    </w:p>
-    <w:p>
-      <w:pPr>
-        <w:pStyle w:val="Heading1"/>
-        <w:pageBreakBefore/>
-      </w:pPr>
-      <w:bookmarkStart w:name="_Toc18" w:id="18"/>
-      <w:r>
-        <w:t xml:space="preserve">Appendix</w:t>
-      </w:r>
-      <w:bookmarkEnd w:id="18"/>
-    </w:p>
-    <w:p>
-      <w:pPr>
-        <w:spacing w:after="100" w:line="276"/>
-      </w:pPr>
-      <w:r>
-        <w:rPr>
-          <w:sz w:val="22"/>
-          <w:szCs w:val="22"/>
-        </w:rPr>
-        <w:t xml:space="preserve">Chapter 11 examples: examples/chapter11/qlpack.yml and example-suite.qls. Official docs: https://codeql.github.com/docs/. Repository: https://github.com/rod-trent/MustLearnCodeQL.</w:t>
-      </w:r>
-    </w:p>
-    <w:p>
-      <w:pPr>
-        <w:spacing w:before="200"/>
+        <w:t xml:space="preserve">Sample workflow: examples/chapter12/codeql-analysis.yml. Official CodeQL Action documentation and https://codeql.github.com/docs/. Repository: https://github.com/rod-trent/MustLearnCodeQL.</w:t>
+      </w:r>
+    </w:p>
+    <w:p>
+      <w:pPr>
+        <w:spacing w:before="160"/>
         <w:jc w:val="center"/>
       </w:pPr>
       <w:r>
@@ -1313,8 +1143,8 @@
           <w:i/>
           <w:iCs/>
           <w:color w:val="666666"/>
-          <w:sz w:val="20"/>
-          <w:szCs w:val="20"/>
+          <w:sz w:val="18"/>
+          <w:szCs w:val="18"/>
         </w:rPr>
         <w:t xml:space="preserve">End of Must Learn CodeQL</w:t>
       </w:r>
@@ -1749,7 +1579,7 @@
     <w:next w:val="Normal"/>
     <w:qFormat/>
     <w:pPr>
-      <w:spacing w:after="80" w:before="140"/>
+      <w:spacing w:after="60" w:before="120"/>
       <w:outlineLvl w:val="0"/>
     </w:pPr>
     <w:rPr>
@@ -1767,7 +1597,7 @@
     <w:next w:val="Normal"/>
     <w:qFormat/>
     <w:pPr>
-      <w:spacing w:after="60" w:before="160"/>
+      <w:spacing w:after="50" w:before="140"/>
       <w:outlineLvl w:val="1"/>
     </w:pPr>
     <w:rPr>

</xml_diff>

<commit_message>
Expand Chapter 13 on performance, efficient predicates, and partial-flow debugging
</commit_message>
<xml_diff>
--- a/Book_Version/MustLearnCodeQL.docx
+++ b/Book_Version/MustLearnCodeQL.docx
@@ -4,7 +4,7 @@
   <w:body>
     <w:p>
       <w:pPr>
-        <w:spacing w:after="60"/>
+        <w:spacing w:after="40"/>
         <w:jc w:val="center"/>
       </w:pPr>
       <w:r>
@@ -12,15 +12,15 @@
           <w:b/>
           <w:bCs/>
           <w:color w:val="1F4E79"/>
-          <w:sz w:val="42"/>
-          <w:szCs w:val="42"/>
+          <w:sz w:val="40"/>
+          <w:szCs w:val="40"/>
         </w:rPr>
         <w:t xml:space="preserve">Must Learn CodeQL</w:t>
       </w:r>
     </w:p>
     <w:p>
       <w:pPr>
-        <w:spacing w:after="100"/>
+        <w:spacing w:after="80"/>
         <w:jc w:val="center"/>
       </w:pPr>
       <w:r>
@@ -48,10 +48,10 @@
     </w:p>
     <w:p>
       <w:pPr>
-        <w:spacing w:before="40"/>
+        <w:spacing w:before="30"/>
         <w:jc w:val="center"/>
       </w:pPr>
-      <w:hyperlink w:history="1" r:id="rIdj4qcyd7ntp-wbt7ggyu77">
+      <w:hyperlink w:history="1" r:id="rId2z1kwfqcugttcuhwerggk">
         <w:r>
           <w:rPr>
             <w:rStyle w:val="Hyperlink"/>
@@ -156,7 +156,7 @@
           </w:pPr>
           <w:hyperlink w:history="1" w:anchor="_Toc4">
             <w:r>
-              <w:t xml:space="preserve">Chapter 12: Integrating CodeQL into Development Workflows</w:t>
+              <w:t xml:space="preserve">Chapter 13: Advanced Techniques and Performance</w:t>
             </w:r>
             <w:r>
               <w:tab/>
@@ -179,7 +179,7 @@
           </w:pPr>
           <w:hyperlink w:history="1" w:anchor="_Toc5">
             <w:r>
-              <w:t xml:space="preserve">Why CI Integration Matters</w:t>
+              <w:t xml:space="preserve">Why Performance and Debuggability Matter</w:t>
             </w:r>
             <w:r>
               <w:tab/>
@@ -202,7 +202,7 @@
           </w:pPr>
           <w:hyperlink w:history="1" w:anchor="_Toc6">
             <w:r>
-              <w:t xml:space="preserve">GitHub Code Scanning and the CodeQL Action</w:t>
+              <w:t xml:space="preserve">Writing Efficient Predicates</w:t>
             </w:r>
             <w:r>
               <w:tab/>
@@ -225,7 +225,7 @@
           </w:pPr>
           <w:hyperlink w:history="1" w:anchor="_Toc7">
             <w:r>
-              <w:t xml:space="preserve">Minimal Workflow Sketch</w:t>
+              <w:t xml:space="preserve">Source and Sink Precision</w:t>
             </w:r>
             <w:r>
               <w:tab/>
@@ -248,7 +248,7 @@
           </w:pPr>
           <w:hyperlink w:history="1" w:anchor="_Toc8">
             <w:r>
-              <w:t xml:space="preserve">Other Continuous Integration Systems</w:t>
+              <w:t xml:space="preserve">Local versus Global</w:t>
             </w:r>
             <w:r>
               <w:tab/>
@@ -271,7 +271,7 @@
           </w:pPr>
           <w:hyperlink w:history="1" w:anchor="_Toc9">
             <w:r>
-              <w:t xml:space="preserve">Multi-Repository Variant Analysis</w:t>
+              <w:t xml:space="preserve">Partial-Flow Debugging</w:t>
             </w:r>
             <w:r>
               <w:tab/>
@@ -294,7 +294,7 @@
           </w:pPr>
           <w:hyperlink w:history="1" w:anchor="_Toc10">
             <w:r>
-              <w:t xml:space="preserve">Rollout Practices</w:t>
+              <w:t xml:space="preserve">Profiling and Measurement</w:t>
             </w:r>
             <w:r>
               <w:tab/>
@@ -317,7 +317,7 @@
           </w:pPr>
           <w:hyperlink w:history="1" w:anchor="_Toc11">
             <w:r>
-              <w:t xml:space="preserve">Common Integration Pitfalls</w:t>
+              <w:t xml:space="preserve">Modular Design</w:t>
             </w:r>
             <w:r>
               <w:tab/>
@@ -332,14 +332,15 @@
         </w:p>
         <w:p>
           <w:pPr>
-            <w:pStyle w:val="TOC1"/>
+            <w:pStyle w:val="TOC2"/>
             <w:tabs>
               <w:tab w:val="right" w:pos="9648" w:leader="dot"/>
             </w:tabs>
+            <w:ind w:left="220"/>
           </w:pPr>
           <w:hyperlink w:history="1" w:anchor="_Toc12">
             <w:r>
-              <w:t xml:space="preserve">Chapter 13: Performance and Debugging</w:t>
+              <w:t xml:space="preserve">Common Performance Pitfalls</w:t>
             </w:r>
             <w:r>
               <w:tab/>
@@ -354,14 +355,15 @@
         </w:p>
         <w:p>
           <w:pPr>
-            <w:pStyle w:val="TOC1"/>
+            <w:pStyle w:val="TOC2"/>
             <w:tabs>
               <w:tab w:val="right" w:pos="9648" w:leader="dot"/>
             </w:tabs>
+            <w:ind w:left="220"/>
           </w:pPr>
           <w:hyperlink w:history="1" w:anchor="_Toc13">
             <w:r>
-              <w:t xml:space="preserve">Chapter 14: Case Studies</w:t>
+              <w:t xml:space="preserve">Practical Checklist</w:t>
             </w:r>
             <w:r>
               <w:tab/>
@@ -383,7 +385,7 @@
           </w:pPr>
           <w:hyperlink w:history="1" w:anchor="_Toc14">
             <w:r>
-              <w:t xml:space="preserve">Chapter 15: Best Practices</w:t>
+              <w:t xml:space="preserve">Chapter 14: Case Studies</w:t>
             </w:r>
             <w:r>
               <w:tab/>
@@ -405,7 +407,7 @@
           </w:pPr>
           <w:hyperlink w:history="1" w:anchor="_Toc15">
             <w:r>
-              <w:t xml:space="preserve">Appendix</w:t>
+              <w:t xml:space="preserve">Chapter 15: Best Practices</w:t>
             </w:r>
             <w:r>
               <w:tab/>
@@ -413,6 +415,28 @@
             <w:r>
               <w:fldChar w:fldCharType="begin" w:dirty="true"/>
               <w:instrText xml:space="preserve">PAGEREF _Toc15 \h</w:instrText>
+              <w:fldChar w:fldCharType="separate"/>
+              <w:fldChar w:fldCharType="end"/>
+            </w:r>
+          </w:hyperlink>
+        </w:p>
+        <w:p>
+          <w:pPr>
+            <w:pStyle w:val="TOC1"/>
+            <w:tabs>
+              <w:tab w:val="right" w:pos="9648" w:leader="dot"/>
+            </w:tabs>
+          </w:pPr>
+          <w:hyperlink w:history="1" w:anchor="_Toc16">
+            <w:r>
+              <w:t xml:space="preserve">Appendix</w:t>
+            </w:r>
+            <w:r>
+              <w:tab/>
+            </w:r>
+            <w:r>
+              <w:fldChar w:fldCharType="begin" w:dirty="true"/>
+              <w:instrText xml:space="preserve">PAGEREF _Toc16 \h</w:instrText>
               <w:fldChar w:fldCharType="separate"/>
               <w:fldChar w:fldCharType="end"/>
             </w:r>
@@ -438,14 +462,14 @@
     </w:p>
     <w:p>
       <w:pPr>
-        <w:spacing w:after="90" w:line="276"/>
-      </w:pPr>
-      <w:r>
-        <w:rPr>
-          <w:sz w:val="22"/>
-          <w:szCs w:val="22"/>
-        </w:rPr>
-        <w:t xml:space="preserve">Chapter 12 on CI integration has been expanded. The sample workflow is in examples/chapter12/codeql-analysis.yml.</w:t>
+        <w:spacing w:after="80" w:line="276"/>
+      </w:pPr>
+      <w:r>
+        <w:rPr>
+          <w:sz w:val="22"/>
+          <w:szCs w:val="22"/>
+        </w:rPr>
+        <w:t xml:space="preserve">Chapter 13 on performance and debugging has been expanded. Related example: examples/chapter13/performance-predicate.ql.</w:t>
       </w:r>
     </w:p>
     <w:p>
@@ -461,14 +485,14 @@
     </w:p>
     <w:p>
       <w:pPr>
-        <w:spacing w:after="90" w:line="276"/>
-      </w:pPr>
-      <w:r>
-        <w:rPr>
-          <w:sz w:val="22"/>
-          <w:szCs w:val="22"/>
-        </w:rPr>
-        <w:t xml:space="preserve">Chapters 1–11 cover fundamentals through packaging: databases, QL, data flow, taint tracking, library extension, packs, suites, and metadata. This chapter shows how to run those packs automatically.</w:t>
+        <w:spacing w:after="80" w:line="276"/>
+      </w:pPr>
+      <w:r>
+        <w:rPr>
+          <w:sz w:val="22"/>
+          <w:szCs w:val="22"/>
+        </w:rPr>
+        <w:t xml:space="preserve">Chapters 1–12 cover fundamentals through CI integration. This chapter focuses on keeping queries fast and diagnosable once they run regularly.</w:t>
       </w:r>
     </w:p>
     <w:p>
@@ -478,7 +502,7 @@
       </w:pPr>
       <w:bookmarkStart w:name="_Toc4" w:id="4"/>
       <w:r>
-        <w:t xml:space="preserve">Chapter 12: Integrating CodeQL into Development Workflows</w:t>
+        <w:t xml:space="preserve">Chapter 13: Advanced Techniques and Performance</w:t>
       </w:r>
       <w:bookmarkEnd w:id="4"/>
     </w:p>
@@ -488,20 +512,20 @@
       </w:pPr>
       <w:bookmarkStart w:name="_Toc5" w:id="5"/>
       <w:r>
-        <w:t xml:space="preserve">Why CI Integration Matters</w:t>
+        <w:t xml:space="preserve">Why Performance and Debuggability Matter</w:t>
       </w:r>
       <w:bookmarkEnd w:id="5"/>
     </w:p>
     <w:p>
       <w:pPr>
-        <w:spacing w:after="90" w:line="276"/>
-      </w:pPr>
-      <w:r>
-        <w:rPr>
-          <w:sz w:val="22"/>
-          <w:szCs w:val="22"/>
-        </w:rPr>
-        <w:t xml:space="preserve">A query that is run only by hand protects nothing after the first week. Embedding CodeQL in continuous integration turns every pull request into an opportunity to catch regressions and new variants of known issues. Alerts appear where developers already work, with paths and severity, so triage is immediate.</w:t>
+        <w:spacing w:after="80" w:line="276"/>
+      </w:pPr>
+      <w:r>
+        <w:rPr>
+          <w:sz w:val="22"/>
+          <w:szCs w:val="22"/>
+        </w:rPr>
+        <w:t xml:space="preserve">A query that is correct but slow will be disabled. A query that produces unexplained missing results will be distrusted. Once CodeQL runs in CI, both speed and the ability to diagnose surprises become production requirements. Most performance problems are precision problems in disguise, and most missing paths are modeling gaps.</w:t>
       </w:r>
     </w:p>
     <w:p>
@@ -510,92 +534,32 @@
       </w:pPr>
       <w:bookmarkStart w:name="_Toc6" w:id="6"/>
       <w:r>
-        <w:t xml:space="preserve">GitHub Code Scanning and the CodeQL Action</w:t>
+        <w:t xml:space="preserve">Writing Efficient Predicates</w:t>
       </w:r>
       <w:bookmarkEnd w:id="6"/>
     </w:p>
     <w:p>
       <w:pPr>
-        <w:spacing w:after="90" w:line="276"/>
-      </w:pPr>
-      <w:r>
-        <w:rPr>
-          <w:sz w:val="22"/>
-          <w:szCs w:val="22"/>
-        </w:rPr>
-        <w:t xml:space="preserve">The most common setup uses the official CodeQL GitHub Action. The workflow checks out the repository, initializes CodeQL for the desired languages, optionally builds the project, runs the selected queries or suite, and uploads the SARIF results. Alerts then appear in the repository Security tab and as pull-request comments.</w:t>
-      </w:r>
-    </w:p>
-    <w:p>
-      <w:pPr>
-        <w:spacing w:after="90" w:line="276"/>
-      </w:pPr>
-      <w:r>
-        <w:rPr>
-          <w:sz w:val="22"/>
-          <w:szCs w:val="22"/>
-        </w:rPr>
-        <w:t xml:space="preserve">A complete, adaptable workflow is provided at examples/chapter12/codeql-analysis.yml. Key points you will customize:</w:t>
-      </w:r>
-    </w:p>
-    <w:p>
-      <w:pPr>
-        <w:spacing w:after="90" w:line="276"/>
-      </w:pPr>
-      <w:r>
-        <w:rPr>
-          <w:sz w:val="22"/>
-          <w:szCs w:val="22"/>
-        </w:rPr>
-        <w:t xml:space="preserve">• Language matrix (javascript, python, java, cpp, etc.)</w:t>
-      </w:r>
-    </w:p>
-    <w:p>
-      <w:pPr>
-        <w:spacing w:after="90" w:line="276"/>
-      </w:pPr>
-      <w:r>
-        <w:rPr>
-          <w:sz w:val="22"/>
-          <w:szCs w:val="22"/>
-        </w:rPr>
-        <w:t xml:space="preserve">• Queries or packs/suites to run (built-in security-extended or your own pack)</w:t>
-      </w:r>
-    </w:p>
-    <w:p>
-      <w:pPr>
-        <w:spacing w:after="90" w:line="276"/>
-      </w:pPr>
-      <w:r>
-        <w:rPr>
-          <w:sz w:val="22"/>
-          <w:szCs w:val="22"/>
-        </w:rPr>
-        <w:t xml:space="preserve">• Build mode or explicit build command for compiled languages</w:t>
-      </w:r>
-    </w:p>
-    <w:p>
-      <w:pPr>
-        <w:spacing w:after="90" w:line="276"/>
-      </w:pPr>
-      <w:r>
-        <w:rPr>
-          <w:sz w:val="22"/>
-          <w:szCs w:val="22"/>
-        </w:rPr>
-        <w:t xml:space="preserve">• Paths to ignore (generated code, vendored dependencies)</w:t>
-      </w:r>
-    </w:p>
-    <w:p>
-      <w:pPr>
-        <w:spacing w:after="90" w:line="276"/>
-      </w:pPr>
-      <w:r>
-        <w:rPr>
-          <w:sz w:val="22"/>
-          <w:szCs w:val="22"/>
-        </w:rPr>
-        <w:t xml:space="preserve">• Permissions required for security-events: write</w:t>
+        <w:spacing w:after="80" w:line="276"/>
+      </w:pPr>
+      <w:r>
+        <w:rPr>
+          <w:sz w:val="22"/>
+          <w:szCs w:val="22"/>
+        </w:rPr>
+        <w:t xml:space="preserve">Keep predicates small and specific. The optimizer works better with clear, narrow relations than with large, overlapping ones. Prefer predicates already provided by the standard libraries over hand-written joins. Avoid unnecessary recursion and broad exists clauses when a more precise formulation exists.</w:t>
+      </w:r>
+    </w:p>
+    <w:p>
+      <w:pPr>
+        <w:spacing w:after="80" w:line="276"/>
+      </w:pPr>
+      <w:r>
+        <w:rPr>
+          <w:sz w:val="22"/>
+          <w:szCs w:val="22"/>
+        </w:rPr>
+        <w:t xml:space="preserve">A tighter formulation of an eval check (excluding certain wrappers early) is shown in examples/chapter13/performance-predicate.ql. Compare it with a naïve version that selects every call and filters later; the early filter reduces work.</w:t>
       </w:r>
     </w:p>
     <w:p>
@@ -604,353 +568,20 @@
       </w:pPr>
       <w:bookmarkStart w:name="_Toc7" w:id="7"/>
       <w:r>
-        <w:t xml:space="preserve">Minimal Workflow Sketch</w:t>
+        <w:t xml:space="preserve">Source and Sink Precision</w:t>
       </w:r>
       <w:bookmarkEnd w:id="7"/>
     </w:p>
     <w:p>
       <w:pPr>
-        <w:spacing w:after="15" w:before="50"/>
-      </w:pPr>
-    </w:p>
-    <w:p>
-      <w:pPr>
-        <w:pBdr>
-          <w:left w:val="single" w:color="2E75B6" w:sz="12" w:space="6"/>
-        </w:pBdr>
-        <w:shd w:fill="F7F9FC" w:val="clear"/>
-        <w:spacing w:after="0" w:line="240"/>
-        <w:ind w:left="320"/>
-      </w:pPr>
-      <w:r>
-        <w:rPr>
-          <w:rFonts w:ascii="Consolas" w:cs="Consolas" w:eastAsia="Consolas" w:hAnsi="Consolas"/>
-          <w:color w:val="1E293B"/>
-          <w:sz w:val="18"/>
-          <w:szCs w:val="18"/>
-        </w:rPr>
-        <w:t xml:space="preserve">name: CodeQL</w:t>
-      </w:r>
-    </w:p>
-    <w:p>
-      <w:pPr>
-        <w:pBdr>
-          <w:left w:val="single" w:color="2E75B6" w:sz="12" w:space="6"/>
-        </w:pBdr>
-        <w:shd w:fill="F7F9FC" w:val="clear"/>
-        <w:spacing w:after="0" w:line="240"/>
-        <w:ind w:left="320"/>
-      </w:pPr>
-      <w:r>
-        <w:rPr>
-          <w:rFonts w:ascii="Consolas" w:cs="Consolas" w:eastAsia="Consolas" w:hAnsi="Consolas"/>
-          <w:color w:val="1E293B"/>
-          <w:sz w:val="18"/>
-          <w:szCs w:val="18"/>
-        </w:rPr>
-        <w:t xml:space="preserve">on:</w:t>
-      </w:r>
-    </w:p>
-    <w:p>
-      <w:pPr>
-        <w:pBdr>
-          <w:left w:val="single" w:color="2E75B6" w:sz="12" w:space="6"/>
-        </w:pBdr>
-        <w:shd w:fill="F7F9FC" w:val="clear"/>
-        <w:spacing w:after="0" w:line="240"/>
-        <w:ind w:left="320"/>
-      </w:pPr>
-      <w:r>
-        <w:rPr>
-          <w:rFonts w:ascii="Consolas" w:cs="Consolas" w:eastAsia="Consolas" w:hAnsi="Consolas"/>
-          <w:color w:val="1E293B"/>
-          <w:sz w:val="18"/>
-          <w:szCs w:val="18"/>
-        </w:rPr>
-        <w:t xml:space="preserve">  push:</w:t>
-      </w:r>
-    </w:p>
-    <w:p>
-      <w:pPr>
-        <w:pBdr>
-          <w:left w:val="single" w:color="2E75B6" w:sz="12" w:space="6"/>
-        </w:pBdr>
-        <w:shd w:fill="F7F9FC" w:val="clear"/>
-        <w:spacing w:after="0" w:line="240"/>
-        <w:ind w:left="320"/>
-      </w:pPr>
-      <w:r>
-        <w:rPr>
-          <w:rFonts w:ascii="Consolas" w:cs="Consolas" w:eastAsia="Consolas" w:hAnsi="Consolas"/>
-          <w:color w:val="1E293B"/>
-          <w:sz w:val="18"/>
-          <w:szCs w:val="18"/>
-        </w:rPr>
-        <w:t xml:space="preserve">    branches: [ main ]</w:t>
-      </w:r>
-    </w:p>
-    <w:p>
-      <w:pPr>
-        <w:pBdr>
-          <w:left w:val="single" w:color="2E75B6" w:sz="12" w:space="6"/>
-        </w:pBdr>
-        <w:shd w:fill="F7F9FC" w:val="clear"/>
-        <w:spacing w:after="0" w:line="240"/>
-        <w:ind w:left="320"/>
-      </w:pPr>
-      <w:r>
-        <w:rPr>
-          <w:rFonts w:ascii="Consolas" w:cs="Consolas" w:eastAsia="Consolas" w:hAnsi="Consolas"/>
-          <w:color w:val="1E293B"/>
-          <w:sz w:val="18"/>
-          <w:szCs w:val="18"/>
-        </w:rPr>
-        <w:t xml:space="preserve">  pull_request:</w:t>
-      </w:r>
-    </w:p>
-    <w:p>
-      <w:pPr>
-        <w:pBdr>
-          <w:left w:val="single" w:color="2E75B6" w:sz="12" w:space="6"/>
-        </w:pBdr>
-        <w:shd w:fill="F7F9FC" w:val="clear"/>
-        <w:spacing w:after="0" w:line="240"/>
-        <w:ind w:left="320"/>
-      </w:pPr>
-      <w:r>
-        <w:rPr>
-          <w:rFonts w:ascii="Consolas" w:cs="Consolas" w:eastAsia="Consolas" w:hAnsi="Consolas"/>
-          <w:color w:val="1E293B"/>
-          <w:sz w:val="18"/>
-          <w:szCs w:val="18"/>
-        </w:rPr>
-        <w:t xml:space="preserve">jobs:</w:t>
-      </w:r>
-    </w:p>
-    <w:p>
-      <w:pPr>
-        <w:pBdr>
-          <w:left w:val="single" w:color="2E75B6" w:sz="12" w:space="6"/>
-        </w:pBdr>
-        <w:shd w:fill="F7F9FC" w:val="clear"/>
-        <w:spacing w:after="0" w:line="240"/>
-        <w:ind w:left="320"/>
-      </w:pPr>
-      <w:r>
-        <w:rPr>
-          <w:rFonts w:ascii="Consolas" w:cs="Consolas" w:eastAsia="Consolas" w:hAnsi="Consolas"/>
-          <w:color w:val="1E293B"/>
-          <w:sz w:val="18"/>
-          <w:szCs w:val="18"/>
-        </w:rPr>
-        <w:t xml:space="preserve">  analyze:</w:t>
-      </w:r>
-    </w:p>
-    <w:p>
-      <w:pPr>
-        <w:pBdr>
-          <w:left w:val="single" w:color="2E75B6" w:sz="12" w:space="6"/>
-        </w:pBdr>
-        <w:shd w:fill="F7F9FC" w:val="clear"/>
-        <w:spacing w:after="0" w:line="240"/>
-        <w:ind w:left="320"/>
-      </w:pPr>
-      <w:r>
-        <w:rPr>
-          <w:rFonts w:ascii="Consolas" w:cs="Consolas" w:eastAsia="Consolas" w:hAnsi="Consolas"/>
-          <w:color w:val="1E293B"/>
-          <w:sz w:val="18"/>
-          <w:szCs w:val="18"/>
-        </w:rPr>
-        <w:t xml:space="preserve">    runs-on: ubuntu-latest</w:t>
-      </w:r>
-    </w:p>
-    <w:p>
-      <w:pPr>
-        <w:pBdr>
-          <w:left w:val="single" w:color="2E75B6" w:sz="12" w:space="6"/>
-        </w:pBdr>
-        <w:shd w:fill="F7F9FC" w:val="clear"/>
-        <w:spacing w:after="0" w:line="240"/>
-        <w:ind w:left="320"/>
-      </w:pPr>
-      <w:r>
-        <w:rPr>
-          <w:rFonts w:ascii="Consolas" w:cs="Consolas" w:eastAsia="Consolas" w:hAnsi="Consolas"/>
-          <w:color w:val="1E293B"/>
-          <w:sz w:val="18"/>
-          <w:szCs w:val="18"/>
-        </w:rPr>
-        <w:t xml:space="preserve">    permissions:</w:t>
-      </w:r>
-    </w:p>
-    <w:p>
-      <w:pPr>
-        <w:pBdr>
-          <w:left w:val="single" w:color="2E75B6" w:sz="12" w:space="6"/>
-        </w:pBdr>
-        <w:shd w:fill="F7F9FC" w:val="clear"/>
-        <w:spacing w:after="0" w:line="240"/>
-        <w:ind w:left="320"/>
-      </w:pPr>
-      <w:r>
-        <w:rPr>
-          <w:rFonts w:ascii="Consolas" w:cs="Consolas" w:eastAsia="Consolas" w:hAnsi="Consolas"/>
-          <w:color w:val="1E293B"/>
-          <w:sz w:val="18"/>
-          <w:szCs w:val="18"/>
-        </w:rPr>
-        <w:t xml:space="preserve">      security-events: write</w:t>
-      </w:r>
-    </w:p>
-    <w:p>
-      <w:pPr>
-        <w:pBdr>
-          <w:left w:val="single" w:color="2E75B6" w:sz="12" w:space="6"/>
-        </w:pBdr>
-        <w:shd w:fill="F7F9FC" w:val="clear"/>
-        <w:spacing w:after="0" w:line="240"/>
-        <w:ind w:left="320"/>
-      </w:pPr>
-      <w:r>
-        <w:rPr>
-          <w:rFonts w:ascii="Consolas" w:cs="Consolas" w:eastAsia="Consolas" w:hAnsi="Consolas"/>
-          <w:color w:val="1E293B"/>
-          <w:sz w:val="18"/>
-          <w:szCs w:val="18"/>
-        </w:rPr>
-        <w:t xml:space="preserve">    steps:</w:t>
-      </w:r>
-    </w:p>
-    <w:p>
-      <w:pPr>
-        <w:pBdr>
-          <w:left w:val="single" w:color="2E75B6" w:sz="12" w:space="6"/>
-        </w:pBdr>
-        <w:shd w:fill="F7F9FC" w:val="clear"/>
-        <w:spacing w:after="0" w:line="240"/>
-        <w:ind w:left="320"/>
-      </w:pPr>
-      <w:r>
-        <w:rPr>
-          <w:rFonts w:ascii="Consolas" w:cs="Consolas" w:eastAsia="Consolas" w:hAnsi="Consolas"/>
-          <w:color w:val="1E293B"/>
-          <w:sz w:val="18"/>
-          <w:szCs w:val="18"/>
-        </w:rPr>
-        <w:t xml:space="preserve">      - uses: actions/checkout@v4</w:t>
-      </w:r>
-    </w:p>
-    <w:p>
-      <w:pPr>
-        <w:pBdr>
-          <w:left w:val="single" w:color="2E75B6" w:sz="12" w:space="6"/>
-        </w:pBdr>
-        <w:shd w:fill="F7F9FC" w:val="clear"/>
-        <w:spacing w:after="0" w:line="240"/>
-        <w:ind w:left="320"/>
-      </w:pPr>
-      <w:r>
-        <w:rPr>
-          <w:rFonts w:ascii="Consolas" w:cs="Consolas" w:eastAsia="Consolas" w:hAnsi="Consolas"/>
-          <w:color w:val="1E293B"/>
-          <w:sz w:val="18"/>
-          <w:szCs w:val="18"/>
-        </w:rPr>
-        <w:t xml:space="preserve">      - uses: github/codeql-action/init@v3</w:t>
-      </w:r>
-    </w:p>
-    <w:p>
-      <w:pPr>
-        <w:pBdr>
-          <w:left w:val="single" w:color="2E75B6" w:sz="12" w:space="6"/>
-        </w:pBdr>
-        <w:shd w:fill="F7F9FC" w:val="clear"/>
-        <w:spacing w:after="0" w:line="240"/>
-        <w:ind w:left="320"/>
-      </w:pPr>
-      <w:r>
-        <w:rPr>
-          <w:rFonts w:ascii="Consolas" w:cs="Consolas" w:eastAsia="Consolas" w:hAnsi="Consolas"/>
-          <w:color w:val="1E293B"/>
-          <w:sz w:val="18"/>
-          <w:szCs w:val="18"/>
-        </w:rPr>
-        <w:t xml:space="preserve">        with:</w:t>
-      </w:r>
-    </w:p>
-    <w:p>
-      <w:pPr>
-        <w:pBdr>
-          <w:left w:val="single" w:color="2E75B6" w:sz="12" w:space="6"/>
-        </w:pBdr>
-        <w:shd w:fill="F7F9FC" w:val="clear"/>
-        <w:spacing w:after="0" w:line="240"/>
-        <w:ind w:left="320"/>
-      </w:pPr>
-      <w:r>
-        <w:rPr>
-          <w:rFonts w:ascii="Consolas" w:cs="Consolas" w:eastAsia="Consolas" w:hAnsi="Consolas"/>
-          <w:color w:val="1E293B"/>
-          <w:sz w:val="18"/>
-          <w:szCs w:val="18"/>
-        </w:rPr>
-        <w:t xml:space="preserve">          languages: javascript</w:t>
-      </w:r>
-    </w:p>
-    <w:p>
-      <w:pPr>
-        <w:pBdr>
-          <w:left w:val="single" w:color="2E75B6" w:sz="12" w:space="6"/>
-        </w:pBdr>
-        <w:shd w:fill="F7F9FC" w:val="clear"/>
-        <w:spacing w:after="0" w:line="240"/>
-        <w:ind w:left="320"/>
-      </w:pPr>
-      <w:r>
-        <w:rPr>
-          <w:rFonts w:ascii="Consolas" w:cs="Consolas" w:eastAsia="Consolas" w:hAnsi="Consolas"/>
-          <w:color w:val="1E293B"/>
-          <w:sz w:val="18"/>
-          <w:szCs w:val="18"/>
-        </w:rPr>
-        <w:t xml:space="preserve">          queries: security-extended</w:t>
-      </w:r>
-    </w:p>
-    <w:p>
-      <w:pPr>
-        <w:pBdr>
-          <w:left w:val="single" w:color="2E75B6" w:sz="12" w:space="6"/>
-        </w:pBdr>
-        <w:shd w:fill="F7F9FC" w:val="clear"/>
-        <w:spacing w:after="0" w:line="240"/>
-        <w:ind w:left="320"/>
-      </w:pPr>
-      <w:r>
-        <w:rPr>
-          <w:rFonts w:ascii="Consolas" w:cs="Consolas" w:eastAsia="Consolas" w:hAnsi="Consolas"/>
-          <w:color w:val="1E293B"/>
-          <w:sz w:val="18"/>
-          <w:szCs w:val="18"/>
-        </w:rPr>
-        <w:t xml:space="preserve">      - uses: github/codeql-action/analyze@v3</w:t>
-      </w:r>
-    </w:p>
-    <w:p>
-      <w:pPr>
-        <w:spacing w:after="70" w:before="15"/>
-      </w:pPr>
-    </w:p>
-    <w:p>
-      <w:pPr>
-        <w:spacing w:after="90" w:line="276"/>
-      </w:pPr>
-      <w:r>
-        <w:rPr>
-          <w:sz w:val="22"/>
-          <w:szCs w:val="22"/>
-        </w:rPr>
-        <w:t xml:space="preserve">For a custom pack or suite, replace the queries value with a pack reference or a path to your .qls file. Compiled languages usually need an explicit build step between init and analyze, or a configured build mode.</w:t>
+        <w:spacing w:after="80" w:line="276"/>
+      </w:pPr>
+      <w:r>
+        <w:rPr>
+          <w:sz w:val="22"/>
+          <w:szCs w:val="22"/>
+        </w:rPr>
+        <w:t xml:space="preserve">Global data-flow and taint-tracking configurations are expensive when sources or sinks match too much. A source predicate that matches every string forces the engine to explore a huge graph. Start with the most specific library classes available (RemoteFlowSource, language-specific sink classes), then extend only where required. The same discipline applies to barriers: precise barriers both improve results and can prune search space.</w:t>
       </w:r>
     </w:p>
     <w:p>
@@ -959,20 +590,20 @@
       </w:pPr>
       <w:bookmarkStart w:name="_Toc8" w:id="8"/>
       <w:r>
-        <w:t xml:space="preserve">Other Continuous Integration Systems</w:t>
+        <w:t xml:space="preserve">Local versus Global</w:t>
       </w:r>
       <w:bookmarkEnd w:id="8"/>
     </w:p>
     <w:p>
       <w:pPr>
-        <w:spacing w:after="90" w:line="276"/>
-      </w:pPr>
-      <w:r>
-        <w:rPr>
-          <w:sz w:val="22"/>
-          <w:szCs w:val="22"/>
-        </w:rPr>
-        <w:t xml:space="preserve">If you use Jenkins, Azure Pipelines, GitLab CI, or another system, download the CodeQL CLI bundle, create the database with the same commands shown in earlier chapters, run the queries or suite, and upload the resulting SARIF file to GitHub (via the API or the codeql github upload-results command). The packs, suites, and metadata you prepared in Chapter 11 work unchanged.</w:t>
+        <w:spacing w:after="80" w:line="276"/>
+      </w:pPr>
+      <w:r>
+        <w:rPr>
+          <w:sz w:val="22"/>
+          <w:szCs w:val="22"/>
+        </w:rPr>
+        <w:t xml:space="preserve">Use local data flow whenever the check does not need to cross function boundaries. Local analysis is dramatically cheaper. Only promote a query to global flow when you have confirmed that inter-procedural tracking is required for the vulnerability class you care about.</w:t>
       </w:r>
     </w:p>
     <w:p>
@@ -981,20 +612,80 @@
       </w:pPr>
       <w:bookmarkStart w:name="_Toc9" w:id="9"/>
       <w:r>
-        <w:t xml:space="preserve">Multi-Repository Variant Analysis</w:t>
+        <w:t xml:space="preserve">Partial-Flow Debugging</w:t>
       </w:r>
       <w:bookmarkEnd w:id="9"/>
     </w:p>
     <w:p>
       <w:pPr>
-        <w:spacing w:after="90" w:line="276"/>
-      </w:pPr>
-      <w:r>
-        <w:rPr>
-          <w:sz w:val="22"/>
-          <w:szCs w:val="22"/>
-        </w:rPr>
-        <w:t xml:space="preserve">For research or organization-wide hunting, multi-repository variant analysis (MRVA) runs a single query or suite against a large set of repositories. This is the same mechanism used by security researchers to discover new vulnerability variants at scale. Results can be exported and triaged centrally. MRVA complements per-repository CI: CI prevents regressions; MRVA finds historical and cross-repo instances.</w:t>
+        <w:spacing w:after="80" w:line="276"/>
+      </w:pPr>
+      <w:r>
+        <w:rPr>
+          <w:sz w:val="22"/>
+          <w:szCs w:val="22"/>
+        </w:rPr>
+        <w:t xml:space="preserve">When an expected path is absent, partial-flow predicates show the frontier—the last nodes taint actually reached. That frontier almost always identifies a missing additional flow step, an accidental barrier, or a source/sink predicate that does not match the nodes you intended. Debugging sequence:</w:t>
+      </w:r>
+    </w:p>
+    <w:p>
+      <w:pPr>
+        <w:spacing w:after="80" w:line="276"/>
+      </w:pPr>
+      <w:r>
+        <w:rPr>
+          <w:sz w:val="22"/>
+          <w:szCs w:val="22"/>
+        </w:rPr>
+        <w:t xml:space="preserve">1. Select sources alone and verify.</w:t>
+      </w:r>
+    </w:p>
+    <w:p>
+      <w:pPr>
+        <w:spacing w:after="80" w:line="276"/>
+      </w:pPr>
+      <w:r>
+        <w:rPr>
+          <w:sz w:val="22"/>
+          <w:szCs w:val="22"/>
+        </w:rPr>
+        <w:t xml:space="preserve">2. Select sinks alone and verify.</w:t>
+      </w:r>
+    </w:p>
+    <w:p>
+      <w:pPr>
+        <w:spacing w:after="80" w:line="276"/>
+      </w:pPr>
+      <w:r>
+        <w:rPr>
+          <w:sz w:val="22"/>
+          <w:szCs w:val="22"/>
+        </w:rPr>
+        <w:t xml:space="preserve">3. Disable barriers temporarily.</w:t>
+      </w:r>
+    </w:p>
+    <w:p>
+      <w:pPr>
+        <w:spacing w:after="80" w:line="276"/>
+      </w:pPr>
+      <w:r>
+        <w:rPr>
+          <w:sz w:val="22"/>
+          <w:szCs w:val="22"/>
+        </w:rPr>
+        <w:t xml:space="preserve">4. Inspect partial paths to find the stopping node.</w:t>
+      </w:r>
+    </w:p>
+    <w:p>
+      <w:pPr>
+        <w:spacing w:after="80" w:line="276"/>
+      </w:pPr>
+      <w:r>
+        <w:rPr>
+          <w:sz w:val="22"/>
+          <w:szCs w:val="22"/>
+        </w:rPr>
+        <w:t xml:space="preserve">5. Add the missing model or adjust the barrier, then re-enable constraints one at a time.</w:t>
       </w:r>
     </w:p>
     <w:p>
@@ -1003,20 +694,20 @@
       </w:pPr>
       <w:bookmarkStart w:name="_Toc10" w:id="10"/>
       <w:r>
-        <w:t xml:space="preserve">Rollout Practices</w:t>
+        <w:t xml:space="preserve">Profiling and Measurement</w:t>
       </w:r>
       <w:bookmarkEnd w:id="10"/>
     </w:p>
     <w:p>
       <w:pPr>
-        <w:spacing w:after="90" w:line="276"/>
-      </w:pPr>
-      <w:r>
-        <w:rPr>
-          <w:sz w:val="22"/>
-          <w:szCs w:val="22"/>
-        </w:rPr>
-        <w:t xml:space="preserve">Start with a single repository and the default security suite. Review the first set of alerts, add barriers or models for the noisiest false positives, then expand. When you introduce custom packs, pin their versions. Monitor alert volume and fix rate. Provide a short internal guide that explains how to read a path alert and how to request a model update when an internal framework is involved.</w:t>
+        <w:spacing w:after="80" w:line="276"/>
+      </w:pPr>
+      <w:r>
+        <w:rPr>
+          <w:sz w:val="22"/>
+          <w:szCs w:val="22"/>
+        </w:rPr>
+        <w:t xml:space="preserve">Use the CodeQL CLI timing and diagnostic options, or the VS Code extension’s performance views, to see which predicates dominate runtime. Focus optimization effort on the hottest predicates. After a change, re-measure on a representative database rather than assuming the edit helped.</w:t>
       </w:r>
     </w:p>
     <w:p>
@@ -1025,20 +716,124 @@
       </w:pPr>
       <w:bookmarkStart w:name="_Toc11" w:id="11"/>
       <w:r>
-        <w:t xml:space="preserve">Common Integration Pitfalls</w:t>
+        <w:t xml:space="preserve">Modular Design</w:t>
       </w:r>
       <w:bookmarkEnd w:id="11"/>
     </w:p>
     <w:p>
       <w:pPr>
-        <w:spacing w:after="90" w:line="276"/>
-      </w:pPr>
-      <w:r>
-        <w:rPr>
-          <w:sz w:val="22"/>
-          <w:szCs w:val="22"/>
-        </w:rPr>
-        <w:t xml:space="preserve">Missing security-events permission prevents upload. Forgetting the build step for compiled languages produces empty or incomplete databases. Pointing at the wrong suite silently runs too many or too few queries. Unpinned pack versions cause sudden alert changes after an upstream update. Generated or third-party code that is not excluded creates noise. Address these before enabling the workflow on many repositories.</w:t>
+        <w:spacing w:after="80" w:line="276"/>
+      </w:pPr>
+      <w:r>
+        <w:rPr>
+          <w:sz w:val="22"/>
+          <w:szCs w:val="22"/>
+        </w:rPr>
+        <w:t xml:space="preserve">Break complex logic into well-named predicates and modules. Modular queries are easier to test, easier to reuse, and often faster because the optimizer sees clearer boundaries. They also make partial-flow debugging simpler, because you can select intermediate predicates directly.</w:t>
+      </w:r>
+    </w:p>
+    <w:p>
+      <w:pPr>
+        <w:pStyle w:val="Heading2"/>
+      </w:pPr>
+      <w:bookmarkStart w:name="_Toc12" w:id="12"/>
+      <w:r>
+        <w:t xml:space="preserve">Common Performance Pitfalls</w:t>
+      </w:r>
+      <w:bookmarkEnd w:id="12"/>
+    </w:p>
+    <w:p>
+      <w:pPr>
+        <w:spacing w:after="80" w:line="276"/>
+      </w:pPr>
+      <w:r>
+        <w:rPr>
+          <w:sz w:val="22"/>
+          <w:szCs w:val="22"/>
+        </w:rPr>
+        <w:t xml:space="preserve">Selecting from every expression or every call without early filters. Recursive predicates that explore large graphs without bounding conditions. Configurations that start from overly broad sources. Analyzing generated or vendored code that should have been excluded at database-creation time. Fixing the database scope is frequently more effective than micro-optimizing a query.</w:t>
+      </w:r>
+    </w:p>
+    <w:p>
+      <w:pPr>
+        <w:pStyle w:val="Heading2"/>
+      </w:pPr>
+      <w:bookmarkStart w:name="_Toc13" w:id="13"/>
+      <w:r>
+        <w:t xml:space="preserve">Practical Checklist</w:t>
+      </w:r>
+      <w:bookmarkEnd w:id="13"/>
+    </w:p>
+    <w:p>
+      <w:pPr>
+        <w:spacing w:after="80" w:line="276"/>
+      </w:pPr>
+      <w:r>
+        <w:rPr>
+          <w:sz w:val="22"/>
+          <w:szCs w:val="22"/>
+        </w:rPr>
+        <w:t xml:space="preserve">• Prefer library predicates.</w:t>
+      </w:r>
+    </w:p>
+    <w:p>
+      <w:pPr>
+        <w:spacing w:after="80" w:line="276"/>
+      </w:pPr>
+      <w:r>
+        <w:rPr>
+          <w:sz w:val="22"/>
+          <w:szCs w:val="22"/>
+        </w:rPr>
+        <w:t xml:space="preserve">• Keep sources and sinks as narrow as correctness allows.</w:t>
+      </w:r>
+    </w:p>
+    <w:p>
+      <w:pPr>
+        <w:spacing w:after="80" w:line="276"/>
+      </w:pPr>
+      <w:r>
+        <w:rPr>
+          <w:sz w:val="22"/>
+          <w:szCs w:val="22"/>
+        </w:rPr>
+        <w:t xml:space="preserve">• Use local flow when sufficient.</w:t>
+      </w:r>
+    </w:p>
+    <w:p>
+      <w:pPr>
+        <w:spacing w:after="80" w:line="276"/>
+      </w:pPr>
+      <w:r>
+        <w:rPr>
+          <w:sz w:val="22"/>
+          <w:szCs w:val="22"/>
+        </w:rPr>
+        <w:t xml:space="preserve">• Add tests that cover both presence and absence of results.</w:t>
+      </w:r>
+    </w:p>
+    <w:p>
+      <w:pPr>
+        <w:spacing w:after="80" w:line="276"/>
+      </w:pPr>
+      <w:r>
+        <w:rPr>
+          <w:sz w:val="22"/>
+          <w:szCs w:val="22"/>
+        </w:rPr>
+        <w:t xml:space="preserve">• Measure before and after optimization changes.</w:t>
+      </w:r>
+    </w:p>
+    <w:p>
+      <w:pPr>
+        <w:spacing w:after="80" w:line="276"/>
+      </w:pPr>
+      <w:r>
+        <w:rPr>
+          <w:sz w:val="22"/>
+          <w:szCs w:val="22"/>
+        </w:rPr>
+        <w:t xml:space="preserve">• Exclude irrelevant code at database build time.</w:t>
       </w:r>
     </w:p>
     <w:p>
@@ -1046,22 +841,22 @@
         <w:pStyle w:val="Heading1"/>
         <w:pageBreakBefore/>
       </w:pPr>
-      <w:bookmarkStart w:name="_Toc12" w:id="12"/>
-      <w:r>
-        <w:t xml:space="preserve">Chapter 13: Performance and Debugging</w:t>
-      </w:r>
-      <w:bookmarkEnd w:id="12"/>
-    </w:p>
-    <w:p>
-      <w:pPr>
-        <w:spacing w:after="90" w:line="276"/>
-      </w:pPr>
-      <w:r>
-        <w:rPr>
-          <w:sz w:val="22"/>
-          <w:szCs w:val="22"/>
-        </w:rPr>
-        <w:t xml:space="preserve">Precise predicates and partial-flow debugging keep CI runs fast and results trustworthy. See examples/chapter13/.</w:t>
+      <w:bookmarkStart w:name="_Toc14" w:id="14"/>
+      <w:r>
+        <w:t xml:space="preserve">Chapter 14: Case Studies</w:t>
+      </w:r>
+      <w:bookmarkEnd w:id="14"/>
+    </w:p>
+    <w:p>
+      <w:pPr>
+        <w:spacing w:after="80" w:line="276"/>
+      </w:pPr>
+      <w:r>
+        <w:rPr>
+          <w:sz w:val="22"/>
+          <w:szCs w:val="22"/>
+        </w:rPr>
+        <w:t xml:space="preserve">Real analyses in the Security Lab series and examples/chapter14/ demonstrate efficient source-to-sink patterns you can adapt.</w:t>
       </w:r>
     </w:p>
     <w:p>
@@ -1069,22 +864,22 @@
         <w:pStyle w:val="Heading1"/>
         <w:pageBreakBefore/>
       </w:pPr>
-      <w:bookmarkStart w:name="_Toc13" w:id="13"/>
-      <w:r>
-        <w:t xml:space="preserve">Chapter 14: Case Studies</w:t>
-      </w:r>
-      <w:bookmarkEnd w:id="13"/>
-    </w:p>
-    <w:p>
-      <w:pPr>
-        <w:spacing w:after="90" w:line="276"/>
-      </w:pPr>
-      <w:r>
-        <w:rPr>
-          <w:sz w:val="22"/>
-          <w:szCs w:val="22"/>
-        </w:rPr>
-        <w:t xml:space="preserve">Published queries and examples/chapter14/ show patterns ready to place in the packs you run in CI.</w:t>
+      <w:bookmarkStart w:name="_Toc15" w:id="15"/>
+      <w:r>
+        <w:t xml:space="preserve">Chapter 15: Best Practices</w:t>
+      </w:r>
+      <w:bookmarkEnd w:id="15"/>
+    </w:p>
+    <w:p>
+      <w:pPr>
+        <w:spacing w:after="80" w:line="276"/>
+      </w:pPr>
+      <w:r>
+        <w:rPr>
+          <w:sz w:val="22"/>
+          <w:szCs w:val="22"/>
+        </w:rPr>
+        <w:t xml:space="preserve">Precise, modular, tested predicates plus good models keep both results and runtime acceptable in CI.</w:t>
       </w:r>
     </w:p>
     <w:p>
@@ -1092,50 +887,27 @@
         <w:pStyle w:val="Heading1"/>
         <w:pageBreakBefore/>
       </w:pPr>
-      <w:bookmarkStart w:name="_Toc14" w:id="14"/>
-      <w:r>
-        <w:t xml:space="preserve">Chapter 15: Best Practices</w:t>
-      </w:r>
-      <w:bookmarkEnd w:id="14"/>
-    </w:p>
-    <w:p>
-      <w:pPr>
-        <w:spacing w:after="90" w:line="276"/>
-      </w:pPr>
-      <w:r>
-        <w:rPr>
-          <w:sz w:val="22"/>
-          <w:szCs w:val="22"/>
-        </w:rPr>
-        <w:t xml:space="preserve">Pin versions, test before enabling organization-wide, and keep models and queries in separate packs.</w:t>
-      </w:r>
-    </w:p>
-    <w:p>
-      <w:pPr>
-        <w:pStyle w:val="Heading1"/>
-        <w:pageBreakBefore/>
-      </w:pPr>
-      <w:bookmarkStart w:name="_Toc15" w:id="15"/>
+      <w:bookmarkStart w:name="_Toc16" w:id="16"/>
       <w:r>
         <w:t xml:space="preserve">Appendix</w:t>
       </w:r>
-      <w:bookmarkEnd w:id="15"/>
-    </w:p>
-    <w:p>
-      <w:pPr>
-        <w:spacing w:after="90" w:line="276"/>
-      </w:pPr>
-      <w:r>
-        <w:rPr>
-          <w:sz w:val="22"/>
-          <w:szCs w:val="22"/>
-        </w:rPr>
-        <w:t xml:space="preserve">Sample workflow: examples/chapter12/codeql-analysis.yml. Official CodeQL Action documentation and https://codeql.github.com/docs/. Repository: https://github.com/rod-trent/MustLearnCodeQL.</w:t>
-      </w:r>
-    </w:p>
-    <w:p>
-      <w:pPr>
-        <w:spacing w:before="160"/>
+      <w:bookmarkEnd w:id="16"/>
+    </w:p>
+    <w:p>
+      <w:pPr>
+        <w:spacing w:after="80" w:line="276"/>
+      </w:pPr>
+      <w:r>
+        <w:rPr>
+          <w:sz w:val="22"/>
+          <w:szCs w:val="22"/>
+        </w:rPr>
+        <w:t xml:space="preserve">Performance example: examples/chapter13/performance-predicate.ql. Official performance guidance is in the CodeQL documentation. Repository: https://github.com/rod-trent/MustLearnCodeQL.</w:t>
+      </w:r>
+    </w:p>
+    <w:p>
+      <w:pPr>
+        <w:spacing w:before="120"/>
         <w:jc w:val="center"/>
       </w:pPr>
       <w:r>
@@ -1579,7 +1351,7 @@
     <w:next w:val="Normal"/>
     <w:qFormat/>
     <w:pPr>
-      <w:spacing w:after="60" w:before="120"/>
+      <w:spacing w:after="50" w:before="100"/>
       <w:outlineLvl w:val="0"/>
     </w:pPr>
     <w:rPr>
@@ -1597,7 +1369,7 @@
     <w:next w:val="Normal"/>
     <w:qFormat/>
     <w:pPr>
-      <w:spacing w:after="50" w:before="140"/>
+      <w:spacing w:after="40" w:before="120"/>
       <w:outlineLvl w:val="1"/>
     </w:pPr>
     <w:rPr>

</xml_diff>

<commit_message>
Expand Chapter 14 on case studies, vulnerability patterns, and SQL injection example
</commit_message>
<xml_diff>
--- a/Book_Version/MustLearnCodeQL.docx
+++ b/Book_Version/MustLearnCodeQL.docx
@@ -4,7 +4,7 @@
   <w:body>
     <w:p>
       <w:pPr>
-        <w:spacing w:after="40"/>
+        <w:spacing w:after="30"/>
         <w:jc w:val="center"/>
       </w:pPr>
       <w:r>
@@ -12,15 +12,15 @@
           <w:b/>
           <w:bCs/>
           <w:color w:val="1F4E79"/>
-          <w:sz w:val="40"/>
-          <w:szCs w:val="40"/>
+          <w:sz w:val="38"/>
+          <w:szCs w:val="38"/>
         </w:rPr>
         <w:t xml:space="preserve">Must Learn CodeQL</w:t>
       </w:r>
     </w:p>
     <w:p>
       <w:pPr>
-        <w:spacing w:after="80"/>
+        <w:spacing w:after="60"/>
         <w:jc w:val="center"/>
       </w:pPr>
       <w:r>
@@ -28,30 +28,30 @@
           <w:i/>
           <w:iCs/>
           <w:color w:val="5B9BD5"/>
-          <w:sz w:val="20"/>
-          <w:szCs w:val="20"/>
-        </w:rPr>
-        <w:t xml:space="preserve">A Practical Guide to Semantic Code Analysis</w:t>
-      </w:r>
-    </w:p>
-    <w:p>
-      <w:pPr>
-        <w:jc w:val="center"/>
-      </w:pPr>
-      <w:r>
-        <w:rPr>
           <w:sz w:val="18"/>
           <w:szCs w:val="18"/>
         </w:rPr>
+        <w:t xml:space="preserve">A Practical Guide to Semantic Code Analysis</w:t>
+      </w:r>
+    </w:p>
+    <w:p>
+      <w:pPr>
+        <w:jc w:val="center"/>
+      </w:pPr>
+      <w:r>
+        <w:rPr>
+          <w:sz w:val="16"/>
+          <w:szCs w:val="16"/>
+        </w:rPr>
         <w:t xml:space="preserve">Rod Trent • 2026</w:t>
       </w:r>
     </w:p>
     <w:p>
       <w:pPr>
-        <w:spacing w:before="30"/>
+        <w:spacing w:before="20"/>
         <w:jc w:val="center"/>
       </w:pPr>
-      <w:hyperlink w:history="1" r:id="rId2z1kwfqcugttcuhwerggk">
+      <w:hyperlink w:history="1" r:id="rIdhd7m76vakir2j9bl2vfrp">
         <w:r>
           <w:rPr>
             <w:rStyle w:val="Hyperlink"/>
@@ -156,7 +156,7 @@
           </w:pPr>
           <w:hyperlink w:history="1" w:anchor="_Toc4">
             <w:r>
-              <w:t xml:space="preserve">Chapter 13: Advanced Techniques and Performance</w:t>
+              <w:t xml:space="preserve">Chapter 14: Real-World Case Studies and Patterns</w:t>
             </w:r>
             <w:r>
               <w:tab/>
@@ -179,7 +179,7 @@
           </w:pPr>
           <w:hyperlink w:history="1" w:anchor="_Toc5">
             <w:r>
-              <w:t xml:space="preserve">Why Performance and Debuggability Matter</w:t>
+              <w:t xml:space="preserve">Learning from Published Analyses</w:t>
             </w:r>
             <w:r>
               <w:tab/>
@@ -202,7 +202,7 @@
           </w:pPr>
           <w:hyperlink w:history="1" w:anchor="_Toc6">
             <w:r>
-              <w:t xml:space="preserve">Writing Efficient Predicates</w:t>
+              <w:t xml:space="preserve">Common Vulnerability Classes</w:t>
             </w:r>
             <w:r>
               <w:tab/>
@@ -225,7 +225,7 @@
           </w:pPr>
           <w:hyperlink w:history="1" w:anchor="_Toc7">
             <w:r>
-              <w:t xml:space="preserve">Source and Sink Precision</w:t>
+              <w:t xml:space="preserve">SQL Injection Skeleton</w:t>
             </w:r>
             <w:r>
               <w:tab/>
@@ -248,7 +248,7 @@
           </w:pPr>
           <w:hyperlink w:history="1" w:anchor="_Toc8">
             <w:r>
-              <w:t xml:space="preserve">Local versus Global</w:t>
+              <w:t xml:space="preserve">From Seed to Variant Analysis</w:t>
             </w:r>
             <w:r>
               <w:tab/>
@@ -271,7 +271,7 @@
           </w:pPr>
           <w:hyperlink w:history="1" w:anchor="_Toc9">
             <w:r>
-              <w:t xml:space="preserve">Partial-Flow Debugging</w:t>
+              <w:t xml:space="preserve">Studying Standard Library Queries</w:t>
             </w:r>
             <w:r>
               <w:tab/>
@@ -294,7 +294,7 @@
           </w:pPr>
           <w:hyperlink w:history="1" w:anchor="_Toc10">
             <w:r>
-              <w:t xml:space="preserve">Profiling and Measurement</w:t>
+              <w:t xml:space="preserve">Adapting a Case Study</w:t>
             </w:r>
             <w:r>
               <w:tab/>
@@ -317,7 +317,7 @@
           </w:pPr>
           <w:hyperlink w:history="1" w:anchor="_Toc11">
             <w:r>
-              <w:t xml:space="preserve">Modular Design</w:t>
+              <w:t xml:space="preserve">What Good Case Studies Share</w:t>
             </w:r>
             <w:r>
               <w:tab/>
@@ -325,52 +325,6 @@
             <w:r>
               <w:fldChar w:fldCharType="begin" w:dirty="true"/>
               <w:instrText xml:space="preserve">PAGEREF _Toc11 \h</w:instrText>
-              <w:fldChar w:fldCharType="separate"/>
-              <w:fldChar w:fldCharType="end"/>
-            </w:r>
-          </w:hyperlink>
-        </w:p>
-        <w:p>
-          <w:pPr>
-            <w:pStyle w:val="TOC2"/>
-            <w:tabs>
-              <w:tab w:val="right" w:pos="9648" w:leader="dot"/>
-            </w:tabs>
-            <w:ind w:left="220"/>
-          </w:pPr>
-          <w:hyperlink w:history="1" w:anchor="_Toc12">
-            <w:r>
-              <w:t xml:space="preserve">Common Performance Pitfalls</w:t>
-            </w:r>
-            <w:r>
-              <w:tab/>
-            </w:r>
-            <w:r>
-              <w:fldChar w:fldCharType="begin" w:dirty="true"/>
-              <w:instrText xml:space="preserve">PAGEREF _Toc12 \h</w:instrText>
-              <w:fldChar w:fldCharType="separate"/>
-              <w:fldChar w:fldCharType="end"/>
-            </w:r>
-          </w:hyperlink>
-        </w:p>
-        <w:p>
-          <w:pPr>
-            <w:pStyle w:val="TOC2"/>
-            <w:tabs>
-              <w:tab w:val="right" w:pos="9648" w:leader="dot"/>
-            </w:tabs>
-            <w:ind w:left="220"/>
-          </w:pPr>
-          <w:hyperlink w:history="1" w:anchor="_Toc13">
-            <w:r>
-              <w:t xml:space="preserve">Practical Checklist</w:t>
-            </w:r>
-            <w:r>
-              <w:tab/>
-            </w:r>
-            <w:r>
-              <w:fldChar w:fldCharType="begin" w:dirty="true"/>
-              <w:instrText xml:space="preserve">PAGEREF _Toc13 \h</w:instrText>
               <w:fldChar w:fldCharType="separate"/>
               <w:fldChar w:fldCharType="end"/>
             </w:r>
@@ -383,16 +337,16 @@
               <w:tab w:val="right" w:pos="9648" w:leader="dot"/>
             </w:tabs>
           </w:pPr>
-          <w:hyperlink w:history="1" w:anchor="_Toc14">
-            <w:r>
-              <w:t xml:space="preserve">Chapter 14: Case Studies</w:t>
+          <w:hyperlink w:history="1" w:anchor="_Toc12">
+            <w:r>
+              <w:t xml:space="preserve">Chapter 15: Best Practices</w:t>
             </w:r>
             <w:r>
               <w:tab/>
             </w:r>
             <w:r>
               <w:fldChar w:fldCharType="begin" w:dirty="true"/>
-              <w:instrText xml:space="preserve">PAGEREF _Toc14 \h</w:instrText>
+              <w:instrText xml:space="preserve">PAGEREF _Toc12 \h</w:instrText>
               <w:fldChar w:fldCharType="separate"/>
               <w:fldChar w:fldCharType="end"/>
             </w:r>
@@ -405,38 +359,16 @@
               <w:tab w:val="right" w:pos="9648" w:leader="dot"/>
             </w:tabs>
           </w:pPr>
-          <w:hyperlink w:history="1" w:anchor="_Toc15">
-            <w:r>
-              <w:t xml:space="preserve">Chapter 15: Best Practices</w:t>
+          <w:hyperlink w:history="1" w:anchor="_Toc13">
+            <w:r>
+              <w:t xml:space="preserve">Appendix</w:t>
             </w:r>
             <w:r>
               <w:tab/>
             </w:r>
             <w:r>
               <w:fldChar w:fldCharType="begin" w:dirty="true"/>
-              <w:instrText xml:space="preserve">PAGEREF _Toc15 \h</w:instrText>
-              <w:fldChar w:fldCharType="separate"/>
-              <w:fldChar w:fldCharType="end"/>
-            </w:r>
-          </w:hyperlink>
-        </w:p>
-        <w:p>
-          <w:pPr>
-            <w:pStyle w:val="TOC1"/>
-            <w:tabs>
-              <w:tab w:val="right" w:pos="9648" w:leader="dot"/>
-            </w:tabs>
-          </w:pPr>
-          <w:hyperlink w:history="1" w:anchor="_Toc16">
-            <w:r>
-              <w:t xml:space="preserve">Appendix</w:t>
-            </w:r>
-            <w:r>
-              <w:tab/>
-            </w:r>
-            <w:r>
-              <w:fldChar w:fldCharType="begin" w:dirty="true"/>
-              <w:instrText xml:space="preserve">PAGEREF _Toc16 \h</w:instrText>
+              <w:instrText xml:space="preserve">PAGEREF _Toc13 \h</w:instrText>
               <w:fldChar w:fldCharType="separate"/>
               <w:fldChar w:fldCharType="end"/>
             </w:r>
@@ -462,14 +394,14 @@
     </w:p>
     <w:p>
       <w:pPr>
-        <w:spacing w:after="80" w:line="276"/>
-      </w:pPr>
-      <w:r>
-        <w:rPr>
-          <w:sz w:val="22"/>
-          <w:szCs w:val="22"/>
-        </w:rPr>
-        <w:t xml:space="preserve">Chapter 13 on performance and debugging has been expanded. Related example: examples/chapter13/performance-predicate.ql.</w:t>
+        <w:spacing w:after="70" w:line="276"/>
+      </w:pPr>
+      <w:r>
+        <w:rPr>
+          <w:sz w:val="22"/>
+          <w:szCs w:val="22"/>
+        </w:rPr>
+        <w:t xml:space="preserve">Chapter 14 on case studies and patterns has been expanded. Related example: examples/chapter14/sql-injection-example.ql.</w:t>
       </w:r>
     </w:p>
     <w:p>
@@ -485,14 +417,14 @@
     </w:p>
     <w:p>
       <w:pPr>
-        <w:spacing w:after="80" w:line="276"/>
-      </w:pPr>
-      <w:r>
-        <w:rPr>
-          <w:sz w:val="22"/>
-          <w:szCs w:val="22"/>
-        </w:rPr>
-        <w:t xml:space="preserve">Chapters 1–12 cover fundamentals through CI integration. This chapter focuses on keeping queries fast and diagnosable once they run regularly.</w:t>
+        <w:spacing w:after="70" w:line="276"/>
+      </w:pPr>
+      <w:r>
+        <w:rPr>
+          <w:sz w:val="22"/>
+          <w:szCs w:val="22"/>
+        </w:rPr>
+        <w:t xml:space="preserve">Chapters 1–13 cover fundamentals through performance and debugging. This chapter shows how those techniques appear in real analyses.</w:t>
       </w:r>
     </w:p>
     <w:p>
@@ -502,7 +434,7 @@
       </w:pPr>
       <w:bookmarkStart w:name="_Toc4" w:id="4"/>
       <w:r>
-        <w:t xml:space="preserve">Chapter 13: Advanced Techniques and Performance</w:t>
+        <w:t xml:space="preserve">Chapter 14: Real-World Case Studies and Patterns</w:t>
       </w:r>
       <w:bookmarkEnd w:id="4"/>
     </w:p>
@@ -512,20 +444,20 @@
       </w:pPr>
       <w:bookmarkStart w:name="_Toc5" w:id="5"/>
       <w:r>
-        <w:t xml:space="preserve">Why Performance and Debuggability Matter</w:t>
+        <w:t xml:space="preserve">Learning from Published Analyses</w:t>
       </w:r>
       <w:bookmarkEnd w:id="5"/>
     </w:p>
     <w:p>
       <w:pPr>
-        <w:spacing w:after="80" w:line="276"/>
-      </w:pPr>
-      <w:r>
-        <w:rPr>
-          <w:sz w:val="22"/>
-          <w:szCs w:val="22"/>
-        </w:rPr>
-        <w:t xml:space="preserve">A query that is correct but slow will be disabled. A query that produces unexplained missing results will be distrusted. Once CodeQL runs in CI, both speed and the ability to diagnose surprises become production requirements. Most performance problems are precision problems in disguise, and most missing paths are modeling gaps.</w:t>
+        <w:spacing w:after="70" w:line="276"/>
+      </w:pPr>
+      <w:r>
+        <w:rPr>
+          <w:sz w:val="22"/>
+          <w:szCs w:val="22"/>
+        </w:rPr>
+        <w:t xml:space="preserve">The fastest way to internalize effective query patterns is to study complete, published work. The GitHub Security Lab Zero-to-Hero blog series, the Secure Code Game, individual vulnerability write-ups, and the queries shipped in the standard CodeQL packs all show how researchers move from a single seed finding to a robust, low-noise query. Pay attention to how they choose sources, model sinks, add barriers, and handle library functions that are not yet covered.</w:t>
       </w:r>
     </w:p>
     <w:p>
@@ -534,32 +466,104 @@
       </w:pPr>
       <w:bookmarkStart w:name="_Toc6" w:id="6"/>
       <w:r>
-        <w:t xml:space="preserve">Writing Efficient Predicates</w:t>
+        <w:t xml:space="preserve">Common Vulnerability Classes</w:t>
       </w:r>
       <w:bookmarkEnd w:id="6"/>
     </w:p>
     <w:p>
       <w:pPr>
-        <w:spacing w:after="80" w:line="276"/>
-      </w:pPr>
-      <w:r>
-        <w:rPr>
-          <w:sz w:val="22"/>
-          <w:szCs w:val="22"/>
-        </w:rPr>
-        <w:t xml:space="preserve">Keep predicates small and specific. The optimizer works better with clear, narrow relations than with large, overlapping ones. Prefer predicates already provided by the standard libraries over hand-written joins. Avoid unnecessary recursion and broad exists clauses when a more precise formulation exists.</w:t>
-      </w:r>
-    </w:p>
-    <w:p>
-      <w:pPr>
-        <w:spacing w:after="80" w:line="276"/>
-      </w:pPr>
-      <w:r>
-        <w:rPr>
-          <w:sz w:val="22"/>
-          <w:szCs w:val="22"/>
-        </w:rPr>
-        <w:t xml:space="preserve">A tighter formulation of an eval check (excluding certain wrappers early) is shown in examples/chapter13/performance-predicate.ql. Compare it with a naïve version that selects every call and filters later; the early filter reduces work.</w:t>
+        <w:spacing w:after="70" w:line="276"/>
+      </w:pPr>
+      <w:r>
+        <w:rPr>
+          <w:sz w:val="22"/>
+          <w:szCs w:val="22"/>
+        </w:rPr>
+        <w:t xml:space="preserve">Most security queries follow the same source-to-sink skeleton you practiced in the taint-tracking chapter. The classes you will encounter most often are:</w:t>
+      </w:r>
+    </w:p>
+    <w:p>
+      <w:pPr>
+        <w:spacing w:after="70" w:line="276"/>
+      </w:pPr>
+      <w:r>
+        <w:rPr>
+          <w:sz w:val="22"/>
+          <w:szCs w:val="22"/>
+        </w:rPr>
+        <w:t xml:space="preserve">• Injection flaws (SQL, command, LDAP, XPath)</w:t>
+      </w:r>
+    </w:p>
+    <w:p>
+      <w:pPr>
+        <w:spacing w:after="70" w:line="276"/>
+      </w:pPr>
+      <w:r>
+        <w:rPr>
+          <w:sz w:val="22"/>
+          <w:szCs w:val="22"/>
+        </w:rPr>
+        <w:t xml:space="preserve">• Cross-site scripting (reflected, stored, DOM-based)</w:t>
+      </w:r>
+    </w:p>
+    <w:p>
+      <w:pPr>
+        <w:spacing w:after="70" w:line="276"/>
+      </w:pPr>
+      <w:r>
+        <w:rPr>
+          <w:sz w:val="22"/>
+          <w:szCs w:val="22"/>
+        </w:rPr>
+        <w:t xml:space="preserve">• Path traversal and file inclusion</w:t>
+      </w:r>
+    </w:p>
+    <w:p>
+      <w:pPr>
+        <w:spacing w:after="70" w:line="276"/>
+      </w:pPr>
+      <w:r>
+        <w:rPr>
+          <w:sz w:val="22"/>
+          <w:szCs w:val="22"/>
+        </w:rPr>
+        <w:t xml:space="preserve">• Insecure deserialization</w:t>
+      </w:r>
+    </w:p>
+    <w:p>
+      <w:pPr>
+        <w:spacing w:after="70" w:line="276"/>
+      </w:pPr>
+      <w:r>
+        <w:rPr>
+          <w:sz w:val="22"/>
+          <w:szCs w:val="22"/>
+        </w:rPr>
+        <w:t xml:space="preserve">• Unsafe cryptographic or random usage</w:t>
+      </w:r>
+    </w:p>
+    <w:p>
+      <w:pPr>
+        <w:spacing w:after="70" w:line="276"/>
+      </w:pPr>
+      <w:r>
+        <w:rPr>
+          <w:sz w:val="22"/>
+          <w:szCs w:val="22"/>
+        </w:rPr>
+        <w:t xml:space="preserve">• Open redirects and SSRF</w:t>
+      </w:r>
+    </w:p>
+    <w:p>
+      <w:pPr>
+        <w:spacing w:after="70" w:line="276"/>
+      </w:pPr>
+      <w:r>
+        <w:rPr>
+          <w:sz w:val="22"/>
+          <w:szCs w:val="22"/>
+        </w:rPr>
+        <w:t xml:space="preserve">Each class has a characteristic set of sources and sinks. Once those are modeled, the configuration style remains identical.</w:t>
       </w:r>
     </w:p>
     <w:p>
@@ -568,21 +572,373 @@
       </w:pPr>
       <w:bookmarkStart w:name="_Toc7" w:id="7"/>
       <w:r>
-        <w:t xml:space="preserve">Source and Sink Precision</w:t>
+        <w:t xml:space="preserve">SQL Injection Skeleton</w:t>
       </w:r>
       <w:bookmarkEnd w:id="7"/>
     </w:p>
     <w:p>
       <w:pPr>
-        <w:spacing w:after="80" w:line="276"/>
-      </w:pPr>
-      <w:r>
-        <w:rPr>
-          <w:sz w:val="22"/>
-          <w:szCs w:val="22"/>
-        </w:rPr>
-        <w:t xml:space="preserve">Global data-flow and taint-tracking configurations are expensive when sources or sinks match too much. A source predicate that matches every string forces the engine to explore a huge graph. Start with the most specific library classes available (RemoteFlowSource, language-specific sink classes), then extend only where required. The same discipline applies to barriers: precise barriers both improve results and can prune search space.</w:t>
-      </w:r>
+        <w:spacing w:after="70" w:line="276"/>
+      </w:pPr>
+      <w:r>
+        <w:rPr>
+          <w:sz w:val="22"/>
+          <w:szCs w:val="22"/>
+        </w:rPr>
+        <w:t xml:space="preserve">A simplified path query that demonstrates the structure is in examples/chapter14/sql-injection-example.ql. In production you replace the placeholder sink with a properly modeled SQL execution API or with an extension that recognizes your data-access layer. The same file can serve as a template for command injection or LDAP injection by changing only the sink predicate.</w:t>
+      </w:r>
+    </w:p>
+    <w:p>
+      <w:pPr>
+        <w:spacing w:after="8" w:before="30"/>
+      </w:pPr>
+    </w:p>
+    <w:p>
+      <w:pPr>
+        <w:pBdr>
+          <w:left w:val="single" w:color="2E75B6" w:sz="10" w:space="4"/>
+        </w:pBdr>
+        <w:shd w:fill="F7F9FC" w:val="clear"/>
+        <w:spacing w:after="0" w:line="240"/>
+        <w:ind w:left="280"/>
+      </w:pPr>
+      <w:r>
+        <w:rPr>
+          <w:rFonts w:ascii="Consolas" w:cs="Consolas" w:eastAsia="Consolas" w:hAnsi="Consolas"/>
+          <w:color w:val="1E293B"/>
+          <w:sz w:val="18"/>
+          <w:szCs w:val="18"/>
+        </w:rPr>
+        <w:t xml:space="preserve">/**</w:t>
+      </w:r>
+    </w:p>
+    <w:p>
+      <w:pPr>
+        <w:pBdr>
+          <w:left w:val="single" w:color="2E75B6" w:sz="10" w:space="4"/>
+        </w:pBdr>
+        <w:shd w:fill="F7F9FC" w:val="clear"/>
+        <w:spacing w:after="0" w:line="240"/>
+        <w:ind w:left="280"/>
+      </w:pPr>
+      <w:r>
+        <w:rPr>
+          <w:rFonts w:ascii="Consolas" w:cs="Consolas" w:eastAsia="Consolas" w:hAnsi="Consolas"/>
+          <w:color w:val="1E293B"/>
+          <w:sz w:val="18"/>
+          <w:szCs w:val="18"/>
+        </w:rPr>
+        <w:t xml:space="preserve"> * @kind path-problem</w:t>
+      </w:r>
+    </w:p>
+    <w:p>
+      <w:pPr>
+        <w:pBdr>
+          <w:left w:val="single" w:color="2E75B6" w:sz="10" w:space="4"/>
+        </w:pBdr>
+        <w:shd w:fill="F7F9FC" w:val="clear"/>
+        <w:spacing w:after="0" w:line="240"/>
+        <w:ind w:left="280"/>
+      </w:pPr>
+      <w:r>
+        <w:rPr>
+          <w:rFonts w:ascii="Consolas" w:cs="Consolas" w:eastAsia="Consolas" w:hAnsi="Consolas"/>
+          <w:color w:val="1E293B"/>
+          <w:sz w:val="18"/>
+          <w:szCs w:val="18"/>
+        </w:rPr>
+        <w:t xml:space="preserve"> * @id mustlearn/sql-injection-example</w:t>
+      </w:r>
+    </w:p>
+    <w:p>
+      <w:pPr>
+        <w:pBdr>
+          <w:left w:val="single" w:color="2E75B6" w:sz="10" w:space="4"/>
+        </w:pBdr>
+        <w:shd w:fill="F7F9FC" w:val="clear"/>
+        <w:spacing w:after="0" w:line="240"/>
+        <w:ind w:left="280"/>
+      </w:pPr>
+      <w:r>
+        <w:rPr>
+          <w:rFonts w:ascii="Consolas" w:cs="Consolas" w:eastAsia="Consolas" w:hAnsi="Consolas"/>
+          <w:color w:val="1E293B"/>
+          <w:sz w:val="18"/>
+          <w:szCs w:val="18"/>
+        </w:rPr>
+        <w:t xml:space="preserve"> * @name Example SQL injection</w:t>
+      </w:r>
+    </w:p>
+    <w:p>
+      <w:pPr>
+        <w:pBdr>
+          <w:left w:val="single" w:color="2E75B6" w:sz="10" w:space="4"/>
+        </w:pBdr>
+        <w:shd w:fill="F7F9FC" w:val="clear"/>
+        <w:spacing w:after="0" w:line="240"/>
+        <w:ind w:left="280"/>
+      </w:pPr>
+      <w:r>
+        <w:rPr>
+          <w:rFonts w:ascii="Consolas" w:cs="Consolas" w:eastAsia="Consolas" w:hAnsi="Consolas"/>
+          <w:color w:val="1E293B"/>
+          <w:sz w:val="18"/>
+          <w:szCs w:val="18"/>
+        </w:rPr>
+        <w:t xml:space="preserve"> */</w:t>
+      </w:r>
+    </w:p>
+    <w:p>
+      <w:pPr>
+        <w:pBdr>
+          <w:left w:val="single" w:color="2E75B6" w:sz="10" w:space="4"/>
+        </w:pBdr>
+        <w:shd w:fill="F7F9FC" w:val="clear"/>
+        <w:spacing w:after="0" w:line="240"/>
+        <w:ind w:left="280"/>
+      </w:pPr>
+      <w:r>
+        <w:rPr>
+          <w:rFonts w:ascii="Consolas" w:cs="Consolas" w:eastAsia="Consolas" w:hAnsi="Consolas"/>
+          <w:color w:val="1E293B"/>
+          <w:sz w:val="18"/>
+          <w:szCs w:val="18"/>
+        </w:rPr>
+        <w:t xml:space="preserve">import javascript</w:t>
+      </w:r>
+    </w:p>
+    <w:p>
+      <w:pPr>
+        <w:pBdr>
+          <w:left w:val="single" w:color="2E75B6" w:sz="10" w:space="4"/>
+        </w:pBdr>
+        <w:shd w:fill="F7F9FC" w:val="clear"/>
+        <w:spacing w:after="0" w:line="240"/>
+        <w:ind w:left="280"/>
+      </w:pPr>
+      <w:r>
+        <w:rPr>
+          <w:rFonts w:ascii="Consolas" w:cs="Consolas" w:eastAsia="Consolas" w:hAnsi="Consolas"/>
+          <w:color w:val="1E293B"/>
+          <w:sz w:val="18"/>
+          <w:szCs w:val="18"/>
+        </w:rPr>
+        <w:t xml:space="preserve">module Config implements DataFlow::ConfigSig {</w:t>
+      </w:r>
+    </w:p>
+    <w:p>
+      <w:pPr>
+        <w:pBdr>
+          <w:left w:val="single" w:color="2E75B6" w:sz="10" w:space="4"/>
+        </w:pBdr>
+        <w:shd w:fill="F7F9FC" w:val="clear"/>
+        <w:spacing w:after="0" w:line="240"/>
+        <w:ind w:left="280"/>
+      </w:pPr>
+      <w:r>
+        <w:rPr>
+          <w:rFonts w:ascii="Consolas" w:cs="Consolas" w:eastAsia="Consolas" w:hAnsi="Consolas"/>
+          <w:color w:val="1E293B"/>
+          <w:sz w:val="18"/>
+          <w:szCs w:val="18"/>
+        </w:rPr>
+        <w:t xml:space="preserve">  predicate isSource(DataFlow::Node n) { n instanceof RemoteFlowSource }</w:t>
+      </w:r>
+    </w:p>
+    <w:p>
+      <w:pPr>
+        <w:pBdr>
+          <w:left w:val="single" w:color="2E75B6" w:sz="10" w:space="4"/>
+        </w:pBdr>
+        <w:shd w:fill="F7F9FC" w:val="clear"/>
+        <w:spacing w:after="0" w:line="240"/>
+        <w:ind w:left="280"/>
+      </w:pPr>
+      <w:r>
+        <w:rPr>
+          <w:rFonts w:ascii="Consolas" w:cs="Consolas" w:eastAsia="Consolas" w:hAnsi="Consolas"/>
+          <w:color w:val="1E293B"/>
+          <w:sz w:val="18"/>
+          <w:szCs w:val="18"/>
+        </w:rPr>
+        <w:t xml:space="preserve">  predicate isSink(DataFlow::Node n) {</w:t>
+      </w:r>
+    </w:p>
+    <w:p>
+      <w:pPr>
+        <w:pBdr>
+          <w:left w:val="single" w:color="2E75B6" w:sz="10" w:space="4"/>
+        </w:pBdr>
+        <w:shd w:fill="F7F9FC" w:val="clear"/>
+        <w:spacing w:after="0" w:line="240"/>
+        <w:ind w:left="280"/>
+      </w:pPr>
+      <w:r>
+        <w:rPr>
+          <w:rFonts w:ascii="Consolas" w:cs="Consolas" w:eastAsia="Consolas" w:hAnsi="Consolas"/>
+          <w:color w:val="1E293B"/>
+          <w:sz w:val="18"/>
+          <w:szCs w:val="18"/>
+        </w:rPr>
+        <w:t xml:space="preserve">    // Replace with a real modeled sink</w:t>
+      </w:r>
+    </w:p>
+    <w:p>
+      <w:pPr>
+        <w:pBdr>
+          <w:left w:val="single" w:color="2E75B6" w:sz="10" w:space="4"/>
+        </w:pBdr>
+        <w:shd w:fill="F7F9FC" w:val="clear"/>
+        <w:spacing w:after="0" w:line="240"/>
+        <w:ind w:left="280"/>
+      </w:pPr>
+      <w:r>
+        <w:rPr>
+          <w:rFonts w:ascii="Consolas" w:cs="Consolas" w:eastAsia="Consolas" w:hAnsi="Consolas"/>
+          <w:color w:val="1E293B"/>
+          <w:sz w:val="18"/>
+          <w:szCs w:val="18"/>
+        </w:rPr>
+        <w:t xml:space="preserve">    n.asExpr().(CallExpr).getCalleeName() = "query"</w:t>
+      </w:r>
+    </w:p>
+    <w:p>
+      <w:pPr>
+        <w:pBdr>
+          <w:left w:val="single" w:color="2E75B6" w:sz="10" w:space="4"/>
+        </w:pBdr>
+        <w:shd w:fill="F7F9FC" w:val="clear"/>
+        <w:spacing w:after="0" w:line="240"/>
+        <w:ind w:left="280"/>
+      </w:pPr>
+      <w:r>
+        <w:rPr>
+          <w:rFonts w:ascii="Consolas" w:cs="Consolas" w:eastAsia="Consolas" w:hAnsi="Consolas"/>
+          <w:color w:val="1E293B"/>
+          <w:sz w:val="18"/>
+          <w:szCs w:val="18"/>
+        </w:rPr>
+        <w:t xml:space="preserve">  }</w:t>
+      </w:r>
+    </w:p>
+    <w:p>
+      <w:pPr>
+        <w:pBdr>
+          <w:left w:val="single" w:color="2E75B6" w:sz="10" w:space="4"/>
+        </w:pBdr>
+        <w:shd w:fill="F7F9FC" w:val="clear"/>
+        <w:spacing w:after="0" w:line="240"/>
+        <w:ind w:left="280"/>
+      </w:pPr>
+      <w:r>
+        <w:rPr>
+          <w:rFonts w:ascii="Consolas" w:cs="Consolas" w:eastAsia="Consolas" w:hAnsi="Consolas"/>
+          <w:color w:val="1E293B"/>
+          <w:sz w:val="18"/>
+          <w:szCs w:val="18"/>
+        </w:rPr>
+        <w:t xml:space="preserve">}</w:t>
+      </w:r>
+    </w:p>
+    <w:p>
+      <w:pPr>
+        <w:pBdr>
+          <w:left w:val="single" w:color="2E75B6" w:sz="10" w:space="4"/>
+        </w:pBdr>
+        <w:shd w:fill="F7F9FC" w:val="clear"/>
+        <w:spacing w:after="0" w:line="240"/>
+        <w:ind w:left="280"/>
+      </w:pPr>
+      <w:r>
+        <w:rPr>
+          <w:rFonts w:ascii="Consolas" w:cs="Consolas" w:eastAsia="Consolas" w:hAnsi="Consolas"/>
+          <w:color w:val="1E293B"/>
+          <w:sz w:val="18"/>
+          <w:szCs w:val="18"/>
+        </w:rPr>
+        <w:t xml:space="preserve">module Flow = TaintTracking::Global&lt;Config&gt;;</w:t>
+      </w:r>
+    </w:p>
+    <w:p>
+      <w:pPr>
+        <w:pBdr>
+          <w:left w:val="single" w:color="2E75B6" w:sz="10" w:space="4"/>
+        </w:pBdr>
+        <w:shd w:fill="F7F9FC" w:val="clear"/>
+        <w:spacing w:after="0" w:line="240"/>
+        <w:ind w:left="280"/>
+      </w:pPr>
+      <w:r>
+        <w:rPr>
+          <w:rFonts w:ascii="Consolas" w:cs="Consolas" w:eastAsia="Consolas" w:hAnsi="Consolas"/>
+          <w:color w:val="1E293B"/>
+          <w:sz w:val="18"/>
+          <w:szCs w:val="18"/>
+        </w:rPr>
+        <w:t xml:space="preserve">import Flow::PathGraph</w:t>
+      </w:r>
+    </w:p>
+    <w:p>
+      <w:pPr>
+        <w:pBdr>
+          <w:left w:val="single" w:color="2E75B6" w:sz="10" w:space="4"/>
+        </w:pBdr>
+        <w:shd w:fill="F7F9FC" w:val="clear"/>
+        <w:spacing w:after="0" w:line="240"/>
+        <w:ind w:left="280"/>
+      </w:pPr>
+      <w:r>
+        <w:rPr>
+          <w:rFonts w:ascii="Consolas" w:cs="Consolas" w:eastAsia="Consolas" w:hAnsi="Consolas"/>
+          <w:color w:val="1E293B"/>
+          <w:sz w:val="18"/>
+          <w:szCs w:val="18"/>
+        </w:rPr>
+        <w:t xml:space="preserve">from Flow::PathNode source, Flow::PathNode sink</w:t>
+      </w:r>
+    </w:p>
+    <w:p>
+      <w:pPr>
+        <w:pBdr>
+          <w:left w:val="single" w:color="2E75B6" w:sz="10" w:space="4"/>
+        </w:pBdr>
+        <w:shd w:fill="F7F9FC" w:val="clear"/>
+        <w:spacing w:after="0" w:line="240"/>
+        <w:ind w:left="280"/>
+      </w:pPr>
+      <w:r>
+        <w:rPr>
+          <w:rFonts w:ascii="Consolas" w:cs="Consolas" w:eastAsia="Consolas" w:hAnsi="Consolas"/>
+          <w:color w:val="1E293B"/>
+          <w:sz w:val="18"/>
+          <w:szCs w:val="18"/>
+        </w:rPr>
+        <w:t xml:space="preserve">where Flow::flowPath(source, sink)</w:t>
+      </w:r>
+    </w:p>
+    <w:p>
+      <w:pPr>
+        <w:pBdr>
+          <w:left w:val="single" w:color="2E75B6" w:sz="10" w:space="4"/>
+        </w:pBdr>
+        <w:shd w:fill="F7F9FC" w:val="clear"/>
+        <w:spacing w:after="0" w:line="240"/>
+        <w:ind w:left="280"/>
+      </w:pPr>
+      <w:r>
+        <w:rPr>
+          <w:rFonts w:ascii="Consolas" w:cs="Consolas" w:eastAsia="Consolas" w:hAnsi="Consolas"/>
+          <w:color w:val="1E293B"/>
+          <w:sz w:val="18"/>
+          <w:szCs w:val="18"/>
+        </w:rPr>
+        <w:t xml:space="preserve">select sink.getNode(), source, sink, "SQL injection via $@.", source.getNode(), "user input"</w:t>
+      </w:r>
+    </w:p>
+    <w:p>
+      <w:pPr>
+        <w:spacing w:after="50" w:before="8"/>
+      </w:pPr>
     </w:p>
     <w:p>
       <w:pPr>
@@ -590,20 +946,20 @@
       </w:pPr>
       <w:bookmarkStart w:name="_Toc8" w:id="8"/>
       <w:r>
-        <w:t xml:space="preserve">Local versus Global</w:t>
+        <w:t xml:space="preserve">From Seed to Variant Analysis</w:t>
       </w:r>
       <w:bookmarkEnd w:id="8"/>
     </w:p>
     <w:p>
       <w:pPr>
-        <w:spacing w:after="80" w:line="276"/>
-      </w:pPr>
-      <w:r>
-        <w:rPr>
-          <w:sz w:val="22"/>
-          <w:szCs w:val="22"/>
-        </w:rPr>
-        <w:t xml:space="preserve">Use local data flow whenever the check does not need to cross function boundaries. Local analysis is dramatically cheaper. Only promote a query to global flow when you have confirmed that inter-procedural tracking is required for the vulnerability class you care about.</w:t>
+        <w:spacing w:after="70" w:line="276"/>
+      </w:pPr>
+      <w:r>
+        <w:rPr>
+          <w:sz w:val="22"/>
+          <w:szCs w:val="22"/>
+        </w:rPr>
+        <w:t xml:space="preserve">A typical research or internal workflow is: discover one vulnerability manually or from a report, write a query that captures the essential conditions, refine sources, sinks, barriers, and additional steps until false positives are acceptable, then run the query at scale with multi-repository variant analysis or inside CI. The finished query becomes both a detector for similar bugs and a regression test that prevents the pattern from returning.</w:t>
       </w:r>
     </w:p>
     <w:p>
@@ -612,80 +968,20 @@
       </w:pPr>
       <w:bookmarkStart w:name="_Toc9" w:id="9"/>
       <w:r>
-        <w:t xml:space="preserve">Partial-Flow Debugging</w:t>
+        <w:t xml:space="preserve">Studying Standard Library Queries</w:t>
       </w:r>
       <w:bookmarkEnd w:id="9"/>
     </w:p>
     <w:p>
       <w:pPr>
-        <w:spacing w:after="80" w:line="276"/>
-      </w:pPr>
-      <w:r>
-        <w:rPr>
-          <w:sz w:val="22"/>
-          <w:szCs w:val="22"/>
-        </w:rPr>
-        <w:t xml:space="preserve">When an expected path is absent, partial-flow predicates show the frontier—the last nodes taint actually reached. That frontier almost always identifies a missing additional flow step, an accidental barrier, or a source/sink predicate that does not match the nodes you intended. Debugging sequence:</w:t>
-      </w:r>
-    </w:p>
-    <w:p>
-      <w:pPr>
-        <w:spacing w:after="80" w:line="276"/>
-      </w:pPr>
-      <w:r>
-        <w:rPr>
-          <w:sz w:val="22"/>
-          <w:szCs w:val="22"/>
-        </w:rPr>
-        <w:t xml:space="preserve">1. Select sources alone and verify.</w:t>
-      </w:r>
-    </w:p>
-    <w:p>
-      <w:pPr>
-        <w:spacing w:after="80" w:line="276"/>
-      </w:pPr>
-      <w:r>
-        <w:rPr>
-          <w:sz w:val="22"/>
-          <w:szCs w:val="22"/>
-        </w:rPr>
-        <w:t xml:space="preserve">2. Select sinks alone and verify.</w:t>
-      </w:r>
-    </w:p>
-    <w:p>
-      <w:pPr>
-        <w:spacing w:after="80" w:line="276"/>
-      </w:pPr>
-      <w:r>
-        <w:rPr>
-          <w:sz w:val="22"/>
-          <w:szCs w:val="22"/>
-        </w:rPr>
-        <w:t xml:space="preserve">3. Disable barriers temporarily.</w:t>
-      </w:r>
-    </w:p>
-    <w:p>
-      <w:pPr>
-        <w:spacing w:after="80" w:line="276"/>
-      </w:pPr>
-      <w:r>
-        <w:rPr>
-          <w:sz w:val="22"/>
-          <w:szCs w:val="22"/>
-        </w:rPr>
-        <w:t xml:space="preserve">4. Inspect partial paths to find the stopping node.</w:t>
-      </w:r>
-    </w:p>
-    <w:p>
-      <w:pPr>
-        <w:spacing w:after="80" w:line="276"/>
-      </w:pPr>
-      <w:r>
-        <w:rPr>
-          <w:sz w:val="22"/>
-          <w:szCs w:val="22"/>
-        </w:rPr>
-        <w:t xml:space="preserve">5. Add the missing model or adjust the barrier, then re-enable constraints one at a time.</w:t>
+        <w:spacing w:after="70" w:line="276"/>
+      </w:pPr>
+      <w:r>
+        <w:rPr>
+          <w:sz w:val="22"/>
+          <w:szCs w:val="22"/>
+        </w:rPr>
+        <w:t xml:space="preserve">The queries shipped with CodeQL are excellent case studies. Open a security query for your language, observe how it defines its configuration, which library classes it reuses, and how it documents metadata and help text. Copy the structure, then adapt the source and sink predicates for an internal API. This is usually faster and more precise than starting from a blank file.</w:t>
       </w:r>
     </w:p>
     <w:p>
@@ -694,20 +990,80 @@
       </w:pPr>
       <w:bookmarkStart w:name="_Toc10" w:id="10"/>
       <w:r>
-        <w:t xml:space="preserve">Profiling and Measurement</w:t>
+        <w:t xml:space="preserve">Adapting a Case Study</w:t>
       </w:r>
       <w:bookmarkEnd w:id="10"/>
     </w:p>
     <w:p>
       <w:pPr>
-        <w:spacing w:after="80" w:line="276"/>
-      </w:pPr>
-      <w:r>
-        <w:rPr>
-          <w:sz w:val="22"/>
-          <w:szCs w:val="22"/>
-        </w:rPr>
-        <w:t xml:space="preserve">Use the CodeQL CLI timing and diagnostic options, or the VS Code extension’s performance views, to see which predicates dominate runtime. Focus optimization effort on the hottest predicates. After a change, re-measure on a representative database rather than assuming the edit helped.</w:t>
+        <w:spacing w:after="70" w:line="276"/>
+      </w:pPr>
+      <w:r>
+        <w:rPr>
+          <w:sz w:val="22"/>
+          <w:szCs w:val="22"/>
+        </w:rPr>
+        <w:t xml:space="preserve">When you adapt a published query:</w:t>
+      </w:r>
+    </w:p>
+    <w:p>
+      <w:pPr>
+        <w:spacing w:after="70" w:line="276"/>
+      </w:pPr>
+      <w:r>
+        <w:rPr>
+          <w:sz w:val="22"/>
+          <w:szCs w:val="22"/>
+        </w:rPr>
+        <w:t xml:space="preserve">1. Identify the original sources and sinks.</w:t>
+      </w:r>
+    </w:p>
+    <w:p>
+      <w:pPr>
+        <w:spacing w:after="70" w:line="276"/>
+      </w:pPr>
+      <w:r>
+        <w:rPr>
+          <w:sz w:val="22"/>
+          <w:szCs w:val="22"/>
+        </w:rPr>
+        <w:t xml:space="preserve">2. Map them to the equivalent concepts in your codebase (or add extensions).</w:t>
+      </w:r>
+    </w:p>
+    <w:p>
+      <w:pPr>
+        <w:spacing w:after="70" w:line="276"/>
+      </w:pPr>
+      <w:r>
+        <w:rPr>
+          <w:sz w:val="22"/>
+          <w:szCs w:val="22"/>
+        </w:rPr>
+        <w:t xml:space="preserve">3. Run against a small positive/negative test database.</w:t>
+      </w:r>
+    </w:p>
+    <w:p>
+      <w:pPr>
+        <w:spacing w:after="70" w:line="276"/>
+      </w:pPr>
+      <w:r>
+        <w:rPr>
+          <w:sz w:val="22"/>
+          <w:szCs w:val="22"/>
+        </w:rPr>
+        <w:t xml:space="preserve">4. Add barriers for known sanitizers.</w:t>
+      </w:r>
+    </w:p>
+    <w:p>
+      <w:pPr>
+        <w:spacing w:after="70" w:line="276"/>
+      </w:pPr>
+      <w:r>
+        <w:rPr>
+          <w:sz w:val="22"/>
+          <w:szCs w:val="22"/>
+        </w:rPr>
+        <w:t xml:space="preserve">5. Measure precision, then add the query to a suite.</w:t>
       </w:r>
     </w:p>
     <w:p>
@@ -716,124 +1072,20 @@
       </w:pPr>
       <w:bookmarkStart w:name="_Toc11" w:id="11"/>
       <w:r>
-        <w:t xml:space="preserve">Modular Design</w:t>
+        <w:t xml:space="preserve">What Good Case Studies Share</w:t>
       </w:r>
       <w:bookmarkEnd w:id="11"/>
     </w:p>
     <w:p>
       <w:pPr>
-        <w:spacing w:after="80" w:line="276"/>
-      </w:pPr>
-      <w:r>
-        <w:rPr>
-          <w:sz w:val="22"/>
-          <w:szCs w:val="22"/>
-        </w:rPr>
-        <w:t xml:space="preserve">Break complex logic into well-named predicates and modules. Modular queries are easier to test, easier to reuse, and often faster because the optimizer sees clearer boundaries. They also make partial-flow debugging simpler, because you can select intermediate predicates directly.</w:t>
-      </w:r>
-    </w:p>
-    <w:p>
-      <w:pPr>
-        <w:pStyle w:val="Heading2"/>
-      </w:pPr>
-      <w:bookmarkStart w:name="_Toc12" w:id="12"/>
-      <w:r>
-        <w:t xml:space="preserve">Common Performance Pitfalls</w:t>
-      </w:r>
-      <w:bookmarkEnd w:id="12"/>
-    </w:p>
-    <w:p>
-      <w:pPr>
-        <w:spacing w:after="80" w:line="276"/>
-      </w:pPr>
-      <w:r>
-        <w:rPr>
-          <w:sz w:val="22"/>
-          <w:szCs w:val="22"/>
-        </w:rPr>
-        <w:t xml:space="preserve">Selecting from every expression or every call without early filters. Recursive predicates that explore large graphs without bounding conditions. Configurations that start from overly broad sources. Analyzing generated or vendored code that should have been excluded at database-creation time. Fixing the database scope is frequently more effective than micro-optimizing a query.</w:t>
-      </w:r>
-    </w:p>
-    <w:p>
-      <w:pPr>
-        <w:pStyle w:val="Heading2"/>
-      </w:pPr>
-      <w:bookmarkStart w:name="_Toc13" w:id="13"/>
-      <w:r>
-        <w:t xml:space="preserve">Practical Checklist</w:t>
-      </w:r>
-      <w:bookmarkEnd w:id="13"/>
-    </w:p>
-    <w:p>
-      <w:pPr>
-        <w:spacing w:after="80" w:line="276"/>
-      </w:pPr>
-      <w:r>
-        <w:rPr>
-          <w:sz w:val="22"/>
-          <w:szCs w:val="22"/>
-        </w:rPr>
-        <w:t xml:space="preserve">• Prefer library predicates.</w:t>
-      </w:r>
-    </w:p>
-    <w:p>
-      <w:pPr>
-        <w:spacing w:after="80" w:line="276"/>
-      </w:pPr>
-      <w:r>
-        <w:rPr>
-          <w:sz w:val="22"/>
-          <w:szCs w:val="22"/>
-        </w:rPr>
-        <w:t xml:space="preserve">• Keep sources and sinks as narrow as correctness allows.</w:t>
-      </w:r>
-    </w:p>
-    <w:p>
-      <w:pPr>
-        <w:spacing w:after="80" w:line="276"/>
-      </w:pPr>
-      <w:r>
-        <w:rPr>
-          <w:sz w:val="22"/>
-          <w:szCs w:val="22"/>
-        </w:rPr>
-        <w:t xml:space="preserve">• Use local flow when sufficient.</w:t>
-      </w:r>
-    </w:p>
-    <w:p>
-      <w:pPr>
-        <w:spacing w:after="80" w:line="276"/>
-      </w:pPr>
-      <w:r>
-        <w:rPr>
-          <w:sz w:val="22"/>
-          <w:szCs w:val="22"/>
-        </w:rPr>
-        <w:t xml:space="preserve">• Add tests that cover both presence and absence of results.</w:t>
-      </w:r>
-    </w:p>
-    <w:p>
-      <w:pPr>
-        <w:spacing w:after="80" w:line="276"/>
-      </w:pPr>
-      <w:r>
-        <w:rPr>
-          <w:sz w:val="22"/>
-          <w:szCs w:val="22"/>
-        </w:rPr>
-        <w:t xml:space="preserve">• Measure before and after optimization changes.</w:t>
-      </w:r>
-    </w:p>
-    <w:p>
-      <w:pPr>
-        <w:spacing w:after="80" w:line="276"/>
-      </w:pPr>
-      <w:r>
-        <w:rPr>
-          <w:sz w:val="22"/>
-          <w:szCs w:val="22"/>
-        </w:rPr>
-        <w:t xml:space="preserve">• Exclude irrelevant code at database build time.</w:t>
+        <w:spacing w:after="70" w:line="276"/>
+      </w:pPr>
+      <w:r>
+        <w:rPr>
+          <w:sz w:val="22"/>
+          <w:szCs w:val="22"/>
+        </w:rPr>
+        <w:t xml:space="preserve">Clear metadata, a focused configuration, reuse of standard library classes, explicit handling of common sanitizers, and a set of tests. They also document limitations—what the query does not detect—so future maintainers know where models still need to be added.</w:t>
       </w:r>
     </w:p>
     <w:p>
@@ -841,22 +1093,22 @@
         <w:pStyle w:val="Heading1"/>
         <w:pageBreakBefore/>
       </w:pPr>
-      <w:bookmarkStart w:name="_Toc14" w:id="14"/>
-      <w:r>
-        <w:t xml:space="preserve">Chapter 14: Case Studies</w:t>
-      </w:r>
-      <w:bookmarkEnd w:id="14"/>
-    </w:p>
-    <w:p>
-      <w:pPr>
-        <w:spacing w:after="80" w:line="276"/>
-      </w:pPr>
-      <w:r>
-        <w:rPr>
-          <w:sz w:val="22"/>
-          <w:szCs w:val="22"/>
-        </w:rPr>
-        <w:t xml:space="preserve">Real analyses in the Security Lab series and examples/chapter14/ demonstrate efficient source-to-sink patterns you can adapt.</w:t>
+      <w:bookmarkStart w:name="_Toc12" w:id="12"/>
+      <w:r>
+        <w:t xml:space="preserve">Chapter 15: Best Practices</w:t>
+      </w:r>
+      <w:bookmarkEnd w:id="12"/>
+    </w:p>
+    <w:p>
+      <w:pPr>
+        <w:spacing w:after="70" w:line="276"/>
+      </w:pPr>
+      <w:r>
+        <w:rPr>
+          <w:sz w:val="22"/>
+          <w:szCs w:val="22"/>
+        </w:rPr>
+        <w:t xml:space="preserve">Apply the patterns from case studies: small tested configurations, library extension, and precise barriers.</w:t>
       </w:r>
     </w:p>
     <w:p>
@@ -864,50 +1116,27 @@
         <w:pStyle w:val="Heading1"/>
         <w:pageBreakBefore/>
       </w:pPr>
-      <w:bookmarkStart w:name="_Toc15" w:id="15"/>
-      <w:r>
-        <w:t xml:space="preserve">Chapter 15: Best Practices</w:t>
-      </w:r>
-      <w:bookmarkEnd w:id="15"/>
-    </w:p>
-    <w:p>
-      <w:pPr>
-        <w:spacing w:after="80" w:line="276"/>
-      </w:pPr>
-      <w:r>
-        <w:rPr>
-          <w:sz w:val="22"/>
-          <w:szCs w:val="22"/>
-        </w:rPr>
-        <w:t xml:space="preserve">Precise, modular, tested predicates plus good models keep both results and runtime acceptable in CI.</w:t>
-      </w:r>
-    </w:p>
-    <w:p>
-      <w:pPr>
-        <w:pStyle w:val="Heading1"/>
-        <w:pageBreakBefore/>
-      </w:pPr>
-      <w:bookmarkStart w:name="_Toc16" w:id="16"/>
+      <w:bookmarkStart w:name="_Toc13" w:id="13"/>
       <w:r>
         <w:t xml:space="preserve">Appendix</w:t>
       </w:r>
-      <w:bookmarkEnd w:id="16"/>
-    </w:p>
-    <w:p>
-      <w:pPr>
-        <w:spacing w:after="80" w:line="276"/>
-      </w:pPr>
-      <w:r>
-        <w:rPr>
-          <w:sz w:val="22"/>
-          <w:szCs w:val="22"/>
-        </w:rPr>
-        <w:t xml:space="preserve">Performance example: examples/chapter13/performance-predicate.ql. Official performance guidance is in the CodeQL documentation. Repository: https://github.com/rod-trent/MustLearnCodeQL.</w:t>
-      </w:r>
-    </w:p>
-    <w:p>
-      <w:pPr>
-        <w:spacing w:before="120"/>
+      <w:bookmarkEnd w:id="13"/>
+    </w:p>
+    <w:p>
+      <w:pPr>
+        <w:spacing w:after="70" w:line="276"/>
+      </w:pPr>
+      <w:r>
+        <w:rPr>
+          <w:sz w:val="22"/>
+          <w:szCs w:val="22"/>
+        </w:rPr>
+        <w:t xml:space="preserve">SQL injection example: examples/chapter14/sql-injection-example.ql. Security Lab Zero-to-Hero series and official CodeQL security queries. Repository: https://github.com/rod-trent/MustLearnCodeQL.</w:t>
+      </w:r>
+    </w:p>
+    <w:p>
+      <w:pPr>
+        <w:spacing w:before="100"/>
         <w:jc w:val="center"/>
       </w:pPr>
       <w:r>
@@ -1351,7 +1580,7 @@
     <w:next w:val="Normal"/>
     <w:qFormat/>
     <w:pPr>
-      <w:spacing w:after="50" w:before="100"/>
+      <w:spacing w:after="40" w:before="80"/>
       <w:outlineLvl w:val="0"/>
     </w:pPr>
     <w:rPr>
@@ -1369,7 +1598,7 @@
     <w:next w:val="Normal"/>
     <w:qFormat/>
     <w:pPr>
-      <w:spacing w:after="40" w:before="120"/>
+      <w:spacing w:after="30" w:before="100"/>
       <w:outlineLvl w:val="1"/>
     </w:pPr>
     <w:rPr>

</xml_diff>